<commit_message>
fix: keep six-figure backups responsive (web v1241)
</commit_message>
<xml_diff>
--- a/docs/maintenance/AI开发项目_Bug修改规范.docx
+++ b/docs/maintenance/AI开发项目_Bug修改规范.docx
@@ -11202,6 +11202,34 @@
     <w:p>
       <w:r>
         <w:t>发布身份：网页及私人内置源码v1239，原生iOS1.0.355（355）、桥37不变，不制作私人包。全量测试与实际Pages发布结果见v1239_浏览器运行诊断核验.md。DOCX仅追加并验证历史正文与其余ZIP成员保留；缺少LibreOffice，未完成页面渲染验收。</w:t>
+      </w:r>
+    </w:p>
+    <w:p>
+      <w:r>
+        <w:br w:type="page"/>
+      </w:r>
+    </w:p>
+    <w:p>
+      <w:pPr>
+        <w:pStyle w:val="Heading1"/>
+      </w:pPr>
+      <w:r>
+        <w:t>v1241 和 v1242 大存档备份流畅修复</w:t>
+      </w:r>
+    </w:p>
+    <w:p>
+      <w:r>
+        <w:t>大存档卡顿必须按诊断阶段定位。若最后阶段是 backup-copy，且没有 backup-serialize、backup-image-read 或 backup-download，不得把故障归因于下载按钮、Service Worker 或单张损坏图片。</w:t>
+      </w:r>
+    </w:p>
+    <w:p>
+      <w:r>
+        <w:t>移动浏览器备份不得先为大型数组建立完整键表或复制整个状态树。数组应固定长度后按下标分段读取；分段算法必须用十万级数据验证事件循环间隔、导出、导入、保存和重启恢复。</w:t>
+      </w:r>
+    </w:p>
+    <w:p>
+      <w:r>
+        <w:t>MacIntel 不能单独判定设备是 Mac。iPhone Safari 可使用桌面级 User-Agent，应结合 standalone、视口和像素比判断。pagehide 证明文档被销毁，不足以单独证明系统强杀。详见 docs/maintenance/v1241_v1242_大存档备份流畅修复核验.md。</w:t>
       </w:r>
     </w:p>
     <w:sectPr>

</xml_diff>

<commit_message>
Release private v1274 with cozy home 052
</commit_message>
<xml_diff>
--- a/docs/maintenance/AI开发项目_Bug修改规范.docx
+++ b/docs/maintenance/AI开发项目_Bug修改规范.docx
@@ -11230,6 +11230,29 @@
     <w:p>
       <w:r>
         <w:t>MacIntel 不能单独判定设备是 Mac。iPhone Safari 可使用桌面级 User-Agent，应结合 standalone、视口和像素比判断。pagehide 证明文档被销毁，不足以单独证明系统强杀。详见 docs/maintenance/v1241_v1242_大存档备份流畅修复核验.md。</w:t>
+      </w:r>
+    </w:p>
+    <w:p>
+      <w:pPr>
+        <w:pStyle w:val="Heading1"/>
+      </w:pPr>
+      <w:r>
+        <w:t>v1274｜移动 3D 预热与版本替换稳定规范（2026-09-21）</w:t>
+      </w:r>
+    </w:p>
+    <w:p>
+      <w:r>
+        <w:t>移动 WebGL 启动预热不得用正式整屋材质依次绘制所有房间，也不得为了减少首次短帧而同时保留全屋几何、高清纹理和镜面渲染目标。必须使用与正式场景隔离的临时材质/纹理，逐次恢复正式引用，并在进入前释放临时几何和镜面缓冲；桌面浏览器通过不能替代 iPhone GPU 压力验收。</w:t>
+      </w:r>
+    </w:p>
+    <w:p>
+      <w:r>
+        <w:t>动作优化不能把“本帧移动量为零”等同于“无需姿态处理”。固定站姿、重力补偿、裙摆收拢或其他与移动幅度无关的骨骼偏移必须继续执行；只允许复用临时计算对象，不能提前返回跳过姿态。</w:t>
+      </w:r>
+    </w:p>
+    <w:p>
+      <w:r>
+        <w:t>发布号替换必须限定到版本字段、缓存键和明确测试断言。复制整包资源后禁止对 vendor、图片数据脚本或业务数值做全目录数字替换；若产生意外差异，先从 HEAD 恢复无关文件，再继续发布。新包必须从已提交树读取，并反向解压逐字节验证。</w:t>
       </w:r>
     </w:p>
     <w:sectPr>

</xml_diff>

<commit_message>
fix(private): wait for streamed cloud backup commit
</commit_message>
<xml_diff>
--- a/docs/maintenance/AI开发项目_Bug修改规范.docx
+++ b/docs/maintenance/AI开发项目_Bug修改规范.docx
@@ -11253,6 +11253,29 @@
     <w:p>
       <w:r>
         <w:t>发布号替换必须限定到版本字段、缓存键和明确测试断言。复制整包资源后禁止对 vendor、图片数据脚本或业务数值做全目录数字替换；若产生意外差异，先从 HEAD 恢复无关文件，再继续发布。新包必须从已提交树读取，并反向解压逐字节验证。</w:t>
+      </w:r>
+    </w:p>
+    <w:p>
+      <w:r>
+        <w:br w:type="page"/>
+      </w:r>
+    </w:p>
+    <w:p>
+      <w:pPr>
+        <w:pStyle w:val="Heading1"/>
+      </w:pPr>
+      <w:r>
+        <w:t>私人每日云备份提交等待修复候选 2026年9月21日</w:t>
+      </w:r>
+    </w:p>
+    <w:p>
+      <w:r>
+        <w:t>长原生任务必须逐层核对超时，不能只放宽 URLSession 或 SmallPhoneNative.request 就宣称网页会等够。调用链中的业务包装器、桥请求、原生网络请求和资源总时限必须满足外层大于等于内层，并用测试记录实际传入的 timeoutMs。私人每日云备份是永久发布门禁：每个私人版本必须同时保留 private-cloud-backup.js、两个入口引用、begin/chunk/commit/abort、PrivateBackupFileStore、fromFile 上传、Xcode Target 资源归属和提交阶段等待关系；任一缺失都阻止测试与打包。源码包包含文件不等于 Mac 构建或真机已运行该文件。</w:t>
+      </w:r>
+    </w:p>
+    <w:p>
+      <w:r>
+        <w:t>完整代码证据与原始设计边界见 v1240_私人每日分块云备份核验.md。当前仅有 Windows 源码与自动测试证据；尚未完成 Mac 编译、签名、真实 iPhone 54 MB 上传、跨日自动备份或云端恢复验收。打包与推送状态以实际发布结果为准。</w:t>
       </w:r>
     </w:p>
     <w:sectPr>

</xml_diff>

<commit_message>
fix: hide app decision metadata and ship cover recovery v1282 v1283
</commit_message>
<xml_diff>
--- a/docs/maintenance/AI开发项目_Bug修改规范.docx
+++ b/docs/maintenance/AI开发项目_Bug修改规范.docx
@@ -11276,6 +11276,16 @@
     <w:p>
       <w:r>
         <w:t>完整代码证据与原始设计边界见 v1240_私人每日分块云备份核验.md。当前仅有 Windows 源码与自动测试证据；尚未完成 Mac 编译、签名、真实 iPhone 54 MB 上传、跨日自动备份或云端恢复验收。打包与推送状态以实际发布结果为准。</w:t>
+      </w:r>
+    </w:p>
+    <w:p>
+      <w:r>
+        <w:t>2026-09-21 内部协议可见性边界</w:t>
+      </w:r>
+    </w:p>
+    <w:p>
+      <w:r>
+        <w:t>授权控制协议必须先严格解析执行，显示边界再对已知内部标记兜底隐藏，不为隐藏格式而放宽执行条件；不能因为原文输出开启便把内部应用决定作为通知。分别覆盖前台入库、后台入库及APNs投影，保留功能卡片和心情同步。服务部署前下载比较各项目基线，不能把私人策略整份覆盖到公开服务。</w:t>
       </w:r>
     </w:p>
     <w:sectPr>

</xml_diff>

<commit_message>
fix: ship v1322 and private v1323 role preferences and receipt fixes
</commit_message>
<xml_diff>
--- a/docs/maintenance/AI开发项目_Bug修改规范.docx
+++ b/docs/maintenance/AI开发项目_Bug修改规范.docx
@@ -11286,6 +11286,29 @@
     <w:p>
       <w:r>
         <w:t>授权控制协议必须先严格解析执行，显示边界再对已知内部标记兜底隐藏，不为隐藏格式而放宽执行条件；不能因为原文输出开启便把内部应用决定作为通知。分别覆盖前台入库、后台入库及APNs投影，保留功能卡片和心情同步。服务部署前下载比较各项目基线，不能把私人策略整份覆盖到公开服务。</w:t>
+      </w:r>
+    </w:p>
+    <w:p>
+      <w:r>
+        <w:br w:type="page"/>
+      </w:r>
+    </w:p>
+    <w:p>
+      <w:pPr>
+        <w:pStyle w:val="Heading1"/>
+      </w:pPr>
+      <w:r>
+        <w:t>2026年9月26日 v1322和v1323维护记录</w:t>
+      </w:r>
+    </w:p>
+    <w:p>
+      <w:r>
+        <w:t>更换显示变量时同时核对首次渲染与即时设置路径；将设置由全局迁往角色时核对保存、运行读取及后台同步。派生回执不得重复结算或伪造服务端消息。打包脚本必须由版本常量生成SOURCE_STATE，不能沿用旧脚本写死的旧版本；继续保留逐包清单和解压反核。</w:t>
+      </w:r>
+    </w:p>
+    <w:p>
+      <w:r>
+        <w:t>详细核验见 v1322_v1323_角色偏好与界面修复.md。Mac和真实iPhone尚未验证。</w:t>
       </w:r>
     </w:p>
     <w:sectPr>

</xml_diff>

<commit_message>
fix: expose role call frequency and keep mobile input visible v1324
</commit_message>
<xml_diff>
--- a/docs/maintenance/AI开发项目_Bug修改规范.docx
+++ b/docs/maintenance/AI开发项目_Bug修改规范.docx
@@ -11309,6 +11309,19 @@
     <w:p>
       <w:r>
         <w:t>详细核验见 v1322_v1323_角色偏好与界面修复.md。Mac和真实iPhone尚未验证。</w:t>
+      </w:r>
+    </w:p>
+    <w:p>
+      <w:pPr>
+        <w:pStyle w:val="Heading1"/>
+      </w:pPr>
+      <w:r>
+        <w:t>2026年9月26日 电话频率入口补修 v1324和v1325</w:t>
+      </w:r>
+    </w:p>
+    <w:p>
+      <w:r>
+        <w:t>用户找不到电话频率。线上复现手机390px宽度时输入框实际宽0，前轮DOM赋值测试漏检了可见性。现采用局部竖排布局，并在角色资料右上角更多的聊天与主动页顶部增加电话频率直接入口。两端320、390、430宽度真实点击填写保存通过，不影响其他角色；全量2572项通过。今后输入设置验收必须检查真实点击、可见宽度、保存与角色隔离，不能只向DOM直接赋值。详见 v1324_v1325_电话频率入口修复.md。</w:t>
       </w:r>
     </w:p>
     <w:sectPr>

</xml_diff>

<commit_message>
fix: parse nested delivery product titles v1326
</commit_message>
<xml_diff>
--- a/docs/maintenance/AI开发项目_Bug修改规范.docx
+++ b/docs/maintenance/AI开发项目_Bug修改规范.docx
@@ -11322,6 +11322,30 @@
     <w:p>
       <w:r>
         <w:t>用户找不到电话频率。线上复现手机390px宽度时输入框实际宽0，前轮DOM赋值测试漏检了可见性。现采用局部竖排布局，并在角色资料右上角更多的聊天与主动页顶部增加电话频率直接入口。两端320、390、430宽度真实点击填写保存通过，不影响其他角色；全量2572项通过。今后输入设置验收必须检查真实点击、可见宽度、保存与角色隔离，不能只向DOM直接赋值。详见 v1324_v1325_电话频率入口修复.md。</w:t>
+      </w:r>
+    </w:p>
+    <w:p/>
+    <w:p>
+      <w:r>
+        <w:rPr>
+          <w:b/>
+        </w:rPr>
+        <w:t>2026年9月27日 结构化动作嵌套边界规则</w:t>
+      </w:r>
+    </w:p>
+    <w:p>
+      <w:r>
+        <w:t>结构化动作的字段值允许包含与业务名称有关的括号时，禁止使用“遇到第一个右括号就结束”的排除字符正则。必须按外层定界符种类和嵌套深度扫描，并让聊天、补判、重试和通话共用同一解析入口。</w:t>
+      </w:r>
+    </w:p>
+    <w:p>
+      <w:r>
+        <w:t>已识别控制标签前缀但未完整解析或消费的内容必须失败关闭：不得执行残缺动作，不得把控制标签或残片显示为角色气泡。新增解析器必须同时覆盖网页和私人内置页，并以永久修复守卫防止后续整文件覆盖丢失。</w:t>
+      </w:r>
+    </w:p>
+    <w:p>
+      <w:r>
+        <w:t>外卖可用性错误要拆分定位：HTTP 502/503/530 属于本地服务、隧道或上游连接层；门店或商品没有命中属于自动化页面层；动作字段被截断属于前端结构化协议层。不得用重启隧道掩盖解析缺陷，也不得用前端解析补丁冒充网络恢复。</w:t>
       </w:r>
     </w:p>
     <w:sectPr>

</xml_diff>

<commit_message>
fix: keep lock screen swipe ownership and reset drag state v1328
</commit_message>
<xml_diff>
--- a/docs/maintenance/AI开发项目_Bug修改规范.docx
+++ b/docs/maintenance/AI开发项目_Bug修改规范.docx
@@ -11346,6 +11346,25 @@
     <w:p>
       <w:r>
         <w:t>外卖可用性错误要拆分定位：HTTP 502/503/530 属于本地服务、隧道或上游连接层；门店或商品没有命中属于自动化页面层；动作字段被截断属于前端结构化协议层。不得用重启隧道掩盖解析缺陷，也不得用前端解析补丁冒充网络恢复。</w:t>
+      </w:r>
+    </w:p>
+    <w:p/>
+    <w:p>
+      <w:r>
+        <w:rPr>
+          <w:b/>
+        </w:rPr>
+        <w:t>2026年9月27日 v1328/v1329 屏保上滑被浏览器接管后回弹</w:t>
+      </w:r>
+    </w:p>
+    <w:p>
+      <w:r>
+        <w:t>页面自定义竖向触屏手势必须在触摸开始前声明局部 touch-action；仅在 pointermove 中 preventDefault 无法保证浏览器不发 pointercancel。拖动与松手动画分离，所有退出路径清除拖动样式。</w:t>
+      </w:r>
+    </w:p>
+    <w:p>
+      <w:r>
+        <w:t>桌面 Chromium 触屏复现不等于 Safari 真机验证；合成 touchCancel 后的输入流不合成 click 也不能直接归因于产品事件处理。诊断和发布记录必须区分已复现缺陷、推测性能因素和未验证用户症状。</w:t>
       </w:r>
     </w:p>
     <w:sectPr>

</xml_diff>

<commit_message>
fix: route license activation through same-backend relay v1332
</commit_message>
<xml_diff>
--- a/docs/maintenance/AI开发项目_Bug修改规范.docx
+++ b/docs/maintenance/AI开发项目_Bug修改规范.docx
@@ -11365,6 +11365,19 @@
     <w:p>
       <w:r>
         <w:t>桌面 Chromium 触屏复现不等于 Safari 真机验证；合成 touchCancel 后的输入流不合成 click 也不能直接归因于产品事件处理。诊断和发布记录必须区分已复现缺陷、推测性能因素和未验证用户症状。</w:t>
+      </w:r>
+    </w:p>
+    <w:p>
+      <w:pPr>
+        <w:pStyle w:val="Heading2"/>
+      </w:pPr>
+      <w:r>
+        <w:t>2026-09-27 · v1332/v1333 免费授权入口与原后台登记</w:t>
+      </w:r>
+    </w:p>
+    <w:p>
+      <w:r>
+        <w:t>授权网络兼容修复必须保持后端身份和管理员登记链：代理固定上游、保留原业务响应及设备信息，拒绝管理员动作与任意上游，不在激活响应丢失时盲目自动重试。CORS预检、会话续期、封禁、通行密钥Origin/RP、私人原生桥、已有存档均需回归。客户端入口不得被无关可选服务阻塞。网络探测通过只证明该设备当时可达，不证明已兑换或所有安卓恢复；用户真实邀请码未经授权不得用于测试。版本号负向断言须精确边界，禁止build40应不误匹配400；源码写回保留LF，不扩大无关差异。</w:t>
       </w:r>
     </w:p>
     <w:sectPr>

</xml_diff>

<commit_message>
fix: add verified feature directory and local support answers (v1334)
</commit_message>
<xml_diff>
--- a/docs/maintenance/AI开发项目_Bug修改规范.docx
+++ b/docs/maintenance/AI开发项目_Bug修改规范.docx
@@ -11378,6 +11378,30 @@
     <w:p>
       <w:r>
         <w:t>授权网络兼容修复必须保持后端身份和管理员登记链：代理固定上游、保留原业务响应及设备信息，拒绝管理员动作与任意上游，不在激活响应丢失时盲目自动重试。CORS预检、会话续期、封禁、通行密钥Origin/RP、私人原生桥、已有存档均需回归。客户端入口不得被无关可选服务阻塞。网络探测通过只证明该设备当时可达，不证明已兑换或所有安卓恢复；用户真实邀请码未经授权不得用于测试。版本号负向断言须精确边界，禁止build40应不误匹配400；源码写回保留LF，不扩大无关差异。</w:t>
+      </w:r>
+    </w:p>
+    <w:p/>
+    <w:p>
+      <w:pPr>
+        <w:pStyle w:val="Heading2"/>
+      </w:pPr>
+      <w:r>
+        <w:t>2026-09-27 v1334 客服功能目录与设置入口</w:t>
+      </w:r>
+    </w:p>
+    <w:p>
+      <w:r>
+        <w:t>客服不得凭旧版路径或主观推断指导操作。配置入口应以实际页面按钮、导航和控制项为依据，特别区分角色创建与真人好友、全局与单角色、模拟功能与真实设备。开发中页面不能宣传为已实现。</w:t>
+      </w:r>
+    </w:p>
+    <w:p>
+      <w:r>
+        <w:t>功能目录、本地回答和模型知识使用同一公开数据源。新增/移动应用、设置、游戏时同步WX_HELP及覆盖检查；常见“在哪里”问题应无需模型配置即可回答。增加敏感配置哨兵测试，防止把存档或API配置送入客服模型。</w:t>
+      </w:r>
+    </w:p>
+    <w:p>
+      <w:r>
+        <w:t>用户明确只推送不打包时，不运行私人打包脚本；共享功能保留私人源码等价性及独立网页版本，不能把源码同步宣称为用户安装的私人App已升级。</w:t>
       </w:r>
     </w:p>
     <w:sectPr>

</xml_diff>

<commit_message>
fix(voice): isolate external tests and honor internal voice switch (v1336)
</commit_message>
<xml_diff>
--- a/docs/maintenance/AI开发项目_Bug修改规范.docx
+++ b/docs/maintenance/AI开发项目_Bug修改规范.docx
@@ -11402,6 +11402,24 @@
     <w:p>
       <w:r>
         <w:t>用户明确只推送不打包时，不运行私人打包脚本；共享功能保留私人源码等价性及独立网页版本，不能把源码同步宣称为用户安装的私人App已升级。</w:t>
+      </w:r>
+    </w:p>
+    <w:p>
+      <w:pPr>
+        <w:pStyle w:val="Heading1"/>
+      </w:pPr>
+      <w:r>
+        <w:t>2026-09-27 v1336 / v1337 语音测试渠道隔离（不打包）</w:t>
+      </w:r>
+    </w:p>
+    <w:p>
+      <w:r>
+        <w:t>语音测试必须绑定用户当前填写的明确渠道；空配置立即失败，不能借用全局内置状态。异步测试用局部快照，禁止临时替换后恢复全局设置。内置开关在共享生成入口及关键异步等待后检查，退款与账户查询必须独立放行。</w:t>
+      </w:r>
+    </w:p>
+    <w:p>
+      <w:r>
+        <w:t>公开免费音色不等于免费生成。余额、账单、实际请求证据分开核对；没有账单不能推断具体声音来源。零余额边界测试不得影响真实用户或泄露邀请码。保留付费老用户余额与服务，不以全局停服代替前端渠道修复。</w:t>
       </w:r>
     </w:p>
     <w:sectPr>

</xml_diff>

<commit_message>
fix(chat): queue translations and block reasoning leaks (v1338)
</commit_message>
<xml_diff>
--- a/docs/maintenance/AI开发项目_Bug修改规范.docx
+++ b/docs/maintenance/AI开发项目_Bug修改规范.docx
@@ -11420,6 +11420,55 @@
     <w:p>
       <w:r>
         <w:t>公开免费音色不等于免费生成。余额、账单、实际请求证据分开核对；没有账单不能推断具体声音来源。零余额边界测试不得影响真实用户或泄露邀请码。保留付费老用户余额与服务，不以全局停服代替前端渠道修复。</w:t>
+      </w:r>
+    </w:p>
+    <w:p>
+      <w:pPr>
+        <w:pStyle w:val="Heading1"/>
+        <w:keepNext/>
+      </w:pPr>
+      <w:r>
+        <w:t>2026-09-28 新增规则：生成内容清洗与辅助模型队列</w:t>
+      </w:r>
+    </w:p>
+    <w:p>
+      <w:pPr>
+        <w:keepLines/>
+      </w:pPr>
+      <w:r>
+        <w:t>任何“原始输出／不筛选”开关只能放宽角色格式，不得绕过内部思考、控制标签、密钥或协议内容的安全清洗。新增输出模式时必须复用最终泄漏守卫。</w:t>
+      </w:r>
+    </w:p>
+    <w:p>
+      <w:pPr>
+        <w:keepLines/>
+      </w:pPr>
+      <w:r>
+        <w:t>同一页面可同时生成多条辅助模型任务时，不得在渲染循环内无界并发。应使用有界队列，并用测试记录最大并发。</w:t>
+      </w:r>
+    </w:p>
+    <w:p>
+      <w:pPr>
+        <w:keepLines/>
+      </w:pPr>
+      <w:r>
+        <w:t>自动重试必须区分临时故障与永久故障：超时、网络、429、5xx、空结果可有限重试；401、403、余额、Key 和配置错误不得重试。重试次数必须有硬上限。</w:t>
+      </w:r>
+    </w:p>
+    <w:p>
+      <w:pPr>
+        <w:keepLines/>
+      </w:pPr>
+      <w:r>
+        <w:t>队列任务开始前必须重新核对目标对象与源内容；对象被删除或内容变化时应取消任务并释放 busy/pending 标记。</w:t>
+      </w:r>
+    </w:p>
+    <w:p>
+      <w:pPr>
+        <w:keepLines/>
+      </w:pPr>
+      <w:r>
+        <w:t>推理泄漏回归必须覆盖闭合标签、未闭合标签、无标签连续推理句和普通英文误报边界，并同时检查网页与私人内置源码。</w:t>
       </w:r>
     </w:p>
     <w:sectPr>

</xml_diff>

<commit_message>
Web v1422 / Private v1423 iOS435: inherit offline features and repair eight chat issues
</commit_message>
<xml_diff>
--- a/docs/maintenance/AI开发项目_Bug修改规范.docx
+++ b/docs/maintenance/AI开发项目_Bug修改规范.docx
@@ -11469,6 +11469,56 @@
       </w:pPr>
       <w:r>
         <w:t>推理泄漏回归必须覆盖闭合标签、未闭合标签、无标签连续推理句和普通英文误报边界，并同时检查网页与私人内置源码。</w:t>
+      </w:r>
+    </w:p>
+    <w:p>
+      <w:r>
+        <w:t xml:space="preserve">2026-10-03 新规则追加：八项聊天修复。</w:t>
+      </w:r>
+    </w:p>
+    <w:p>
+      <w:r>
+        <w:t xml:space="preserve">内部控制行只按整行格式识别，保留角色真实台词、旁白与用户原话；专属红包必须执行层核对对象，不仅靠提示词，未知对象应阻止领取；使用稳定接收人ID。</w:t>
+      </w:r>
+    </w:p>
+    <w:p>
+      <w:r>
+        <w:t xml:space="preserve">好友备用链路只读探测选路，业务写不能因超时跨路重试；网络/5xx/非JSON结果未确认不得直接退款；需要区分提交前故障与提交后未确认。</w:t>
+      </w:r>
+    </w:p>
+    <w:p>
+      <w:r>
+        <w:t xml:space="preserve">未读计数须排除自己、已读、撤回、静默和隐藏传输，账户和朋友圈查看状态隔离；进入当前会话立即已读。截图测试与真实模型、部署、Mac构建、iPhone网络验收分别报告。</w:t>
+      </w:r>
+    </w:p>
+    <w:p>
+      <w:r>
+        <w:t xml:space="preserve">2026-10-03 发布阶段追加：用户随后明确授权上线与完整私人打包。网页v1422为双数，私人v1423为单数，原生1.0.435 (435)，桥42；原签名配置不变。</w:t>
+      </w:r>
+    </w:p>
+    <w:p>
+      <w:r>
+        <w:t xml:space="preserve">完整继承v1420线下旁白状态、多角色接话/点名/离场恢复、按日期删记录与共同生活功能，并保留本次八项修复。最后交付v1353/iOS420包逐文件核对无缺失；当前源的历史包提交是祖先。</w:t>
+      </w:r>
+    </w:p>
+    <w:p>
+      <w:r>
+        <w:t xml:space="preserve">主测试2943/2943、relay25/25、线下继承与永久回归513/513通过；两端核心聊天与实际浏览器检查通过。原13项测试失败查明为Windows换行读取误报，仅归一化测试读取，原断言保留。</w:t>
+      </w:r>
+    </w:p>
+    <w:p>
+      <w:r>
+        <w:t xml:space="preserve">现有Cloudflare备用服务已发布Active版本05dd1e47。只按已配置原好友库处理白名单RPC，不跨数据库、不自动重试业务写。具体手机不开VPN效果、真实模型长期多样性、Mac编译与iPhone验收待验证。</w:t>
+      </w:r>
+    </w:p>
+    <w:p>
+      <w:r>
+        <w:t xml:space="preserve">唯一私人交付物为最新私人版本覆盖包_v1423_iOS435.zip；完整Xcode源码、内置网页、依赖、来源提交和SHA256清单一并交付。最终实际提交与包状态看Git和SOURCE_STATE，不以先前预览记录代替。</w:t>
+      </w:r>
+    </w:p>
+    <w:p>
+      <w:r>
+        <w:t xml:space="preserve">最终继承补齐：私人版同步网页已有的文字自动翻译、角色独立模型路线选择与朋友圈图片开关，保留私人原生性能/备份/缓存/后台调度差异。最终主测试2948/2948通过；两端授权正常聊天、保存重开及八项实际浏览器回归通过，私人三处继承UI/状态检查通过。备用服务实际域名健康200、空好友搜索200且空列表、非白名单RPC404，CORS符合网页来源；不等于受影响手机不开VPN已恢复。</w:t>
       </w:r>
     </w:p>
     <w:sectPr>

</xml_diff>

<commit_message>
Release small-fish travel services and unified search; web v1504 private source v1505
</commit_message>
<xml_diff>
--- a/docs/maintenance/AI开发项目_Bug修改规范.docx
+++ b/docs/maintenance/AI开发项目_Bug修改规范.docx
@@ -11519,6 +11519,61 @@
     <w:p>
       <w:r>
         <w:t xml:space="preserve">最终继承补齐：私人版同步网页已有的文字自动翻译、角色独立模型路线选择与朋友圈图片开关，保留私人原生性能/备份/缓存/后台调度差异。最终主测试2948/2948通过；两端授权正常聊天、保存重开及八项实际浏览器回归通过，私人三处继承UI/状态检查通过。备用服务实际域名健康200、空好友搜索200且空列表、非白名单RPC404，CORS符合网页来源；不等于受影响手机不开VPN已恢复。</w:t>
+      </w:r>
+    </w:p>
+    <w:p>
+      <w:r>
+        <w:t>2026-10-04｜相邻票种隔离规则</w:t>
+      </w:r>
+    </w:p>
+    <w:p>
+      <w:r>
+        <w:t>新增票种必须独立表单/标记/指令，并检查旧行程渲染、提醒、角色普通上下文、授权查手机、远程快照和聊天窗口过滤；卡片以订单引用读取现状态。独立页面的 active 状态必须互斥，避免从聊天打开另一票种卡片时被上次页面遮住。</w:t>
+      </w:r>
+    </w:p>
+    <w:p>
+      <w:r>
+        <w:t>2026-10-04 追加：HTML文本转义不能替代HTML属性转义；结构化查询ID必须在data-*属性中转义引号并以真实DOM点击验收。角色订票必须通过实际aiReply与真实资金执行器验证，覆盖普通及原文模式、成功与余额不足，不能用roleDirect单独成功替代完整标签解析验收。模拟演出应明确区别查询、预订与实际开票，禁止写未核实的余票、热度、官方档期；角色资金和用户钱包分开，退款依原资金来源。</w:t>
+      </w:r>
+    </w:p>
+    <w:p>
+      <w:r>
+        <w:t>2026-10-04 追加演唱会提醒验收：时间任务不能在排队或请求启动时标记已完成，以真正可见消息为回执，并持久化、重开去重。异步模型／语音准备前后须验证订单有效窗口与账号角色权限；不替换当前普通聊天定时器。自动隐藏需验证页面保持打开时更新、精确结束和退款24小时边界；宽度规则限订单容器，不扩大聊天气泡。定时器证明限运行中的页面，系统暂停／关闭时的准时通知需要独立原生或服务端验收。</w:t>
+      </w:r>
+    </w:p>
+    <w:p>
+      <w:r>
+        <w:t>2026-10-04 打车新增规则：GPS地址仅明确共享到选定角色，不自动发给所有角色；对方上车点不得复用用户GPS；报价／定位有效期、角色权限、乘车人和原始付款来源必须冻结核验。按车收费，禁止双扣和双退，角色自有资金与亲属卡独立。司机到达不能自动视为上车，以明确按钮为行程开始和角色通知依据；提醒收到实际可见消息后持久化，异步前后验证订单、账号、角色及时间窗口，不能覆盖原有聊天／通话任务。系统暂停或关闭时无法承诺准时后台通知。隐藏行程保留账单，退款24小时及完结24小时精确边界验证；本地预览、私人源码浏览器与Mac签名／真机验收分开报告。</w:t>
+      </w:r>
+    </w:p>
+    <w:p>
+      <w:r>
+        <w:t>2026-10-04 打车角色报备须区分乘车主体：给角色叫车的到车／上车提醒使用角色第一人称报备，不能说用户已上车；用户乘车不得自动确认。模拟上车必须等待角色到车报备的实际可见回执并按订单持久化定时，不按请求启动计时，取消／超时／已删除角色／切账号均不得继续模拟上车。专属卡取消动作阻止冒泡，不误打开详情；目的地选择不得依赖不可定制颜色的系统datalist。</w:t>
+      </w:r>
+    </w:p>
+    <w:p>
+      <w:r>
+        <w:t>2026-10-04 打车取消权限由付款人与实际乘车人共同确定，不单看谁点按钮或订单所在账号；限制必须在界面和执行器同时实现。用户付款给角色不能手动退，角色付款给用户也不能手动退；独自／同行自己乘坐且用户付款的行程仅在订单列表取消。自动超时原路退款属于系统生命周期，不能因收紧手动权限而失效。用户最新权限要求优先于旧产品测试预期，保留旧实现失败证据并更新行为测试。查手机遵循既有授权，普通上下文仅共享知情角色，不因订单存在而泄漏给无关角色。</w:t>
+      </w:r>
+    </w:p>
+    <w:p>
+      <w:r>
+        <w:t>2026-10-04 汇总页只读取原始订单，不能创建第二份订单表／资金流水；账户隔离与有效期复用各类原判断，不能为了显示所有记录恢复已清理行程。详情入口直接调用原详情，不先初始化无关查询表单；付款、退款、角色知情及取消权限仍归原执行器。列表分页约束DOM，不能一次渲染无限图片或全部历史；类型筛选无需模型。复用查询入口只能用于相同订单语义，游乐园与景点可共用门票，租车不能伪装打车，跟团不能伪装普通单次票，未开发入口保持明确状态。</w:t>
+      </w:r>
+    </w:p>
+    <w:p>
+      <w:r>
+        <w:t>2026-10-04 网页1498／私人1499：携程旅行统一改名小鱼旅行，同步桌面默认名称、微信服务入口、角色订单卡片及页面标题；旧名称兼容识别，保留原 travel 数据键及权限。我的行程汇总酒店、门票、机票、火车票、演唱会、打车，按类型筛选并每页12条，详情复用原页面，遵守原退款／到期隐藏和账户隔离规则。门票入口复用攻略查询，并显示项目类型。网页和私人浏览器六类详情及不修改订单余额检查通过；未推送、未打包，未验证真实iPhone。</w:t>
+      </w:r>
+    </w:p>
+    <w:p>
+      <w:r>
+        <w:t>2026-10-04 网页v1502／私人源码v1503：小鱼旅行集成本聊天酒店、景点门票、机票、火车票、演唱会、打车与统一我的行程。首页移除租车、跟团游、无功能快捷栏及更多产品入口，第二排均分3项；保留兼容服务弹窗并去除黑色外框。首页搜索使用本地目的地／酒店品牌／景点／艺人资料，明确匹配带入原查询页，城市、跨城路线、歧义和未知词先选服务；不自动调用模型、不预订或扣款。角色远程查看改为真实新首页→我的行程→订单详情，按实时DOM位置点击；小鱼旅行订单优先识别为旅行软件，锁定／解锁、情侣空间权限与共同生活名称同步，旧品牌保留别名。两端实际浏览器搜索、真实授权远控点击中心、订单隔离／生命周期／正常授权聊天检查通过；全量3044项通过。只授权网页发布，不打包，Mac／真实iPhone未验证。</w:t>
+      </w:r>
+    </w:p>
+    <w:p>
+      <w:r>
+        <w:t>2026-10-04 最终发布检查：网页 v1504、私人共享源码 v1505，本次仅推送网页，不打私人包。全量 3044 项测试通过；共享旅行资源 53 文件一致。修复版本替换误改时间常量的问题，核查两端无该类差异。角色调用、情侣空间权限和远控统一小鱼旅行，兼容旧称。远控使用当前 DOM 中心坐标，统一搜索只带入查询表单。旧攻略封面已替换，区域检查改为现存兼容选择页；国家与城市、定位失败与成功、账号隔离均通过。私人旅行资源加入跟踪白名单，防止后续遗漏。</w:t>
       </w:r>
     </w:p>
     <w:sectPr>

</xml_diff>

<commit_message>
Fix large role travel balances with decimal debit and original-source refunds; web v1506 private v1507
</commit_message>
<xml_diff>
--- a/docs/maintenance/AI开发项目_Bug修改规范.docx
+++ b/docs/maintenance/AI开发项目_Bug修改规范.docx
@@ -11574,6 +11574,11 @@
     <w:p>
       <w:r>
         <w:t>2026-10-04 最终发布检查：网页 v1504、私人共享源码 v1505，本次仅推送网页，不打私人包。全量 3044 项测试通过；共享旅行资源 53 文件一致。修复版本替换误改时间常量的问题，核查两端无该类差异。角色调用、情侣空间权限和远控统一小鱼旅行，兼容旧称。远控使用当前 DOM 中心坐标，统一搜索只带入查询表单。旧攻略封面已替换，区域检查改为现存兼容选择页；国家与城市、定位失败与成功、账号隔离均通过。私人旅行资源加入跟踪白名单，防止后续遗漏。</w:t>
+      </w:r>
+    </w:p>
+    <w:p>
+      <w:r>
+        <w:t>2026-10-04 v1506网页／v1507私人源码：修复角色超大模拟钱包被旅行支付误判余额不足。原因是分金额转换后以Number.isSafeInteger校验整个余额，超过约90万亿元被拒绝；新增旧实现失败的火车票回归。共享十进制金额算法对大额使用字符串与BigInt计算，JSON中不存BigInt；普通余额仍为数值，兼容无BigInt环境使用有限数值退化。角色编辑保存保留大额十进制，六类角色订单扣款和退款保持原钱包／银行，拒绝真实不足、无效数值，不动用户账户或亲属卡。两端真实浏览器验证六服务×两资金源的扣款和全额返还，普通金额、授权聊天与生命周期继续回归。旧档已被Number舍入的末位无法凭空恢复。</w:t>
       </w:r>
     </w:p>
     <w:sectPr>

</xml_diff>

<commit_message>
fix(taxi): book role rides from explicit chat routes
</commit_message>
<xml_diff>
--- a/docs/maintenance/AI开发项目_Bug修改规范.docx
+++ b/docs/maintenance/AI开发项目_Bug修改规范.docx
@@ -11584,6 +11584,16 @@
     <ns0:p>
       <ns0:r>
         <ns0:t>2026-10-04 订单归属规则：不要通过删除底层订单来隐藏用户列表；canonical原始记录须保留供聊天卡、角色消费页面、账单、提醒读取。用户列表过滤须与原始rows分开。禁退必须同时覆盖显示与执行层。cid可能是同行角色，不能只凭cid推断付款归属。相同查询的幂等匹配应包含付款角色，防止角色和用户订单混用。私人源码跟随网页共享修复，保留各自入口和原生差异。</ns0:t>
+      </ns0:r>
+    </ns0:p>
+    <ns0:p>
+      <ns0:r>
+        <ns0:t>2026-10-04 微信叫车修复规则：模型说已完成不等于执行成功。不得用释放拦截候选替代真实订单执行；聊天路线必须逐字来自同账号同角色最近用户消息，不能猜测或借用GPS。缺信息应询问，失败应留系统事实，不能静默吞掉整轮而无原因。异步动作纠正后复核账号、回复有效性与最新用户信息。去重必须含付款人与角色身份，已执行聊天请求不能重放扣款。页面查询、正常聊天、缺地点、权限隔离、余额不足、订单与卡片均需两端行为验收。</ns0:t>
+      </ns0:r>
+    </ns0:p>
+    <ns0:p>
+      <ns0:r>
+        <ns0:t>2026-10-04 v1510／私人源码v1511最终本地检查：全量3066/3066通过、0失败；网页／私人正常授权聊天通过，页面错误0；微信叫车八场景与保存重开后原订单、卡片、角色扣款持久化通过。正式资源及缓存版本已对齐，原有换行现场和其他工作树保留。未提交、推送、部署或打包；真实模型、Mac/iPhone与本地DOCX排版渲染未验证。</ns0:t>
       </ns0:r>
     </ns0:p>
     <ns0:sectPr ns0:rsidR="00FC693F" ns0:rsidRPr="0006063C" ns0:rsidSect="00034616">

</xml_diff>

<commit_message>
fix(taxi): let roles choose simulated ride locations
</commit_message>
<xml_diff>
--- a/docs/maintenance/AI开发项目_Bug修改规范.docx
+++ b/docs/maintenance/AI开发项目_Bug修改规范.docx
@@ -11594,6 +11594,16 @@
     <ns0:p>
       <ns0:r>
         <ns0:t>2026-10-04 v1510／私人源码v1511最终本地检查：全量3066/3066通过、0失败；网页／私人正常授权聊天通过，页面错误0；微信叫车八场景与保存重开后原订单、卡片、角色扣款持久化通过。正式资源及缓存版本已对齐，原有换行现场和其他工作树保留。未提交、推送、部署或打包；真实模型、Mac/iPhone与本地DOCX排版渲染未验证。</ns0:t>
+      </ns0:r>
+    </ns0:p>
+    <ns0:p>
+      <ns0:r>
+        <ns0:t>2026-10-04 模拟与现实约束必须区分：小手机模拟出行允许角色自行选择地点，不能擅自把真实平台的准确地址前置条件套到模拟业务。只要本角色本账号当前聊天存在且角色输出有效叫车动作，就允许按角色选择的路线执行，不要求用户消息包含叫车关键词或目的地原文。用户明确取消、账号角色隔离、真实GPS共享、付款不足和重复扣款仍检查。旧简写补全失败不能仅继续询问用户地址；生成模拟路线后经过原订单与扣款执行器，不能伪造成功卡。</ns0:t>
+      </ns0:r>
+    </ns0:p>
+    <ns0:p>
+      <ns0:r>
+        <ns0:t>2026-10-04 v1512／v1513最终回归3068/3068通过、0失败；网页和私人正常授权聊天及12个模拟叫车浏览器场景通过，页面错误0、订单卡保存重开通过。网页推送及部署结果以本轮Git和线上文件核对为准，未制作私人覆盖包。</ns0:t>
       </ns0:r>
     </ns0:p>
     <ns0:sectPr ns0:rsidR="00FC693F" ns0:rsidRPr="0006063C" ns0:rsidSect="00034616">

</xml_diff>

<commit_message>
fix(hotel): show readable full-page order details
</commit_message>
<xml_diff>
--- a/docs/maintenance/AI开发项目_Bug修改规范.docx
+++ b/docs/maintenance/AI开发项目_Bug修改规范.docx
@@ -11604,6 +11604,11 @@
     <ns0:p>
       <ns0:r>
         <ns0:t>2026-10-04 v1512／v1513最终回归3068/3068通过、0失败；网页和私人正常授权聊天及12个模拟叫车浏览器场景通过，页面错误0、订单卡保存重开通过。网页推送及部署结果以本轮Git和线上文件核对为准，未制作私人覆盖包。</ns0:t>
+      </ns0:r>
+    </ns0:p>
+    <ns0:p>
+      <ns0:r>
+        <ns0:t>2026-10-04 网页v1514／私人源码v1515：用户指出酒店订单详情标题过浅、弹窗不全屏、橙色与字号过大。根因为cth-dialog继承通用深色弹窗标题及p b橙色19px规则。改为酒店模块独立全屏详情，17px深色标题、14px深色订单值、13px标签，独立滚动，返回原聊天或酒店订单列表。原订单事实、账号与到期校验、用户退订及角色订单只读保持。旧浏览器检查失败，修改后两端320/430宽度全屏、颜色字号、无横向溢出、聊天返回、用户退订入口、角色只读及跨账号隐藏检查通过，订单数据未变化。全量3069/3069通过，授权正常聊天与页面错误0检查通过。未做Mac/iPhone及DOCX排版渲染；网页部署看本轮Git及线上核对，不制作私人包。</ns0:t>
       </ns0:r>
     </ns0:p>
     <ns0:sectPr ns0:rsidR="00FC693F" ns0:rsidRPr="0006063C" ns0:rsidSect="00034616">

</xml_diff>

<commit_message>
fix(travel): simplify simulated bookings and clean white dialogs
</commit_message>
<xml_diff>
--- a/docs/maintenance/AI开发项目_Bug修改规范.docx
+++ b/docs/maintenance/AI开发项目_Bug修改规范.docx
@@ -11609,6 +11609,11 @@
     <ns0:p>
       <ns0:r>
         <ns0:t>2026-10-04 网页v1514／私人源码v1515：用户指出酒店订单详情标题过浅、弹窗不全屏、橙色与字号过大。根因为cth-dialog继承通用深色弹窗标题及p b橙色19px规则。改为酒店模块独立全屏详情，17px深色标题、14px深色订单值、13px标签，独立滚动，返回原聊天或酒店订单列表。原订单事实、账号与到期校验、用户退订及角色订单只读保持。旧浏览器检查失败，修改后两端320/430宽度全屏、颜色字号、无横向溢出、聊天返回、用户退订入口、角色只读及跨账号隐藏检查通过，订单数据未变化。全量3069/3069通过，授权正常聊天与页面错误0检查通过。未做Mac/iPhone及DOCX排版渲染；网页部署看本轮Git及线上核对，不制作私人包。</ns0:t>
+      </ns0:r>
+    </ns0:p>
+    <ns0:p>
+      <ns0:r>
+        <ns0:t>2026-10-04 网页v1516／私人源码v1517：小鱼旅行全部白色弹窗去除外层灰色玻璃包边，标题加深并将日期等输入统一border-box限制在父容器内；酒店详情保留上一版全屏。全季等56个大众品牌在国内、海外及自定义城市均可生成明确标识的模拟分店，品牌优先于冲突的星级过滤；保留手动查询原有日期规则（用户明确撤回修改）。角色代办酒店、机票、火车票、演唱会及景点门票可自主补齐城市、品牌、房型/舱位、同行等偏好，支持今天/明天，缺省一晚；酒店支持自定义模拟名称。只改模拟旅行，真实外卖及真实支付不在范围。保留角色独立付款、账户隔离、退款权限、重复下单幂等及失败不宣称成功。测试：56品牌×3城市；两端320/430宽度共112弹窗检查，20次省略参数的真实页面订单生成且用户钱包未动，授权查手机正常聊天双端矩阵通过。全量结果见本轮日志，私人未打包、未Mac/iPhone验证，模型HTTP与角色自主决定尚未实机验证。失败记录：发现品牌父名称重叠筛选问题，修为最长命中；未知酒店旧失败预期依用户新要求改为允许模拟订单。Word仅结构与历史保留校验，本机无LibreOffice，未声称版面渲染通过。新聊天启动说明评估无新通用入口变化，保持不动。</ns0:t>
       </ns0:r>
     </ns0:p>
     <ns0:sectPr ns0:rsidR="00FC693F" ns0:rsidRPr="0006063C" ns0:rsidSect="00034616">

</xml_diff>

<commit_message>
fix(travel): restore inner spacing in transport and concert dialogs
</commit_message>
<xml_diff>
--- a/docs/maintenance/AI开发项目_Bug修改规范.docx
+++ b/docs/maintenance/AI开发项目_Bug修改规范.docx
@@ -11614,6 +11614,11 @@
     <ns0:p>
       <ns0:r>
         <ns0:t>2026-10-04 网页v1516／私人源码v1517：小鱼旅行全部白色弹窗去除外层灰色玻璃包边，标题加深并将日期等输入统一border-box限制在父容器内；酒店详情保留上一版全屏。全季等56个大众品牌在国内、海外及自定义城市均可生成明确标识的模拟分店，品牌优先于冲突的星级过滤；保留手动查询原有日期规则（用户明确撤回修改）。角色代办酒店、机票、火车票、演唱会及景点门票可自主补齐城市、品牌、房型/舱位、同行等偏好，支持今天/明天，缺省一晚；酒店支持自定义模拟名称。只改模拟旅行，真实外卖及真实支付不在范围。保留角色独立付款、账户隔离、退款权限、重复下单幂等及失败不宣称成功。测试：56品牌×3城市；两端320/430宽度共112弹窗检查，20次省略参数的真实页面订单生成且用户钱包未动，授权查手机正常聊天双端矩阵通过。全量结果见本轮日志，私人未打包、未Mac/iPhone验证，模型HTTP与角色自主决定尚未实机验证。失败记录：发现品牌父名称重叠筛选问题，修为最长命中；未知酒店旧失败预期依用户新要求改为允许模拟订单。Word仅结构与历史保留校验，本机无LibreOffice，未声称版面渲染通过。新聊天启动说明评估无新通用入口变化，保持不动。</ns0:t>
+      </ns0:r>
+    </ns0:p>
+    <ns0:p>
+      <ns0:r>
+        <ns0:t>2026-10-04 网页v1518／私人源码v1519：修复机票、火车票、演唱会白色弹窗内容贴边、间距拥挤。事实：上一版去掉外层sheet内边距，但ctf/ctn-dialog没有自身padding，而酒店原有20px；演唱会复用ctf-dialog，因此同受影响。方案：仅ctf/ctn白色内容容器加20px内边距，标题16px下间距、同行方式可换行、角色行40px最小高度，按钮至少44px并留白。灰色包边仍去除，酒店、攻略保持现状，未改查询/角色/订单/余额规则。检查：网页和私人源码320/430宽度共112弹窗，无横向溢出，三类弹窗标题与两侧按钮距面板边缘20px；真实页面五类省略参数订单生成且用户钱包不变仍通过。图片人工核对机票同行人员面板通过，Windows浏览器不能替代真实iPhone验证。全量回归见travel-v1518-final.log；Word结构与原历史段落保留校验，无LibreOffice版面渲染能力。工程规则：移除外层灰色包边时必须分别验证有无内部padding，不能仅检验边框和overflow。本次新聊天启动说明无需改变。</ns0:t>
       </ns0:r>
     </ns0:p>
     <ns0:sectPr ns0:rsidR="00FC693F" ns0:rsidRPr="0006063C" ns0:rsidSect="00034616">

</xml_diff>

<commit_message>
feat(travel): add wallet role and family-card payment choices
</commit_message>
<xml_diff>
--- a/docs/maintenance/AI开发项目_Bug修改规范.docx
+++ b/docs/maintenance/AI开发项目_Bug修改规范.docx
@@ -11619,6 +11619,11 @@
     <ns0:p>
       <ns0:r>
         <ns0:t>2026-10-04 网页v1518／私人源码v1519：修复机票、火车票、演唱会白色弹窗内容贴边、间距拥挤。事实：上一版去掉外层sheet内边距，但ctf/ctn-dialog没有自身padding，而酒店原有20px；演唱会复用ctf-dialog，因此同受影响。方案：仅ctf/ctn白色内容容器加20px内边距，标题16px下间距、同行方式可换行、角色行40px最小高度，按钮至少44px并留白。灰色包边仍去除，酒店、攻略保持现状，未改查询/角色/订单/余额规则。检查：网页和私人源码320/430宽度共112弹窗，无横向溢出，三类弹窗标题与两侧按钮距面板边缘20px；真实页面五类省略参数订单生成且用户钱包不变仍通过。图片人工核对机票同行人员面板通过，Windows浏览器不能替代真实iPhone验证。全量回归见travel-v1518-final.log；Word结构与原历史段落保留校验，无LibreOffice版面渲染能力。工程规则：移除外层灰色包边时必须分别验证有无内部padding，不能仅检验边框和overflow。本次新聊天启动说明无需改变。</ns0:t>
+      </ns0:r>
+    </ns0:p>
+    <ns0:p>
+      <ns0:r>
+        <ns0:t>2026-10-04 网页v1520／私人源码v1521：酒店、攻略景点门票、机票、火车票、演唱会查询预订统一白底蓝黑文字付款方式弹窗。补齐我的模拟钱包、请角色代付、亲属卡三种支付；代付请求持久化到当前账号，真实回复代付成功指令才完成对应报价订单并从角色原钱包/银行扣款，拒绝或余额不足不生成成功卡；亲属卡沿用冻结及月额度规则，不扣用户钱包。旅行代付请求、代付成功、亲属卡已付款卡均为白底，其他购物/外卖卡保持旧行为；旅行标签不误发商城包裹。退款按原角色资金来源/原月卡额度返回，用户发起代付订单与角色自主订的受保护订单区分，原角色自主订单退款权限不变。测试：双端5服务×3付款方式=30真实页面创建及原路退款，10次实际aiReply代付解析，仅模型HTTP为模拟；防重放、拒付、冻结、月额度、跨月退款、原银行来源、账号切换和重开持久化7项针对性通过；全量与授权聊天记录见travel-payment-final/core日志。截图在推送前展示15种付款弹窗与付款卡片（choice/role/family五类对照），真实iPhone未验证，私人仅源码未打包。失败：第一次浏览器自购机票因测试钱包520不足1420正确拦截，测试补足余额；永久守卫旧tvHotelBook(i)签名更新为支付参数新签名，功能保留。Word追加历史结构校验，无法本机渲染。新聊天启动说明无需修改。</ns0:t>
       </ns0:r>
     </ns0:p>
     <ns0:sectPr ns0:rsidR="00FC693F" ns0:rsidRPr="0006063C" ns0:rsidSect="00034616">

</xml_diff>

<commit_message>
fix: show current character remarks on travel payment cards
</commit_message>
<xml_diff>
--- a/docs/maintenance/AI开发项目_Bug修改规范.docx
+++ b/docs/maintenance/AI开发项目_Bug修改规范.docx
@@ -11624,6 +11624,21 @@
     <ns0:p>
       <ns0:r>
         <ns0:t>2026-10-04 网页v1520／私人源码v1521：酒店、攻略景点门票、机票、火车票、演唱会查询预订统一白底蓝黑文字付款方式弹窗。补齐我的模拟钱包、请角色代付、亲属卡三种支付；代付请求持久化到当前账号，真实回复代付成功指令才完成对应报价订单并从角色原钱包/银行扣款，拒绝或余额不足不生成成功卡；亲属卡沿用冻结及月额度规则，不扣用户钱包。旅行代付请求、代付成功、亲属卡已付款卡均为白底，其他购物/外卖卡保持旧行为；旅行标签不误发商城包裹。退款按原角色资金来源/原月卡额度返回，用户发起代付订单与角色自主订的受保护订单区分，原角色自主订单退款权限不变。测试：双端5服务×3付款方式=30真实页面创建及原路退款，10次实际aiReply代付解析，仅模型HTTP为模拟；防重放、拒付、冻结、月额度、跨月退款、原银行来源、账号切换和重开持久化7项针对性通过；全量与授权聊天记录见travel-payment-final/core日志。截图在推送前展示15种付款弹窗与付款卡片（choice/role/family五类对照），真实iPhone未验证，私人仅源码未打包。失败：第一次浏览器自购机票因测试钱包520不足1420正确拦截，测试补足余额；永久守卫旧tvHotelBook(i)签名更新为支付参数新签名，功能保留。Word追加历史结构校验，无法本机渲染。新聊天启动说明无需修改。</ns0:t>
+      </ns0:r>
+    </ns0:p>
+    <ns0:p>
+      <ns0:r>
+        <ns0:t>2026-10-04 · 网页v1522 / 私人源码v1523 · 旅行付款卡片备注名修复</ns0:t>
+      </ns0:r>
+    </ns0:p>
+    <ns0:p>
+      <ns0:r>
+        <ns0:t>原因：付款成功卡片标题硬编码“角色代付成功”，未读取角色备注。修复：五类旅行付款统一优先当前备注，空备注回退原名，缺失付款方显示原付款方；代付成功、待回复、拒绝、亲属卡已付款和订单付款方显示实际称呼。动态标题经HTML转义。资金扣款、审批和原路退款规则保留。补充备注修改、原名回退、删除付款方、HTML字符及拒绝状态回归；网页和私人源码同步，私人未打包，未进行iPhone验证。</ns0:t>
+      </ns0:r>
+    </ns0:p>
+    <ns0:p>
+      <ns0:r>
+        <ns0:t>验证结果：3090/3090 Node测试通过；五类服务×三种付款方式×网页及私人源码，共30个实际浏览器预订与原路退款用例通过，无页面异常。授权聊天实际构建与回复投递回归通过。五类成功卡片分别使用先生、哥哥、助理、妈咪、罗拉备注。</ns0:t>
       </ns0:r>
     </ns0:p>
     <ns0:sectPr ns0:rsidR="00FC693F" ns0:rsidRPr="0006063C" ns0:rsidSect="00034616">

</xml_diff>

<commit_message>
fix(private): inherit all travel features and prepare v1525 iOS437 overlay
</commit_message>
<xml_diff>
--- a/docs/maintenance/AI开发项目_Bug修改规范.docx
+++ b/docs/maintenance/AI开发项目_Bug修改规范.docx
@@ -11639,6 +11639,16 @@
     <ns0:p>
       <ns0:r>
         <ns0:t>验证结果：3090/3090 Node测试通过；五类服务×三种付款方式×网页及私人源码，共30个实际浏览器预订与原路退款用例通过，无页面异常。授权聊天实际构建与回复投递回归通过。五类成功卡片分别使用先生、哥哥、助理、妈咪、罗拉备注。</ns0:t>
+      </ns0:r>
+    </ns0:p>
+    <ns0:p>
+      <ns0:r>
+        <ns0:t>2026-10-04 私人v1525／iOS437／桥42覆盖包：用户要求每次私人更新交付完整覆盖工程包，不再只同步源码。完整继承v1433包及网页v1522的小鱼旅行六服务、角色原始订单、模拟自主预订、常见酒店品牌、白色弹窗、全屏酒店详情、五类钱包/代付/亲属卡支付、当前备注名、角色粉色余额与灰色支出分离。私人代付成功/拒绝分支由pending改为currentRequest，回归先在旧源码失败再通过；旧资源清单补齐47项当前入口依赖和旅行图片，旧重建脚本拒绝擦写正式私人bundle。保留原Team/Bundle ID/签名/桥42和手机数据，只递增工程及诊断build到437。当前Mac源码包未进行Mac编译、签名或真实iPhone验证。提交后从Git读取工程，包内SOURCE_STATE与哈希、解压逐文件验证，继承旧包文件无缺项。网页代码保持v1522。</ns0:t>
+      </ns0:r>
+    </ns0:p>
+    <ns0:p>
+      <ns0:r>
+        <ns0:t>本轮最终验证：3095/3095主测试通过；私人实际入口5服务×3付款方式共15个创建与原路退款场景通过，页面异常0；网页/私人已有授权状态的正常聊天、自动查手机、状态保存与重开回归通过。HTTP模型回复为模拟；原生仅版本标记递增，桥契约仍42；Mac/Xcode与iPhone未验证。包内逐文件及旧v1433完整继承检查由打包脚本强制执行。</ns0:t>
       </ns0:r>
     </ns0:p>
     <ns0:sectPr ns0:rsidR="00FC693F" ns0:rsidRPr="0006063C" ns0:rsidSect="00034616">

</xml_diff>

<commit_message>
fix(travel): display actual payer remarks on every order card and detail
</commit_message>
<xml_diff>
--- a/docs/maintenance/AI开发项目_Bug修改规范.docx
+++ b/docs/maintenance/AI开发项目_Bug修改规范.docx
@@ -11649,6 +11649,11 @@
     <ns0:p>
       <ns0:r>
         <ns0:t>本轮最终验证：3095/3095主测试通过；私人实际入口5服务×3付款方式共15个创建与原路退款场景通过，页面异常0；网页/私人已有授权状态的正常聊天、自动查手机、状态保存与重开回归通过。HTTP模型回复为模拟；原生仅版本标记递增，桥契约仍42；Mac/Xcode与iPhone未验证。包内逐文件及旧v1433完整继承检查由打包脚本强制执行。</ns0:t>
+      </ns0:r>
+    </ns0:p>
+    <ns0:p>
+      <ns0:r>
+        <ns0:t>2026-10-04 网页v1526／私人源码v1527：用户截图中的角色直接预订订单仍硬编码角色付款/角色自己的银行付款。统一六类旅行卡片、详情、行程摘要的付款说明，按fundingRoleId优先、原角色付款cid回退读取实际付款人，优先当前备注、空备注回退昵称；缺少付款人显示原付款方，不使用同行或入住人冒充付款人。保留代付/亲属卡来源区别，动态HTML文字转义，资金、订单归属与退款权限不变。酒店主app仅改一处卡片渲染，两端私人专用逻辑保留。用户最新要求修改后直接推送、先不打包，私人仅源码同步；上次v1525/iOS437覆盖包保留。回归旧五类实际卡片复现固定词语失败，新双端六类卡片、详情、修改备注与HTML字符通过，核心授权正常聊天通过；全量以payer-names-final-full日志为准。Mac/iPhone未验证。新聊天启动说明评估无通用入口变化，保持不变。</ns0:t>
       </ns0:r>
     </ns0:p>
     <ns0:sectPr ns0:rsidR="00FC693F" ns0:rsidRPr="0006063C" ns0:rsidSect="00034616">

</xml_diff>

<commit_message>
fix(chat): clarify transport diagnostics and stop retries after hangup
</commit_message>
<xml_diff>
--- a/docs/maintenance/AI开发项目_Bug修改规范.docx
+++ b/docs/maintenance/AI开发项目_Bug修改规范.docx
@@ -11654,6 +11654,21 @@
     <ns0:p>
       <ns0:r>
         <ns0:t>2026-10-04 网页v1526／私人源码v1527：用户截图中的角色直接预订订单仍硬编码角色付款/角色自己的银行付款。统一六类旅行卡片、详情、行程摘要的付款说明，按fundingRoleId优先、原角色付款cid回退读取实际付款人，优先当前备注、空备注回退昵称；缺少付款人显示原付款方，不使用同行或入住人冒充付款人。保留代付/亲属卡来源区别，动态HTML文字转义，资金、订单归属与退款权限不变。酒店主app仅改一处卡片渲染，两端私人专用逻辑保留。用户最新要求修改后直接推送、先不打包，私人仅源码同步；上次v1525/iOS437覆盖包保留。回归旧五类实际卡片复现固定词语失败，新双端六类卡片、详情、修改备注与HTML字符通过，核心授权正常聊天通过；全量以payer-names-final-full日志为准。Mac/iPhone未验证。新聊天启动说明评估无通用入口变化，保持不变。</ns0:t>
+      </ns0:r>
+    </ns0:p>
+    <ns0:p>
+      <ns0:r>
+        <ns0:t>2026-10-04 网页v1528／私人源码v1529：电话微信故障证据与挂断重试边界</ns0:t>
+      </ns0:r>
+    </ns0:p>
+    <ns0:p>
+      <ns0:r>
+        <ns0:t>禁止把通用网络异常确定归因于图片排队、密钥或余额。原始错误与解释分离，计时器超时与一般AbortError分开；每次有限重试前检查原会话，挂断/换会话不能继续请求。改版本时核对shell严格检查、缓存和断言，不全局替换业务数字。</ns0:t>
+      </ns0:r>
+    </ns0:p>
+    <ns0:p>
+      <ns0:r>
+        <ns0:t>新8项回归在0b867b97旧实现失败、新实现通过。全量3110/3110；两端正式入口正常授权聊天、存档/权限/账号隔离、自动查手机通过。实际Edge与真实fetch、受控上游验证掉线恢复、挂断停止、401不重试、诊断UI隐私和无页面异常。日志 .codex_tmp/call-evidence-full.log、call-evidence-chat-gate.log、call-evidence-browser.log。版本相关旧断言同步递增；通话续写测试改定位callAI的实际_md，不弱化断言。严格shell首行标记同步对齐1528/1529。用户只授权网页发布；私人源码同步不打包，iOS437/桥42不变。未进行真实上游故障复现或Mac/iPhone验收。</ns0:t>
       </ns0:r>
     </ns0:p>
     <ns0:sectPr ns0:rsidR="00FC693F" ns0:rsidRPr="0006063C" ns0:rsidSect="00034616">

</xml_diff>

<commit_message>
feat(mail): redesign inbox and compose with linked replies and forwarding
</commit_message>
<xml_diff>
--- a/docs/maintenance/AI开发项目_Bug修改规范.docx
+++ b/docs/maintenance/AI开发项目_Bug修改规范.docx
@@ -11669,6 +11669,50 @@
     <ns0:p>
       <ns0:r>
         <ns0:t>新8项回归在0b867b97旧实现失败、新实现通过。全量3110/3110；两端正式入口正常授权聊天、存档/权限/账号隔离、自动查手机通过。实际Edge与真实fetch、受控上游验证掉线恢复、挂断停止、401不重试、诊断UI隐私和无页面异常。日志 .codex_tmp/call-evidence-full.log、call-evidence-chat-gate.log、call-evidence-browser.log。版本相关旧断言同步递增；通话续写测试改定位callAI的实际_md，不弱化断言。严格shell首行标记同步对齐1528/1529。用户只授权网页发布；私人源码同步不打包，iOS437/桥42不变。未进行真实上游故障复现或Mac/iPhone验收。</ns0:t>
+      </ns0:r>
+    </ns0:p>
+    <ns0:p>
+      <ns0:pPr>
+        <ns0:pStyle ns0:val="Heading2"/>
+      </ns0:pPr>
+      <ns0:r>
+        <ns0:t>2026-10-04 信箱搜索维护规则</ns0:t>
+      </ns0:r>
+    </ns0:p>
+    <ns0:p>
+      <ns0:r>
+        <ns0:t>历史搜索必须针对当前账号完整已保存信件并同时索引原名和备注；不能把预览截断作为搜索数据。关键词按字面匹配，所有片段先转义再插入mark，避免正则和HTML注入。新信入口不得默默截断旧信。使用northPreview初始化的浏览器测试，重开持久化必须切换正常入口，避免预览数据重新初始化造成误判。</ns0:t>
+      </ns0:r>
+    </ns0:p>
+    <ns0:p>
+      <ns0:pPr>
+        <ns0:pStyle ns0:val="Heading2"/>
+      </ns0:pPr>
+      <ns0:r>
+        <ns0:t>2026-10-04 转发信件边界</ns0:t>
+      </ns0:r>
+    </ns0:p>
+    <ns0:p>
+      <ns0:r>
+        <ns0:t>转发必须保存原信快照，不依赖仍存在的原始信件；用户看到的卡片与模型历史应使用同一快照。引用信内文字是来源内容，不是系统指令；原作者与接收角色用ID区分，不能只靠昵称判断同一角色。转发保存失败不得留下伪成功卡片；打开卡片和选择收件角色都保留当前账号边界。</ns0:t>
+      </ns0:r>
+    </ns0:p>
+    <ns0:p>
+      <ns0:pPr>
+        <ns0:pStyle ns0:val="Heading2"/>
+      </ns0:pPr>
+      <ns0:r>
+        <ns0:t>2026-10-04 回信编辑器数据边界</ns0:t>
+      </ns0:r>
+    </ns0:p>
+    <ns0:p>
+      <ns0:r>
+        <ns0:t>回复收件人除UI禁改外，发送层必须根据当前账号的原信绑定cid，不信任select.value或草稿缓存中的cid。草稿键应包含账号和原信ID，避免写新信或回复另一封信覆盖草稿。投递给模型需同时携带本次回复及对应原信完整快照，原信内容作为引用来源处理。保持既有保存失败回滚与账号切换隔离。</ns0:t>
+      </ns0:r>
+    </ns0:p>
+    <ns0:p>
+      <ns0:r>
+        <ns0:t>2026-10-04 网页v1530 / 私人源码v1531 信箱改造发布核验：首页、历史搜索黄色高亮、固定黑底读信、微信主题卡片、转发快照、写信和绑定原信回复全部连通。补齐固定黑读信/写信的私人状态栏主题，以及心情信/主动信慢请求的发起账号绑定，导入替换存档时丢弃旧请求结果。全量3111/3111通过，两端历史/转发/回复/账号切换/正常授权聊天实浏览器通过。模型HTTP是测试桩，未验证真实模型和iPhone。私人仅源码同步、不打包。推送和线上部署结果以最终Git及远程字节核验为准。</ns0:t>
       </ns0:r>
     </ns0:p>
     <ns0:sectPr ns0:rsidR="00FC693F" ns0:rsidRPr="0006063C" ns0:rsidSect="00034616">

</xml_diff>

<commit_message>
fix(mail): align action icons and purchase sender avatars with inbox back navigation
</commit_message>
<xml_diff>
--- a/docs/maintenance/AI开发项目_Bug修改规范.docx
+++ b/docs/maintenance/AI开发项目_Bug修改规范.docx
@@ -11713,6 +11713,24 @@
     <ns0:p>
       <ns0:r>
         <ns0:t>2026-10-04 网页v1530 / 私人源码v1531 信箱改造发布核验：首页、历史搜索黄色高亮、固定黑底读信、微信主题卡片、转发快照、写信和绑定原信回复全部连通。补齐固定黑读信/写信的私人状态栏主题，以及心情信/主动信慢请求的发起账号绑定，导入替换存档时丢弃旧请求结果。全量3111/3111通过，两端历史/转发/回复/账号切换/正常授权聊天实浏览器通过。模型HTTP是测试桩，未验证真实模型和iPhone。私人仅源码同步、不打包。推送和线上部署结果以最终Git及远程字节核验为准。</ns0:t>
+      </ns0:r>
+    </ns0:p>
+    <ns0:p>
+      <ns0:pPr>
+        <ns0:pStyle ns0:val="Heading2"/>
+      </ns0:pPr>
+      <ns0:r>
+        <ns0:t>2026-10-04 头像归属和UI图标规则</ns0:t>
+      </ns0:r>
+    </ns0:p>
+    <ns0:p>
+      <ns0:r>
+        <ns0:t>购买到货通知不能仅凭cid判断发件头像，要依据明确kind=self/gift/pay；自购优先用户头像，角色礼物或代付用对应角色头像，历史兼容推断限于明确自购记录。SVG固定图形用于必须还原的回复/转发图标，避免Unicode/emoji的跨平台变化。身份改变需同时核对列表、详情、搜索和转发快照。</ns0:t>
+      </ns0:r>
+    </ns0:p>
+    <ns0:p>
+      <ns0:r>
+        <ns0:t>2026-10-04 网页v1532 / 私人源码v1533：回复转发SVG箭头、购买通知按购买方显示头像/名字、信箱主页圆形返回按钮和搜索栏右移。仅发布共享源码，不打包；验证结果及部署状态以当前日志和Git/线上核对为准。</ns0:t>
       </ns0:r>
     </ns0:p>
     <ns0:sectPr ns0:rsidR="00FC693F" ns0:rsidRPr="0006063C" ns0:rsidSect="00034616">

</xml_diff>

<commit_message>
fix: repair pet memory and family-card lists with compact blue permission card (web v1538)
</commit_message>
<xml_diff>
--- a/docs/maintenance/AI开发项目_Bug修改规范.docx
+++ b/docs/maintenance/AI开发项目_Bug修改规范.docx
@@ -11731,6 +11731,21 @@
     <ns0:p>
       <ns0:r>
         <ns0:t>2026-10-04 网页v1532 / 私人源码v1533：回复转发SVG箭头、购买通知按购买方显示头像/名字、信箱主页圆形返回按钮和搜索栏右移。仅发布共享源码，不打包；验证结果及部署状态以当前日志和Git/线上核对为准。</ns0:t>
+      </ns0:r>
+    </ns0:p>
+    <ns0:p>
+      <ns0:r>
+        <ns0:t>2026-10-04 网页v1534 / 私人源码v1535（未推送、未打包）：四项修复。桌宠漏写分隔符也解析、执行后不显示，绑定角色权限保留；控制标记不入长期记忆，历史纯标记定向清理。偷登微信旧代码写死忆北改为玩家资料姓名，只修复带固定系统记录前缀的历史文本，不替换真实人物名字。角色银行不显示撤回/婉拒卡，账目退款和历史消费保留。私聊/角色群聊转发与删除分开，转发绿色，私聊文件与独立垃圾桶入口互换；展开面板隐藏遮挡标签的浮动回复按钮。双端本地浏览器验证及六张截图；模型输出采用测试数据，Mac/iPhone和真实模型未验证。</ns0:t>
+      </ns0:r>
+    </ns0:p>
+    <ns0:p>
+      <ns0:r>
+        <ns0:t>版本号更新必须限定完整版本标记/URL参数，不可全文件无边界替换数字子串。本轮1536→1538曾误改测试的31536000年度cookie常量，私人1535→1539曾误改登录页#c61535色值；均已还原并重新通过3121/3121。版本更新必须复核非版本数字和色值，避免样式任务波及其它页面。</ns0:t>
+      </ns0:r>
+    </ns0:p>
+    <ns0:p>
+      <ns0:r>
+        <ns0:t>2026-10-04 发布核验追加：网页v1538 / 私人资源v1539。桌宠控制格式、限定来源的记忆修复、银行撤回卡过滤、独立多选删除及绿色转发、半高蓝色授权卡完成。全量3121/3121通过，两端正常授权聊天及专项浏览器截图通过。提交前发现版本替换误改1024x1536、1536x1024图片尺寸，已恢复原值并重新全测；未改变生图功能。用户已授权本轮网页推送，私人资源同步但不打包；部署结果另行核实。</ns0:t>
       </ns0:r>
     </ns0:p>
     <ns0:sectPr ns0:rsidR="00FC693F" ns0:rsidRPr="0006063C" ns0:rsidSect="00034616">

</xml_diff>

<commit_message>
feat: swap game entries and refine glass icon rims (web v1542)
Move girl and pet into home, icon customization and independent couple controls; retain saved games and historical invitations. Update first-run beauty images with permanent custom-icon protection, remove the line theme, and apply hollow white glass highlights. Synchronize private resources v1543 without packaging. Validated 3132 tests and authorized normal chat in both runtimes.
</commit_message>
<xml_diff>
--- a/docs/maintenance/AI开发项目_Bug修改规范.docx
+++ b/docs/maintenance/AI开发项目_Bug修改规范.docx
@@ -11746,6 +11746,25 @@
     <ns0:p>
       <ns0:r>
         <ns0:t>2026-10-04 发布核验追加：网页v1538 / 私人资源v1539。桌宠控制格式、限定来源的记忆修复、银行撤回卡过滤、独立多选删除及绿色转发、半高蓝色授权卡完成。全量3121/3121通过，两端正常授权聊天及专项浏览器截图通过。提交前发现版本替换误改1024x1536、1536x1024图片尺寸，已恢复原值并重新全测；未改变生图功能。用户已授权本轮网页推送，私人资源同步但不打包；部署结果另行核实。</ns0:t>
+      </ns0:r>
+    </ns0:p>
+    <ns0:p>
+      <ns0:r>
+        <ns0:t>2026-10-04 用户长期维护规则追加：每次新聊天读取精简交接；每次修复后安全清理，默认禁止新增工作树、副本、临时/备份目录或重复版本文件，优先复用已有文件，必须新增时取得明确同意。不得覆盖独有内容、清理未合并工作或为消除Git状态执行reset/stash/广泛clean。保留必要证据一份，复用现有记录；删除核对内容与边界，工作树用Git正式移除。审批拒绝或用途不明确时如实记录保留原因。网页v1538/121d3be5已推送部署，18个线上文件逐字节核对通过；私人v1539尚未打包。本轮目录/文件堆积源于历次任务未收尾，现已删除20重复包、5缓存、空日志及两个结束工作树，临时整目录删除被审批阻止，继续保留。</ns0:t>
+      </ns0:r>
+    </ns0:p>
+    <ns0:p>
+      <ns0:r>
+        <ns0:t>2026-10-04 本地预览追加：用户要求规则怪谈、惊悚抉择进入游戏大厅，像素少女/电子宠物换到原主屏位置，清理空间、角色锁定、图标美化同步调整；本阶段明确先生成图预览，不替换入口。内置imagegen分别生成两款各黑/粉/灰/蓝8张候选图，使用原assets/app-icons/glass各主题games.webp参考，灰色少女边缘杂线已单独修正；最终对照截图.codex_tmp/game-icons-preview.png，单张图仅保存在Codex生成目录，未写入正式assets。随后用户明确要求彻底删除线条主题：网页/私人app.js已移除选择按钮与配色函数，旧line/无效值回退black，加载、完整备份恢复走normalizeLoadedState，美化包导入也规范化主题；自定义图标和既有游戏存档保留。既有MICO是图标加载失败时的通用fallback及其他界面SVG，不属于可选择线条主题，不删除它。旧HEAD解析实际复现line仍可选，候选双端真实浏览器验证四主题切换、旧存档与美化包迁移通过，正常授权聊天通过，全量3124/3124。初次浏览器检查误进设置总入口，改为appearance实际外观页后通过。源码标记仍是已发布1538/私人1539；本次未提交、未推送、未打包，线上仍是121d3be5。复用当前工作树、已有测试文件及临时目录，日志/截图使用固定路径覆盖，无新工作树或一次性脚本文件。</ns0:t>
+      </ns0:r>
+    </ns0:p>
+    <ns0:p>
+      <ns0:r>
+        <ns0:t>2026-10-04 本地候选网页v1540 / 私人源码v1541（用户授权正式互换，暂不推送）：主屏像素少女/pet独立入口替换原tale/dread位置；旧布局、Dock和参考槽位按键迁移，游戏存档、旧自定义图标记录不删除；游戏大厅前两个改为规则怪谈/惊悚抉择，原玩法保持。图标美化、情侣空间软件授权/时长/查看与名称解析同步，像素少女/电子宠物可分别上传、角色分别锁定和解锁，直接打开函数也校验锁定。四主题复用现有tale/dread资源路径，256px显示资产8张共445962字节，原生成图保留。首次默认美化包只更新两张用户提供的原JPEG为pixelhome/pet，默认包仍仅初次空白存档适用；成功自定义图标后永久跳过自动美化。真实浏览器复现下载中换图标又复位会被套包的竞态，已在下载后再次检查永久标记，两端首次/二次开机、竞态与重开验证全部通过。双端真实上传、实际applyControlTags授权/拒绝未授权/独立锁解锁通过；情侣空间专项67项、最终全量3131/3131及双端正常授权聊天通过。不是实际模型、Mac编译或iPhone真机验证。截图复用.codex_tmp：game-icons-default-home.png、game-icons-custom-editor.png、game-icons-couple-control.png、game-hall-replacement-preview.png。前期自动下载延迟测试误等待load导致超时，改waitUntil commit后复现并修复竞态，失败与成功记录同存theme-browser.log。当前HEAD仍121d3be5，线上仍v1538，已有安装包未更新；不提交、不推送、不打包。没有新增工作树或一次性脚本，清理本轮make_default_beauty_pack编译缓存，保留必要截图与测试记录。 补验：历史像素少女/电子宠物邀请保留兼容，新怪谈/抉择进入专属玩法；四主题正式资源两端加载正常。</ns0:t>
+        <ns0:br/>
+        <ns0:t>2026-10-04 本地追加（暂不推送）：主屏与Dock全部软件图标去掉容器边框和自定义图标深色底缝，按《液态玻璃_磨砂加细高光_做法.md》使用0.8px镂空白色渐变高光，140度明暗变化，亮度1.72/饱和度1.68，描边不模糊且不拦截点击；保留图片本身、品牌/宠物内部黑色轮廓。网页/私人glass-theme.css相同图标规则，保留各自其他样式差异。双端默认美化及黑/粉/灰/蓝5种状态实际浏览器检查全部图标和Dock通过（网页24/私人25个），全量3131/3131通过；iMessage原玻璃规则未改。截图复用现有game-icons-default-home.png及game-icons-{black,pink,gray,blue}-home.png；未创建工作树或一次性脚本，未提交、推送、打包。候选仍v1540/v1541，正式发布前再分配新版本标记。</ns0:t>
+        <ns0:br/>
+        <ns0:t>2026-10-04 用户授权先推送。本轮网页发布v1542，私人共享源码v1543（iOS仍438，未打包）：正式互换主屏/游戏大厅入口，保留存档与历史邀请，像素少女/电子宠物独立图标和管控；两张首次美化原图及自定义图标永久跳过保护；移除线条主题；主屏/Dock镂空白色玻璃细高光。正式版本全部入口与缓存标记已核对，共享资源及8张图标两端逐字节一致；双端正常授权聊天含存档/输出模式/自动查手机/重开通过，无页面错误，全量3132/3132通过。没有Mac/iPhone或真实模型验证；推送与部署结果以Git远端及线上字节核验为准。复用已有工作区/固定日志与截图，没有新增工作树、临时目录、一次性脚本或安装包。</ns0:t>
       </ns0:r>
     </ns0:p>
     <ns0:sectPr ns0:rsidR="00FC693F" ns0:rsidRPr="0006063C" ns0:rsidSect="00034616">

</xml_diff>

<commit_message>
feat: customize icon rims, glass widget blocks and status bar colors (web v1544)
</commit_message>
<xml_diff>
--- a/docs/maintenance/AI开发项目_Bug修改规范.docx
+++ b/docs/maintenance/AI开发项目_Bug修改规范.docx
@@ -11765,6 +11765,22 @@
         <ns0:t>2026-10-04 本地追加（暂不推送）：主屏与Dock全部软件图标去掉容器边框和自定义图标深色底缝，按《液态玻璃_磨砂加细高光_做法.md》使用0.8px镂空白色渐变高光，140度明暗变化，亮度1.72/饱和度1.68，描边不模糊且不拦截点击；保留图片本身、品牌/宠物内部黑色轮廓。网页/私人glass-theme.css相同图标规则，保留各自其他样式差异。双端默认美化及黑/粉/灰/蓝5种状态实际浏览器检查全部图标和Dock通过（网页24/私人25个），全量3131/3131通过；iMessage原玻璃规则未改。截图复用现有game-icons-default-home.png及game-icons-{black,pink,gray,blue}-home.png；未创建工作树或一次性脚本，未提交、推送、打包。候选仍v1540/v1541，正式发布前再分配新版本标记。</ns0:t>
         <ns0:br/>
         <ns0:t>2026-10-04 用户授权先推送。本轮网页发布v1542，私人共享源码v1543（iOS仍438，未打包）：正式互换主屏/游戏大厅入口，保留存档与历史邀请，像素少女/电子宠物独立图标和管控；两张首次美化原图及自定义图标永久跳过保护；移除线条主题；主屏/Dock镂空白色玻璃细高光。正式版本全部入口与缓存标记已核对，共享资源及8张图标两端逐字节一致；双端正常授权聊天含存档/输出模式/自动查手机/重开通过，无页面错误，全量3132/3132通过。没有Mac/iPhone或真实模型验证；推送与部署结果以Git远端及线上字节核验为准。复用已有工作区/固定日志与截图，没有新增工作树、临时目录、一次性脚本或安装包。</ns0:t>
+        <ns0:br/>
+        <ns0:t>2026-10-04 推送结果：本轮源码已提交为55575eca1446ddaf12afd708ae35f2b824808075（网页v1542/私人源码v1543），但首次git push origin HEAD:main失败：连接github.com:443超时，约21秒。依发布规则不自动重试，不绕路修改远端；提交保留，可待网络恢复手动推送。没有本提交的Pages部署记录，线上仍未发布本轮版本。剩余16项既有仅行尾差异保留，未reset或广泛清理；未新增工作树、临时目录、一次性脚本，未打包。</ns0:t>
+        <ns0:br/>
+        <ns0:t>2026-10-04 用户明确授权再尝试一次，git push origin HEAD:main成功；远端main为55575eca1446ddaf12afd708ae35f2b824808075。网页v1542 Pages部署37178925685已completed/success，线上入口、app.js、glass-theme.css、SW、热修复、共享运行组件、首次美化包及8张主题图标共19项与提交逐字节一致。私人共享源码v1543已随提交保存，未打包。下方第一次网络失败为历史记录。沿用已有工作区与日志，无新增临时产物，保留既有行尾差异。</ns0:t>
+        <ns0:br/>
+        <ns0:t>2026-10-04 私人覆盖包完成：最新私人版本覆盖包_v1543_iOS438.zip，165445082字节，1731文件，SHA256=3dc04b801762c9c720abb3a635e6bf29e2727baa2401f29b396ba641e464e356。从提交ed8112ee74e1329ac4c6ee6ebee24f35d3778deb打包（55575eca网页发布的运行资源+本地打包脚本/当前Mac指南提交，后者未推送）。私人v1543/iOS1.0.438(438)/桥42；之前v1533覆盖包清单逐项继承，原生与签名内容逐字节保持；包内全部文件解压读取与提交/哈希表核对通过，最新537项永久修复/云备份/私人基础检查通过，发布前全量3132与双端正常授权聊天通过。完整Mac/Xcode源码覆盖包，不是IPA，Mac编译/签名/iPhone仍未验证。复用现有v1533打包脚本文件并更新当前参数，没有新增脚本、工作树或临时目录；解压检查改为内存读取，不创建临时解压副本，必要交付ZIP一份，保留旧唯一交付包及已有其他改动。</ns0:t>
+      </ns0:r>
+    </ns0:p>
+    <ns0:p>
+      <ns0:r>
+        <ns0:t>2026-10-04 本地候选网页v1544 / 私人v1545 / iOS1.0.439 (439)：主屏/Dock白色或黑色图标包边；透明玻璃组件15种内部小块独立颜色及0–100%透明度，按主题保存，包括双人左右头像与文字底块；0%保留图片文字及操作。外观与主屏新增顶部系统区域自由颜色与跟随主题，私人原生桥appearance.statusBar持久化颜色、顶部安全区绘制与文字亮度适配。美化导出和存档恢复保留设置。全量3134/3134通过，双端浏览器0%/重开保存/导出/桥接参数及正常聊天检查通过，无页面错误。未Mac编译和iPhone验收；截图为浏览器页面，不是系统状态栏真机证明。未提交/推送/打包，最后交付仍私人v1543/iOS438覆盖包；HEAD仍ed8112ee，线上v1542/55575eca。复用现有工作树、脚本与固定日志截图，未创建临时目录、工作树或一次性脚本。</ns0:t>
+      </ns0:r>
+    </ns0:p>
+    <ns0:p>
+      <ns0:r>
+        <ns0:t>2026-10-04 用户授权先推送、不打包：网页v1544、私人源码v1545/iOS439完成发布前核验。全量3140/3140及双端实际授权聊天检查通过，新功能已登记永久继承检查。九项共享新函数一致，保留私人CSS原有性能保护差异，不覆盖成网页副本。版本入口、缓存标记对齐；只提交实际内容改动，保留已有行尾差异。系统顶部颜色原生部分未Mac/iPhone验证，覆盖包仍v1543/iOS438；此次不打包。推送及部署结果以追加记录为准。</ns0:t>
       </ns0:r>
     </ns0:p>
     <ns0:sectPr ns0:rsidR="00FC693F" ns0:rsidRPr="0006063C" ns0:rsidSect="00034616">

</xml_diff>

<commit_message>
fix: preserve live color picker and add vinyl and lock-pull opacity controls (web v1546)
</commit_message>
<xml_diff>
--- a/docs/maintenance/AI开发项目_Bug修改规范.docx
+++ b/docs/maintenance/AI开发项目_Bug修改规范.docx
@@ -11781,6 +11781,16 @@
     <ns0:p>
       <ns0:r>
         <ns0:t>2026-10-04 用户授权先推送、不打包：网页v1544、私人源码v1545/iOS439完成发布前核验。全量3140/3140及双端实际授权聊天检查通过，新功能已登记永久继承检查。九项共享新函数一致，保留私人CSS原有性能保护差异，不覆盖成网页副本。版本入口、缓存标记对齐；只提交实际内容改动，保留已有行尾差异。系统顶部颜色原生部分未Mac/iPhone验证，覆盖包仍v1543/iOS438；此次不打包。推送及部署结果以追加记录为准。</ns0:t>
+      </ns0:r>
+    </ns0:p>
+    <ns0:p>
+      <ns0:r>
+        <ns0:t>2026-10-04 发布完成：网页v1544与私人源码v1545/iOS439已提交51f7420f46788906708e519d8071be746348f0d1并推送origin/main；Pages运行37180603754完成success，线上index/小手机入口/app.js/glass-theme.css/sw.js/web-hotfix.js/repair.html七项与提交字节一致。全量3140/3140及双端正常授权聊天通过。此次没有打包，最新私人覆盖包仍v1543/iOS438；系统顶部原生背景待Mac/iPhone确认。复用现有工作区与固定日志，未新增临时文件或目录；保留16个已有行尾差异及本次部署维护记录，不以reset或stash掩盖。</ns0:t>
+      </ns0:r>
+    </ns0:p>
+    <ns0:p>
+      <ns0:r>
+        <ns0:t>2026-10-04 本地修复候选网页v1546/私人v1547（原生iOS439不变）：用户反馈顶部系统颜色选择控件闪退。复现回归旧实现失败，原因statusBarColorSet在每个input事件调用render，移除了仍在操作的颜色输入节点；修复为仅同步背景和控件数值并250ms延迟保存，不重绘设置页。加入圆盘与唱臂联动0–100%透明度，主屏圆盘/封面/右侧唱臂一起变化，不改音乐App样式及播放逻辑；0保留布局和点击。用户追加顶部锁屏小箭头按钮底色与整按钮透明度，保留点击锁屏及布局，颜色自动搭配箭头深浅，透明度覆盖入场动画最终opacity，按主题保存；恢复玻璃组件默认保留独立箭头设置。两端连续input同节点/焦点保留、实际滑块拖至0和50、箭头颜色透明度及点击、重开保存、美化导出、复位通过，pageErrors=0；全量3148/3148及双端正常授权聊天通过。初次CSS检查失败因通用.lockpull选择器触发旧布局保护，改用#lockPull与自定义类只控制用户定制，不改默认。截图复用theme-selection/glass-inner-controls/glass-inner-transparent/glass-inner-colored固定位置；网页/私人内核浏览器证据不等于原生iPhone验收。未提交/推送/打包；线上仍v1544/51f7420f，最新覆盖包仍v1543/iOS438，原生顶部自由颜色待Mac/iPhone确认。复用现有工作树、测试和日志，无新增临时目录或一次性脚本，保护既有维护记录与16项行尾差异。</ns0:t>
       </ns0:r>
     </ns0:p>
     <ns0:sectPr ns0:rsidR="00FC693F" ns0:rsidRPr="0006063C" ns0:rsidSect="00034616">

</xml_diff>

<commit_message>
fix: preserve vinyl cover and honor custom home-screen status colors (web v1548)
</commit_message>
<xml_diff>
--- a/docs/maintenance/AI开发项目_Bug修改规范.docx
+++ b/docs/maintenance/AI开发项目_Bug修改规范.docx
@@ -11791,6 +11791,16 @@
     <ns0:p>
       <ns0:r>
         <ns0:t>2026-10-04 本地修复候选网页v1546/私人v1547（原生iOS439不变）：用户反馈顶部系统颜色选择控件闪退。复现回归旧实现失败，原因statusBarColorSet在每个input事件调用render，移除了仍在操作的颜色输入节点；修复为仅同步背景和控件数值并250ms延迟保存，不重绘设置页。加入圆盘与唱臂联动0–100%透明度，主屏圆盘/封面/右侧唱臂一起变化，不改音乐App样式及播放逻辑；0保留布局和点击。用户追加顶部锁屏小箭头按钮底色与整按钮透明度，保留点击锁屏及布局，颜色自动搭配箭头深浅，透明度覆盖入场动画最终opacity，按主题保存；恢复玻璃组件默认保留独立箭头设置。两端连续input同节点/焦点保留、实际滑块拖至0和50、箭头颜色透明度及点击、重开保存、美化导出、复位通过，pageErrors=0；全量3148/3148及双端正常授权聊天通过。初次CSS检查失败因通用.lockpull选择器触发旧布局保护，改用#lockPull与自定义类只控制用户定制，不改默认。截图复用theme-selection/glass-inner-controls/glass-inner-transparent/glass-inner-colored固定位置；网页/私人内核浏览器证据不等于原生iPhone验收。未提交/推送/打包；线上仍v1544/51f7420f，最新覆盖包仍v1543/iOS438，原生顶部自由颜色待Mac/iPhone确认。复用现有工作树、测试和日志，无新增临时目录或一次性脚本，保护既有维护记录与16项行尾差异。</ns0:t>
+      </ns0:r>
+    </ns0:p>
+    <ns0:p>
+      <ns0:r>
+        <ns0:t>2026-10-04 最新发布：网页v1546、私人源码v1547已提交c8cc2748622f2517602290bd647896b54c15d05c并推送origin/main。Pages运行37181216966完成success；线上index.html、小手机.html、app.js、glass-theme.css、sw.js、web-hotfix.js、repair.html七项与提交字节完全一致。包含顶部系统选色不重绘修复、光盘与唱臂联动透明度、锁屏顶部小箭头独立底色和透明度、组件复位保留箭头设置。全量3148/3148、双端正常授权聊天及浏览器实际拖动/保存/重开/复位通过。此轮未打包；最新私人覆盖包仍v1543/iOS438，源码原生iOS439的顶部颜色需Mac/iPhone验收。继续复用现有工作区、脚本、固定日志与截图，没有新增临时目录或安装包；保留16个既有行尾差异及追加的部署维护记录。</ns0:t>
+      </ns0:r>
+    </ns0:p>
+    <ns0:p>
+      <ns0:r>
+        <ns0:t>2026-10-04 本地候选网页v1548/私人v1549：用户明确唱片外围及唱臂透明，中心梅花图片必须保留；之前把整个.vinyl-record容器设opacity导致中心封面同时消失。已将圆盘纹理/阴影放到独立:before装饰层，透明度只控制该层及右侧唱臂，封面不改图源、不参与此透明度。用户确认系统栏故障发生在添加主屏的网页版本；旧代码apple-mobile-web-app-status-bar-style在standalone下强制black，主题CSS对html/body设置!important覆盖自选色。修复去掉强制black、保留default与原安全布局，明确自选色同步html/body，未改viewport-fit或添加遮挡页面的固定层。参考Apple Supported Meta Tags官方文档，该black参数定义黑底；不把此旧规范说明当作当前iPhone任意背景色已验证。实际旧HEAD浏览器复现中心有效opacity=0、style=black、body仍黑；新双端模拟iPhone主屏模式中心有效opacity=1，装饰和唱臂0/50，meta=default、body蓝色、重开保存通过。全量3154/3154和双端正常授权聊天通过，原有必须black的旧源码断言按新行为更新；中心图截图用测试封面，不是读取用户的梅花图。系统栏真实iPhone变色仍待用户更新后实测。未提交/推送/打包，线上仍v1546/c8cc2748，私人源码原生439未Mac/iPhone验证，最新交付包仍v1543/iOS438。复用原工作树、固定日志和截图，无新增临时目录/一次性脚本，保留历史及既有行尾差异。</ns0:t>
       </ns0:r>
     </ns0:p>
     <ns0:sectPr ns0:rsidR="00FC693F" ns0:rsidRPr="0006063C" ns0:rsidSect="00034616">

</xml_diff>

<commit_message>
fix: release v1552 image game friend send and call recovery
</commit_message>
<xml_diff>
--- a/docs/maintenance/AI开发项目_Bug修改规范.docx
+++ b/docs/maintenance/AI开发项目_Bug修改规范.docx
@@ -11801,6 +11801,64 @@
     <ns0:p>
       <ns0:r>
         <ns0:t>2026-10-04 本地候选网页v1548/私人v1549：用户明确唱片外围及唱臂透明，中心梅花图片必须保留；之前把整个.vinyl-record容器设opacity导致中心封面同时消失。已将圆盘纹理/阴影放到独立:before装饰层，透明度只控制该层及右侧唱臂，封面不改图源、不参与此透明度。用户确认系统栏故障发生在添加主屏的网页版本；旧代码apple-mobile-web-app-status-bar-style在standalone下强制black，主题CSS对html/body设置!important覆盖自选色。修复去掉强制black、保留default与原安全布局，明确自选色同步html/body，未改viewport-fit或添加遮挡页面的固定层。参考Apple Supported Meta Tags官方文档，该black参数定义黑底；不把此旧规范说明当作当前iPhone任意背景色已验证。实际旧HEAD浏览器复现中心有效opacity=0、style=black、body仍黑；新双端模拟iPhone主屏模式中心有效opacity=1，装饰和唱臂0/50，meta=default、body蓝色、重开保存通过。全量3154/3154和双端正常授权聊天通过，原有必须black的旧源码断言按新行为更新；中心图截图用测试封面，不是读取用户的梅花图。系统栏真实iPhone变色仍待用户更新后实测。未提交/推送/打包，线上仍v1546/c8cc2748，私人源码原生439未Mac/iPhone验证，最新交付包仍v1543/iOS438。复用原工作树、固定日志和截图，无新增临时目录/一次性脚本，保留历史及既有行尾差异。</ns0:t>
+      </ns0:r>
+    </ns0:p>
+    <ns0:p>
+      <ns0:r>
+        <ns0:t>2026-10-04 发布完成：网页v1548、私人源码v1549已提交9498a67df083757837065340199cedd053a50e80并推送origin/main。Pages运行37181925091完成success，线上index.html、小手机.html、app.js、glass-theme.css、sw.js、web-hotfix.js、repair.html七项与提交字节一致。唱片透明度仅外围纹理/阴影与唱臂，中心图片保留；添加主屏网页不再强制系统栏black，自选色同步html/body。全量3154/3154、旧版问题复现及双端浏览器回归、正常授权聊天通过。真实iPhone系统栏是否采用自选色仍待实测，未Mac/iPhone验收。此次未打包，最新私人覆盖包仍v1543/iOS438，原生源码439。复用既有工作区与固定检查位置，无新增临时目录/安装包；保留16个原有行尾差异和部署记录，不使用reset/stash强清。</ns0:t>
+      </ns0:r>
+    </ns0:p>
+    <ns0:p>
+      <ns0:r>
+        <ns0:t>2026-10-04 私人v1549/iOS1.0.439(439)/桥42覆盖包已生成：最新私人版本覆盖包_v1549_iOS439.zip；来源beb14a18c8a1f163dd9b6afc2d48c8dc3d8f66bd（9498a67d已部署运行资源加打包脚本/安装指南提交，打包提交未推送）。1731文件、165826710字节，SHA256=bad2885137bed1972d21853c1728b3b755098217a343887fed179250a4b63ca2。全部ZIP文件解压字节、哈希及入口版本核验通过；继承上次v1543清单与全部preserved记录，原生仅已审核顶部自选色和439标记变化，签名/Team/Bundle ID保持。551项永久修复和私人云备份检查通过；同一运行源码此前全量3154及双端正常授权聊天通过。新增图标白黑包边、内部小块透明度、顶部颜色、箭头颜色透明度、唱片外围透明且中心图片保留全部入包。是Mac/Xcode源码覆盖包，不是IPA，未Mac编译/签名/iPhone验收。用户网页反馈“可以了”不替代私人原生真机验收。仅复用既有脚本、日志和工作树，无新增临时目录/源码副本；必要交付ZIP一份，保留旧唯一交付包和原有行尾差异。</ns0:t>
+      </ns0:r>
+    </ns0:p>
+    <ns0:p>
+      <ns0:r>
+        <ns0:t>2026-10-05 本地修复候选网页v1550/私人v1551，未提交、未推送、未打包；HEAD仍beb14a18，线上9498a67d/v1548，上次覆盖包v1549/iOS439保持。用户主屏网页导入美化后短暂灰块/过曝，部分安卓像素少女图片读取超时，苹果一直可打开；另补充仅像素少女返回延迟。图标onerror永久display:none、idb短引用直接进入src触发错误是可复现原因，修复缓存直读及onload恢复显示，导入图标按2张一批预读；高光曝光为移动合成风险推测，图标细0.8px白黑镂空边保留，仅取消其brightness backdrop滤镜，不改图片颜色、其他玻璃/透明度或用户存档。游戏超时清理旧图片请求，自动一次新缓存键重试，SW重试绕过旧缓存读取，保留file原生串行槽；初始素材132文件解码负担与实际手机网络/显存可能相关，不承诺所有安卓故障完全消失。返回旧handler等lastSave磁盘写入，修复先执行save、父页按消息顺序接收进度，再退出，不等磁盘；保存失败仍留页。旧实现晚加载/超时/慢盘三项回归先失败，新两端通过。实际浏览器两端导入无错误、132衣柜文件和小屋完整启动通过；模拟1.5秒磁盘写入返回68/64ms，父页保留wardrobe；一次停滞请求自动恢复。全量3164/3164、正常授权聊天双端通过。首次版本替换误碰私人内嵌素材/第三方数字，继承检查发现后已逐字节恢复，并清理本轮行尾变化；新增optional chaining违背旧安卓解析限制已修正；跨日固定旅行测试改为固定测试时钟，未改旅行业务规则。首次失败结果保留于记录，最新日志为最终通过。复用原工作树、测试/日志/截图固定位置，未新增工作树或临时目录；保护原16个测试行尾差异及已有维护记录。浏览器不是iOS主屏/安卓真机验证，模型HTTP为模拟；手机实际导入曝光及安卓网络仍需更新后验收。</ns0:t>
+      </ns0:r>
+    </ns0:p>
+    <ns0:p>
+      <ns0:r>
+        <ns0:t>2026-10-05 电话故障定向本地修复：用户补充私人App通话页前台发送后立即报网络异常，网页版也有类似现象；历史28–91秒Load failed与即时失败需分开，不认定模型/站子或后台为已确认根因。callChatWithRetry原把HTTP200空字符串当成功，现空正文进入现有同路线最多2次/配置副路线1次的预算，空白也拒绝，挂断停止、401不重试保持；长时间本机计时器超时不因Load failed字样再重试。callFailureText将连接失败、空正文、本机超时分开，后台仅提示观察状态，取消“这句没送出去”的无证据结论。网页与私人app.js定向同步，未改模型、余额、原生桥或重试总上限。新增6项行为回归在修改前失败、修改后通过；专项28通过，实际Edge两端fetch模拟掉线/空正文恢复、连续空正文限次/挂断/401/隐私隔离通过，双端正常授权聊天及查手机/保存恢复通过，全量3170/3170。测试上游均为受控模拟，不是用户接口或iPhone实测。未提交、未推送、未打包；当前HEAD beb14a18，工作区同时有另一项美化/像素少女1550/1551候选，保留全部既有现场，不将其混入电话发布。下一步用户自然即时失败后立即复制完整请求故障诊断、保留版本/耗时/原始错误/阶段，补当时前后台与入口；不要反复收费测试或提供密钥。复用现有测试、浏览器脚本和call-evidence-full.log，无新增临时目录或副本。</ns0:t>
+      </ns0:r>
+    </ns0:p>
+    <ns0:p>
+      <ns0:pPr>
+        <ns0:pStyle ns0:val="Heading2"/>
+      </ns0:pPr>
+      <ns0:r>
+        <ns0:t>2026-10-05 真人好友发送结果与只读核对（未发布）</ns0:t>
+      </ns0:r>
+    </ns0:p>
+    <ns0:p>
+      <ns0:r>
+        <ns0:t>2026-10-05 真人好友发送结果定向修复，本地网页v1552/私人v1553，未提交、未推送、未打包；HEAD仍beb14a18，线上9498a67d/v1548与已交付私人v1549/iOS439保持。用户报告浏览器偶发连接提示、重发可成功，另有人提示异常但接收方已收到；用户随后提供私人App“发送结果尚未确认”截图，不能判定仅网页版或服务器已宕机。只读实网探测：正常Edge主/备用均200约3.2/3.3秒；Python脚本备用403/Cloudflare1010，浏览器成功，不能以脚本客户端特征拦截推断用户被拦。</ns0:t>
+      </ns0:r>
+    </ns0:p>
+    <ns0:p>
+      <ns0:r>
+        <ns0:t>确认客户端缺口：通用探测误用“消息尚未提交”；写请求丢失/空白/无有效ID响应后缺少定向核对；按相同正文及2分钟窗口匹配会混淆连续相同消息；发送成功后的本机错误仍可能误退款；fetchT收到响应头即清计时器，pfRpc读取正文没有独立上限。修复消息独立_clientSendId放入兼容现有PF正文，旧客户端仍正常显示类型/文字；单聊/群聊、图片/语音、支付/隐藏控制均保留原类型及样式，最终60000字符上限校验。只读phone_friend_sync按发送者/目标/唯一标识核对，绝不自动重发写请求或因结果未知退款；服务器确认后清本地占位，晚到记录标识匹配不受旧2分钟限制，旧未标识消息保留兼容。消息下方分别显示发送中/结果待确认/尚未发送，独立于已读开关；确认成功后本机保存错误仅提示刷新，不退款。群红包领取未知时保留pending领取，不误说未抢到、清记录后再抓。资料等非消息写请求使用“操作结果未确认”，与消息状态分离。</ns0:t>
+      </ns0:r>
+    </ns0:p>
+    <ns0:p>
+      <ns0:r>
+        <ns0:t>只读主/备用连接探测各5秒放宽至最多8秒（调用较短预算仍遵守）；403可进入备用，401/404保留明确授权/开通错误；写提交仍单次、不改数据库或Cloudflare配置。正文读取加有界计时器，HTTP200无有效消息ID也视为结果未知并核对。小手机好友页新增连接诊断，最多24条fn/阶段/主备用入口标签/状态/耗时/错误类型，不采集正文、好友ID、密钥或完整请求响应。</ns0:t>
+      </ns0:r>
+    </ns0:p>
+    <ns0:p>
+      <ns0:r>
+        <ns0:t>回归先在旧实现复现单聊/群聊丢失响应、重复正文、通用误提示、慢探测及正文等待等失败；旧正文等待用例会挂住，停掉本轮测试进程后给测试本身加外部100ms界限，生产读取有独立超时。第一轮私人夹具漏_payloadCache导致假失败，补齐真实缓存依赖；初始状态重复保存影响故障注入位置，改为初始状态随原save一次保存；第一次版本检查漏v=查询及转义断言，精确补齐标记，未替换素材或第三方数据。全量3204/3204、双端正常授权聊天/查手机/权限与存档恢复通过；实际Edge正式双端页面模拟已收消息但响应断连，两条相同文字各保留一条确认消息，未知状态可见，写3次只读核对3次、无自动写重试、诊断无正文、pageErrors=0。网络和上游错误为受控模拟，不是实际用户当时服务器或iPhone/Android真机证明，底层网络故障仍可能发生。保留美化/像素少女与其他聊天电话修复现场，按功能定向同步私人，不整份覆盖；版本/入口/缓存门禁通过。</ns0:t>
+      </ns0:r>
+    </ns0:p>
+    <ns0:p>
+      <ns0:r>
+        <ns0:t>复用原工作树、已有测试/维护文档与eight-unit/eight-browser/theme-chat日志。未建分支、工作树、源码副本或备份目录；本轮两份中间检查输出将摘要归入固定日志后删除，不清理旧唯一包、原行尾差异或其他聊天文件。</ns0:t>
+      </ns0:r>
+    </ns0:p>
+    <ns0:p>
+      <ns0:r>
+        <ns0:t>2026-10-05 联合发布范围：用户授权“先推送带上其他工作区的改动”。网页 v1552，私人内置源码 v1553，iOS439/bridge42保持。本次包含美化包图片显示、像素少女素材加载与返回、真人好友发送确认及另一聊天已完成的电话空正文/超时/错误提示修复。已核对其他注册工作树，旧真实外卖、公版审核、小家和硬件独立候选保留现场，不混入发布。全仓3204/3204、双入口授权正常聊天、好友受控故障恢复、电话浏览器检查通过；用户实际网络、手机和Mac编译未验证。本次只推送网页，不打包。</ns0:t>
       </ns0:r>
     </ns0:p>
     <ns0:sectPr ns0:rsidR="00FC693F" ns0:rsidRPr="0006063C" ns0:rsidSect="00034616">

</xml_diff>

<commit_message>
fix: release v1554 role WeChat switching and remove daily event ledger
</commit_message>
<xml_diff>
--- a/docs/maintenance/AI开发项目_Bug修改规范.docx
+++ b/docs/maintenance/AI开发项目_Bug修改规范.docx
@@ -11859,6 +11859,21 @@
     <ns0:p>
       <ns0:r>
         <ns0:t>2026-10-05 联合发布范围：用户授权“先推送带上其他工作区的改动”。网页 v1552，私人内置源码 v1553，iOS439/bridge42保持。本次包含美化包图片显示、像素少女素材加载与返回、真人好友发送确认及另一聊天已完成的电话空正文/超时/错误提示修复。已核对其他注册工作树，旧真实外卖、公版审核、小家和硬件独立候选保留现场，不混入发布。全仓3204/3204、双入口授权正常聊天、好友受控故障恢复、电话浏览器检查通过；用户实际网络、手机和Mac编译未验证。本次只推送网页，不打包。</ns0:t>
+      </ns0:r>
+    </ns0:p>
+    <ns0:p>
+      <ns0:r>
+        <ns0:t>2026-10-05 本地预览：角色微信首次密码验证成功后保存绑定状态，角色切换页展示已绑定/未绑定、切换/登录/解绑。解绑只撤销快速登录，不删除好友聊天、角色手机数据；下一次重新输入账号密码。绑定仅存verifiedAt，不存密码，按用户账号和角色ID隔离，主号限定与删除/拉黑检查保留；验证码找回仍沿原路径，本次不自动建立密码绑定。原hisStartSession随机被发现/退出记录规则不变。网页/私人定向函数同步，未推送、未打包，线上仍v1552/225dea2b。自动3206/3206、正常授权聊天双端、角色好友回复回归通过；实际Edge预览解绑后进入密码页通过；尚未真实iPhone验证。复用8774预览、原测试和脚本，新增用户请求的截图.codex_tmp/role-wechat-switch.png，演示数据保留在iframe内存，不保存正式账号。既有脏测试行尾保持，没有reset/stash/广泛清理。</ns0:t>
+      </ns0:r>
+    </ns0:p>
+    <ns0:p>
+      <ns0:r>
+        <ns0:t>2026-10-05 本地候选：按用户纠正，角色快捷登录放在现有微信“切换账号”整页的角色列表内，未绑定显示登录，密码验证成功后显示切换及解绑。解绑撤销该账号下该角色的快捷授权，不删聊天。彻底移除日常事件簿的手机入口、网页/私人加载、独立组件、模型提示和专用同步脚本；保留独立小事簿、正常记忆和聊天，旧事件标签只做隐藏兼容，旧备份数据不做破坏性清理。已通过 tests/*.test.mjs 共3203/3203及网页/私人真实入口授权聊天回归（模拟HTTP，真实上下文与送达）；未Mac编译或真机验证，本轮未提交、推送、打包。</ns0:t>
+      </ns0:r>
+    </ns0:p>
+    <ns0:p>
+      <ns0:r>
+        <ns0:t>2026-10-05 用户授权本轮网页推送：发布候选网页v1554、私人共享源码v1555；iOS439/桥42不变且未打包。切换账号整页包含密码验证后快捷切换及解绑；移除日常事件簿的入口、独立组件、模型读写和加载清单，保留小事簿、普通记忆与聊天。3203项回归及网页/私人真实入口授权聊天检查通过，浏览器已实点解绑后重新要求密码。发布提交和Pages结果以Git及部署记录为准，Windows检查不代表Mac/iPhone验收。</ns0:t>
       </ns0:r>
     </ns0:p>
     <ns0:sectPr ns0:rsidR="00FC693F" ns0:rsidRPr="0006063C" ns0:rsidSect="00034616">

</xml_diff>

<commit_message>
Release web v1572 role-aware photo album and completed phone inspection pages
Retire the requested AI account browser UI and internal voice/subtitle generation, preserving external interfaces and archived backend records. Migrate only obsolete retired-feature assertions; retain active external voice, chat and permanent inheritance guards. Export album Blob originals in standard backups, reject missing originals, and include all four themed icons in web/offline and private source. Include completed parallel role phone refresh, WeChat, contacts, phone/SMS, read-only travel, and Moments awareness changes. Shared private source is v1573; native iOS 439 and bridge 42 unchanged. Full 3313 tests and authorized chat web/private browser gates pass; no Mac or iPhone validation claimed.
</commit_message>
<xml_diff>
--- a/docs/maintenance/AI开发项目_Bug修改规范.docx
+++ b/docs/maintenance/AI开发项目_Bug修改规范.docx
@@ -11914,6 +11914,106 @@
     <ns0:p>
       <ns0:r>
         <ns0:t xml:space="preserve">2026-10-05 用户授权统一发布网页v1570 / 私人共享源码v1571，iOS439/桥42不变，未打包：角色微信气泡按实际作者同步角色配置，左右换位不换颜色/圆角/装饰/字体/头像形状，独立设置及全局回退、恢复默认即时跟随；角色手机密码拨号盘和独立背景设置、10个透明液态磨砂数字键、无底色取消/删除一并发布，密码校验、删除、锁定与存档隔离保留。既有原地改名、定位图标对齐及全部交付修复继承。3229/3229完整Node回归、网页/私人实际HTML授权聊天HTTP模拟检查通过，pageErrors=0；实际Edge双入口角色气泡、透明材质及正确密码解锁通过。初次全量18项及随后1项失败均为当前版shell/cache版本断言仍保留1568/1569，精确同步身份断言后全量通过，没有移除业务检查。3份维护DOCX此前追加代码错误假设w前缀，实际为ns0，导致段落插入到文档闭合标签中；现恢复原闭合标签并把所有新增段落放到已有正文末尾section之前，逐项核对原文本与全部追加文本不丢失，其余DOCX parts不变。四份XML已解析通过，未宣称Word视觉渲染。以后追加先读实际namespace和body结构并验证XML，禁止仅用rfind固定w前缀。仅提交审核后的内容变化，原14个行尾现场及其它工作树候选保留，必要证据保留，没有可安全丢弃的新临时文件。实际推送/Pages以Git及线上核验为准；未真实模型、Mac或iPhone验收。</ns0:t>
+      </ns0:r>
+    </ns0:p>
+    <ns0:p>
+      <ns0:r>
+        <ns0:t>2026-10-05 页面复用规则：先核对实际HTML加载顺序和运行后的渲染函数，特别是commerce-ui等后加载覆盖层；查手机查看页复用展示函数时使用显式inspection上下文，订单/搜索记录只读取当前账号与目标角色，不替换全局S.shop/S.browser，不调用购买/退款/搜索/清空或建立登录会话。验证模拟按钮无数据/资金变化，并比较正常入口渲染与旧实现；字段缺失不编造购买时间、物流状态或记录。</ns0:t>
+      </ns0:r>
+    </ns0:p>
+    <ns0:p>
+      <ns0:r>
+        <ns0:t>2026-10-05 朋友圈提醒发布复核（两边共有，仅本地）：补齐momentRequestRoleReaction上下文，明确当前角色被“提醒谁看”选中，不将提醒误作正文，保留角色自主回应与既有情侣互动。选中姓名回填、搜索保留、关闭丢弃、发布可见性过滤、本地发表通过；专项35/35。提醒对象超出普通三人上限仍处理，情侣与提醒重叠只处理一次，重复ID及屏蔽/删除/不可见对象不重复或越权请求。网页/私人真实HTML授权聊天HTTP模拟pageErrors=0；未调用真实模型，未验证Mac/iPhone。整仓日期格式计数测试仍失败，不能称全部发布检查通过。本轮未提交、推送或打包。选中后截图.codex_tmp/eight-chat/moment-compose-mentioned-dark.jpg。</ns0:t>
+      </ns0:r>
+    </ns0:p>
+    <ns0:p>
+      <ns0:r>
+        <ns0:t>本轮最终补充：并行工作持续变化，最终tests目录整仓为3236项、3232通过、4失败（微信联系人短信/iMessage分流3项及private Intl日期格式1项）；不能沿用此前只有1项失败的数字。朋友圈专项35/35及授权聊天两入口pageErrors=0不变。本轮未修改短信分流或购物日期函数，发布前由对应任务解决后再重跑。</ns0:t>
+      </ns0:r>
+    </ns0:p>
+    <ns0:p>
+      <ns0:r>
+        <ns0:t xml:space="preserve">2026-10-05 角色手机电话视图规则：读取既有玩家电话数据必须投影到角色视角，区分玩家匿名发给角色与角色匿名发给玩家；禁止通过主号recent暴露匿名身份，禁止临时替换全局phoneapp复用UI。复用原模板并传只读inspection上下文，按角色关联实时查询，完整会话优先且清空/刷新不能复活旧复制。新记录排序时间区分真实事件时间与生成快照时间，未知历史时间不得默认Date.now。私人日期显示复用northLocaleDate，避免直接Intl路径。</ns0:t>
+      </ns0:r>
+    </ns0:p>
+    <ns0:p>
+      <ns0:r>
+        <ns0:t xml:space="preserve">2026-10-05 原页面复用时要同时复用页面主题容器和CSS变量；仅复制内容会使继承色与布局失效。检查onclick、onsubmit、onkeydown等所有入口，模拟页面不得触发真实预订、发送、好友接受或拒绝。旅行查看只读原始订单并沿用归属/账号/有效期，不能通过复制快照绕过清理规则。通用卡片函数新增可选上下文时，注意Array.map会传数字index作为第二参数，必须校验上下文类型/标识。重构消费者后，永久guard和源代码定位测试应跟随实际调用链，并保留行为隔离测试。</ns0:t>
+      </ns0:r>
+    </ns0:p>
+    <ns0:p>
+      <ns0:r>
+        <ns0:t>2026-10-05 独立相册界面稿与旧AI账户移除（两边共有，本地未提交/推送/打包）：用户明确选择连同内置语音/字幕服务一起移除，仅保留外置接口。删除根/私人ai-account.js加载模块，新增photo-album.js，首页入口改相册，homeGameEntriesMigrate迁移旧aiaccount布局/底栏键并保留旧路由到相册的兼容；不清用户照片、聊天、授权或历史付费数据。移除AI身份同步调用、内置生成请求和默认后台配置，ttsRelayOn/sttRelayOn返回false使旧存档relay旗标无效；外置TTS转发仍保留，这个转发调用用户自己配置的平台，不是旧点数服务。手动导入字幕及正常外置接口保留。主页面黑底白字，精选集只保留回忆/相簿/人物与宠物/精选照片/共享相簿/最近的日子/旅程，图库三列；圆形按钮/底部切换栏复用遮罩细高光+磨砂，右上头像实时读S.me.avatar。分类/搜索/选择只有界面预览提示，无扫描/上传/识别/AI生成。图库正式无数据时0项/空态，预览15项为本地旅行样例非用户图库。专项30/30，双端正常授权聊天HTTP模拟pageErrors=0，浏览器两页切换及截图通过；未验证真实外置服务、Mac或iPhone。最终tests整仓3222项3191通过31失败，主要是仍读取已删除ai-account.js或要求旧内置/点数行为的历史断言，另有缓存/已提交私人manifest等需按新入口调整；禁止把这31项直接无条件跳过，必须保留其中外置/授权/缓存有效检查逐项迁移，移除模块纯历史检查应明确退役记录；这项发布检查尚未完成，不能宣称版本可发布。复用tests/ai-relay-project-key.test.mjs为旧开关不发请求/相册断言，tts-test-isolation保留外置6项并删除明确退役内置测试。固定预览127.0.0.1:8787/theme-real-preview.html?page=album，截图.codex_tmp/eight-chat/photo-album-{collections,library}.jpg；旧源码/后台历史/安装包保留Git和现有历史资料，未部署删除云数据。维护经验：移除模块前检查许可恢复、字幕、语音及SW有效资源验签，不把旧relay配置落成对外置接口的拦截。</ns0:t>
+      </ns0:r>
+    </ns0:p>
+    <ns0:p>
+      <ns0:r>
+        <ns0:t xml:space="preserve">2026-10-05 角色设置复用应传显式角色上下文，角色分类绑定旧业务动作，严禁复制玩家API、云备份和全局授权动作。页面内导航按账号与角色隔离；保存继续使用原字段和原验证/提醒流程，授权状态只读，重置保留原确认。验证真实运行时页面包装器，不能只对比app.js声明；后台既有原生初始化须先完成后建立副作用断言基线。northPreview会强制每次seed，持久化验证需在同一隔离浏览器中保存后打开不带预览参数的真实入口，不能将预览重置误作存档失败。</ns0:t>
+      </ns0:r>
+    </ns0:p>
+    <ns0:p>
+      <ns0:r>
+        <ns0:t>2026-10-05 相册照片查看页（网页/私人共有，仅本地）：photo-album.js图库逐张点击进入黑底完整大图页，玻璃返回/日期时间/更多与底部操作栏、可横滑缩略图及选中放大样式。大图Pointer拖动左右切换与键盘左右键，首尾不越界、取消/竖向手势不误切、旧页面定时器不会改新页面；切换仅更新查看页DOM，不重绘应用，最多3张大图和41张缩略图，大相册通过前后窗口入口浏览。读取takenAt/capturedAt，ISO保留拍摄钟面时区，缺失/无效/仅日期元数据均显示拍摄时间未知，不使用上传时间；EXIF导入与图库上传仍未实现。其他功能按钮仅预览提示。15项专项通过（含网页/私人1000张记录的DOM上限与滑动边界行为）；浏览器15张缩略图逐张切换、鼠标拖动5→6、横滚scrollLeft 0→76、未知时间及返回图库通过，控制台错误0。截图.codex_tmp/eight-chat/photo-album-viewer.jpg，localhost:8787/theme-real-preview.html?page=album；预览图片/日期为隔离内存样例，不改用户存档。未验证触摸真机/iPhone流畅度、Mac编译或整仓发布门禁，之前AI移除的整仓失败仍需迁移验证；不提交、推送或打包。复用当前预览/测试/维护位置，只增加用户要求的查看页截图，无新增临时副本或清理用户文件。</ns0:t>
+      </ns0:r>
+    </ns0:p>
+    <ns0:p>
+      <ns0:r>
+        <ns0:t>2026-10-05 刷新同步规则：不要只给空聊天导入快照；已有好友也必须补齐新记录。无消息ID的旧快照按方向、正文及出现次数匹配，保护图片、付款和真实发送历史；同时验证重复刷新幂等、进入聊天直接刷新、用户/角色/账号隔离。没有ID的相同正文独立新消息仍存在识别边界，不虚构可识别性。回归须先复现旧实现遗漏，再验证网页/私人实际入口。</ns0:t>
+      </ns0:r>
+    </ns0:p>
+    <ns0:p>
+      <ns0:r>
+        <ns0:t>2026-10-05 精选集分类展开与本机分类上传（网页/私人共有，本地未提交/推送/打包）：photoAlbumToggle/Section为七个分类提供蓝色玻璃箭头展开收起、原生横向滚动。回忆240px圆角大卡片显示地区和拍摄日期，去除播放键；人物与宠物/精选照片108px方块不叠日期，其余分类146px日期卡片。photoAlbumOpen可传分类，只查看该分类照片，关闭返回原精选集而非强制图库。分类上传表单选择分类、标题、地区、拍摄日期时间和多张图片；photoAlbumUploadSave逐张将原File及独立360px缩略Blob写入__album_photo_*本机IDB，S.photoAlbum仅保存album:引用与元数据，不嵌入原图/全局图片缓存；账号归属隔离，写入或核心保存失败回滚本轮新数据。photoAlbumHydrateSoon通过IntersectionObserver按可见区域读取Blob、卸载离屏src并撤销ObjectURL，返回后按需重读；退出页面释放URL。启动时body为空造成MutationObserver.observe错误，已改DOMContentLoaded后初始化，并补回归。专项22/22通过，包含原图字节、存储失败回滚、离屏释放重新读取、日期/账号及启动顺序。最新浏览器测试本机上传→分类回忆→分类4/4大图、本地原图960x640、13:42日期、返回原分类通过；卡片横滚scrollLeft到270.4，七分类样式及展开收起验证，修复重载后新增控制台错误0。未验证iPhone触摸流畅度/Mac编译；预览保存为隔离测试，不能当正式冷重启持久化证据。当前上传仅本机；发布前必须将新Blob引用接入导出/导入/云备份及清理保护检查，尚未完成，不能宣称跨设备迁移可用；共享相簿只是分类，没有联网共享。此前AI账户移除导致的整仓门禁仍需迁移验证。本轮不改app核心/他人并行内容。固定预览album.localhost:8787/theme-real-preview.html?page=album；开发server仅northPreview HTML禁用SW避免旧缓存，正式HTML不改。截图复用固定目录photo-album-memory.jpg、photo-album-collections-square.jpg、photo-album-collections-dates.jpg，演示照片与日期不代表真实拍摄内容。无新源码副本、日志目录或待清理临时备份；必要截图及本轮隔离测试数据保留。</ns0:t>
+      </ns0:r>
+    </ns0:p>
+    <ns0:p>
+      <ns0:r>
+        <ns0:t>2026-10-05 图库选择删除及两种排序（网页/私人共有，仅本地未提交/推送/打包）：photo-album.js新增photoAlbumSelectionToggle/Pick/DeleteSelected与SortToggle/SetSort。选择后右上变叉号，按行对象身份多选，照片右下蓝勾、底部所选数量及玻璃垃圾桶；删除成功退出多选回普通图库，空选择禁用删除。只按当前账号当前相册可见记录删除，先saveNowAsync成功再清理__album_photo_*原图和缩略图；保存失败回滚照片列表及选中状态，不删Blob；仍被其他账号/记录引用的图片不删，外部assets/聊天图片不清理。最近添加按uploadedAt降序、拍摄日期按takenAt/capturedAt降序，未知时间排末、同时间稳定；sortByAccount独立保存偏好，失败恢复。切换排序不改变已选照片，不按变化后的index错误删图；异步排序/删除期间阻止重复操作。图库左侧按钮改两选项磨砂菜单，无筛选/显示选项；分类上传仍在精选集更多入口。新增4项双端行为回归，专项26/26，原查看/分类/上传/玻璃检查保持通过，syntax/diff检查通过（并行文件行尾警告保留）。浏览器隔离内存演示选中苏州/杭州→切拍摄日期仍选同两张→删除15变13→恢复选择按钮和普通底栏；不删除用户真实照片。预览旧origin缓存HTML导致旧按钮，开发server仅northPreview给album/css开发资源键，复用8787服务并改gallery.localhost新源后正常；正式缓存/版本入口未改。预览gallery.localhost:8787/theme-real-preview.html?page=album，截图.codex_tmp/eight-chat/photo-album-library-selection.jpg与photo-album-library-sort.jpg。未做Mac/iPhone及整仓发布门禁；前轮Blob导出/导入/云备份/清理保护和AI退役整仓测试迁移仍未完成，不能声称相册可发布。没有新工作树、备份或版本包；保留并行未提交现场。</ns0:t>
+      </ns0:r>
+    </ns0:p>
+    <ns0:p>
+      <ns0:r>
+        <ns0:t>2026-10-05 相册多图分享，本地候选，未提交/推送/打包：独立磨砂分享页支持蓝勾选图、圆形联系人头像和名字、多选角色/真人好友/群聊，选择联系人后叉号变发送。角色按当前账号过滤，全局角色群仅主账号可选。复用真人好友/群既有传输与回执；逐图片/联系人记录成功、失败、待确认，成功不重发、未知结果不自动重试。角色消息持久化失败回滚且不调用角色行为/识图；每张照片跨角色和角色群复用一次串行识图。发送聊天图片副本，保留相册原图。app.js 仅补角色群图片显示和事实摘要两处，网页和私人 bundle 最小同步，禁止整文件覆盖不同 app.js。专项34/34通过；真实HTML入口的授权聊天回归在受控HTTP模型下通过，pageErrors=0。完整套件3253项，3222通过、31失败，AI账户/内置服务移除后的旧断言和发布标记仍需修复，不是全测通过。相册Blob备份/导入/云备份保护未完成，发布仍被阻断。浏览器演示2张照片给角色、模拟真人、模拟群各2条，未向真实好友发图；线上真人、Mac和iPhone未验证。截图 .codex_tmp/eight-chat/photo-album-share-empty.jpg、photo-album-share-selected.jpg；预览 http://photoshare.localhost:8787/theme-real-preview.html?page=album。保留其它聊天未提交改动和用户数据。</ns0:t>
+      </ns0:r>
+    </ns0:p>
+    <ns0:p>
+      <ns0:r>
+        <ns0:t>2026-10-05 相册统一搜索，本地候选未提交/推送/打包：图库/精选集放大镜共用独立搜索页；支持中文数字月份、年月日、YYYY-MM-DD/年-月、年份+地区/标题/分类、今年/去年/前年、春夏秋冬季（3-5/6-8/9-11/12-2月）。按记录拍摄日筛选、保留ISO原始拍摄日期，未知日期不使用上传时间替代；纯关键词仍可搜到未知日期照片。每账号最多12条去重最近搜索；清除只清查询词，不删除照片。最近查看/共享记录真实操作，最近编辑无记录时空置，不伪造功能。搜索结果复用图库排序、对象身份选择、删除、分享；索引转换到原始行，避免过滤/排序后错删；照片查看器限定搜索结果并返回搜索页。左下精选集玻璃按钮直接返回精选集且保留展开分类，右侧叉返回进入搜索前页。只改 photo-album.js 与末尾相册CSS，私人bundle同步，未改共享 app.js。专项42/42通过，新增年月日/组合词/原始日期/账号隔离/历史上限和清除/过滤选图删除/真实最近操作检查。浏览器验证2026年旅程2个结果、蓝勾选择、进入共用分享页、排序菜单、左下返回精选集；无真人发送。截图 .codex_tmp/eight-chat/photo-album-search-home.jpg、photo-album-search-results.jpg、photo-album-search-selection.jpg；预览 http://photosearch.localhost:8787/theme-real-preview.html?page=album。本轮未重跑全套或正常聊天门禁（共享聊天核心未改）；上一轮完整套件31失败和相册Blob备份/导入/云备份保护未完成仍为发布阻断。Mac/iPhone/系统键盘未验证；没有伪造系统键盘或录音按钮，输入框使用真实系统键盘。保留用户照片、其它聊天未提交改动、历史源码和安装包。</ns0:t>
+      </ns0:r>
+    </ns0:p>
+    <ns0:p>
+      <ns0:r>
+        <ns0:t>2026-10-05 搜索框微调：删除右侧重复提交放大镜，只保留输入框左侧装饰放大镜。保留真实 type=search / enterkeyhint=search / form submit，手机点输入框使用系统键盘，键盘搜索或桌面Enter提交；未做自绘键盘，真机唤起尚未实测。根目录和私人bundle相册同步；专项42/42通过，未提交推送。</ns0:t>
+      </ns0:r>
+    </ns0:p>
+    <ns0:p>
+      <ns0:r>
+        <ns0:t>2026-10-05 精选集三点分类上传菜单：改为液态磨砂浮层，七行分类+右侧上传，只取参考样式，不加入参考中的布局/全部显示/折叠/重新排序。用户点击分类直接触发原生 file input 图片多选；选好后复用原分类上传页，自动带入指定分类和文件，原图/缩略图/可选标题地区日期保存逻辑不改。取消文件选择不上传，账号切换阻止旧选择器结果写入；菜单外点击关闭，进入图库/搜索收起。仅 photo-album.js、相册末尾CSS及专项测试变动，根/私人bundle相册字节一致，不覆盖差异 app.js。专项44/44通过；浏览器实际文件选择器验证 multiple=true、人物与宠物正确带入、已选择1张演示照片，未保存演示文件、未碰用户照片。截图 .codex_tmp/eight-chat/photo-album-category-upload-menu.jpg；预览 http://photocategories.localhost:8787/theme-real-preview.html?page=album。照片详情的收藏/信息/编辑/单图删除及个人头像设置仍为预览，不能称所有按钮功能完成。未提交/推送/打包，未做Mac/iPhone验证；原完整测试失败和Blob备份发布阻断继续保留。</ns0:t>
+      </ns0:r>
+    </ns0:p>
+    <ns0:p>
+      <ns0:r>
+        <ns0:t>2026-10-05 相册软件图标四主题：使用内置image_gen分别参考 assets/app-icons/glass/{blue,pink,gray,black}/aiaccount.webp，提示保留原主题调色、透明圆角、细白双高光、玻璃材质，仅以叠放照片/山峰太阳替换人头网络图。四张1254x1254 RGBA PNG分别落在同目录 album.png，私人bundle逐文件同字节同步；原aiaccount图不删除。appIconPackAsset仅album分支改指各主题PNG?v=album20261005，用户自定义图优先级不改，不整文件覆盖根/私人app.js差异。四图共约6.10MB源文件，未做有损压缩，单主题仅加载对应图；后续发布可另优化资源大小，不能宣称与旧图逐像素颜色一致，模型重绘高光渐变/中央几何有差异，已告知用户。专项相册+玻璃+主题86/86通过；原全测/Blob备份发布阻断仍在，未做Mac/真机。四图预览 http://photocategories.localhost:8787/theme-real-preview.html?page=album-icons；截图 .codex_tmp/eight-chat/photo-album-theme-icons.jpg。内置生成提示规范：保留各原图配色/玻璃框，中央两张照片山峰太阳，白边，无头脑网络/文字/额外logo/新色，真实透明角。未提交、推送、打包，保留原生成文件和用户其它改动。</ns0:t>
+      </ns0:r>
+    </ns0:p>
+    <ns0:p>
+      <ns0:r>
+        <ns0:t>2026-10-05 相册与当前情侣联动（本地未发布）：移除情侣空间旧共同相册展示，改为管控授权页的相册权限与相册入口；权限默认关闭，绑定当前情侣ID和主账号，角色不能通过远控自行开启照片权限。LOCKABLE、首页启动、直达页面、限时页面映射加入album/相册，迁移旧aiaccount管控键。旧照片以原引用迁入共享相簿，保留旧源码数据，legacyImported防止删除后复活。聊天[存共同相册|一句话]仅当前授权情侣有效，保存到共享相簿并显示提示；上传照片逐张真实识图+角色外置聊天线路生成简短留言，显示头像/名字，失败可重试，撤权/换情侣/换账号/删除照片后迟到结果丢弃。支持[回忆相册|照片ID|留言]，仅已有识图照片生成可点回原照片的聊天卡片。正常网页及私人HTML的受控聊天回归通过，pageErrors=0；相册专项及既有v1008相册契约更新加远控回归共153/153通过；截图均为隔离演示数据和模型桩，不是实际外置模型或真机证明。未提交、未推送、未升版本、未生成安装包。原相册Blob备份/导入/云备份等发布收尾及既有AI退役全套测试失败仍需单独完成，不能冒充已发布。 角色主动存图等待saveNowAsync确认才提示成功，存储失败回滚；网页和私人主聊天各自await异步保存标签消费，不能整文件覆盖两份app.js；最终全套3275项，3244通过、31个既有退役/版本/发布守卫失败。</ns0:t>
+      </ns0:r>
+    </ns0:p>
+    <ns0:p>
+      <ns0:r>
+        <ns0:t>2026-10-05 相册来源与批量角色知情，本地候选未发布：上传记录uploadedBy，角色保存记录savedBy，分享图片消息带_albumShare快照。微信事实摘要与角色群摘要明确相册分类、上传者和保存者，不将保存/上传误认为拍摄。旧记录来源未知时明确未知。角色再次保存现有相册分享图复用原行，不复制照片；删除的相册引用不能悄悄复原。成功识图写入照片元数据，共享WeakMap任务防止留言/分享并发重复识图，失败允许重试；后续分享/留言/回忆复用描述。每批上传逐张留言，完成后一次微信通知；批量删除一次通知，仅数量不继续提供已删除画面。通知绑定权限对象/epoch/角色/账号，排队及模型返回阶段验证，关闭后再打开不会恢复旧事件。回忆只允许正常用户聊天的明确请求或有限可核实主题匹配，一轮一张；非明确请求7日内不重复，后台功能事件不发回忆卡。删除保留已发微信副本和历史聊天，删除相册记录/识图/留言，旧迁移数据保留恢复且有防复活标记。170项相册/远控/普通图片删除/安卓语法回归通过；真实网页和私人HTML入口受控聊天回归通过，pageErrors=0；全套3285项3254通过31个既有失败，仍非全测通过。相册Blob备份/导入/云备份收尾及AI退役历史测试/发布标记仍为发布阻断。网页/私人相册模块字节一致，app.js保留差异仅改相关消费者；未升版本、未提交、未推送、未打包、未做Mac或真机/实际外置模型验证。隔离模型桩预览与截图用于核对界面，不能证明真实角色口吻或真人发送。</ns0:t>
+      </ns0:r>
+    </ns0:p>
+    <ns0:p>
+      <ns0:r>
+        <ns0:t>2026-10-05 角色相册分类与长按换组（本地未发布）：角色保存支持[存共同相册|分类|留言]，允许七个现有分组，复用已有画面描述不新增分类识图请求；旧无分类标签保留兼容，确定的宠物/人像/旅行描述可作保守回退，不明内容仍入共享相簿。照片创建记录categoryBy=role/user；再次保存已有行不改位置，用户手动移动优先，微信来源快照明确“分享时分类”与当前分类区分。图库、精选集分类卡、搜索结果照片支持450ms长按，显示磨砂分组面板和拖动缩略图，目标高亮，松手后持久保存；也可直接点分组或取消。未激活前移动超过10px取消长按，保留正常滑动；多触点/取消/失效账号或记录取消拖动，松手到面板外保留可点选菜单且不继续抢移动事件。photoAlbumMove只改分类元数据，保留原图/缩略图、拍摄时间、缓存识图、留言和上传保存来源；移出旧多分类，保存失败或账号变化回滚，既有情侣授权开启时一次功能事件同步新位置。浏览器鼠标长按/目标蓝色高亮/松手实际移入旅程及总数不变已验证；iPhone触摸手感未验证（当前预览工具不支持触摸输入模拟），真实模型分类准确率未验证。182项相关回归通过，网页和私人HTML普通聊天受控回归通过/pageErrors=0；全套3297项3266通过31个既有失败，发布阻断未消除。网页和私人photo-album.js字节一致，app.js仅保存标签消费者最小同步，维护既有差异。未提交、未推送、未升版本、未打包。预览http://albummove.localhost:8787/theme-real-preview.html?page=album；截图.codex_tmp/eight-chat/photo-album-move-group.jpg。原相册Blob备份/导入/云备份、既有AI退役测试和发布标记收尾仍未完成。</ns0:t>
+      </ns0:r>
+    </ns0:p>
+    <ns0:p>
+      <ns0:r>
+        <ns0:t>2026-10-05 网页发布候选 v1572 / 私人源码 v1573 收尾：相册原图 Blob 在完整快照/文件流备份中导出为标准 DataURL，导入沿用已有图片转换，不修改现场 album 引用；缺少原图明确中止备份。新增测试验证原始字节、元数据和丢图拒绝；四主题相册图标进入离线缓存。AI账户浏览器模块和内置语音/字幕按用户要求退役，历史后端及管理记录保留，相关过时断言改为禁用/缺失检查，未放宽仍有效的外置语音、聊天和永久修复守卫。最近并行聊天已完成的角色微信/通讯录/电话短信/旅行只读页面、数据刷新、朋友圈发布提醒同步纳入当前工作树。旧外卖候选及独立原生/机器人/3D现场保留，不用旧整库覆盖当前代码。整仓3313项全部通过；网页和私人HTML实际授权聊天受控HTTP测试通过，pageErrors=0。私人仅源码同步，iOS1.0.439/build439、原生桥42不变；没有新安装包，没有Mac编译、真机或真实模型验证。发表、权限、角色来源/分类、批量通知/缓存识图/防复活与只读订单沿用当前测试约束；头像设置、单图收藏/编辑/信息等预览按钮不宣称已实现。Git/部署结果以此次提交及线上文件核对为准。</ns0:t>
       </ns0:r>
     </ns0:p>
     <ns0:sectPr ns0:rsidR="00FC693F" ns0:rsidRPr="0006063C" ns0:rsidSect="00034616">

</xml_diff>

<commit_message>
fix: release web v1574 album favorites and safe role likes
</commit_message>
<xml_diff>
--- a/docs/maintenance/AI开发项目_Bug修改规范.docx
+++ b/docs/maintenance/AI开发项目_Bug修改规范.docx
@@ -12014,6 +12014,26 @@
     <ns0:p>
       <ns0:r>
         <ns0:t>2026-10-05 网页发布候选 v1572 / 私人源码 v1573 收尾：相册原图 Blob 在完整快照/文件流备份中导出为标准 DataURL，导入沿用已有图片转换，不修改现场 album 引用；缺少原图明确中止备份。新增测试验证原始字节、元数据和丢图拒绝；四主题相册图标进入离线缓存。AI账户浏览器模块和内置语音/字幕按用户要求退役，历史后端及管理记录保留，相关过时断言改为禁用/缺失检查，未放宽仍有效的外置语音、聊天和永久修复守卫。最近并行聊天已完成的角色微信/通讯录/电话短信/旅行只读页面、数据刷新、朋友圈发布提醒同步纳入当前工作树。旧外卖候选及独立原生/机器人/3D现场保留，不用旧整库覆盖当前代码。整仓3313项全部通过；网页和私人HTML实际授权聊天受控HTTP测试通过，pageErrors=0。私人仅源码同步，iOS1.0.439/build439、原生桥42不变；没有新安装包，没有Mac编译、真机或真实模型验证。发表、权限、角色来源/分类、批量通知/缓存识图/防复活与只读订单沿用当前测试约束；头像设置、单图收藏/编辑/信息等预览按钮不宣称已实现。Git/部署结果以此次提交及线上文件核对为准。</ns0:t>
+      </ns0:r>
+    </ns0:p>
+    <ns0:p>
+      <ns0:r>
+        <ns0:t>2026-10-05 相册闪图与照片信息编辑，本地候选（当前线上仍v1572、私人源码发布基线v1573，未提交推送）：分类蓝色箭头仅替换目标分组，不重绘其他照片；album Blob图片HTML直接复用现有对象URL，IntersectionObserver只释放本次真正离开可见区域且没有其他使用节点的地址，保持离屏内存释放。分享选照片/联系人只更新勾选和标题，发送中和逐条状态不重建图片；全部成功后清空分享/查看/搜索/选择状态并返回图库，失败或未知回执保留结果和去重。头像改为无点击行为展示元素。查看页右上三个点原位弹出液态磨砂编辑框，日期与时间须一起填写或一起留空，地点/标题120字；保存更新takenAt、地点、标题、lastEditedAt及metadataBy=user，不修改图片、缓存识图、留言、来源及分类；错误保存回滚，账号和照片存在性检查。完成只更新当前日期和标题地点，不重建大图。测试验证非法日期、保存失败回滚、账号隔离、原图和缓存/来源保留、现有对象URL首屏直接复用，以及分享成功回图库。受控本地浏览器手机尺寸操作编辑保存、分享角色及自动回图库通过；演示图片/联系人/模型桩，未向真实好友发送。截图复用本轮photo-album-metadata.jpg及photo-album-metadata-saved.jpg，预览albumedit.localhost:8787/theme-real-preview.html?page=album。整仓3317通过、网页/私人授权聊天受控检查pageErrors=0；真实iPhone闪动是否彻底消失仍未实测。网页和私人相册模块相同，保留两侧CSS原有差异；无新工作树/包/脚本，只有用户要求的两张截图和既有测试记录。</ns0:t>
+      </ns0:r>
+    </ns0:p>
+    <ns0:p>
+      <ns0:r>
+        <ns0:t>2026-10-05 本地待预览（未提交、未推送）：相册新增“我的喜欢”自动集合，用户收藏与角色喜欢独立保存，有任一爱心即显示，保留原分类。角色只在现有留言/相关相册聊天中决定点赞，仅情侣且相册授权有效；使用已缓存成功识别，不新增图片识别请求，撤权/跨账号/保存失败阻断或回滚。上传日期时间输入已约束宽度，430与320宽浏览器检查不越界。3323/3323 Node测试通过，网页和私人源码正常授权聊天检查通过、页面错误0。截图角色喜欢为本地模拟模型回复；未做Mac编译、iPhone真机或真实外置模型验收。上一轮元数据编辑、闪烁与分享回图库修改仍保留。</ns0:t>
+      </ns0:r>
+    </ns0:p>
+    <ns0:p>
+      <ns0:r>
+        <ns0:t>2026-10-05 本地相册分类入口（未提交、未推送）：详情底部ⓘ照片信息按钮禁用，保留外观且无提示；调节图标改为调整照片分类。photoAlbumEditOpen(category)/photoAlbumCategoryHTML/Save复用元数据磨砂弹框和photoAlbumMove，七个手动分类单选、当前分类说明、完成保存/取消；我的喜欢仍为派生爱心集合，不作手动移动目标。Move新增keepViewer可选项，原长按路径不变，新入口保存不重绘大图；保留原图、缓存识图、留言、爱心、时间地点及来源，沿用移动通知与存储回滚/账号隔离。新增网页与私人运行回归验证失败重试、不重绘、字段保留；91项相关测试、3325项全套通过，网页及私人HTML实际正常授权聊天受控测试通过/pageErrors=0。本地浏览器真实点击从回忆移入旅程、图库15张不变及禁用按钮可访问状态已验证；演示照片/接口受控，不是真实模型、Mac或iPhone验收。新截图photo-album-category-picker.jpg及photo-album-category-saved.jpg位于既有.codex_tmp/eight-chat。保留先前未提交修改及其他现场，未升版本或打包。</ns0:t>
+      </ns0:r>
+    </ns0:p>
+    <ns0:p>
+      <ns0:r>
+        <ns0:t>2026-10-05 网页v1574发布检查：用户授权复查并推送。私人同步源码v1575，iOS1.0.439/build439/桥42不变，本次不生成私人安装包。包含相册分类展开/分享闪图修复、分享全部成功回图库、装饰头像、原位日期时间/地点标题编辑、上传日期框宽度、独立用户收藏与角色喜欢/我的喜欢自动集合、禁用ⓘ与详情分类调节入口。重点复查点赞补充：主动事件传入空用户文本时，旧分享图片不能产生无关点赞；用户与角色保存锁分开，避免同时喜欢被互相阻挡；保存失败回滚后安排保存。情侣权限关闭、账号变化、记录删除、未知或识图失败照片拒绝角色喜欢，成功识图缓存复用，用户取消不删角色记录，角色没有喜欢标签则不自动点赞。新并发/旧分享/删除回归及永久继承守卫纳入测试；最终整仓3328/3328通过，网页及私人HTML真实正常授权聊天受控测试通过，pageErrors=0。先前浏览器真实点选、取消收藏、角色演示、分类保存、日期430/320宽检查通过。外置模型自主偏好准确率、iPhone闪动/原生日期控件、Mac编译未验收，不能用Windows结果替代。来源以Git提交/Pages运行及线上字节核对为准；无其他工作区覆盖、无清理历史源码/包或签名配置。</ns0:t>
       </ns0:r>
     </ns0:p>
     <ns0:sectPr ns0:rsidR="00FC693F" ns0:rsidRPr="0006063C" ns0:rsidSect="00034616">

</xml_diff>

<commit_message>
build: validate complete private v1575 iOS439 overlay delivery
</commit_message>
<xml_diff>
--- a/docs/maintenance/AI开发项目_Bug修改规范.docx
+++ b/docs/maintenance/AI开发项目_Bug修改规范.docx
@@ -12034,6 +12034,11 @@
     <ns0:p>
       <ns0:r>
         <ns0:t>2026-10-05 网页v1574发布检查：用户授权复查并推送。私人同步源码v1575，iOS1.0.439/build439/桥42不变，本次不生成私人安装包。包含相册分类展开/分享闪图修复、分享全部成功回图库、装饰头像、原位日期时间/地点标题编辑、上传日期框宽度、独立用户收藏与角色喜欢/我的喜欢自动集合、禁用ⓘ与详情分类调节入口。重点复查点赞补充：主动事件传入空用户文本时，旧分享图片不能产生无关点赞；用户与角色保存锁分开，避免同时喜欢被互相阻挡；保存失败回滚后安排保存。情侣权限关闭、账号变化、记录删除、未知或识图失败照片拒绝角色喜欢，成功识图缓存复用，用户取消不删角色记录，角色没有喜欢标签则不自动点赞。新并发/旧分享/删除回归及永久继承守卫纳入测试；最终整仓3328/3328通过，网页及私人HTML真实正常授权聊天受控测试通过，pageErrors=0。先前浏览器真实点选、取消收藏、角色演示、分类保存、日期430/320宽检查通过。外置模型自主偏好准确率、iPhone闪动/原生日期控件、Mac编译未验收，不能用Windows结果替代。来源以Git提交/Pages运行及线上字节核对为准；无其他工作区覆盖、无清理历史源码/包或签名配置。</ns0:t>
+      </ns0:r>
+    </ns0:p>
+    <ns0:p>
+      <ns0:r>
+        <ns0:t>2026-10-05 用户确认只打包发布小手机已完成内容：网页v1574/私人源码v1575，运行源码a4084255482eea0d064cbe375bebc3ab342cda29已线上14项逐字节重新核验，3328/3328自动测试及双入口授权聊天证据有效。复用既有打包脚本，补齐相册与AI账户退役核验、上一份v1571覆盖包完整清单/哈希和原生签名继承检查，修正文档旧网页版本及测试数字；只忽略CSS空白行，私人性能保护原文仍须完整保留。准备交付最新私人版本覆盖包_v1575_iOS439.zip，iOS1.0.439/build439/桥42；源码ZIP，非IPA，Mac编译与iPhone未验证。独立外卖、公版North、机器人、小家候选按用户确认不纳入，保护其现场；不新建脚本/工作树，不更改运行代码。</ns0:t>
       </ns0:r>
     </ns0:p>
     <ns0:sectPr ns0:rsidR="00FC693F" ns0:rsidRPr="0006063C" ns0:rsidSect="00034616">

</xml_diff>

<commit_message>
fix: release web v1576 swipe dismiss notifications and nearby couple controls
</commit_message>
<xml_diff>
--- a/docs/maintenance/AI开发项目_Bug修改规范.docx
+++ b/docs/maintenance/AI开发项目_Bug修改规范.docx
@@ -12039,6 +12039,11 @@
     <ns0:p>
       <ns0:r>
         <ns0:t>2026-10-05 用户确认只打包发布小手机已完成内容：网页v1574/私人源码v1575，运行源码a4084255482eea0d064cbe375bebc3ab342cda29已线上14项逐字节重新核验，3328/3328自动测试及双入口授权聊天证据有效。复用既有打包脚本，补齐相册与AI账户退役核验、上一份v1571覆盖包完整清单/哈希和原生签名继承检查，修正文档旧网页版本及测试数字；只忽略CSS空白行，私人性能保护原文仍须完整保留。准备交付最新私人版本覆盖包_v1575_iOS439.zip，iOS1.0.439/build439/桥42；源码ZIP，非IPA，Mac编译与iPhone未验证。独立外卖、公版North、机器人、小家候选按用户确认不纳入，保护其现场；不新建脚本/工作树，不更改运行代码。</ns0:t>
+      </ns0:r>
+    </ns0:p>
+    <ns0:p>
+      <ns0:r>
+        <ns0:t>2026-10-05 网页v1576 / 私人同步源码v1577：新增顶部消息横幅上滑28px且以纵向为主时立即关闭，清理旧自动隐藏计时、阻止滑动后的误点；轻点打开聊天与原自动消失保持，水平/下滑不关闭，新通知替换中取消旧手势，Pointer Events仅绑定通知框，消息/未读/存档不改。情侣空间软件管控新增nearby=附近的人，默认未授权；动态授权列表、模型锁解锁名称、远程管控权限列表及curAppKey计时复用；微信发现显示锁态，openApp及直接go入口、已打开页面、刷新/添加/附近列表打开均检查锁，既有已发好友申请继续原逻辑，不删除好友。通过真实网页与私人HTML受控Edge浏览器验证上滑/轻点/水平滑动/新通知、默认拒绝/非情侣拒绝/授权锁定解锁/撤权清锁/入口及刷新无模型调用/持久化，以及原正常聊天授权存档/输出模式/手动回复/查手机/pageErrors=0；3329/3329全量测试通过。新增永久继承守卫。微信权限关闭通知被测试隔离，避免其异步回复污染正常聊天断言；未修改正式撤权行为。共享两侧保留原生差异，iOS1.0.439/build439/桥42不变，未生成新的私人包，未Mac编译或真机手势验收。版本与缓存标记同步，旧私人恢复页和说明版本一并对齐；独立项目候选与原11项行尾现场保留，无新工作树/源码副本/脚本/截图。部署结果以提交与实际线上文件核对为准。</ns0:t>
       </ns0:r>
     </ns0:p>
     <ns0:sectPr ns0:rsidR="00FC693F" ns0:rsidRPr="0006063C" ns0:rsidSect="00034616">

</xml_diff>

<commit_message>
build: prepare private v1577 iOS439 complete overlay package
</commit_message>
<xml_diff>
--- a/docs/maintenance/AI开发项目_Bug修改规范.docx
+++ b/docs/maintenance/AI开发项目_Bug修改规范.docx
@@ -12044,6 +12044,11 @@
     <ns0:p>
       <ns0:r>
         <ns0:t>2026-10-05 网页v1576 / 私人同步源码v1577：新增顶部消息横幅上滑28px且以纵向为主时立即关闭，清理旧自动隐藏计时、阻止滑动后的误点；轻点打开聊天与原自动消失保持，水平/下滑不关闭，新通知替换中取消旧手势，Pointer Events仅绑定通知框，消息/未读/存档不改。情侣空间软件管控新增nearby=附近的人，默认未授权；动态授权列表、模型锁解锁名称、远程管控权限列表及curAppKey计时复用；微信发现显示锁态，openApp及直接go入口、已打开页面、刷新/添加/附近列表打开均检查锁，既有已发好友申请继续原逻辑，不删除好友。通过真实网页与私人HTML受控Edge浏览器验证上滑/轻点/水平滑动/新通知、默认拒绝/非情侣拒绝/授权锁定解锁/撤权清锁/入口及刷新无模型调用/持久化，以及原正常聊天授权存档/输出模式/手动回复/查手机/pageErrors=0；3329/3329全量测试通过。新增永久继承守卫。微信权限关闭通知被测试隔离，避免其异步回复污染正常聊天断言；未修改正式撤权行为。共享两侧保留原生差异，iOS1.0.439/build439/桥42不变，未生成新的私人包，未Mac编译或真机手势验收。版本与缓存标记同步，旧私人恢复页和说明版本一并对齐；独立项目候选与原11项行尾现场保留，无新工作树/源码副本/脚本/截图。部署结果以提交与实际线上文件核对为准。</ns0:t>
+      </ns0:r>
+    </ns0:p>
+    <ns0:p>
+      <ns0:r>
+        <ns0:t>2026-10-05 用户授权打包私人v1577/iOS1.0.439/build439/桥42，包含已发布网页v1576的通知横幅上滑关闭和附近的人情侣管控，以及全部既有已完成内容。复用现有打包脚本，读取Git已提交文件，上一份v1575包SHA256=afe34846bb83122923fd12e170277534c7a1d06771f96fd481815384bb73c725；校验完整清单、哈希、无文件遗漏、原生及签名不变、相册/本轮功能标记、两个私人入口及云备份/小家继承。运行源e882562dd81d9d0b34d51b5bceed34a227b83e1b全套3329/3329及双入口浏览器聊天/手势/管控/持久化通过，HTTP模拟，非真机。仅更新打包配置与维护说明，不修改运行代码；交付一个最新私人版本覆盖包_v1577_iOS439.zip，ZIP非IPA，Mac签名编译/iPhone仍未验收。原11项行尾现场、独立候选和历史包保留，无新脚本/工作树/临时解压目录。</ns0:t>
       </ns0:r>
     </ns0:p>
     <ns0:sectPr ns0:rsidR="00FC693F" ns0:rsidRPr="0006063C" ns0:rsidSect="00034616">

</xml_diff>

<commit_message>
feat: direct Screen Time shortcut uploads and owner-scoped cloud reads v1580
</commit_message>
<xml_diff>
--- a/docs/maintenance/AI开发项目_Bug修改规范.docx
+++ b/docs/maintenance/AI开发项目_Bug修改规范.docx
@@ -12049,6 +12049,11 @@
     <ns0:p>
       <ns0:r>
         <ns0:t>2026-10-05 用户授权打包私人v1577/iOS1.0.439/build439/桥42，包含已发布网页v1576的通知横幅上滑关闭和附近的人情侣管控，以及全部既有已完成内容。复用现有打包脚本，读取Git已提交文件，上一份v1575包SHA256=afe34846bb83122923fd12e170277534c7a1d06771f96fd481815384bb73c725；校验完整清单、哈希、无文件遗漏、原生及签名不变、相册/本轮功能标记、两个私人入口及云备份/小家继承。运行源e882562dd81d9d0b34d51b5bceed34a227b83e1b全套3329/3329及双入口浏览器聊天/手势/管控/持久化通过，HTTP模拟，非真机。仅更新打包配置与维护说明，不修改运行代码；交付一个最新私人版本覆盖包_v1577_iOS439.zip，ZIP非IPA，Mac签名编译/iPhone仍未验收。原11项行尾现场、独立候选和历史包保留，无新脚本/工作树/临时解压目录。</ns0:t>
+      </ns0:r>
+    </ns0:p>
+    <ns0:p>
+      <ns0:r>
+        <ns0:t xml:space="preserve">2026-10-05 网页v1580 / 私人同步源码v1581：用户明确要求免复制粘贴，新增快捷指令直接上传。复用phone-shortcuts云函数和原SQL文件扩展独立phone_screen_sources表；上传token仅保存哈希，管理和读取沿用已配对主人鉴权，按云、账号、客户端及角色隔离，重建失效旧token，撤销清除最新快照。只保存最新一份，不触发模型；空名称（可能为网站活动）自动跳过并显示数量，保留0和毫秒，不合计App/网站总时长。情侣空间生成专用URL/action/token/text配置，上传成功返回ok:true；网页可见时每分钟读取，角色聊天前等待最新读取，失败明确标记旧缓存，保留原手动导入及North/私人原生数据。手机须用户一次性配置获取URL内容POST JSON和系统定时立即运行，锁屏自动化及更新频率仍需iPhone实测，不冒充实时唤醒。iOS439/桥42不变，不打包。专项及云事务回滚隔离/撤销测试通过，实际网页/私人HTML配置、读取、停止及普通授权聊天受控Edge验证通过；首次读取后页面不刷新由错误路由变量_page导致，改为cur().p，只刷新情侣页；冷重新打开测试的授权门遮挡先恢复隔离夹具状态。全量最终以固定full-tests.log为准；上线HTTP测试与Pages字节核对以实际结果为准。维护资料仅追加，不改历史，Word视觉未验证。</ns0:t>
       </ns0:r>
     </ns0:p>
     <ns0:sectPr ns0:rsidR="00FC693F" ns0:rsidRPr="0006063C" ns0:rsidSect="00034616">

</xml_diff>

<commit_message>
fix: wire single photo viewer deletion in web v1582
</commit_message>
<xml_diff>
--- a/docs/maintenance/AI开发项目_Bug修改规范.docx
+++ b/docs/maintenance/AI开发项目_Bug修改规范.docx
@@ -12054,6 +12054,11 @@
     <ns0:p>
       <ns0:r>
         <ns0:t xml:space="preserve">2026-10-05 网页v1580 / 私人同步源码v1581：用户明确要求免复制粘贴，新增快捷指令直接上传。复用phone-shortcuts云函数和原SQL文件扩展独立phone_screen_sources表；上传token仅保存哈希，管理和读取沿用已配对主人鉴权，按云、账号、客户端及角色隔离，重建失效旧token，撤销清除最新快照。只保存最新一份，不触发模型；空名称（可能为网站活动）自动跳过并显示数量，保留0和毫秒，不合计App/网站总时长。情侣空间生成专用URL/action/token/text配置，上传成功返回ok:true；网页可见时每分钟读取，角色聊天前等待最新读取，失败明确标记旧缓存，保留原手动导入及North/私人原生数据。手机须用户一次性配置获取URL内容POST JSON和系统定时立即运行，锁屏自动化及更新频率仍需iPhone实测，不冒充实时唤醒。iOS439/桥42不变，不打包。专项及云事务回滚隔离/撤销测试通过，实际网页/私人HTML配置、读取、停止及普通授权聊天受控Edge验证通过；首次读取后页面不刷新由错误路由变量_page导致，改为cur().p，只刷新情侣页；冷重新打开测试的授权门遮挡先恢复隔离夹具状态。全量最终以固定full-tests.log为准；上线HTTP测试与Pages字节核对以实际结果为准。维护资料仅追加，不改历史，Word视觉未验证。</ns0:t>
+      </ns0:r>
+    </ns0:p>
+    <ns0:p>
+      <ns0:r>
+        <ns0:t xml:space="preserve">2026-10-05 网页v1582 / 私人同步源码v1583：单张照片查看页垃圾桶仍调用photoAlbumPreviewAction导致只显示功能待完善，现接入photoAlbumDeleteCurrent并复用photoAlbumDeleteSelected的持久化、引用保护及情侣删除通知。直接删除当前照片，同组有剩余时保持顺序显示下一张（末尾选前一张），最后一张删除后返回图库；当前账号过滤同步作用于分类、搜索及我的喜欢，保留其他账号、共享引用和聊天图片。保存失败恢复原记录，不清原图；删除过程中阻止重复点击、切换和打开编辑框；账号切换后不能删除旧查看照片，迟到结果不能把已删照片恢复。两端旧实现新增回归均先失败，修复后相册专项95/95、全量3343/3343，真实网页和私人HTML正常聊天授权存档、输出模式、手动回复、自动查手机、持久化pageErrors=0。浏览器接口受控模拟，非真实模型/Mac编译/iPhone验收。维护资料只追加；版本测试机械对齐可见版本与标题，不删除旧修复守卫。iOS1.0.439/build439/桥42不变，未打私人包。保留11项原行尾现场及其他工作区、历史包、签名，无新工作树、脚本或截图。</ns0:t>
       </ns0:r>
     </ns0:p>
     <ns0:sectPr ns0:rsidR="00FC693F" ns0:rsidRPr="0006063C" ns0:rsidSect="00034616">

</xml_diff>

<commit_message>
fix: include pre-delete photo facts in role notices web v1584
</commit_message>
<xml_diff>
--- a/docs/maintenance/AI开发项目_Bug修改规范.docx
+++ b/docs/maintenance/AI开发项目_Bug修改规范.docx
@@ -12059,6 +12059,11 @@
     <ns0:p>
       <ns0:r>
         <ns0:t xml:space="preserve">2026-10-05 网页v1582 / 私人同步源码v1583：单张照片查看页垃圾桶仍调用photoAlbumPreviewAction导致只显示功能待完善，现接入photoAlbumDeleteCurrent并复用photoAlbumDeleteSelected的持久化、引用保护及情侣删除通知。直接删除当前照片，同组有剩余时保持顺序显示下一张（末尾选前一张），最后一张删除后返回图库；当前账号过滤同步作用于分类、搜索及我的喜欢，保留其他账号、共享引用和聊天图片。保存失败恢复原记录，不清原图；删除过程中阻止重复点击、切换和打开编辑框；账号切换后不能删除旧查看照片，迟到结果不能把已删照片恢复。两端旧实现新增回归均先失败，修复后相册专项95/95、全量3343/3343，真实网页和私人HTML正常聊天授权存档、输出模式、手动回复、自动查手机、持久化pageErrors=0。浏览器接口受控模拟，非真实模型/Mac编译/iPhone验收。维护资料只追加；版本测试机械对齐可见版本与标题，不删除旧修复守卫。iOS1.0.439/build439/桥42不变，未打私人包。保留11项原行尾现场及其他工作区、历史包、签名，无新工作树、脚本或截图。</ns0:t>
+      </ns0:r>
+    </ns0:p>
+    <ns0:p>
+      <ns0:r>
+        <ns0:t xml:space="preserve">2026-10-05 网页v1584 / 私人同步源码v1585：用户反馈角色不知道删除哪张照片。根因为删除调用传空rows且通知只含数量，删除后也不能再从当前相册读取被删记录。新增photoAlbumDeleteSnapshot，在移除记录前按当前情侣权限/账号/角色所属过滤，快照只含ID、标题/名称、分类、地点、有效拍摄时间和成功识别的描述，无图片URL、原图或二次识图；最多20张、每字段限长，额外张数只告知明细未提供，未知画面不能猜。持久化成功且原情侣授权上下文仍有效后传入一次删除通知，明确这些是删除前事实，不能作为当前相册记忆、恢复/保存或回忆卡。保存失败、账号切换、撤权及其他角色私密内容不通知或不泄漏；不保留额外照片记录。新增两端回归先在旧实现失败，再验证已识别/未识别/批量一次/描述快照/图片来源不泄露/其他角色账号隔离/保存失败/等待撤权。相册97/97，全量3346/3346，实际网页与私人HTML正常聊天授权存档、输出模式、手动回复、自动查手机及持久化pageErrors=0。HTTP受控模拟，角色实际自然措辞仍需用户真实接口验证，非Mac编译或iPhone验收。iOS1.0.439/build439/桥42不变，无新安装包；原11项行尾现场、独立候选、签名和历史包保留，本轮无新脚本/工作树/截图或临时文件。维护资料只追加，Word视觉未验。</ns0:t>
       </ns0:r>
     </ns0:p>
     <ns0:sectPr ns0:rsidR="00FC693F" ns0:rsidRPr="0006063C" ns0:rsidSect="00034616">

</xml_diff>

<commit_message>
feat: recently deleted photo recovery web v1586 private v1587
</commit_message>
<xml_diff>
--- a/docs/maintenance/AI开发项目_Bug修改规范.docx
+++ b/docs/maintenance/AI开发项目_Bug修改规范.docx
@@ -12064,6 +12064,16 @@
     <ns0:p>
       <ns0:r>
         <ns0:t xml:space="preserve">2026-10-05 网页v1584 / 私人同步源码v1585：用户反馈角色不知道删除哪张照片。根因为删除调用传空rows且通知只含数量，删除后也不能再从当前相册读取被删记录。新增photoAlbumDeleteSnapshot，在移除记录前按当前情侣权限/账号/角色所属过滤，快照只含ID、标题/名称、分类、地点、有效拍摄时间和成功识别的描述，无图片URL、原图或二次识图；最多20张、每字段限长，额外张数只告知明细未提供，未知画面不能猜。持久化成功且原情侣授权上下文仍有效后传入一次删除通知，明确这些是删除前事实，不能作为当前相册记忆、恢复/保存或回忆卡。保存失败、账号切换、撤权及其他角色私密内容不通知或不泄漏；不保留额外照片记录。新增两端回归先在旧实现失败，再验证已识别/未识别/批量一次/描述快照/图片来源不泄露/其他角色账号隔离/保存失败/等待撤权。相册97/97，全量3346/3346，实际网页与私人HTML正常聊天授权存档、输出模式、手动回复、自动查手机及持久化pageErrors=0。HTTP受控模拟，角色实际自然措辞仍需用户真实接口验证，非Mac编译或iPhone验收。iOS1.0.439/build439/桥42不变，无新安装包；原11项行尾现场、独立候选、签名和历史包保留，本轮无新脚本/工作树/截图或临时文件。维护资料只追加，Word视觉未验。</ns0:t>
+      </ns0:r>
+    </ns0:p>
+    <ns0:p>
+      <ns0:r>
+        <ns0:t xml:space="preserve">2026-10-05 最近删除本地候选（未提交、未推送、未打包；线上仍v1584，私人源码发布基线v1585，iOS439/桥42）：精选集底部新增最近删除。所有相册删除入口将完整照片记录移入deletedItems，保留72小时，可恢复原分类、标题、拍摄时间、地点、识图缓存、评论及双方喜欢；恢复不重复识图。正常相册与角色当前相册记忆移除该照片，删除事件保留此前事实快照；恢复沿用情侣相册权限及账号隔离。到期先持久保存记录移除，再清理无其他引用的原图/缩略图；保存失败不删文件。账号隔离及删除/恢复/到期并发保护，关闭应用期间不会后台运行，到下次打开相册再清理过期内容。递归备份包含三天内可恢复记录和图片。3349/3349自动测试通过，网页与私人HTML受控正常授权聊天检查通过/pageErrors=0；本地浏览器使用独立演示照片实际验证删除、查看最近删除、恢复原分类，三张截图位于.codex_tmp/eight-chat/photo-album-deleted-entry.jpg、photo-album-recently-deleted.jpg、photo-album-restore-photo.jpg。未做Mac编译或手机真机验证。根目录与私人相册模块/CSS同步；保留其他工作区及11项既有换行现场，无版本变更、提交、推送、安装包或清理用户文件。</ns0:t>
+      </ns0:r>
+    </ns0:p>
+    <ns0:p>
+      <ns0:r>
+        <ns0:t xml:space="preserve">2026-10-05 用户授权只发布当前工作区已完成修复，不合入其他工作区候选：网页v1586、私人v1587/iOS1.0.439/build439/桥42。本轮最近删除已完成本地实际删除/恢复，保留72小时，恢复完整记录，到期先保存后清理无引用图片；保存失败、并发及账号隔离回归通过。最终版本对齐后3349/3349自动测试通过，双入口正常授权聊天受控浏览器检查通过/pageErrors=0，未Mac编译或iPhone验收。复用已有打包脚本，交付一个最新私人版本覆盖包_v1587_iOS439.zip；只从本次Git提交读取并核对上一交付包v1577的完整清单/哈希和原生签名文件。保留主线已经发布的历史功能，不读取其他工作区候选。发布与ZIP结果以部署运行/线上资源核对及SOURCE_STATE/SHA256SUMS为准。版本对齐时发现数字替换触及嵌入式图片及第三方库，已撤回这些纯数字替换并确认资源与原提交一致；最终测试在对齐完成后重跑通过。保护11项继承行尾现场、独立候选、历史包和签名，未新增脚本、工作树或临时解压目录。</ns0:t>
       </ns0:r>
     </ns0:p>
     <ns0:sectPr ns0:rsidR="00FC693F" ns0:rsidRPr="0006063C" ns0:rsidSect="00034616">

</xml_diff>

<commit_message>
Remove web manual Screen Time import, keep automatic upload v1588
</commit_message>
<xml_diff>
--- a/docs/maintenance/AI开发项目_Bug修改规范.docx
+++ b/docs/maintenance/AI开发项目_Bug修改规范.docx
@@ -12074,6 +12074,11 @@
     <ns0:p>
       <ns0:r>
         <ns0:t xml:space="preserve">2026-10-05 用户授权只发布当前工作区已完成修复，不合入其他工作区候选：网页v1586、私人v1587/iOS1.0.439/build439/桥42。本轮最近删除已完成本地实际删除/恢复，保留72小时，恢复完整记录，到期先保存后清理无引用图片；保存失败、并发及账号隔离回归通过。最终版本对齐后3349/3349自动测试通过，双入口正常授权聊天受控浏览器检查通过/pageErrors=0，未Mac编译或iPhone验收。复用已有打包脚本，交付一个最新私人版本覆盖包_v1587_iOS439.zip；只从本次Git提交读取并核对上一交付包v1577的完整清单/哈希和原生签名文件。保留主线已经发布的历史功能，不读取其他工作区候选。发布与ZIP结果以部署运行/线上资源核对及SOURCE_STATE/SHA256SUMS为准。版本对齐时发现数字替换触及嵌入式图片及第三方库，已撤回这些纯数字替换并确认资源与原提交一致；最终测试在对齐完成后重跑通过。保护11项继承行尾现场、独立候选、历史包和签名，未新增脚本、工作树或临时解压目录。</ns0:t>
+      </ns0:r>
+    </ns0:p>
+    <ns0:p>
+      <ns0:r>
+        <ns0:t>2026-10-05 网页v1588：用户明确只移除情侣空间手动粘贴的“屏幕使用时间 · 快捷指令导入”，保留自动上传。删除网页手动入口、预览保存和旧记录聊天注入；保留已有存档记录，自动上传解析、配置、读取、撤销及普通快捷指令自动化保持。私人源码/包/后台保持现状，不重新部署私人接口。复用原工作树与固定日志；验证结果看full-tests.log及部署核对。</ns0:t>
       </ns0:r>
     </ns0:p>
     <ns0:sectPr ns0:rsidR="00FC693F" ns0:rsidRPr="0006063C" ns0:rsidSect="00034616">

</xml_diff>

<commit_message>
feat: release v1589 WeChat favorites family sync and friend recovery
</commit_message>
<xml_diff>
--- a/docs/maintenance/AI开发项目_Bug修改规范.docx
+++ b/docs/maintenance/AI开发项目_Bug修改规范.docx
@@ -12079,6 +12079,41 @@
     <ns0:p>
       <ns0:r>
         <ns0:t>2026-10-05 网页v1588：用户明确只移除情侣空间手动粘贴的“屏幕使用时间 · 快捷指令导入”，保留自动上传。删除网页手动入口、预览保存和旧记录聊天注入；保留已有存档记录，自动上传解析、配置、读取、撤销及普通快捷指令自动化保持。私人源码/包/后台保持现状，不重新部署私人接口。复用原工作树与固定日志；验证结果看full-tests.log及部署核对。</ns0:t>
+      </ns0:r>
+    </ns0:p>
+    <ns0:p>
+      <ns0:r>
+        <ns0:t>2026-10-05 收藏音频必须与普通聊天缓存分离：不要通过speakMsg重放收藏，它可能在24小时过期后重新调用生成或用系统音色替代原声。收藏须复制已有实际音频，存储成功后才提示；缺原声不得静默生成。完整备份必须展开收藏/转发音频引用。转发保存稳定作者ID、原时间与代发来源，且必须在实际模型请求中核验，而非只看卡片UI。账号切换中止未完成收藏，保存失败回滚；保留手动回复与读回执。长按菜单提供收藏与引用，显式小⋯使入口可发现；用户要求撤销的复制条目要双端同步移除。</ns0:t>
+      </ns0:r>
+    </ns0:p>
+    <ns0:p>
+      <ns0:r>
+        <ns0:t>2026-10-05 微信收藏界面后续调整（本地候选，不推送）：按用户要求移除消息下方新增的小⋯按钮和对应样式；普通文字消息单击弹出现有操作框，收藏/引用保留，复制文字仍已移除。语音单击播放、长按收藏，避免改变原有播放行为。微信页面及其弹窗的sw/wx-switch开启背景统一#07c160绿色，关闭仍灰色；页面标记离开微信自动移除，不改变其他应用配色或已设置聊天气泡。网页与私人实际HTML验证黑白主题、角色聊天设置、聊天详情及弹窗开关颜色，置顶开关实际切换有效，气泡数据未变，其他应用未被染绿，pageErrors0。收藏双端重新验证正常文字点击菜单、语音长按收藏、独立原声播放、备份音频、转发作者来源和冷重开，TTS调用0。最终全量3353/3353通过。复用原六张截图并更新，新增用户要求的开关效果截图.codex_tmp/eight-chat/wechat-switches-green.png；截图使用隔离演示数据，非手机真机。维护文档只追加，无版本修改、提交、推送、打包或Mac/iPhone验收，保留并行修改及签名。</ns0:t>
+      </ns0:r>
+    </ns0:p>
+    <ns0:p>
+      <ns0:r>
+        <ns0:t>2026-10-05 微信绿色按钮补查（本地候选，未提交推送打包）：上一轮仅覆盖开关，核查发现通用btn.p保存/确认主按钮仍继承粉色，现网页及私人微信范围覆盖为#07c160，连同fab浮动按钮、粉色点赞选中/撤回按下状态、行内粉色minibtn和表单选择强调色。修正角色微信范围为真实hismoments及hisservices/hiswallet/hischange/hisbills/hisfavorites/hisalbum路由。颜色选择器粉色选项、用户气泡自定义、删除危险红色及其他应用配色不改。双实际HTML黑白主题各43页面共86页面状态扫描可见按钮计算背景/渐变/文字，未发现粉色按钮；弹窗保存和开关均绿色，实际置顶切换与样式保存有效，气泡数据未变，其他应用主按钮原状，pageErrors0。专项3/3、全量3353/3353通过，git diff --check通过。新增用户核查要求的实际弹窗截图.codex_tmp/eight-chat/wechat-buttons-green.png，仅隔离演示数据；非真机验证。维护资料只追加，沿用现有测试/预览/日志，保留并行修改与签名，无额外脚本或工作树。</ns0:t>
+      </ns0:r>
+    </ns0:p>
+    <ns0:p>
+      <ns0:r>
+        <ns0:t>2026-10-06 角色自主亲属与微信关系同步本地候选（网页/私人共有，未提交推送打包）：复用现有relNet人物卡/双向关系、hisWx联系人、spyRefresh真实刷新和既有relConsumeTags链路，增加每角色family配置及来源绑定、删除阻止记录、累计新增账本。历史已刷新微信联系人首次接入关系网不占自主新增额度；默认样例占位好友不自动捏人物。已关联的人物固定relKey，用户改名保留旧名alias，头像/人设/称谓以用户资料为准，后续刷新只关联及合并聊天，不覆盖。仅按同名不能跨角色自动认作同一人，有歧义跳过。默认自主新增3位、间隔7天，可按角色设置0至10位和1至365天；一个回复最多1位，主号限定，关闭/0、独生人设、已有同称谓、冷却、累计上限、已删除关系均阻止新增。当前仅允许父母祖父母兄弟姐妹，不自动新增配偶或子女，新增/同步人物转正后不递归扩张。普通私聊、既有群聊/线下关系标签消费链隐藏建立标签并实际创建人物卡，不额外调用模型生成。新建关系及推荐后关系赋值也检查唯一称谓，手动建立不占自主名额。旧HEAD复现亲妹妹/妹妹别名绕过原逐字唯一判断，改为REL_KIN别名同槽；删除关系/人物保留阻止记录，删除不返还累计自主额度，用户可显式允许重新同步。关系网总页新增每角色设置入口，角色关系页新增绿色开关/额度/间隔，关系编辑页可进入人物头像资料编辑。新数据随原S存档/备份保存，不更改资金、角色模型配置、原生签名或发布版本。新增两端行为测试覆盖历史迁移、别名合并、独立角色账本、证据和单回复限制、限额间隔、禁用/0/小号/独生/递归、删除与恢复、改名头像人设保留、同名歧义。初次全量发现新增可选链语法不支持旧安卓，改为兼容写法，不降低原启动测试；单函数提取的旧刷新测试通过可选能力检测保留。最终3367/3367通过，双实际HTML正常授权聊天/已有权限存档/模式/自动查手机/持久化门禁pageErrors0；实际普通回复HTTP模拟建立妹妹、隐藏标签、设置保存、人物改名头像人设、实际spyRefresh刷新、重复刷新去重、冷重开两端通过，非情侣角色路径也通过。模型HTTP模拟，不是真实模型/Mac/iPhone验收。保留3张授权步骤截图.codex_tmp/eight-chat/relation-family-01-network.png、relation-family-03-edit.png、relation-family-04-wechat.png；本轮截图02与01哈希完全一致，已只清理该重复新截图，其余旧证据/并行phone-shortcuts及public检查脚本修改/历史包/签名均保留。维护文档只追加，未新建工作树、源码副本、测试脚本、备份目录或安装包。</ns0:t>
+      </ns0:r>
+    </ns0:p>
+    <ns0:p>
+      <ns0:r>
+        <ns0:t>2026-10-06 真人好友间歇连接本地修复：主/备用只读探测并行最多15秒；sync/search网络、5xx、无效JSON在原总预算内仅备用一次且游标不变。消息和其他写请求不重发，结果未知仍唯一标识只读核对、不误退款；诊断仅白名单后台错误码。专项56、全量3383、两端实际HTML模拟500备用接收及正常授权聊天通过。未后台500根因核实、未服务部署、未Mac或真机验证、未提交推送打包。两个入口都不可达或同源数据库500不能靠客户端保证恢复。保留其他聊天全部现场，日志见README固定路径。</ns0:t>
+      </ns0:r>
+    </ns0:p>
+    <ns0:p>
+      <ns0:r>
+        <ns0:t xml:space="preserve">2026-10-06 已授权网页发布候选：网页v1589 / 私人同步源码v1590，微信收藏与亲属同步。包含角色文字/原声音频收藏、历史出处转发、移除复制文字项和消息三点入口、微信绿色按钮及开关、自主亲属限额/间隔/唯一称谓/去重/编辑资料与登录微信同步，以及已验证的网页屏幕时长自动上传卡片展开收起。沿用iOS439/bridge42，不制作安装包，不宣称Mac/iPhone验证。发布暂存区逐段保留已完成变更，真人聊天正在开发的好友网络重试/检测/诊断代码及其未完成测试留在工作区，本次不发布。版本、HTML资源、SW和hotfix缓存标记同步更新；既有私人v1587安装说明作为历史交付证据保留。此前两端实际浏览器功能与正常授权聊天检查通过；本次最终暂存快照回归及Pages/线上资源核验结果随发布记录追加。</ns0:t>
+      </ns0:r>
+    </ns0:p>
+    <ns0:p>
+      <ns0:r>
+        <ns0:t xml:space="preserve">2026-10-06 联合发布与打包授权：用户追加确认真人聊天修复已完成并要求一起打包推送，取代此前暂存候选排除未完成网络修复的范围。网页v1589 / 私人源码和覆盖包v1590 / iOS439 / bridge42。包含收藏原声音频与历史来源转发、微信绿色按钮、自主亲属限额间隔唯一称谓及头像资料同步、屏幕时长面板展开收起，以及真人好友主备用同时检测/只读同步500或中断切换一次/脱敏错误码/打开聊天不强制上传资料。写请求仍只提交一次，未知结果只读核对，不自动重发或错误退款。最终完整3384/3384通过；两端实际HTML功能和正常授权聊天受控测试通过，无收费模型或真人消息测试。复用既有打包脚本及Mac编译说明，从最终准确Git提交构建最新私人版本覆盖包_v1590_iOS439.zip，核对已交付v1587清单/哈希/原生签名与私有性能云备份继承，全文件解压回读；SOURCE_STATE明确未Mac编译/签名/真实iPhone验证。好友服务端500根因尚无后台记录，两个入口都不可达仍无法恢复。历史包、用户数据、其他工作树及继承行尾现场全部保留。部署成功及实际线上文件一致性另以发布操作证据为准。</ns0:t>
       </ns0:r>
     </ns0:p>
     <ns0:sectPr ns0:rsidR="00FC693F" ns0:rsidRPr="0006063C" ns0:rsidSect="00034616">

</xml_diff>

<commit_message>
docs: record verified v1591 private overlay package
</commit_message>
<xml_diff>
--- a/docs/maintenance/AI开发项目_Bug修改规范.docx
+++ b/docs/maintenance/AI开发项目_Bug修改规范.docx
@@ -12114,6 +12114,11 @@
     <ns0:p>
       <ns0:r>
         <ns0:t xml:space="preserve">2026-10-06 联合发布与打包授权：用户追加确认真人聊天修复已完成并要求一起打包推送，取代此前暂存候选排除未完成网络修复的范围。网页v1589 / 私人源码和覆盖包v1590 / iOS439 / bridge42。包含收藏原声音频与历史来源转发、微信绿色按钮、自主亲属限额间隔唯一称谓及头像资料同步、屏幕时长面板展开收起，以及真人好友主备用同时检测/只读同步500或中断切换一次/脱敏错误码/打开聊天不强制上传资料。写请求仍只提交一次，未知结果只读核对，不自动重发或错误退款。最终完整3384/3384通过；两端实际HTML功能和正常授权聊天受控测试通过，无收费模型或真人消息测试。复用既有打包脚本及Mac编译说明，从最终准确Git提交构建最新私人版本覆盖包_v1590_iOS439.zip，核对已交付v1587清单/哈希/原生签名与私有性能云备份继承，全文件解压回读；SOURCE_STATE明确未Mac编译/签名/真实iPhone验证。好友服务端500根因尚无后台记录，两个入口都不可达仍无法恢复。历史包、用户数据、其他工作树及继承行尾现场全部保留。部署成功及实际线上文件一致性另以发布操作证据为准。</ns0:t>
+      </ns0:r>
+    </ns0:p>
+    <ns0:p>
+      <ns0:r>
+        <ns0:t xml:space="preserve">2026-10-06 最终发布记录：本次私人发布按既有奇数编号约定最终定为v1591，替代前述候选v1590；网页v1589不变。提交2f3e9d4d7901f8b3d4d82eb8c538f370aa14f680。最新私人版本覆盖包_v1591_iOS439.zip已由准确提交生成，1734文件，171924981字节，SHA256=6a4cea00fd3e5a351a802e8877f194d1b7ba7d71f2ca9cda7dbaa716fc49b918。旧v1587包哈希、完整清单、全部原生/签名文件及新增共享修复核对通过，ZIP全文件解压回读与继承/云备份/资源校验通过。最终3384/3384测试通过，正常授权聊天及屏幕时长双实际HTML受控浏览器门禁均pageErrors0。包为Mac/Xcode源码，SOURCE_STATE明确macBuildVerified=false、realIPhoneVerified=false，未制作IPA。历史唯一包和11项继承测试行尾现场保留。</ns0:t>
       </ns0:r>
     </ns0:p>
     <ns0:sectPr ns0:rsidR="00FC693F" ns0:rsidRPr="0006063C" ns0:rsidSect="00034616">

</xml_diff>

<commit_message>
fix: release v1592 role WeChat sticker display size
</commit_message>
<xml_diff>
--- a/docs/maintenance/AI开发项目_Bug修改规范.docx
+++ b/docs/maintenance/AI开发项目_Bug修改规范.docx
@@ -12119,6 +12119,16 @@
     <ns0:p>
       <ns0:r>
         <ns0:t xml:space="preserve">2026-10-06 最终发布记录：本次私人发布按既有奇数编号约定最终定为v1591，替代前述候选v1590；网页v1589不变。提交2f3e9d4d7901f8b3d4d82eb8c538f370aa14f680。最新私人版本覆盖包_v1591_iOS439.zip已由准确提交生成，1734文件，171924981字节，SHA256=6a4cea00fd3e5a351a802e8877f194d1b7ba7d71f2ca9cda7dbaa716fc49b918。旧v1587包哈希、完整清单、全部原生/签名文件及新增共享修复核对通过，ZIP全文件解压回读与继承/云备份/资源校验通过。最终3384/3384测试通过，正常授权聊天及屏幕时长双实际HTML受控浏览器门禁均pageErrors0。包为Mac/Xcode源码，SOURCE_STATE明确macBuildVerified=false、realIPhoneVerified=false，未制作IPA。历史唯一包和11项继承测试行尾现场保留。</ns0:t>
+      </ns0:r>
+    </ns0:p>
+    <ns0:p>
+      <ns0:r>
+        <ns0:t xml:space="preserve">2026-10-06 角色微信表情包过大本地修复（网页/私人共有，未提交推送打包）：用户反馈登录角色微信发送表情放大。实际双HTML复现同一2000x2000表情在角色侧显示2000x2000，正常自己微信100x100，发送给自己的消息已同步。根因为hisChatMessageHTML表情分支使用未设图片尺寸的bubble sticker容器；仅该分支改复用正常微信stickermsg/stkm，继续使用stickerImageHTML保留IDB图片恢复，未修改消息正文/作者/伪装元数据/发送/资金/接收同步。两端实际发送复测角色与玩家侧均100x100，同步消息保留，pageErrors0；角色好友及查手机路由专项19/19通过，正常授权聊天双端门禁另复用固定日志。没有新增文件/脚本/工作树/截图，没有本轮临时清理项；原有11项继承测试行尾现场、旧包及其他工作树保留。当前线上网页v1589和已交付私人v1591覆盖包尚不包含本次本地修复；Mac/真机未验证。</ns0:t>
+      </ns0:r>
+    </ns0:p>
+    <ns0:p>
+      <ns0:r>
+        <ns0:t xml:space="preserve">2026-10-06 用户授权先推送角色微信表情尺寸修复：网页v1592 / 私人同步源码v1593，iOS439/bridge42不变，本次不打包，已交付v1591覆盖包及原安装说明保留。hisChatMessageHTML表情分支复用正常微信stickermsg/stkm，stickerImageHTML与IDB恢复保留；网页/私人实际发送2000x2000表情均显示100x100，自己微信同步收到100x100，原作者和伪装元数据不变，pageErrors0。最终全套3384/3384、双实际HTML正常授权聊天/权限存档/自动检查/保存恢复门禁通过。精准更新版本与SW/hotfix资源缓存标记，保留旧签名和私人差异。只提交本次功能、维护记录与版本断言；11项继承测试行尾现场保留，无新临时文件/截图/工作树或清理项。Mac/iPhone未验证；部署成功与线上字节核对以本次发布操作证据为准。</ns0:t>
       </ns0:r>
     </ns0:p>
     <ns0:sectPr ns0:rsidR="00FC693F" ns0:rsidRPr="0006063C" ns0:rsidSect="00034616">

</xml_diff>

<commit_message>
fix: release v1594 reopen couple space after unbinding
</commit_message>
<xml_diff>
--- a/docs/maintenance/AI开发项目_Bug修改规范.docx
+++ b/docs/maintenance/AI开发项目_Bug修改规范.docx
@@ -12129,6 +12129,11 @@
     <ns0:p>
       <ns0:r>
         <ns0:t xml:space="preserve">2026-10-06 用户授权先推送角色微信表情尺寸修复：网页v1592 / 私人同步源码v1593，iOS439/bridge42不变，本次不打包，已交付v1591覆盖包及原安装说明保留。hisChatMessageHTML表情分支复用正常微信stickermsg/stkm，stickerImageHTML与IDB恢复保留；网页/私人实际发送2000x2000表情均显示100x100，自己微信同步收到100x100，原作者和伪装元数据不变，pageErrors0。最终全套3384/3384、双实际HTML正常授权聊天/权限存档/自动检查/保存恢复门禁通过。精准更新版本与SW/hotfix资源缓存标记，保留旧签名和私人差异。只提交本次功能、维护记录与版本断言；11项继承测试行尾现场保留，无新临时文件/截图/工作树或清理项。Mac/iPhone未验证；部署成功与线上字节核对以本次发布操作证据为准。</ns0:t>
+      </ns0:r>
+    </ns0:p>
+    <ns0:p>
+      <ns0:r>
+        <ns0:t xml:space="preserve">2026-10-06 情侣空间解绑后打不开，网页定向修复发布v1594：实际网页解绑后renderCouple经PhoneScreenTimeImport.cloudPanel/cloudBound调用PhoneShortcuts.identity，NorthPublicRuntime.profile抛出请先绑定情侣空间角色，未绑定页渲染被中断；私人既有入口正常。只在网页phone-shortcuts.js的cloudAuth/cloudPanel加未绑定返回，未绑定不读取控制身份、不发上传/拉取请求，正常绑定的时长配置读取撤销及普通聊天保持。新增两个行为回归覆盖null/空对象/空cid解绑状态、重新绑定恢复、旧异步读取不能写入新情侣关系。实际HTML点击解除绑定/确定、返回主屏再次进入、重新绑定、重复绑定保留纪念日、存档刷新后重开均通过，两端pageErrors0；正常授权聊天及绑定态自动上传配置/读取/撤销受控门禁通过。网页资源和SW/hotfix标记更新v1594，私人源码v1593及v1591交付包/原生签名不变，本次不打包。发布暂存快照排除其他聊天的好友同步SQL/客户端和公开North/私人伴生候选，仅包含本修复、网页标记断言和本记录；其他未提交内容、历史唯一包、继承测试行尾保持。没有新增临时文件/工作树/副本或清理项。完整测试和线上部署结果以最终发布检查证据为准；Mac/iPhone未验证。</ns0:t>
       </ns0:r>
     </ns0:p>
     <ns0:sectPr ns0:rsidR="00FC693F" ns0:rsidRPr="0006063C" ns0:rsidSect="00034616">

</xml_diff>

<commit_message>
Retire public companion usage telemetry; preserve private companion boundaries web v1596
</commit_message>
<xml_diff>
--- a/docs/maintenance/AI开发项目_Bug修改规范.docx
+++ b/docs/maintenance/AI开发项目_Bug修改规范.docx
@@ -12134,6 +12134,11 @@
     <ns0:p>
       <ns0:r>
         <ns0:t xml:space="preserve">2026-10-06 情侣空间解绑后打不开，网页定向修复发布v1594：实际网页解绑后renderCouple经PhoneScreenTimeImport.cloudPanel/cloudBound调用PhoneShortcuts.identity，NorthPublicRuntime.profile抛出请先绑定情侣空间角色，未绑定页渲染被中断；私人既有入口正常。只在网页phone-shortcuts.js的cloudAuth/cloudPanel加未绑定返回，未绑定不读取控制身份、不发上传/拉取请求，正常绑定的时长配置读取撤销及普通聊天保持。新增两个行为回归覆盖null/空对象/空cid解绑状态、重新绑定恢复、旧异步读取不能写入新情侣关系。实际HTML点击解除绑定/确定、返回主屏再次进入、重新绑定、重复绑定保留纪念日、存档刷新后重开均通过，两端pageErrors0；正常授权聊天及绑定态自动上传配置/读取/撤销受控门禁通过。网页资源和SW/hotfix标记更新v1594，私人源码v1593及v1591交付包/原生签名不变，本次不打包。发布暂存快照排除其他聊天的好友同步SQL/客户端和公开North/私人伴生候选，仅包含本修复、网页标记断言和本记录；其他未提交内容、历史唯一包、继承测试行尾保持。没有新增临时文件/工作树/副本或清理项。完整测试和线上部署结果以最终发布检查证据为准；Mac/iPhone未验证。</ns0:t>
+      </ns0:r>
+    </ns0:p>
+    <ns0:p>
+      <ns0:r>
+        <ns0:t>2026-10-06 用户授权推送：网页v1596、私人同步源码v1597仅承载已单独允许的快捷指令自动上传撤除；公开North移除原生时长回传与展示、网页旧外置时长入口撤除，网页快捷指令上传保留。保留私人原生伴生/管控/共享屏幕，公开管控/配对/电量/步数/定位/足迹保留。AGENTS记录网页私人伴生差异及禁止未经授权同步打包。精准暂存本次功能和版本，排除并行好友同步、照片缩略图及其维护草稿。不部署后台、不打包、不冒充App Store已更新；完整测试、双实际HTML门禁及线上部署按实际最终证据。</ns0:t>
       </ns0:r>
     </ns0:p>
     <ns0:sectPr ns0:rsidR="00FC693F" ns0:rsidRPr="0006063C" ns0:rsidSect="00034616">

</xml_diff>

<commit_message>
Package private v1599 with verified cross-workspace repairs and protected companion
</commit_message>
<xml_diff>
--- a/docs/maintenance/AI开发项目_Bug修改规范.docx
+++ b/docs/maintenance/AI开发项目_Bug修改规范.docx
@@ -12139,6 +12139,11 @@
     <ns0:p>
       <ns0:r>
         <ns0:t>2026-10-06 用户授权推送：网页v1596、私人同步源码v1597仅承载已单独允许的快捷指令自动上传撤除；公开North移除原生时长回传与展示、网页旧外置时长入口撤除，网页快捷指令上传保留。保留私人原生伴生/管控/共享屏幕，公开管控/配对/电量/步数/定位/足迹保留。AGENTS记录网页私人伴生差异及禁止未经授权同步打包。精准暂存本次功能和版本，排除并行好友同步、照片缩略图及其维护草稿。不部署后台、不打包、不冒充App Store已更新；完整测试、双实际HTML门禁及线上部署按实际最终证据。</ns0:t>
+      </ns0:r>
+    </ns0:p>
+    <ns0:p>
+      <ns0:r>
+        <ns0:t>2026-10-06 用户授权跨工作区私人打包：本地网页源码v1598/私人v1599、iOS439/bridge42，本次不推送。完整继承最近交付v1591清单、哈希、原生与签名及私人性能/云备份链路；加入已验证角色微信表情/照片缩略图原图查看、好友57014不重复查库及3/6/12/24/30秒失败退避，以及.codex_delivery_natural_retry工作区自然重新点单和多商品排除条件定向补丁。所有注册工作树已只读核对；小家旧v1247/iOS360候选不得倒退覆盖当前house052/iOS439，机器人现有桥/资源与先前交付修复保留。独立外卖电脑agent/browser历史路由修复属于外部服务，不混入iOS工程，未部署好友SQL候选不冒充已生效。私人仅撤除另行授权的新快捷指令自动上传卡/云读取，原生时长、App管控、共享屏幕及私人policy/runtime保持；公开North时长撤除不带入。复用既有打包脚本/说明/测试日志，只输出一个新的完整私人覆盖包；Mac/Xcode编译签名与真机验收未验证，源码包非IPA。全量测试及实际HTML结果按本轮最终记录。保护其他工作区、SQL候选、继承行尾和历史唯一包，未新增工作树、临时目录或副本。</ns0:t>
       </ns0:r>
     </ns0:p>
     <ns0:sectPr ns0:rsidR="00FC693F" ns0:rsidRPr="0006063C" ns0:rsidSect="00034616">

</xml_diff>

<commit_message>
Ship virtual user marketplace and couple cloud wallet web v1600
</commit_message>
<xml_diff>
--- a/docs/maintenance/AI开发项目_Bug修改规范.docx
+++ b/docs/maintenance/AI开发项目_Bug修改规范.docx
@@ -12133,17 +12133,102 @@
     </ns0:p>
     <ns0:p>
       <ns0:r>
+        <ns0:t>2026-10-06 好友同步后续修复（本地候选，未发布）：当前基线HEAD 7fa68047b7a1642ac1973958a82e1bbdca6ec0f4，网页1592/私人源码1593，iOS439/桥42不变。用户明确授权继续修改。线上Postgres日志确认phone_friend_sync在RETURN阶段因statement timeout取消，code57014；同一时间relay可达但同步500。客户端两端已改为57014不换入口重复查同一库；自动失败退避3/6/12/24/30秒，手动刷新可越过退避，完整同步成功清零；失败不推进游标、不清好友申请或消息，写入结果未知仍不得自动重发。旧六项回归失败，新八项通过；全量3392/3392，两端实际HTML授权正常聊天、自动查手机、状态保存重开通过，pageErrors=0。SQL候选拆分七段聚合、函数内force_custom_plan，隔离PGlite对比3账号/2游标、申请/消息/群/回执/撤回/鉴权/重复安装通过；此测试不证明线上速度改善。JIT线上原本off，已排除把关闭JIT当根因方案；9项索引已存在，不重复建索引。管理查询反复Connection terminated due to connection timeout，甚至单独count用户也失败；瞬时select1与设置查询成功不能证明服务恢复。连接快照28/60、6 active、0 blocked、0 idle in transaction，不能据此认定锁等待或连接数耗尽。未部署SQL、未提交/推送/打包、未Mac/真机验收。下一步需数据库管理连接稳定后比较新旧函数耗时，再应用并回读函数定义；未解决前不得声称好友通信已修好。后台有Outstanding invoices警告，须核对账单状态，不能未经证据归因为欠费或擅自付费/扩容/重启/终止会话。保留所有既有工作区、用户数据、安装包、签名与继承行尾差异；未新增目录或临时脚本。</ns0:t>
+      </ns0:r>
+    </ns0:p>
+    <ns0:p>
+      <ns0:r>
+        <ns0:t>同轮账单只读核对补充：Supabase组织Billing/Past Invoices实际显示2026-09-30账单25.00美元，状态Outstanding；不是仅凭顶部横幅推测。需要账户所有者核对并自行处理；未进行付款、读取卡号、调整套餐或扩容，不能保证处理账单后同步故障即消失。</ns0:t>
+      </ns0:r>
+    </ns0:p>
+    <ns0:p>
+      <ns0:r>
+        <ns0:t>2026-10-06 伴生功能分离本地候选（用户要求不推送）：公开North移除本机/远程今日屏幕报告展示、隐藏报告Surface、活跃总时长/逐App采集与缓存回传；makeSnapshot强制无时长，保留已选App稳定ID、别名、限额、锁态、命令回执、电量、步数、定位、足迹及FamilyControls管控授权。网页public策略拒绝历史原生时长，不再提供旧外置时长显示/权限/每天屏幕报告规则和旧view命令；快捷指令云上传与聊天前读取保留，折叠白字保留。用户随后单独授权私人仅撤除新增快捷指令自动上传卡片、云读取定时器和聊天刷新包装；原生私人伴生时长、管控、共享屏幕和原有手动导入保持。网页与私人伴生差异正常，未经单独明确许可不得同步或打包覆盖，已追加AGENTS.md和用户请求的记忆更新供其他聊天读取。3393/3393 Node测试通过；实际Edge两端网页管控/配对/快捷指令无回归、网页上传保留和私人云卡消失通过/pageErrors0；正常授权聊天另以本轮结果为准。公开Swift源Windows不能编译，需Mac/Xcode后续归档/真机验收，未声称已上架变更。公开工程签名、BundleID、扩展target及限时monitor/shield保留，旧报告辅助类型未激活并留兼容，后台未部署。复用已有工作树/脚本/日志，保护并行好友同步候选、既有脏测试、历史包；未创建新工作树/安装包，唯一新增为用户明确要求的记忆更新。</ns0:t>
+      </ns0:r>
+    </ns0:p>
+    <ns0:p>
+      <ns0:r>
         <ns0:t xml:space="preserve">2026-10-06 情侣空间解绑后打不开，网页定向修复发布v1594：实际网页解绑后renderCouple经PhoneScreenTimeImport.cloudPanel/cloudBound调用PhoneShortcuts.identity，NorthPublicRuntime.profile抛出请先绑定情侣空间角色，未绑定页渲染被中断；私人既有入口正常。只在网页phone-shortcuts.js的cloudAuth/cloudPanel加未绑定返回，未绑定不读取控制身份、不发上传/拉取请求，正常绑定的时长配置读取撤销及普通聊天保持。新增两个行为回归覆盖null/空对象/空cid解绑状态、重新绑定恢复、旧异步读取不能写入新情侣关系。实际HTML点击解除绑定/确定、返回主屏再次进入、重新绑定、重复绑定保留纪念日、存档刷新后重开均通过，两端pageErrors0；正常授权聊天及绑定态自动上传配置/读取/撤销受控门禁通过。网页资源和SW/hotfix标记更新v1594，私人源码v1593及v1591交付包/原生签名不变，本次不打包。发布暂存快照排除其他聊天的好友同步SQL/客户端和公开North/私人伴生候选，仅包含本修复、网页标记断言和本记录；其他未提交内容、历史唯一包、继承测试行尾保持。没有新增临时文件/工作树/副本或清理项。完整测试和线上部署结果以最终发布检查证据为准；Mac/iPhone未验证。</ns0:t>
       </ns0:r>
     </ns0:p>
     <ns0:p>
       <ns0:r>
+        <ns0:t xml:space="preserve">2026-10-06 角色微信照片显示过大，本地修复未提交推送打包（网页/私人角色微信共有，不改伴生）：实际两端通过hisChatPhoto真实压缩、primeImageForSave、hisChatAppend发送流程复现2000x1500测试图发送后1600x1200被角色bubble img按原尺寸显示，而玩家侧正常150x112.5。只把hisChatMessageHTML图片分支改为正常微信imgmsg缩略图容器，点击停止事件传播后仍调用原viewImg；继续使用stickerImageHTML保留IDB图片恢复。上传/压缩/原图src/消息作者/_forged/接收同步/角色资金均未改。两端复测角色和玩家缩略图均150x112.5，点击原查看器正常显示1600x1200，给自己同步收到，pageErrors0；19项角色好友/查手机路由专项通过，正常授权聊天门禁复用固定日志。生产只定向改两份app.js该图片分支，保留其他聊天好友网络、公开North与私人伴生草稿和维护记录。当前线上v1594、私人源码标记v1593、已交付v1591包尚未包含本候选；不重用旧版本号发布，待授权发布再分配新版本。没有新增文件/截图/脚本/工作树或临时清理项，历史唯一包和继承行尾现场保留；Mac/真机未验证。</ns0:t>
+      </ns0:r>
+    </ns0:p>
+    <ns0:p>
+      <ns0:r>
         <ns0:t>2026-10-06 用户授权推送：网页v1596、私人同步源码v1597仅承载已单独允许的快捷指令自动上传撤除；公开North移除原生时长回传与展示、网页旧外置时长入口撤除，网页快捷指令上传保留。保留私人原生伴生/管控/共享屏幕，公开管控/配对/电量/步数/定位/足迹保留。AGENTS记录网页私人伴生差异及禁止未经授权同步打包。精准暂存本次功能和版本，排除并行好友同步、照片缩略图及其维护草稿。不部署后台、不打包、不冒充App Store已更新；完整测试、双实际HTML门禁及线上部署按实际最终证据。</ns0:t>
       </ns0:r>
     </ns0:p>
     <ns0:p>
       <ns0:r>
+        <ns0:t>2026-10-06 好友后台恢复实测：用户完成25美元账单支付，Billing已Paid、欠费提示消失；支付后SELECT 1仍管理连接超时，不能把通信故障全部归因欠费。Usage明确本周期未超Pro额度。进一步日志发现好友搜索、角色推送、伴生读取及管理接口普遍522，最近60分钟Postgres日志为0、资源指标不可读，项目Unhealthy；官方状态页ap-south-1 Operational，不证明不存在单项目故障。按用户继续处理授权执行一次Fast database reboot，仍Unhealthy、主备空搜索18秒均超时；再执行一次完整Restart project，平台显示Restarting，约两分钟后恢复Healthy。未扩容、未修改计费/密钥/网络/套餐、未删表/好友/申请/消息、未部署候选SQL。恢复后真实管理查询返回connection_check=1，profiles5144/pending requests36/private messages8848/group messages9440，证明已有数据可读，不冒充全量前后哈希一致。主入口空搜索HTTP200约1806ms；无效凭据同步HTTP400/bad-secret约1730ms且无messages字段，鉴权保留。历史pg_stat_statements好友同步23603调用/平均272.63ms/最大2994.96ms，是历史库内统计而非重启后实机网络延迟。备用license域名本机Node TypeError、Python SSL EOF、浏览器ERR_BLOCKED_BY_CLIENT；本机DNS返回198.18.1.63，不能据此认定备用全球宕机，不改DNS或绕过安全检查。恢复截图固定现有.codex_tmp/friend-backend-recovery.jpg；检查日志复用eight-browser.log。电脑主入口与数据库已恢复，用户不开代理双端加好友/双方查看好友列表/连续文字及接收延迟仍需实测；互发申请可能自动成为好友，须同时核对好友列表，不能只看新申请。同步SQL分段/force_custom_plan候选仍未上线，性能收益未证实，不为了部署而部署；客户端57014不重复查询与退避候选仍保留，其他聊天照片/伴生/快捷指令现场与提交保留。本轮未改正式客户端代码、未提交推送打包；后台重启实时生效，无需重装。若复发需再收资源/连接/请求证据，不能保证永久修好或断言OOM/CPU耗尽。</ns0:t>
+      </ns0:r>
+    </ns0:p>
+    <ns0:p>
+      <ns0:r>
         <ns0:t>2026-10-06 用户授权跨工作区私人打包：本地网页源码v1598/私人v1599、iOS439/bridge42，本次不推送。完整继承最近交付v1591清单、哈希、原生与签名及私人性能/云备份链路；加入已验证角色微信表情/照片缩略图原图查看、好友57014不重复查库及3/6/12/24/30秒失败退避，以及.codex_delivery_natural_retry工作区自然重新点单和多商品排除条件定向补丁。所有注册工作树已只读核对；小家旧v1247/iOS360候选不得倒退覆盖当前house052/iOS439，机器人现有桥/资源与先前交付修复保留。独立外卖电脑agent/browser历史路由修复属于外部服务，不混入iOS工程，未部署好友SQL候选不冒充已生效。私人仅撤除另行授权的新快捷指令自动上传卡/云读取，原生时长、App管控、共享屏幕及私人policy/runtime保持；公开North时长撤除不带入。复用既有打包脚本/说明/测试日志，只输出一个新的完整私人覆盖包；Mac/Xcode编译签名与真机验收未验证，源码包非IPA。全量测试及实际HTML结果按本轮最终记录。保护其他工作区、SQL候选、继承行尾和历史唯一包，未新增工作树、临时目录或副本。</ns0:t>
+      </ns0:r>
+    </ns0:p>
+    <ns0:p>
+      <ns0:r>
+        <ns0:t xml:space="preserve">2026-10-06 美团外卖首页参考图改造，本地候选未提交推送打包（网页/私人共享展示层，未改伴生）：核对当前031f3971 HEAD与远程ab72cadb，保留已提交私人v1599与网页源码v1598及未发布差异、并行文档/好友SQL/继承行尾现场，不使用旧phone-work。实际生效渲染器为后加载commerce-ui.js，未改app.js旧同名函数，也未覆盖商城/抖音。复用黄白主色，新增首页/自取抬头、收货地址原外卖设置入口、圆角搜索、9个SVG分类（打码中间分类与整条广告不做）、按当前结果显示的神抢手精选、商家列表、浮动购物车和首页/神券/订单/我的底部导航。搜索/自己下单/请TA吃/让TA代付/亲属卡/订单/真实外卖设置与原流程连接；自取/拼好饭/看病买药/跑腿未接入时显示模拟按键不可点击，不调用模型或创建订单。神券只显示现有未过期couponLabel，无优惠空态；真实数据未返回的评分/月售/距离/优惠不编造。真实平台名称/回执/支付宝本人支付/地址确认/幂等与安全边界保留，不改delivery.js或服务。照片复用原src与stickerImageHTML的IDB缓存/占位恢复，不重建对象URL，不覆盖原图；缺图用代码SVG插画。局部加购仅更新角标，保留原餐品对象，虚拟允许原重复加购、真实按offerId防重复，非外卖页面仍委托原函数，保留滚动和商家DOM，未改价格/资金。原HTML基础CSS继续使用，额外样式只作用mt-home，复用现有commerce-ui.js注入一次，不新增样式文件或版本目录。网页/私人针对同一美团函数区域独立补丁，私人原生/备份差异保持。初次发布检查拦截缺少真实平台事实提示，已保留仅展示平台实际返回且没有放宽守卫；首次角色按钮测试夹具单联系人会直接进入原付款流程，改两位独立演示角色验证选择页；首次正常重开夹具被原锁屏遮挡，按正常lockOpen解锁后继续，未改产品锁屏逻辑。最终全量3404/3404、专项21/21、双实际HTML正常授权聊天/权限存档/模式/忙释放/自动检查门禁pageErrors0。实际两端320/390/430无横向溢出，购物车局部DOM及滚动不变，虚拟下单精确扣款，角色请吃/代付/亲属卡选择页、订单/优惠空态/设置、真实重复加购和缺字段不造数据通过；搜索用受控AI返回，正常入口保存后再次打开保留搜索词与购物车。未真实下单/收费模型/Mac/iPhone验证。只新增一张必要固定预览.codex_tmp/eight-chat/meituan-home.png（独立演示数据），未新建工作树/源码副本/脚本/备份或重复截图；无本轮废弃临时文件可清理。原云同步BUG-WEB-CLOUD-IDB-20261006继续待修复，未恢复开发。</ns0:t>
+      </ns0:r>
+    </ns0:p>
+    <ns0:p>
+      <ns0:r>
+        <ns0:t xml:space="preserve">2026-10-07 固定店铺示范维护规则：商品、历史订单和评价引用使用稳定SKU，新增系列不得按数组位置覆盖旧订单或错连评价；金额以整数分计算，钱包/账单/订单/购物车必须同次保存成功后才显示成功，失败只撤回本次增减，不能覆盖并行或其他账号资金；订单ID和提交锁防重复支付/退款，晚到动作核对账号/模式。模型外卖、固定本地店及未来真人交易分清边界，不把本地示范冒充后台真实交易。私人存储浏览器测试须按原生契约给成功/失败应答，接口mock不等于原生真机验收。</ns0:t>
+      </ns0:r>
+    </ns0:p>
+    <ns0:p>
+      <ns0:r>
+        <ns0:t xml:space="preserve">2026-10-07 参考规格/支付页面规则：业务按钮可点击与颜色正确分别验证，老last-child CSS可能覆盖新组件，选择器必须限定组件并实测computedStyle；密码授权和扣款分离，核验返回后重新核对账号/订单token/密码版本/页面是否取消，再做持久保存，迟到核验不得扣款；账号内本地模拟支付密码仅保存加盐摘要，不与真实平台密码混用，不通过模型解释生成支付状态。用户明确五位初始00000时按五位做，不照抄参考图六位或面容入口；未实现优惠券用真实空态，起送价统计商品小料，配送费另计。</ns0:t>
+      </ns0:r>
+    </ns0:p>
+    <ns0:p>
+      <ns0:r>
+        <ns0:t xml:space="preserve">2026-10-07 模拟优惠券工程规则：在付款前再次检查券的账号/期限/已用状态/门槛及展示金额，失效必须让用户重新确认，不能静默收全价；券消费与钱包/订单同次保存，失败撤回本次增减；退款返原ID券只限未到期，不重新计期限，膨胀只升一次且不重生券。保留原真实平台支付与自有模拟券边界，不用客户端原型规则冒充多人服务器防刷。局部刷新先用实际HTML/DOM检查，源字符串替换要断言匹配；金融保存成功与后续UI错误分开报告。底部选中黄填色应落在SVG内形path，不能用SVG背景方块代替；4个页真实逐一点击验证，图标内部字也可用矢量笔画保持尺寸与线宽一致。</ns0:t>
+      </ns0:r>
+    </ns0:p>
+    <ns0:p>
+      <ns0:r>
+        <ns0:t xml:space="preserve">2026-10-07 通用本机商户与模拟资金规则：自建店规格按商品数据驱动，校验必选/单多选/未知或重复选项、合法数量与整数分，目录修订号阻断过期购物车，历史订单保存购买时快照。图片异步上传以账号/视图/编辑对象校验，复用已有IDB，不因保存失败删除已保存或订单引用图片；比较图片时允许正常boot引用展开，验证内容与业务快照。角色代付用独立请求ID和角色/账号/期限校验，模型同意后才消费正确角色来源；提示仅注入实际微信代付回复消费者，不能全局改变buildSystem或替换旅行支付。付款来源、订单、请求状态与券持久化原子提交，重复/拒绝/取消不扣款，退款依据保存来源，不能静默退另一钱包。亲属卡沿用月额度模型。收入只承认其他顾客已结算且未提现账本，自买、试单、模型文本不产生可提现收入；本机账本不等于服务器结算权限或真实微信出金。保存成功后UI错误不能报告密码失败。根/私人修改精确共享片段并保留私人差异，核心聊天变化仍跑授权门禁与全量测试。</ns0:t>
+      </ns0:r>
+    </ns0:p>
+    <ns0:p>
+      <ns0:r>
+        <ns0:t xml:space="preserve">2026-10-07 个人外卖记录与参考页工程规则：收藏/足迹/搜索词/地址/评价必须账号隔离，收藏删除只删条目不删图片缓存或历史订单，稳定商品/店铺身份去重，足迹记录实际访问且不得共用付款锁干扰快速购买。评价追评修改与删除用持久事务回滚，删除不删订单；参考图骑手评价/商家回复/热度数据没有对应来源不填假数据。结算跳地址页前保存当前输入，选择返回保留备注/券/资金来源，支付快照保留当时地址电话，不能引用未来被编辑的地址。浏览器关闭弹窗应检查真实show状态而非内容被清空，搜索路由先聚焦进入新页面后操作新输入并等待异步结果。图片缓存解析器可不接受已有assets相对路径，分别处理发行静态资源和IDB引用，不用SVG替代已存在照片、不重造blobURL。正常重开/账号切换/真实平台模式隔离/旧支付与开店路径都要验证，截图仅独立演示数据，不复制参考中的他人记录到账号。</ns0:t>
+      </ns0:r>
+    </ns0:p>
+    <ns0:p>
+      <ns0:r>
+        <ns0:t>2026-10-07 模拟商城审计规则：搜索结果必须标来源，模型生成不能当作真人目录查询；本机IDB店铺/图片不是跨用户发布后台，真人目录须统一owner身份/发布状态/分类关键词索引/远端图片权限及后台价库存订单券资金结算，不用客户端main账号别名当全球店主ID。宽泛类别搜索不能被固定店分支截断；模型价格不随机修补，无法生成有效商品用失败空态，禁止迟到搜索写其他账号/视图。自购所有入口包括AI商家和购物车都须走统一确认/PIN/券/订单事务，按商铺拆单校验起送；不能只测用券入口漏掉普通购买。角色支付要同时校验请求记录和原始未撤回卡片，持久锁等待之后再检查取消/角色/模式。聊天送餐保留原food卡消费语义，发送端钱包账单消息原子保存与幂等/账号守卫；自己订单与赠礼记录区分。语义快捷代付未选对象不能默认扣自己的零钱。数量0不应靠||1变有效。所有可点击占位与真正业务入口明确，药店用品只模拟购物，不冒充诊疗；店铺推荐点击必须是店铺而非单个商品。生成商家缺图用用户指定现有袋鼠，不替换固定或用户原图，不制造新的缓存/对象URL。全量通过不是外置模型质量、真人后台、原生或真机保证，最终要报告剩余功能与证据范围。</ns0:t>
+      </ns0:r>
+    </ns0:p>
+    <ns0:p>
+      <ns0:r>
+        <ns0:t>2026-10-07 卡片记录与角色执行规则：详细商品数据必须在动作执行/用户选择时保存快照，不能在渲染时用现价重造旧规格和金额。本机固定/自由规格店使用实际选项合法性和报价，AI自建商品明确来源与默认袋鼠；旧卡未记录温度规格不可补猜。商品合计不等于平台已付款，显示卡片不可制造钱包流水；真实平台回执继续用原平台数据。主循环控制标签保护必须在合法对应动作消费之后拦截残余非法标签，工厂单元测试之外需跑真正buildSystem/myActivity和回复分发。保留永久修复标记及实际守卫，不因注释调整降低继承测试。全局角色选择器依赖cb.name时不得传匿名函数拼onclick，新模块用具名局部分派不改旧全局；付款/赠送捕获账号、状态对象和幂等上下文，保存失败资金消息购物车一起撤回。赠送商品金额与自己订单配送券价必须在角色选择前写明。截图等待消息进场动画完成，不将灰淡截图当成最终样式；浏览器go按真实对象参数契约。新卡跟随微信主题，选择角色的浅灰样式只作用本组件，保护其他礼物/旅行/真实外卖及私人原生差异。</ns0:t>
+      </ns0:r>
+    </ns0:p>
+    <ns0:p>
+      <ns0:r>
+        <ns0:t>2026-10-07 订单评价规则与附件维护：写评价主入口绑定已完成订单，我的评价负责管理和待评价跳转，店铺页展示，不提供无订单写评价按钮；页面隐藏不足够，提交必须复查账号和订单状态。一单一评按同一记录修改，追评不加票，分维度商品/包装/配送不可倍增评分计数；首次星级需显式选择，文字可选，旧已保存长文本不能因新200字UI限制被截断。匿名仅改变展示，未来真人唯一身份和有效订单仍须服务端核验，不以袋鼠头像判重，客户端local记录/示范分不当真实全局分。真实图片先验证压缩/解码/IDB写读，再附草稿和持久化；晚到回调检查当前页、账号、编辑对象，不借用另一草稿尚未提交的缓存键；放弃清理只限自己新且未被S引用的键，保存失败保留原评价及图片重试，不删用户原文件/旧记录图。视频按明确要求不做，语音输入使用现有能力且只在用户点击时启动，不能以未实测浏览器能力承诺真机识别。新UI采用独立页、可滚动内容及底部黄发布栏，文字/图片等字段同次事务保存，回归既有角色卡/支付/聊天，不复制旧工作区或误称后台已上线。</ns0:t>
+      </ns0:r>
+    </ns0:p>
+    <ns0:p>
+      <ns0:r>
+        <ns0:t>2026-10-07 店铺发布评价验证规则：我的评价可以汇集自己的各店订单，单店评价与计数必须同时限定商铺身份和来源，不能仅凭账号/已完成或同名商铺字符串判断；固定目录SKU、自建merchantId、AI模拟来源分别约束，未来真人商铺要用服务器稳定shopId及认证buyer订单。共享展示组件复用已存评价/图片引用/追评，不能把别家内容搬进本店或重造图片。验证须从真实UI模拟下单付款、完成收货、发布、回店查看、图片打开、冷重开走全链，并分别注入异店/同名来源检验隔离。真实保存和可见的本机评价不等于跨用户公开或服务端总评分已上线，固定样例分必须标明来源。</ns0:t>
+      </ns0:r>
+    </ns0:p>
+    <ns0:p>
+      <ns0:r>
+        <ns0:t>2026-10-07 模拟运营展示与收藏规则：没有实际数据的本机/AI店可以按用户授权显示系统分配模拟销量距时，但须标模拟，展示计算纯函数、相同店身份一致、ETA关联距离/备餐；真实平台已有字段不能被随机或模型想象覆盖，随机月售不进收入/订单账本。同店收藏key是店铺身份而非商品下标；DOM data属性要正确编码JSON，不用只转义文本的esc直接拼双引号，状态更新应保留SVG并同步aria，不用textContent替换整个图标。店铺星右上空心/黄填分别实测，收藏列表直接打开已保存AI商铺快照，不能偷偷重生成菜单价格。UI持久锁未结束的用户加购等动作要先检查busy再消费已选规格，避免临时拦截永久丢草稿。对原脚本的UI契约变化做显式选择和懒图解码等待，不为了通过测试恢复已取消的默认评分/示范固定值。保留原业务/私人差异和历史影像，模拟信息不等于真人统计或现实定位。</ns0:t>
+      </ns0:r>
+    </ns0:p>
+    <ns0:p>
+      <ns0:r>
+        <ns0:t>2026-10-07 云端交易维护规则：赠额用稳定授权主体和服务端幂等账本，不按设备、角色或客户端金额发钱；本机虚拟资产不可反向兑换云资金，真实店铺资金只限批准用途，解除情侣及时回收余资，角色请求绑定当前关系/账号/原消息与服务器关系版本，不能显示paid代替后台成交。模拟源与云源互不替换付款数据；亲属卡禁用须在付款数据接口和消费扣款路径约束，不仅隐藏按钮。所有报价/数量/选项/门槛/券/订单状态/一单一评/收入和退款在服务器验证，权限函数schema限定且不改旧共享鉴权；一张已完成订单修改评论替换一票，匿名不能隐藏真实授权归属。先保存无密码的client nonce再发扣款，失联查询同一收据，不改变来源/价格再用新key重发；后端成功但本机保存失败仍是已付款，允许云端重查。跨账户验证对象之外也比较稳定身份字段；每个await前后约束状态、账号、角色，上传前检查，公共文字必须按HTML属性编码，不用只转义文本的esc拼属性。Storage公开仅公开读取，不等于开放写/枚举/覆盖；新桶限定owner、RESTRICTIVE边界只能约束新桶并保留其他桶原规则，历史图不随商品修改删除。真人销量评分只取实际后台数据，无真实性来源不填随机，全部商品资料与图片按需下载区分；列表分批、短缓存、视图内刷余额、无无谓模型/全站轮询。SQL验收用隔离随机身份BEGIN/ROLLBACK，真实跨HTTP使用标记QA账户，收尾隐藏QA店/停用QA授权和secret，不能影响真实账户或删除用户原图。脚本Monaco替换以全选粘贴为准，事务失败确认回滚，不盲目重复含旧SQL的编辑框。改公共/私人APP源码仅插用户授权消费者钩子，不全复制私人app；版本/cache层同时更新，私人源同步不等于安装包/Mac/iPhone。以Git选择的已验证自身文件发布，保护并行SQL/行尾现场；最多一次推送失败停，核对Pages和线上字节后才称网页发布。</ns0:t>
       </ns0:r>
     </ns0:p>
     <ns0:sectPr ns0:rsidR="00FC693F" ns0:rsidRPr="0006063C" ns0:rsidSect="00034616">

</xml_diff>

<commit_message>
Prepare marketplace inventory and operating rules web v1602
</commit_message>
<xml_diff>
--- a/docs/maintenance/AI开发项目_Bug修改规范.docx
+++ b/docs/maintenance/AI开发项目_Bug修改规范.docx
@@ -12229,6 +12229,11 @@
     <ns0:p>
       <ns0:r>
         <ns0:t>2026-10-07 云端交易维护规则：赠额用稳定授权主体和服务端幂等账本，不按设备、角色或客户端金额发钱；本机虚拟资产不可反向兑换云资金，真实店铺资金只限批准用途，解除情侣及时回收余资，角色请求绑定当前关系/账号/原消息与服务器关系版本，不能显示paid代替后台成交。模拟源与云源互不替换付款数据；亲属卡禁用须在付款数据接口和消费扣款路径约束，不仅隐藏按钮。所有报价/数量/选项/门槛/券/订单状态/一单一评/收入和退款在服务器验证，权限函数schema限定且不改旧共享鉴权；一张已完成订单修改评论替换一票，匿名不能隐藏真实授权归属。先保存无密码的client nonce再发扣款，失联查询同一收据，不改变来源/价格再用新key重发；后端成功但本机保存失败仍是已付款，允许云端重查。跨账户验证对象之外也比较稳定身份字段；每个await前后约束状态、账号、角色，上传前检查，公共文字必须按HTML属性编码，不用只转义文本的esc拼属性。Storage公开仅公开读取，不等于开放写/枚举/覆盖；新桶限定owner、RESTRICTIVE边界只能约束新桶并保留其他桶原规则，历史图不随商品修改删除。真人销量评分只取实际后台数据，无真实性来源不填随机，全部商品资料与图片按需下载区分；列表分批、短缓存、视图内刷余额、无无谓模型/全站轮询。SQL验收用隔离随机身份BEGIN/ROLLBACK，真实跨HTTP使用标记QA账户，收尾隐藏QA店/停用QA授权和secret，不能影响真实账户或删除用户原图。脚本Monaco替换以全选粘贴为准，事务失败确认回滚，不盲目重复含旧SQL的编辑框。改公共/私人APP源码仅插用户授权消费者钩子，不全复制私人app；版本/cache层同时更新，私人源同步不等于安装包/Mac/iPhone。以Git选择的已验证自身文件发布，保护并行SQL/行尾现场；最多一次推送失败停，核对Pages和线上字节后才称网页发布。</ns0:t>
+      </ns0:r>
+    </ns0:p>
+    <ns0:p>
+      <ns0:r>
+        <ns0:t>2026-10-07 新增维护规则：数据库回滚验收通过与正式迁移提交必须分开报告；完整源码回归使用node --test tests/*.test.mjs，避免无关服务依赖混入；Monaco SQL全文以全选粘贴及回读核验，不用仅可见行fill。导入云端商铺必须检查存储返回false，并恢复原商铺和图片库；资产的店铺数量使用同账号经营缓存。推送失败按AGENTS停止，不以换分支或强推绕过，完成可审阅候选后取得新授权。</ns0:t>
       </ns0:r>
     </ns0:p>
     <ns0:sectPr ns0:rsidR="00FC693F" ns0:rsidRPr="0006063C" ns0:rsidSect="00034616">

</xml_diff>

<commit_message>
Sync marketplace deployment Word maintenance records
</commit_message>
<xml_diff>
--- a/docs/maintenance/AI开发项目_Bug修改规范.docx
+++ b/docs/maintenance/AI开发项目_Bug修改规范.docx
@@ -12234,6 +12234,12 @@
     <ns0:p>
       <ns0:r>
         <ns0:t>2026-10-07 新增维护规则：数据库回滚验收通过与正式迁移提交必须分开报告；完整源码回归使用node --test tests/*.test.mjs，避免无关服务依赖混入；Monaco SQL全文以全选粘贴及回读核验，不用仅可见行fill。导入云端商铺必须检查存储返回false，并恢复原商铺和图片库；资产的店铺数量使用同账号经营缓存。推送失败按AGENTS停止，不以换分支或强推绕过，完成可审阅候选后取得新授权。</ns0:t>
+      </ns0:r>
+    </ns0:p>
+    <ns0:p>
+      <ns0:r>
+        <ns0:t>2026-10-07 用户明确允许恢复正式部署与正常推送。正式执行202610070002_north_market_social_orders.sql并COMMIT成功；只读核验库存/拼单表存在、RLS开启、首次500规则、完成订单拒退款、唯一启用的拼单每分钟过期任务均为true。没有提交测试订单或测试扣款。完整候选68fcc3d已完成3463项回归与双端聊天验收，随后本轮以正常非强制HEAD:main推送发布。最终Pages及线上资源是否成功以固定online-release-result.json实际核验为准。网页v1602、私人共享源码v1603，iOS439/桥42保持；不打包、不改其他工作区及并行好友SQL。
+</ns0:t>
       </ns0:r>
     </ns0:p>
     <ns0:sectPr ns0:rsidR="00FC693F" ns0:rsidRPr="0006063C" ns0:rsidSect="00034616">

</xml_diff>

<commit_message>
fix: release v1604 colorful vouchers rules and marketplace icons
</commit_message>
<xml_diff>
--- a/docs/maintenance/AI开发项目_Bug修改规范.docx
+++ b/docs/maintenance/AI开发项目_Bug修改规范.docx
@@ -12240,6 +12240,11 @@
       <ns0:r>
         <ns0:t>2026-10-07 用户明确允许恢复正式部署与正常推送。正式执行202610070002_north_market_social_orders.sql并COMMIT成功；只读核验库存/拼单表存在、RLS开启、首次500规则、完成订单拒退款、唯一启用的拼单每分钟过期任务均为true。没有提交测试订单或测试扣款。完整候选68fcc3d已完成3463项回归与双端聊天验收，随后本轮以正常非强制HEAD:main推送发布。最终Pages及线上资源是否成功以固定online-release-result.json实际核验为准。网页v1602、私人共享源码v1603，iOS439/桥42保持；不打包、不改其他工作区及并行好友SQL。
 </ns0:t>
+      </ns0:r>
+    </ns0:p>
+    <ns0:p>
+      <ns0:r>
+        <ns0:t>2026-10-07 彩色神券与收尾规则：页面颜色/主入口恢复必须与资金来源和服务端规则分开，最新用户决定撤回旧方案时，不因复用本机旧券页面而误切云钱包或真人用券。日期格式器若只收毫秒数，服务端ISO字符串先显式解析，测试断言实际到期日而非只检测文字。窄屏地址保持单行并省略长文本，真实320px DOM检查，不仅源码标记。未实现入口明确开发中，不启动AI搜索或伪订单。功能图标按语义独立SVG且保持既定黄按钮。玩法规则以已实现前后端约束为依据，不承诺真实配送/人民币兑换/关App时本机定时。私人覆盖包从提交读取，逐文件/清单/解压哈希核对最近交付继承及原生签名差异，源码验证不等于Mac编译或iPhone运行。维护证据复用固定日志和截图，保护并行SQL及行尾现场。</ns0:t>
       </ns0:r>
     </ns0:p>
     <ns0:sectPr ns0:rsidR="00FC693F" ns0:rsidRPr="0006063C" ns0:rsidSect="00034616">

</xml_diff>

<commit_message>
fix: unify real and AI shop ordering and add atomic bulk replenishment
</commit_message>
<xml_diff>
--- a/docs/maintenance/AI开发项目_Bug修改规范.docx
+++ b/docs/maintenance/AI开发项目_Bug修改规范.docx
@@ -12245,6 +12245,21 @@
     <ns0:p>
       <ns0:r>
         <ns0:t>2026-10-07 彩色神券与收尾规则：页面颜色/主入口恢复必须与资金来源和服务端规则分开，最新用户决定撤回旧方案时，不因复用本机旧券页面而误切云钱包或真人用券。日期格式器若只收毫秒数，服务端ISO字符串先显式解析，测试断言实际到期日而非只检测文字。窄屏地址保持单行并省略长文本，真实320px DOM检查，不仅源码标记。未实现入口明确开发中，不启动AI搜索或伪订单。功能图标按语义独立SVG且保持既定黄按钮。玩法规则以已实现前后端约束为依据，不承诺真实配送/人民币兑换/关App时本机定时。私人覆盖包从提交读取，逐文件/清单/解压哈希核对最近交付继承及原生签名差异，源码验证不等于Mac编译或iPhone运行。维护证据复用固定日志和截图，保护并行SQL及行尾现场。</ns0:t>
+      </ns0:r>
+    </ns0:p>
+    <ns0:p>
+      <ns0:r>
+        <ns0:t>2026-10-07 网页v1606 / 私人v1607：真人店铺统一点单与整批补货</ns0:t>
+      </ns0:r>
+    </ns0:p>
+    <ns0:p>
+      <ns0:r>
+        <ns0:t>经营批量操作必须先显示逐项报价和总额，再在一笔事务内校验并复用单项账本；任何失败整体回滚，重试用稳定请求号，不能客户端逐个扣款冒充批量原子操作。列表封面用同一断点尺寸；返回目的地依据入口，不把所有预览强制送到编辑器。规格名称/值须安全转义属性和事件参数。保留并行好友SQL、11个原有CRLF文件及历史独有包，不部署或提交他人改动。 验收：旧HEAD新增回归最初6项全部失败，修后8项通过；主程序tests/*.test.mjs完整3479/3479，双端实际HTML授权聊天与浏览器50商品/规格/补货/分类/封面尺寸检查通过，无页面错误。SQL隔离测试在BEGIN/ROLLBACK中覆盖密码、他人店铺、重复请求、变更重放、价格变化、余额不足、库存上限、收入来源、分类搜索与真实加价报价；003正式commit后只读核对函数和调用权限true。曾漏更新Mac说明导致3478/3479，修正说明后3479通过；误用裸node --test纳入独立服务测试导致6项依赖/配置失败，未更改服务，使用主程序规定范围重新通过。模型网络受控，未做Mac编译/iPhone实测。</ns0:t>
+      </ns0:r>
+    </ns0:p>
+    <ns0:p>
+      <ns0:r>
+        <ns0:t>补充：AI 模拟店铺也统一为同系列资料、推荐、左分组右商品、黄色规格及底部购物车；温度黄色选项、自定义规格与数量合计，继续无起送价、用本机余额，按当前店铺单独结算。AI商品仍为模拟内容，不冒充真人商品。新增双端AI回归旧实现2项失败，修后通过。最后全量3481/3481，双端实际AI点菜/温度/数量合计/5元结算及正常聊天通过。</ns0:t>
       </ns0:r>
     </ns0:p>
     <ns0:sectPr ns0:rsidR="00FC693F" ns0:rsidRPr="0006063C" ns0:rsidSect="00034616">

</xml_diff>

<commit_message>
docs: record package validation and stopped metadata push
</commit_message>
<xml_diff>
--- a/docs/maintenance/AI开发项目_Bug修改规范.docx
+++ b/docs/maintenance/AI开发项目_Bug修改规范.docx
@@ -12260,6 +12260,11 @@
     <ns0:p>
       <ns0:r>
         <ns0:t>补充：AI 模拟店铺也统一为同系列资料、推荐、左分组右商品、黄色规格及底部购物车；温度黄色选项、自定义规格与数量合计，继续无起送价、用本机余额，按当前店铺单独结算。AI商品仍为模拟内容，不冒充真人商品。新增双端AI回归旧实现2项失败，修后通过。最后全量3481/3481，双端实际AI点菜/温度/数量合计/5元结算及正常聊天通过。</ns0:t>
+      </ns0:r>
+    </ns0:p>
+    <ns0:p>
+      <ns0:r>
+        <ns0:t>2026-10-07 私人v1607打包核对：首次生成在写入上一交付包哈希时使用未导入hashlib而失败，未产出新包；改用既有sha256导入，提交修复后生成1757文件并通过全清单哈希、旧包1755必要文件继承及21原生Swift文件核对。功能提交bf687271已推送；仅打包脚本修正推送因schannel TLS握手失败，遵守首次推送失败停止重试规则，保留本机提交。网页部署与本机包提交分别核对，不冒称全部远端提交。</ns0:t>
       </ns0:r>
     </ns0:p>
     <ns0:sectPr ns0:rsidR="00FC693F" ns0:rsidRPr="0006063C" ns0:rsidSect="00034616">

</xml_diff>

<commit_message>
fix: release v1608 accurate role marketplace ordering and unified store specifications
</commit_message>
<xml_diff>
--- a/docs/maintenance/AI开发项目_Bug修改规范.docx
+++ b/docs/maintenance/AI开发项目_Bug修改规范.docx
@@ -12265,6 +12265,31 @@
     <ns0:p>
       <ns0:r>
         <ns0:t>2026-10-07 私人v1607打包核对：首次生成在写入上一交付包哈希时使用未导入hashlib而失败，未产出新包；改用既有sha256导入，提交修复后生成1757文件并通过全清单哈希、旧包1755必要文件继承及21原生Swift文件核对。功能提交bf687271已推送；仅打包脚本修正推送因schannel TLS握手失败，遵守首次推送失败停止重试规则，保留本机提交。网页部署与本机包提交分别核对，不冒称全部远端提交。</ns0:t>
+      </ns0:r>
+    </ns0:p>
+    <ns0:p>
+      <ns0:r>
+        <ns0:t>2026-10-07 外卖截图反馈复核：本地候选，未提交、未推送、未打包</ns0:t>
+      </ns0:r>
+    </ns0:p>
+    <ns0:p>
+      <ns0:r>
+        <ns0:t>首页、搜索和我的店铺必须用已发布marketId识别同一实体，验收必须同时有本机草稿及云端发布数据；不能仅比较云端卡片与内置图片就声称全部图片一致。图片尺寸需覆盖本机封面、云端封面、内置店铺及实际预览CSS的所有覆盖规则。检查功能入口应从用户点击路径起步，并实际新增规格保存到点单报价，不以源代码有函数代替可见入口。清理按钮名称与真实时间范围保持一致，测试使用隔离记录并核对总结及其他角色不受影响。 新回归旧HEAD双端共8项失败，修后通过。主程序3489/3489；最后CSS和永久保护追加专项604通过。真实网页/私人HTML浏览器受控复现同店本机与云端共存、首页仅一次且位于真人列表上方、三类封面等尺寸、完整50商品、返回大厅、编辑预览返回编辑、新增辣度不辣/微辣加1后保存发布并在点单中报价21、地址黑色、共同生活设置入口以及隔离记录删除/保留总结均通过，页面错误0；双端真实正常聊天门禁通过。首次浏览器首页等待失败来自测试从我的页面未清northView，补用已有northBack进入大厅后通过，未把测试导航误认业务故障。最后截图为本地测试商品，不是用户实际店铺或iPhone实测。正式网页仍v1606，已有私人包v1607未更新。本轮不部署、不提交、不打包；保留并行好友SQL、11个CRLF原有测试和历史唯一包。</ns0:t>
+      </ns0:r>
+    </ns0:p>
+    <ns0:p>
+      <ns0:r>
+        <ns0:t>2026-10-07 补充本地候选：用户确认仅同一家店共用规格，其他店独立。编辑店铺增加全店通用规格入口，支持仅保存默认模板（新商品沿用）或确认后一键套用现有商品；深复制到各商品，只替换规格，不改名称/图片/基础价格/分组/库存，单品可独立覆盖。默认模板保存在当前店铺草稿defaultSpecGroups，公开发布时随首个商品的_northStoreSpecTemplate元数据放入已有catalog.products，导入时读取；复用原后台原样保存products的协议，无数据库迁移或本轮部署。独立各店与deep clone/取消套用旧实现4项失败，修后通过；受控双端浏览器实际新增模板、确认应用49件、添加第50件自动沿用两组、发布后全部50件读取温度/辣度且微辣加1报价21通过。最后全量3493/3493、双端实际正常聊天和页面错误0；截图与发布响应均为本地隔离测试，不冒充真实跨设备云端或iPhone验收。仍未提交、未推送、未生成新包，保留待用户看页面核对。</ns0:t>
+      </ns0:r>
+    </ns0:p>
+    <ns0:p>
+      <ns0:r>
+        <ns0:t>2026-10-07 角色真人点单与玩法规则：本地候选，未提交、未部署、未推送、未打包。用户允许为起送少量加购并要求告诉本人；角色可使用本人云券，最终按实际成功回执回应。核对发现旧代码只提取蛋糕/奶茶大类、随机取八个预报价之一、必选规格挑最低价，丢口味与温度；前次把中途撤回的真人不用券方案当最终决定，用户纠正后确认保留彩色云券入口与真人用券，本轮未改购券资金规则。新增004独立迁移经用户明确同意，只增role_catalog/role_checkout接口，保留旧签名、订单库存触发器、账本和退款接口。搜索先由角色当前模型提取完整口味/品类及规格意图，后端同商品同时匹配所有必需词；最多6家、每家28个带库存的真实菜单选项，不下载图片或加载全站。模型第二次选真实ID/必选与单多选规格，前端拒绝错口味、错温度、假ID、重复商品、超库存和非必要/过量凑单，后台仍以实际修订/库存/报价验证。已达到起送不加购、不为券多买；系统选择满足商品金额门槛的优惠最大单张本人云券，同优惠先到期，配送费不抵扣。角色云银行卡手动充值，扣款/用券/库存/账本在同一事务，幂等请求内容含券和凑单标识。成功回执保存后最多第三次模型只作自然回应，明细、准确加购数量、已减和实付均按订单快照展示；最后模型失败仍保留订单，未成功/付款未知返回真实说明，不因网络或模型失败冒充无店转模拟。无匹配真人商品或无可用云额度保留模拟退路；所选套餐超预算不擅自付款。玩法规则补入角色用券/模型调用成本/失败查原单、同店模板与保存更新发布、整批补货成本及原子回滚、真人预约非自动完成/本机关闭不推进、评分与追评边界，规则和详情正文黑色。根/私人commerce同片段，app仅marketfood历史消息优惠与详细回执定向同步，不改私人原生或伴生差异。新增10项双端行为回归旧HEAD全部失败，修后主程序3503/3503、正常授权聊天双端门禁通过。实际双HTML受控模型HTTP通过三个额外调用、芋泥奶茶温的1份+小料1份凑20、本人券减3、角色实付18.90且一次扣款、详情同价、320/390宽卡片无溢出、规则10段及既有50商品/同店模板/封面/返回/一键补货检查，页面错误0。真实PostgreSQL004+隔离数据BEGIN/ROLLBACK验收通过，覆盖口味AND、规格、本人券与他人券/过期/重复、请求重放、扣款与库存、取消原路资金及券返还、自家店排除、不泄露秘密；结束rolled_back=true，新接口和测试订单未持久化。首次SQL失败来自测试错误要求全站无芋泥蛋糕，改只检查隔离店铺未匹配后通过；首次本地源码服务CRLF提取失败、纯SQL被浏览器按下载拦截，改HTML展示源码/编辑器全选粘贴并按规范化换行回读后通过。首次页面规则等待失败来自测试从订单恢复聊天后未进美团，改从我的功能实际入口进入，未改业务路由来迎合测试。测试模型为受控响应，不是实际收费模型准确率或iPhone证明，真实模型仍可能无法提出有效方案；不保证任何模型百分百选对，错误方案拒绝付款。正式网页仍1606、私人交付包1607未包含这些候选。复用原测试/四格meituan-home.png/固定日志和工作树，只新增获准004迁移，无新备份目录或源码副本；保护并行好友SQL、原11项CRLF改动和唯一旧包，临时SQL内容服务与浏览器测试页已收尾。</ns0:t>
+      </ns0:r>
+    </ns0:p>
+    <ns0:p>
+      <ns0:r>
+        <ns0:t>2026-10-07 用户明确要求先推送，恢复本轮正常发布授权。网页v1608、私人同步源码v1609，iOS439/桥42不变，不打包。004独立角色菜单与云券支付迁移正式COMMIT成功，catalog_ready/checkout_ready=true；只读核验两接口anon执行权限、排除自家店、本人优惠券归属均true，未提交真人顾客订单或扣款。发布门禁：最后主程序3503/3503、双端实际HTML浏览器完整点单/规格模板/云券/凑单/规则、正常授权聊天检查通过。版本收尾曾漏app内sw URL和Mac指南当前标题，回归分别拦截后精确修正，最后全通过；未改素材、原生或私人伴生差异。准备提交本轮所有已验收本地修复及版本断言，保留supabase_phone_friends_update_v416.sql和11个既有CRLF测试改动不暂存；既有同聊天打包脚本修正和记录本机提交随正常祖先继承，不重新打包。推送与Pages线上字节检查结果见本轮后续回读；不将已提交后台等同于网页已发布。</ns0:t>
       </ns0:r>
     </ns0:p>
     <ns0:sectPr ns0:rsidR="00FC693F" ns0:rsidRPr="0006063C" ns0:rsidSect="00034616">

</xml_diff>

<commit_message>
fix: release v1610 configurable specification layout and reliable compact order cards
</commit_message>
<xml_diff>
--- a/docs/maintenance/AI开发项目_Bug修改规范.docx
+++ b/docs/maintenance/AI开发项目_Bug修改规范.docx
@@ -12290,6 +12290,21 @@
     <ns0:p>
       <ns0:r>
         <ns0:t>2026-10-07 用户明确要求先推送，恢复本轮正常发布授权。网页v1608、私人同步源码v1609，iOS439/桥42不变，不打包。004独立角色菜单与云券支付迁移正式COMMIT成功，catalog_ready/checkout_ready=true；只读核验两接口anon执行权限、排除自家店、本人优惠券归属均true，未提交真人顾客订单或扣款。发布门禁：最后主程序3503/3503、双端实际HTML浏览器完整点单/规格模板/云券/凑单/规则、正常授权聊天检查通过。版本收尾曾漏app内sw URL和Mac指南当前标题，回归分别拦截后精确修正，最后全通过；未改素材、原生或私人伴生差异。准备提交本轮所有已验收本地修复及版本断言，保留supabase_phone_friends_update_v416.sql和11个既有CRLF测试改动不暂存；既有同聊天打包脚本修正和记录本机提交随正常祖先继承，不重新打包。推送与Pages线上字节检查结果见本轮后续回读；不将已提交后台等同于网页已发布。</ns0:t>
+      </ns0:r>
+    </ns0:p>
+    <ns0:p>
+      <ns0:r>
+        <ns0:t>2026-10-07 v1608/私人源码1609发布后新一轮本地修复，未提交、未推送、未部署、未打包。正式发布16a50642已成功，Pages37571221207和9文件逐字节核对成功；私人旧交付仍1607/iOS439。用户指出真人规格不是内置奶茶同样形式，明确要求只统一形式，标签/组名/价格自由、加料组可不设置；随后真实截图报额外模型超时且技术原文冒充角色消息，又要求持续正在点单、卡片仅首商品其他折叠、数量短靠左、选项文字居中。实现：真人和本机预览共享northSpecDialogHTML，普通规格按钮/两列图片卡片按组自由选择，组说明/单多选/必选/默认选中/推荐/显示基础价加选项价/图片均可编辑；未配置加料组不产生该区，optional多选可全部不选。嵌套选项真图沿原压缩/IDB/账号草稿检查保存，发布将选项及同店默认模板图片转换为公开受限桶URL，用同次上传缓存去重，原catalog保留附加元数据，无新增数据库迁移。原报价/库存/起送/云券/密码/角色关系约束不改；数量84x36、靠左，默认与普通选择价格实际计算，缺必选或超库存三个按钮禁用。真人规格新增赠餐和代付快捷入口，先保留购物车规格再进入原结算/选择付款方式，不越过确认/PIN/关系/余额校验。简单名字直接按完整词或口味+品类查真实菜单，已知本机菜单无真人匹配时直接使用原模拟退路，减少无谓意图模型调用；45秒额外模型硬限制恢复普通190秒上限。正常精确匹配仅需一次额外选菜单模型，复杂/缺动作修复至多3次；真实付款回执保存后立即发卡，不再等待额外模型写摘要。原回复说点了但没有动作时，在明确外卖上下文里修复一次结构动作；普通到达/点赞等不作为订单，不处理用户明确不要点的请求；微信/通话抑制未执行的付款或15分钟送达承诺，挂断/失效会话守卫保留。失败显示中立sys通知，不显示技术原文、不冒充角色；失败事实可进入该角色后续上下文防止虚构成功。正在点单提示持续到receiptShown实际入聊天才点单完成后消失，失败/未知显示相应状态；关系/账号变化撤销显示，未知仍只查原client不重扣。真人路径20分钟整体禁新单改按turn/client去重；已付却丢卡的旧订单优先补回，允许原卡已存在后的新明确真人请求。普通未授权模拟旧防重复保留。角色真人/赠餐/代付卡均首件展示、其余details折叠，简短加购/已减徽标和实付，长事实保留数据与详情；折叠点击stopPropagation防止冒出消息菜单。规格专用sheet类仅对该弹窗清padding/旧滚动，常规弹窗样式不变。验证：20项新增双端行为回归旧HEAD失败，修后全量3523/3523，正常授权聊天双端门禁通过；固定eight-browser.log含实际双HTML模板/50SKU/图片压缩上传发布/22无加料、24加小料、44两份、0禁用、320/390、快捷付款和失败无原文/未扣、持续通知与折叠展开检查。真实模型和iPhone仍未实测，不承诺不会超时或百分百选对。实际图片检查发现标题被modalSheet旧滚动裁掉、照片被旧规则压到8x14、数量因继承column变84高、选项padding被主题规则覆盖，均针对专用sheet修正并测量照片36、数量84x36和标题可见。测试曾直接读闭包northMarketBusy、quote夹具缺items、遗留菜单浮层导致等待失败；分别去掉无必要等待、补真实报价结构、识别并修折叠冒泡；第一次长inline脚本超过Windows命令长度，改内存分段压缩运行，不建新脚本或目录。保护并行好友SQL、11个行尾文件和旧唯一包。一次误建重复回归日志已合并固定日志并删除，复用唯一截图。</ns0:t>
+      </ns0:r>
+    </ns0:p>
+    <ns0:p>
+      <ns0:r>
+        <ns0:t>2026-10-07 最后验收补充：3523/3523全量、双端正常聊天、实际双HTML320/390完整页面检查均通过，pageErrors=[]。规格文字居中与内距使用规格专用sheet高优先级规则，数量84x36靠左；图片正常36x36并实际解码，图片卡行排列及多选checkbox可见。有效选择不再显示重复的已选长说明，错误提示仍保留。角色真实/赠餐/代付卡默认仅首件，其余折叠且点击不触发消息菜单，完整信息在详情；点单成功立即发卡，不再等模型摘要。持续提示超过普通toast时长仍存在，实际入聊天回执才完成，超时失败另显示中立通知、不付款、不泄漏原文。最终固定四格截图展示真人规格、有无加料、进行中与简短卡片/失败状态。此为本地受控API与数据，不是收费模型、真人账户或iPhone实测。代码未提交推送打包，正式16a50642保持；无新增工作树/源码副本/脚本/目录/迁移，重复临时日志已合并并删除，其他聊天改动和旧包完整保留。</ns0:t>
+      </ns0:r>
+    </ns0:p>
+    <ns0:p>
+      <ns0:r>
+        <ns0:t>2026-10-07 用户要求推送这轮规格/卡片/点单提示修复。准备发布网页1610、私人共享源码1611，iOS439/桥42不变，不打包。3523/3523与双端实际HTML正常聊天门禁通过，数量64x32在320/390视口检查通过，固定页面检查与截图保留。后台004接口已在前一发布正式部署，本轮没有新数据库迁移或真人用户交易；只发布已验收前端与模型点单流程。暂存仅本轮源码、维护记录、缓存版本和必要测试版本断言，保护并行好友SQL及11项既有CRLF现场。远端main经GitHub API核对仍16a50642；git只读ls-remote遇schannel TLS失败，不认定推送失败，正式push仍只尝试一次，若失败依AGENTS停止。最终push/Pages/线上资源结果看固定online-release-result.json及本轮回读，源码验证不等于Mac/iPhone或付费模型准确率。</ns0:t>
       </ns0:r>
     </ns0:p>
     <ns0:sectPr ns0:rsidR="00FC693F" ns0:rsidRPr="0006063C" ns0:rsidSect="00034616">

</xml_diff>

<commit_message>
fix: release v1612 complete real ordering flow and refreshable storefronts
</commit_message>
<xml_diff>
--- a/docs/maintenance/AI开发项目_Bug修改规范.docx
+++ b/docs/maintenance/AI开发项目_Bug修改规范.docx
@@ -12305,6 +12305,16 @@
     <ns0:p>
       <ns0:r>
         <ns0:t>2026-10-07 用户要求推送这轮规格/卡片/点单提示修复。准备发布网页1610、私人共享源码1611，iOS439/桥42不变，不打包。3523/3523与双端实际HTML正常聊天门禁通过，数量64x32在320/390视口检查通过，固定页面检查与截图保留。后台004接口已在前一发布正式部署，本轮没有新数据库迁移或真人用户交易；只发布已验收前端与模型点单流程。暂存仅本轮源码、维护记录、缓存版本和必要测试版本断言，保护并行好友SQL及11项既有CRLF现场。远端main经GitHub API核对仍16a50642；git只读ls-remote遇schannel TLS失败，不认定推送失败，正式push仍只尝试一次，若失败依AGENTS停止。最终push/Pages/线上资源结果看固定online-release-result.json及本轮回读，源码验证不等于Mac/iPhone或付费模型准确率。</ns0:t>
+      </ns0:r>
+    </ns0:p>
+    <ns0:p>
+      <ns0:r>
+        <ns0:t>2026-10-07 网页1610/私人共享源码1611发布后购物车本地修复，未提交推送打包。用户反馈红点持续、打开空购物车、真人结算与赠餐无法完成。确认大厅旧红点统计全部S.food.cart，但入口northSimulationCart只列模拟商品，真人云端行与其他账号/平台行造成可见列表和红点不一致。修复共用northVisibleCartRows按当前账号及平台模式过滤，红点计商品数量；大厅购物车同时列真人分店商品、规格、数量、价格与进店继续结算，模拟分店结算不变，不删除未付款、未知结果或其他账号行。没有当前情侣的规格赠餐/代付入口给明确提示；公开免邀请码预览在加入真人购物车前拒绝并说明需要正式账号，不注册身份或扣款，localhost隔离测试仍可走受控后台。新回归旧HEAD失败，新专项通过；真实双HTML受控购物车检查和正常聊天门禁通过，无pageErrors。无生产交易、无后台变更，正式云端本人付款已有餐具和五位密码链；角色自主付款与本人手动付款分开，用户所走入口尚待确认，真人订单地图仍未补齐，不将该缺口声称已完成。复用固定日志和测试，无新文件或临时目录，保护并行SQL/旧包/行尾改动。</ns0:t>
+      </ns0:r>
+    </ns0:p>
+    <ns0:p>
+      <ns0:r>
+        <ns0:t xml:space="preserve">2026-10-07 网页v1612 / 私人共享源码v1613：真人确认订单、餐具选择并保存、白色五位云端支付密码、付款后的配送进度与袋鼠示意地图均对齐奶茶店同系列展示。本人赠餐仍经PIN，情侣代付先同意再由用户PIN确认，角色自主付款原规则不变。真人地图只读后端订单状态，不按本机计时推进，不虚构现实定位或预计送达时间；完成禁退款及评价权限保持。私人浏览器检出错误PIN提示先于保存结束时快速重输可能漏数字，提交期间禁用数字键、结束恢复；相同请求号重试，不重复扣款。修复大厅红点与购物车内容不一致，真人商品按账号及模式可见；公开免邀请码预览在真人加购前说明不能提交真人交易。首页黄色换一批复用list游标，读5显示最多4、末尾回首批，失败保留旧列表，防重复与账号切换守卫，不增加后台接口。最终3535/3535、双端实际HTML受控完整本人/赠餐/情侣授权后PIN流程、错误密码未支付与原client正确重试、取消未写、付款清空购物车、全状态地图320/390及首页换批回首、正常聊天门禁通过，pageErrors=[]。测试网络和数据隔离，不是真人用户扣款、实际收费模型或iPhone验收；无数据库迁移，不打包，旧唯一1607/iOS439包保留。实际截图复用meituan-home.png四格，固定日志复用，无新文件目录副本或临时产物需删除。维护三文档仅追加；保留并行好友SQL与11个既有行尾测试。准备正常发布，Pages与在线字节核验完成后再确认上线。</ns0:t>
       </ns0:r>
     </ns0:p>
     <ns0:sectPr ns0:rsidR="00FC693F" ns0:rsidRPr="0006063C" ns0:rsidSect="00034616">

</xml_diff>

<commit_message>
fix: release v1614 real order covers reviews and automatic delivery
</commit_message>
<xml_diff>
--- a/docs/maintenance/AI开发项目_Bug修改规范.docx
+++ b/docs/maintenance/AI开发项目_Bug修改规范.docx
@@ -12315,6 +12315,16 @@
     <ns0:p>
       <ns0:r>
         <ns0:t xml:space="preserve">2026-10-07 网页v1612 / 私人共享源码v1613：真人确认订单、餐具选择并保存、白色五位云端支付密码、付款后的配送进度与袋鼠示意地图均对齐奶茶店同系列展示。本人赠餐仍经PIN，情侣代付先同意再由用户PIN确认，角色自主付款原规则不变。真人地图只读后端订单状态，不按本机计时推进，不虚构现实定位或预计送达时间；完成禁退款及评价权限保持。私人浏览器检出错误PIN提示先于保存结束时快速重输可能漏数字，提交期间禁用数字键、结束恢复；相同请求号重试，不重复扣款。修复大厅红点与购物车内容不一致，真人商品按账号及模式可见；公开免邀请码预览在真人加购前说明不能提交真人交易。首页黄色换一批复用list游标，读5显示最多4、末尾回首批，失败保留旧列表，防重复与账号切换守卫，不增加后台接口。最终3535/3535、双端实际HTML受控完整本人/赠餐/情侣授权后PIN流程、错误密码未支付与原client正确重试、取消未写、付款清空购物车、全状态地图320/390及首页换批回首、正常聊天门禁通过，pageErrors=[]。测试网络和数据隔离，不是真人用户扣款、实际收费模型或iPhone验收；无数据库迁移，不打包，旧唯一1607/iOS439包保留。实际截图复用meituan-home.png四格，固定日志复用，无新文件目录副本或临时产物需删除。维护三文档仅追加；保留并行好友SQL与11个既有行尾测试。准备正常发布，Pages与在线字节核验完成后再确认上线。</ns0:t>
+      </ns0:r>
+    </ns0:p>
+    <ns0:p>
+      <ns0:r>
+        <ns0:t>2026-10-08 网页v1614 / 私人共享源码v1615：真人订单标题使用对应店铺封面，商品图保持独立；订单/详情接口追加shop_cover，权限、分页及旧字段保留，下架后仍可读订单关联封面。真人评价复用原设计独立页、SVG星级/评分文字、200字计数、真实图片上传与删除、黄色发布，保留完成后一单一评和后台评分/一次商家回复，未添加视频或假骑手评分。用户确认到时自动完成并结算：新已付款订单快照10至120分钟（默认30）及预约不早于时间，后台每分钟最多100条按实际时间推进制作/配送/完成，结算一次；首次与后来店铺设置不追溯改已付款订单，旧订单不补自动字段；完成禁退款，取消不推进，拼单付齐和角色付款共用订单插入快照。通知查询包含自动完成，前台在现有分钟检查刷新打开的自动订单；关App仍由云端完成，屏幕通知需打开应用，不宣称OS后台推送。玩法规则与店铺编辑补配送时长，卡片/确认页说明同步。隔离数据库首次检出Supabase默认ACL给新函数anon/authenticated权限，补显式撤权，仅service_role可执行；重跑BEGIN/ROLLBACK全部通过，无测试交易保留。六项新双端行为回归旧HEAD失败、修后48项专项通过；实际双HTML受控原完整本人/赠餐/情侣PIN流程、店铺与商品封面区分、上传真实本地图片并发布/查看评价、320/390布局及云端预计时间通过。首次页面字数断言误写11，实际10，修正测试预期；一次本地SQL源服务被旧service worker替换，改新端口内存服务，无新脚本目录。全量、聊天门禁与线上状态以固定最终日志核验。无付费模型、正式用户交易、Mac或iPhone实测，本轮不打包；保护并行好友SQL、11个行尾改动和旧唯一包。</ns0:t>
+      </ns0:r>
+    </ns0:p>
+    <ns0:p>
+      <ns0:r>
+        <ns0:t>2026-10-08 本轮最终验收：3541/3541、双实际HTML正常授权聊天门禁、受控真人完整本人/赠餐/情侣PIN流程与订单封面/评价图片上传发布/自动ETA/320与390布局通过，pageErrors=[]；店铺编辑45分钟保存通过。正式执行202610080001迁移COMMIT后回读cover_ready、auto_delivery_active、settlement_private全部true。隔离数据事务此前rolled_back=true，无测试订单或测试扣款留下。准备正常HEAD:main发布网页1614/私人源码1615，实际Pages与字节结果另核固定online-release-result.json。无新包、无Mac/iPhone或收费模型验收；内存SQL服务与本轮浏览器测试页将收尾，保留唯一固定截图及必要日志。</ns0:t>
       </ns0:r>
     </ns0:p>
     <ns0:sectPr ns0:rsidR="00FC693F" ns0:rsidRPr="0006063C" ns0:rsidSect="00034616">

</xml_diff>

<commit_message>
fix: release v1616 cloud store back navigation and gift nicknames
</commit_message>
<xml_diff>
--- a/docs/maintenance/AI开发项目_Bug修改规范.docx
+++ b/docs/maintenance/AI开发项目_Bug修改规范.docx
@@ -12325,6 +12325,11 @@
     <ns0:p>
       <ns0:r>
         <ns0:t>2026-10-08 本轮最终验收：3541/3541、双实际HTML正常授权聊天门禁、受控真人完整本人/赠餐/情侣PIN流程与订单封面/评价图片上传发布/自动ETA/320与390布局通过，pageErrors=[]；店铺编辑45分钟保存通过。正式执行202610080001迁移COMMIT后回读cover_ready、auto_delivery_active、settlement_private全部true。隔离数据事务此前rolled_back=true，无测试订单或测试扣款留下。准备正常HEAD:main发布网页1614/私人源码1615，实际Pages与字节结果另核固定online-release-result.json。无新包、无Mac/iPhone或收费模型验收；内存SQL服务与本轮浏览器测试页将收尾，保留唯一固定截图及必要日志。</ns0:t>
+      </ns0:r>
+    </ns0:p>
+    <ns0:p>
+      <ns0:r>
+        <ns0:t>2026-10-08 网页v1616 / 私人共享源码v1617：修复真人店铺返回错误go(food)压入重复首页，改为关闭云端视图并绘制已有大厅；从聊天进入时核对原路由后pop返回，不新增历史，重复返回无操作。全局返回先关闭正在展示的云端视图，加载中退出递增epoch，旧响应不能重开或重绘。真人赠餐卡标题使用当前角色备注名优先、昵称次之并转义；赠餐上下文同步自动配送规则。未改支付库存资金、商家数据或后台，无数据库迁移。旧实现新增8项回归失败，修后56项专项、3549全量与双端正常授权聊天通过；实际双HTML连续4次店铺返回/全局返回/延迟请求退出/2.2秒大厅无重绘/昵称标题，以及原完整支付密码/赠餐/代付/购物车/评价上传/自动ETA检查通过，pageErrors=[]。受控网络不代表iPhone或收费模型实测。图片缓存优化尚未实施，不保证所有闪烁或卡顿均已解决。发布后的最终版本门禁及Pages核对见固定日志。本轮不打包，不新增文件目录脚本或工作树；保护其他聊天SQL及11项既有行尾现场。</ns0:t>
       </ns0:r>
     </ns0:p>
     <ns0:sectPr ns0:rsidR="00FC693F" ns0:rsidRPr="0006063C" ns0:rsidSect="00034616">

</xml_diff>

<commit_message>
fix: release v1618 smooth cached cloud pages and yellow orders
</commit_message>
<xml_diff>
--- a/docs/maintenance/AI开发项目_Bug修改规范.docx
+++ b/docs/maintenance/AI开发项目_Bug修改规范.docx
@@ -12330,6 +12330,11 @@
     <ns0:p>
       <ns0:r>
         <ns0:t>2026-10-08 网页v1616 / 私人共享源码v1617：修复真人店铺返回错误go(food)压入重复首页，改为关闭云端视图并绘制已有大厅；从聊天进入时核对原路由后pop返回，不新增历史，重复返回无操作。全局返回先关闭正在展示的云端视图，加载中退出递增epoch，旧响应不能重开或重绘。真人赠餐卡标题使用当前角色备注名优先、昵称次之并转义；赠餐上下文同步自动配送规则。未改支付库存资金、商家数据或后台，无数据库迁移。旧实现新增8项回归失败，修后56项专项、3549全量与双端正常授权聊天通过；实际双HTML连续4次店铺返回/全局返回/延迟请求退出/2.2秒大厅无重绘/昵称标题，以及原完整支付密码/赠餐/代付/购物车/评价上传/自动ETA检查通过，pageErrors=[]。受控网络不代表iPhone或收费模型实测。图片缓存优化尚未实施，不保证所有闪烁或卡顿均已解决。发布后的最终版本门禁及Pages核对见固定日志。本轮不打包，不新增文件目录脚本或工作树；保护其他聊天SQL及11项既有行尾现场。</ns0:t>
+      </ns0:r>
+    </ns0:p>
+    <ns0:p>
+      <ns0:r>
+        <ns0:t>2026-10-08 网页v1618 / 私人共享源码v1619：真人订单恢复与原本机订单同一黄色north-orders-header/filters，保留本人/顾客/拼单/本机入口，标题与筛选不随内容滚动，按钮黑字；云端 store/orders/order 浏览页加入最多16条、按S对象/本机账号/phone身份对象及id和secret隔离的内存深复制快照，不存入持久存档、不缓存钱包/报价/PIN。15秒内重开不重复读，2分钟内先显示快照再非阻塞读；结果相同不重建DOM，结果变化保留滚动位置，失败明确错误并清快照。交易/发布/补货/评价等成功写RPC清缓存，支付仍原服务端报价/库存/金额/权限/PIN/幂等校验。读取不占交易busy锁，epoch及view身份检查保护快速返回/切页/账号切换；自动配送分钟轮询强制读原订单，不被15秒快照遮挡。商品分组保留完整50商品节点、仅切hidden及选中状态，不反复创建图片。没有用本机模拟数据代替云端；首次打开仍受网络速度影响，不宣称达到内置店绝对同样时延。旧实现新增缓存/黄标题/分组行为回归失败，专项64通过；原50商品fixture补缓存依赖并改验证保留50节点及25隐藏，不删除覆盖。全量3557、双端实际HTML正常授权聊天通过。受控双HTML实测15秒缓存无额外shop请求、分组img同一节点、16秒后台慢读不白屏及相同结果img不替换；黄色computed背景通过，原结算/PIN/赠餐/代付/购物车/评价真图上传/自动ETA与返回守卫保留，pageErrors=[]。最终版本门禁与Pages线上核对见固定日志；未做iPhone或真实慢网络实测，无后台迁移、不打包，不新增文件目录工作树。保留其他聊天SQL和11个既有行尾改动。</ns0:t>
       </ns0:r>
     </ns0:p>
     <ns0:sectPr ns0:rsidR="00FC693F" ns0:rsidRPr="0006063C" ns0:rsidSect="00034616">

</xml_diff>

<commit_message>
fix: release v1620 search cards and recipient arrival notices
</commit_message>
<xml_diff>
--- a/docs/maintenance/AI开发项目_Bug修改规范.docx
+++ b/docs/maintenance/AI开发项目_Bug修改规范.docx
@@ -12335,6 +12335,16 @@
     <ns0:p>
       <ns0:r>
         <ns0:t>2026-10-08 网页v1618 / 私人共享源码v1619：真人订单恢复与原本机订单同一黄色north-orders-header/filters，保留本人/顾客/拼单/本机入口，标题与筛选不随内容滚动，按钮黑字；云端 store/orders/order 浏览页加入最多16条、按S对象/本机账号/phone身份对象及id和secret隔离的内存深复制快照，不存入持久存档、不缓存钱包/报价/PIN。15秒内重开不重复读，2分钟内先显示快照再非阻塞读；结果相同不重建DOM，结果变化保留滚动位置，失败明确错误并清快照。交易/发布/补货/评价等成功写RPC清缓存，支付仍原服务端报价/库存/金额/权限/PIN/幂等校验。读取不占交易busy锁，epoch及view身份检查保护快速返回/切页/账号切换；自动配送分钟轮询强制读原订单，不被15秒快照遮挡。商品分组保留完整50商品节点、仅切hidden及选中状态，不反复创建图片。没有用本机模拟数据代替云端；首次打开仍受网络速度影响，不宣称达到内置店绝对同样时延。旧实现新增缓存/黄标题/分组行为回归失败，专项64通过；原50商品fixture补缓存依赖并改验证保留50节点及25隐藏，不删除覆盖。全量3557、双端实际HTML正常授权聊天通过。受控双HTML实测15秒缓存无额外shop请求、分组img同一节点、16秒后台慢读不白屏及相同结果img不替换；黄色computed背景通过，原结算/PIN/赠餐/代付/购物车/评价真图上传/自动ETA与返回守卫保留，pageErrors=[]。最终版本门禁与Pages线上核对见固定日志；未做iPhone或真实慢网络实测，无后台迁移、不打包，不新增文件目录工作树。保留其他聊天SQL和11个既有行尾改动。</ns0:t>
+      </ns0:r>
+    </ns0:p>
+    <ns0:p>
+      <ns0:r>
+        <ns0:t>2026-10-08 网页v1620 / 私人共享源码v1621：用户截图证实搜索推荐卡片底部月售/距离/预估被裁切。实际双HTML在320/390复现：旧north-search-recommend&gt;button&gt;span将文字north-nearby-body一并设为63px高、overflow:hidden，最后一行超出底边；长店名更明显。仅调整这条规则排除文字区域，文本按内容自然撑开，不裁切不省略；搜索推荐直系封面显式与同系列标准一致105x105，小屏83x83，避免推荐泛化img规则将内置封面挤成67宽。CSS限定搜索推荐，商店/交易/规格/缓存代码不改。修后实际双HTML在320/390最后信息行完全落在文字区域内，普通及长店名body分别72.78125和91.78125高，overflow visible，内置与自建封面同尺寸，pageErrors=[]；实际截图复用固定meituan-home.png，测试店名为本地隔离示例。永久修复标记复用现有测试追加，不新建测试/迁移/目录/脚本；全量与正常授权聊天发布门禁见固定最终日志，最终Pages/线上字节核对见online-release-result.json。无后台迁移、不打包、无iPhone真机验证，保护其他聊天SQL和11项行尾现场。</ns0:t>
+      </ns0:r>
+    </ns0:p>
+    <ns0:p>
+      <ns0:r>
+        <ns0:t>2026-10-08 网页v1620 / 私人共享源码v1621补充：送达通知按收餐人而非付款人分流。真人通知接口原来只返回订单号/店名，前端全部弹购买者横幅；现在对未通知订单调用现有授权订单详情读取address.recipientRole，赠餐为对应角色持久化一条确定ID的系统收餐事件并调度自然回复，不弹本人送达横幅。本人收餐（包括角色代付）继续弹小袋鼠通知。详情失败、角色失效/屏蔽、持久化失败不回退为本人通知且不标记已通知；状态/账户跨异步检查保留；重复轮询不重复角色事件。模拟赠餐沿用原角色收下后计时和收餐回复链路，不改变支付/配送/结算。复用现有social-orders测试，两端覆盖赠餐、代付本人收餐、重复、失效/屏蔽角色和保存失败，旧版缺路由失败、修后通过；无新增文件或后台迁移。</ns0:t>
       </ns0:r>
     </ns0:p>
     <ns0:sectPr ns0:rsidR="00FC693F" ns0:rsidRPr="0006063C" ns0:rsidSect="00034616">

</xml_diff>

<commit_message>
feat: release v1622 delivery runner with verified rewards and BGM
</commit_message>
<xml_diff>
--- a/docs/maintenance/AI开发项目_Bug修改规范.docx
+++ b/docs/maintenance/AI开发项目_Bug修改规范.docx
@@ -12345,6 +12345,31 @@
     <ns0:p>
       <ns0:r>
         <ns0:t>2026-10-08 网页v1620 / 私人共享源码v1621补充：送达通知按收餐人而非付款人分流。真人通知接口原来只返回订单号/店名，前端全部弹购买者横幅；现在对未通知订单调用现有授权订单详情读取address.recipientRole，赠餐为对应角色持久化一条确定ID的系统收餐事件并调度自然回复，不弹本人送达横幅。本人收餐（包括角色代付）继续弹小袋鼠通知。详情失败、角色失效/屏蔽、持久化失败不回退为本人通知且不标记已通知；状态/账户跨异步检查保留；重复轮询不重复角色事件。模拟赠餐沿用原角色收下后计时和收餐回复链路，不改变支付/配送/结算。复用现有social-orders测试，两端覆盖赠餐、代付本人收餐、重复、失效/屏蔽角色和保存失败，旧版缺路由失败、修后通过；无新增文件或后台迁移。</ns0:t>
+      </ns0:r>
+    </ns0:p>
+    <ns0:p>
+      <ns0:r>
+        <ns0:t>2026-10-08 本地候选（未推送/未部署/未打包，正式网页仍v1620）：用户授权新增必要跑腿游戏模块、迁移及测试，随后明确先检查不推送。新增独立north-runner.js（网页/私人同一实现）、独立免邀请码north-runner-preview.html、骑手/街景/车辆三张独立素材；原袋鼠图标不替换。三道路透视Canvas，滑动一次一个动作/方向键，60Hz固定逻辑，平滑换道、跳跃、俯身、逐步加密障碍、碰撞扣心和短暂无敌、切后台暂停、退出确认、每600tick一单、6000tick或三心耗尽结算。右上角三颗红心分开展示，街景有店铺路灯植被/道路材质，骑手为骑黄色送餐车的透明素材，车辆和纸箱立体；初版平面色块及车板形象被用户指出简陋，已替换，不将初稿作为验收。绘制只在运行或需要重画时进行；图片开局前一次性decode并按需缓存，不随主页面安装预取大图，不逐帧网络/模型请求。新202610080002独立会话表RLS与现有身份验证，actor钱包同锁，服务端重放种子及操作/碰撞/心数/时间，不接受客户端分数，每单100分币/局最多1000/日最多3000（北京时间00:00），同局幂等，旧局被新局替代，6分钟过期，最多100奖励开局/日，练习不发币。奖励直接本人可用余额，专属runner_reward账本，不改订单/库存/经营收入/PIN/情侣转账规则；已新增玩法规则。隔离真实PostgreSQL执行验证重复/跨身份/坏密钥/伪造/不足时长/日上限/旧局失效/ACL/余额和收入隔离，无正式账户测试交易。实际双HTML受控浏览器滑动/方向键、暂停、41秒死亡结算4单、一次领取、返回通过，pageErrors=[]；新街景180帧桌面采样median8.3ms/p95 8.5ms，不冒充iPhone保证或商业游戏同等质量。最终全量/聊天见固定日志；IAB首次同源小手机预览被已有ServiceWorker HTML导航缓存回旧1558，未清用户缓存/存档，改独立未注册SW的8778试玩页已正确呈现。只读Supabase预检查表未安装和旧账本枚举一致，未运行迁移，未发正式奖励。复用当前工作树、维护文档、固定日志和单一meituan-runner.png，保留此前搜索截图、其他聊天SQL、11项行尾及旧包。图像采用内置imagegen，提示为圆润黄色袋鼠骑送餐车/暖色立体购物街背景/蓝色送餐车障碍。未来正式发布须升级版本并先正式部署已测试迁移；试玩先用户检查。</ns0:t>
+      </ns0:r>
+    </ns0:p>
+    <ns0:p>
+      <ns0:r>
+        <ns0:t>2026-10-08 跑腿本地修复第二轮（仍未推送/未正式部署/未打包）：用户反馈停在边路即可躲过、速度感觉不变、物件像飞过来。旧实现一行只一件障碍、按固定180tick时间差独立画位置、路面变化与碰撞分离；旧seed42固定中路23秒还剩两心，新增行为回归实际失败（2不等于0），不是只靠标记断言。现统一整数世界距离：60Hz物理速度160+min(240,floor(t/12))，初始1倍、15秒1.46875倍、30秒1.9375倍、48秒封顶2.5倍；路面纹理/标线、障碍地面投影、阴影、送达线、真实横向位置和碰撞使用同一距离。投影7000/(7000+gap)，轮胎/箱底贴地并在驶过后移出；角色在7tick左右完成换道，跳跃落地弧线与有效高度判定一致，俯身横杆高度同人物比例，角色障碍随画面等比，竖屏最多430宽。前3行暖场，后续随机两路车辆、全路箱子、全路横杆及两车加箱组合；安全换道保持相邻，三路障碍必需跳/俯身，间隔世界19000至23000，最大速约0.8至1秒一组，有提前可见距离，不再固定边路安全。固定站任意路的5组种子均不能撑23秒；32组种子通过正确动作可100秒三心通关，积分/金额/每日上限不改。候选同份未安装迁移同步整数位置、距离、随机顺序、跳跃有效11至31剩余tick、影子保护50tick的服务端回放；隔离PostgreSQL核验完美路线、空操作假报100秒、时间/身份/重复/日上限/权限/余额收入隔离通过。实际网页和私人HTML方向键、暂停、11秒死亡结算、三颗心终态、100秒10单三心通关、一次领取、返回均通过pageErrors=[]。初次自动试玩速度断言错写1.8/1.9而采样已2.0，修断言；之后回放37秒死亡由测试clock安装后仍实时走时叠加runFor造成，明确pauseAt后稳定完整通关，没有改游戏给测试免伤。原素材/原图标/原规则资金边界/其他聊天改动保留。复用唯一游戏截图和固定日志，最新全量与正常授权聊天结果以full-tests.log/check-chat-authorized.log为准；桌面采样不能冒充iPhone手感或真实压力测试；本地8778同一试玩页刷新给用户，不连正式钱包。三份维护文件均追加检查，不新建文件或另建工作树。</ns0:t>
+      </ns0:r>
+    </ns0:p>
+    <ns0:p>
+      <ns0:r>
+        <ns0:t>2026-10-08 跑腿第二轮最终补充：镜头投影最终为14000/(14000+gap)，比7000拉远，减缓近处骤然放大；驶过的物件按最高轮廓是否已在画面下方剔除，标线两端也完全出画面后消失，不在固定-1800距离突然删除。路面纹理边缘羽化并按投影横向缩放，保留原街景素材。新增实际RPC行为回归证明旧开局/状态/领奖三次清掉店铺缓存（resets=3，期望0）；现在这三个独立游戏方法不清店铺/订单快照，领奖仍仅清钱包余额缓存，正常order_create仍清快照（resets=1）。避免玩游戏又导致商城图片重读闪烁，既有交易缓存失效规则保持。SQL测试优先标准PGlite包、再使用环境NORTH_PGLITE_MODULE或当前用户的已有测试运行库，不新装依赖。网页/私人实际100秒三心10单均再次通过；同一8778本地试玩及单一截图更新，仍未推送/部署/打包。最新全仓结果见固定日志。</ns0:t>
+      </ns0:r>
+    </ns0:p>
+    <ns0:p>
+      <ns0:r>
+        <ns0:t>2026-10-08 跑腿双音频：用户提供两份MP3，第一份02-56-30为游戏循环、第二份02-48-55为结算一次播放。只用一个Audio播放器，开局点击时静音解锁后播放，死亡或100秒结束切换结算，再开局切回游戏并从头；暂停/隐藏/失焦停止，继续保留播放进度，退出释放src。播放被系统阻止时捕获异常，不阻塞物理和领奖。根目录与私人共享游戏/音频逐字节一致；必要资源加入私人清单与SW按需缓存，不安装时预载。9项专项回归通过，真实Edge本地试玩播放game duration66.887、result duration10.585，暂停/继续/死亡/重开/退出检查通过pageErrors=[]。没有实测iPhone静音开关和WKWebView播放策略。复用原工作区、测试/日志/试玩页，未生成临时脚本，原用户音频未改；未推送、部署、打包。</ns0:t>
+      </ns0:r>
+    </ns0:p>
+    <ns0:p>
+      <ns0:r>
+        <ns0:t>2026-10-08 发布验收：用户明确允许推送，本轮网页v1622/私人共享源码v1623，iOS439/桥42不变，不打包。全量3569/3569通过，实际双端正常授权聊天门禁pageErrors0，音频真实Edge切换通过。正式后台独立迁移202610080002已COMMIT成功，只读核验RLS、status/start/claim、匿名直接表访问阻止、零测试会话、runner_reward账本类型均true；没有测试订单或发奖励。现有后台提示Disk IO Budget即将耗尽，已告知用户且未升级套餐。新版本初次回归因旧测试写死1620/1621及Mac说明头未更新失败，按当前1622/1623更新后全量通过。后台验收编辑器setValue仅替换可见段导致残留迁移语句，发现异常提示立即取消未重复执行；全选粘贴只读SQL并核对整段后验收成功。复用原工作树/固定日志/试玩页，无新增工作树或临时脚本；保护并行好友SQL、11项继承行尾现场，网页部署和线上资源最终结果见固定online-release-result.json。</ns0:t>
       </ns0:r>
     </ns0:p>
     <ns0:sectPr ns0:rsidR="00FC693F" ns0:rsidRPr="0006063C" ns0:rsidSect="00034616">

</xml_diff>

<commit_message>
fix: release v1624 cloud ordering recovery and portable shop packs
</commit_message>
<xml_diff>
--- a/docs/maintenance/AI开发项目_Bug修改规范.docx
+++ b/docs/maintenance/AI开发项目_Bug修改规范.docx
@@ -12370,6 +12370,16 @@
     <ns0:p>
       <ns0:r>
         <ns0:t>2026-10-08 发布验收：用户明确允许推送，本轮网页v1622/私人共享源码v1623，iOS439/桥42不变，不打包。全量3569/3569通过，实际双端正常授权聊天门禁pageErrors0，音频真实Edge切换通过。正式后台独立迁移202610080002已COMMIT成功，只读核验RLS、status/start/claim、匿名直接表访问阻止、零测试会话、runner_reward账本类型均true；没有测试订单或发奖励。现有后台提示Disk IO Budget即将耗尽，已告知用户且未升级套餐。新版本初次回归因旧测试写死1620/1621及Mac说明头未更新失败，按当前1622/1623更新后全量通过。后台验收编辑器setValue仅替换可见段导致残留迁移语句，发现异常提示立即取消未重复执行；全选粘贴只读SQL并核对整段后验收成功。复用原工作树/固定日志/试玩页，无新增工作树或临时脚本；保护并行好友SQL、11项继承行尾现场，网页部署和线上资源最终结果见固定online-release-result.json。</ns0:t>
+      </ns0:r>
+    </ns0:p>
+    <ns0:p>
+      <ns0:r>
+        <ns0:t>2026-10-08 网页v1624/私人共享源码v1625：用户要求突破2.5倍、反馈蓝莓真人点单说成功但没有卡、要求管理店铺导出导入包。事实：原文模式ensureAction/filterClaims被_rawOutput跳过，双端旧HEAD回归失败；已移除该绕过，只对现有外卖上下文补救动作与抑制无付款承诺，普通原文保留。另有筛选中断过4分钟的旧searching把下一条请求直接吞掉，改标failed后继续本条请求；pending/unknown只按原client核验并返回中立系统提示，不重复扣款。真人模型筛选/必选规格/云券/回执行为回归通过，不把截图当成原文模式的确定证据、不保证真实外部模型绝不超时。跑酷每12tick增1，100秒从160升660即4.125倍，后段行距19000+min(12000,rowIndex*350)+随机4001，32seed通关及实际网页/私人100秒三心10单通过。独立迁移202610080003新增physics_version并保留三参数老开局API，四参数新版选择2；旧客户端/旧局按版本1，新局按版本2服务端回放，首次30/单局10和资金边界不变。正式迁移COMMIT成功，后续只读兼容验收以固定发布日志记录。新增店铺包format north-shop-pack/version1，内嵌本机IDB/云端图片，支持商品分组/价格/标签/普通规格/加料图片/通用模板，自由编辑。导出白名单不带云端店铺身份、钱包、收入、订单、凭证、库存；导入&lt;=40MB、最多60商品/12分组/8规格组，图片只PNG/JPEG/WebP数据，重建商品/规格ID，保留本人当前店铺云端关联，须确认替换草稿、显式保存，不自动发布/充值/补库存。真实两端浏览器导出IDB和受控公开URL图片、嵌套加料图、导入IDB与规格、未保存旧店不变、错误包不覆盖均pageErrors=[]。测试第一轮把意图修复模型stub沿用到菜单选择，导致sys回执，恢复真实选择模型函数后通过；未知付款原测试期望null更新为可见系统核验消息并保持paid次数1。全量3575/3575、双端正常授权聊天pageErrors0通过，固定日志复用。保护其他聊天好友SQL/11项行尾现场，无临时文件/工作树；无私人打包、Mac编译、iPhone或真实外部模型验证。</ns0:t>
+      </ns0:r>
+    </ns0:p>
+    <ns0:p>
+      <ns0:r>
+        <ns0:t>2026-10-08 v1624发布补充：导入上限最终对齐现有编辑器50商品、每组12选项（先前草案60/30不沿用）；导出处理Apple分享取消/共享/下载分别显示真实提示，账号切换不把完成消息写到新账号。正式加速迁移只读六项physics_version/legacy_start/new_start/new_rpc_grant/both_physics/RLS全部true。全量3575/3575通过，旧局及新局PG回放奖励兼容通过；网页私人实际IDB、公开URL以及规格选项图导出导入均通过。已授权正常推送，不打包。</ns0:t>
       </ns0:r>
     </ns0:p>
     <ns0:sectPr ns0:rsidR="00FC693F" ns0:rsidRPr="0006063C" ns0:rsidSect="00034616">

</xml_diff>

<commit_message>
fix: release v1626 dessert shop, merchant removal and timed order recovery
</commit_message>
<xml_diff>
--- a/docs/maintenance/AI开发项目_Bug修改规范.docx
+++ b/docs/maintenance/AI开发项目_Bug修改规范.docx
@@ -12380,6 +12380,52 @@
     <ns0:p>
       <ns0:r>
         <ns0:t>2026-10-08 v1624发布补充：导入上限最终对齐现有编辑器50商品、每组12选项（先前草案60/30不沿用）；导出处理Apple分享取消/共享/下载分别显示真实提示，账号切换不把完成消息写到新账号。正式加速迁移只读六项physics_version/legacy_start/new_start/new_rpc_grant/both_physics/RLS全部true。全量3575/3575通过，旧局及新局PG回放奖励兼容通过；网页私人实际IDB、公开URL以及规格选项图导出导入均通过。已授权正常推送，不打包。</ns0:t>
+      </ns0:r>
+    </ns0:p>
+    <ns0:p>
+      <ns0:pPr>
+        <ns0:pStyle ns0:val="Heading1"/>
+      </ns0:pPr>
+      <ns0:r>
+        <ns0:rPr>
+          <ns0:color ns0:val="000000"/>
+        </ns0:rPr>
+        <ns0:t>2026年10月8日 美团店铺与点单本地候选 v1626 v1627</ns0:t>
+      </ns0:r>
+    </ns0:p>
+    <ns0:p>
+      <ns0:r>
+        <ns0:t>用户授权本地修改及必要甜品资源、跑酷迁移文件，未授权本轮推送或打包。导出按钮使用明确黄色；停止公开同步关闭本机店铺、清理主页云端快照，按当前marketId核对修订号。删除入口先确认并停止公开，随后移除当前本机店铺和当前账号本店购物车；保存失败回滚本机状态，历史订单、库存、收入和其他账号保留。云端店铺作为历史经营记录保留，不释放三店名额。</ns0:t>
+      </ns0:r>
+    </ns0:p>
+    <ns0:p>
+      <ns0:r>
+        <ns0:t>用户提供north-shop-pack/version1甜品包，固定NORTH甜品店13商品、原图片及价格，评分4.9，距离/月售/预计时间明确为模拟值；奶茶店显示名改为NORTH奶茶店并兼容旧名称订单。固定资源复用自由规格、购物车、本机余额、角色卡和评价渲染，不导入云店身份、资金、订单或库存。</ns0:t>
+      </ns0:r>
+    </ns0:p>
+    <ns0:p>
+      <ns0:r>
+        <ns0:t>用户截图原话是好及独立十五分钟，旧ensureAction只识别到/送达或已点承诺，新增双端回归在旧HEAD失败。仅明确点餐请求、肯定答复与独立时长同时成立才补动作；拒绝、个人回来等不点单。动作回复与失败回复抑制独立未核实配送时间；成功仍必须后台订单回执，unknown只查原单。截图不证明实际版本、模式、资金或唯一根因；未调用真实收费模型或生产付款。</ns0:t>
+      </ns0:r>
+    </ns0:p>
+    <ns0:p>
+      <ns0:r>
+        <ns0:t>跑酷物理版本3初速400，为原160的2.5倍，继续加速至100秒900，增大世界行距保持32种子路线可解；保留版本1/2和旧三参数API，新增202610080004_north_runner_initial_speed.sql同步云端回放。隔离PGlite验证新旧开局、回放、身份/时间/去重/日限，生产迁移尚未部署，因此不能声称线上2.5倍领奖已可用。网页v1626/私人v1627均为本地源码，iOS439/桥42不变，未新打包、Mac编译或真机验收。</ns0:t>
+      </ns0:r>
+    </ns0:p>
+    <ns0:p>
+      <ns0:r>
+        <ns0:t>本地Edge双端13图片/蓝莓15元乘数量/购物车/结算返回/本机删除保留历史通过，pageErrors=[]。双端正常授权聊天门禁通过，模型HTTP受控；全量结果复用full-tests.log。导出初次复用on样式实测为浅底，已改专用黄色规则。维护Word仅追加，未做Word分页视觉验证。原12项继承现场保留，不创建工作树或重复脚本，必要正式资源经用户同意。</ns0:t>
+      </ns0:r>
+    </ns0:p>
+    <ns0:p>
+      <ns0:r>
+        <ns0:t>最终核验：3581/3581全量测试通过，永久继承检查包含在内；最终双端正常授权聊天门禁通过、pageErrors=0。网页/私人普通与原文四条实际aiReply流水线，受控模型与付款响应下均一次role_checkout、可见marketfood卡，未核实十五分钟不展示；每条共3次受控模型响应，不代表真实模型或生产扣款。导出按钮实测rgb(255,226,56)。第一次流水线夹具每次返回新身份对象触发原身份保护，修正为同一夹具对象后通过，没有修改身份保护。11个继承测试规范化后仍与HEAD逐字节相同，好友SQL仍32新增17删除。新增仅已授权的固定甜品资源（双端）与跑酷迁移；复用既有预览/日志/截图，无本轮无用临时文件或结束工作树需要清理。</ns0:t>
+      </ns0:r>
+    </ns0:p>
+    <ns0:p>
+      <ns0:r>
+        <ns0:t>2026-10-08 用户授权推送本轮v1626/v1627。生产202610080004_north_runner_initial_speed.sql事务成功，浏览器换行规范化后start/claim函数源码MD5与本轮文件一致，版本约束1/2/3，旧三参数API、anon/authenticated执行权限及会话RLS均保留；未创建生产测试局或发放测试奖励。只stage本轮路径及双端甜品资源，保护原12项现场。Pages上线结果以本次线上核对记录为准；本次不打私人包。</ns0:t>
       </ns0:r>
     </ns0:p>
     <ns0:sectPr ns0:rsidR="00FC693F" ns0:rsidRPr="0006063C" ns0:rsidSect="00034616">

</xml_diff>

<commit_message>
fix: release v1628 prevent silent legacy commerce fallback
</commit_message>
<xml_diff>
--- a/docs/maintenance/AI开发项目_Bug修改规范.docx
+++ b/docs/maintenance/AI开发项目_Bug修改规范.docx
@@ -12426,6 +12426,16 @@
     <ns0:p>
       <ns0:r>
         <ns0:t>2026-10-08 用户授权推送本轮v1626/v1627。生产202610080004_north_runner_initial_speed.sql事务成功，浏览器换行规范化后start/claim函数源码MD5与本轮文件一致，版本约束1/2/3，旧三参数API、anon/authenticated执行权限及会话RLS均保留；未创建生产测试局或发放测试奖励。只stage本轮路径及双端甜品资源，保护原12项现场。Pages上线结果以本次线上核对记录为准；本次不打私人包。</ns0:t>
+      </ns0:r>
+    </ns0:p>
+    <ns0:p>
+      <ns0:r>
+        <ns0:t>2026-10-08 网页v1628/私人共享源码v1629 美团组件加载失败恢复。用户截图确认主程序v1626但外卖为app.js内旧food-nav/商品列表，不能称服务器回退或仅说缓存。已复现阻断commerce-ui.js：主程序bootReady=true、旧标题显示、新美团缺失、失败提示未显示。根因可确认的代码缺口是启动后__northBootFail忽略组件错误、旧renderFood仍可显示；尚无用户设备日志证明下载失败的具体原因。修复旧renderFood改明确加载/失败页；未执行脚本仅自动重试一次、手动最多再一次，部分初始化运行错误不重执行；完成标记之后才视为组件可用，迟到组件只刷新当前food页。SW把commerce升为完整性校验必需核心，缓存读取检验已完成标记，切换CORE_FILES顺序时HTML保存键改按kind查找，避免误覆盖其他核心文件。未清存档/IndexedDB、未改模型渠道或付款规则、未再次部署数据库，继承v1626甜品/删店/跑腿/点单全部修复。双端首下载失败恢复、持续失败有提示/重试限次、运行错误不重复执行、购物车和搜索结果保留6项实浏览器通过；同一回归在旧HEAD失败。初次测试未禁用SW，SW成功缓存恢复使网络失败夹具被绕过，改隔离serviceWorkers:block定向测试后通过；旧夹具HTML路径需decode后匹配，前次启动超时是夹具版本混用而非业务根因。全量与正常聊天以固定日志最终结果为准，未做原用户iPhone现场复验。维护Word只追加，未验证分页。无新源码文件/脚本/目录/工作树，保留原12项现场。</ns0:t>
+      </ns0:r>
+    </ns0:p>
+    <ns0:p>
+      <ns0:r>
+        <ns0:t>最终v1628/v1629回归3587/3587通过，双端正常授权聊天检查通过。全量启动超时诊断显示测试预览未送到app.js（核心函数全缺），不是已定位的美团组件失败；将隔离回归夹具改为从当前真实文件字节fulfill全部本地资源、仅对commerce故障注入，不mock buildSystem/myActivity，完整回归通过。保留失败页food-nav用于既有iOS安全区样式，不保留旧商品列表。用户本次发布后的退回旧界面反馈属于当前发布修复范围，准备提交推送；Pages成功及资源匹配才视为上线。无新增目录/源码副本/脚本、无生产迁移或真实模型调用，12项现场保留。</ns0:t>
       </ns0:r>
     </ns0:p>
     <ns0:sectPr ns0:rsidR="00FC693F" ns0:rsidRPr="0006063C" ns0:rsidSect="00034616">

</xml_diff>

<commit_message>
fix: release v1630 clearable search, request-bound food cards and harder runner
</commit_message>
<xml_diff>
--- a/docs/maintenance/AI开发项目_Bug修改规范.docx
+++ b/docs/maintenance/AI开发项目_Bug修改规范.docx
@@ -12436,6 +12436,26 @@
     <ns0:p>
       <ns0:r>
         <ns0:t>最终v1628/v1629回归3587/3587通过，双端正常授权聊天检查通过。全量启动超时诊断显示测试预览未送到app.js（核心函数全缺），不是已定位的美团组件失败；将隔离回归夹具改为从当前真实文件字节fulfill全部本地资源、仅对commerce故障注入，不mock buildSystem/myActivity，完整回归通过。保留失败页food-nav用于既有iOS安全区样式，不保留旧商品列表。用户本次发布后的退回旧界面反馈属于当前发布修复范围，准备提交推送；Pages成功及资源匹配才视为上线。无新增目录/源码副本/脚本、无生产迁移或真实模型调用，12项现场保留。</ns0:t>
+      </ns0:r>
+    </ns0:p>
+    <ns0:p>
+      <ns0:r>
+        <ns0:t>2026-10-08 网页v1630/私人共享源码v1631本轮继续：店铺原包线上逐项核对13商品、封面、图片、价格、分组和规格完全一致；首页固定甜品店原来被S.food.q历史kkk过滤，改为与奶茶店固定展示，搜索结果页仍按关键词筛选。搜索输入原来无oninput，手删后重绘回填；补同步查询状态与清空按钮，清空只保存一次、保留商品/购物车/搜索历史，epoch阻断保存后/云目录迟到响应与后续AI生成，不新增模型调用；进入搜索结果时先render已提交词，修复等待云目录期间按钮隐藏。实际双端按钮清空/手删/重绘/返回及迟到响应无AI调用通过，旧HEAD固定入口回归失败。</ns0:t>
+      </ns0:r>
+    </ns0:p>
+    <ns0:p>
+      <ns0:r>
+        <ns0:t>角色新截图好/十五分钟送到再次证明此前原设备未修好。连续两次措辞补救失败后重新评估，改为本轮明确食物购买请求的一次模型意图核验，不依赖配送词；拒绝/非订单返回false，不强迫购买，背景续聊不自动增加此核验。实际手动回复入口会使用续聊note，因此通过reopenCompleted识别用户手动重试。遗留20分钟任意旧卡挡新请求改为用户消息键，保留账户/角色隔离；云意图按messageId优先且取最新记录，同请求已付款不重扣、缺卡可恢复、确认未付款的失败仅用户手动可再试、unknown只查原client；本机卡也保存回执供恢复。八条实际replyGenerationRun路径（网页/私人、普通/原文、云单/固定虚拟店）使用原截图原话及3小时前用户请求、旧助手好，均第一轮可见1张卡、再次手动回复仍1张；云checkout一次，本机卡原蓝莓图31775字符，未核实配送时间不展示。模型及付款HTTP受控，无真实用户扣款、真实模型或iPhone成功现场，不再把受控测试说成原设备修好了。</ns0:t>
+      </ns0:r>
+    </ns0:p>
+    <ns0:p>
+      <ns0:r>
+        <ns0:t>用户认为跑腿仍简单，初速继续2.5倍，加难物理版本4增加路线密度、边道之间换道、车辆+跳箱/下滑组合；32种子路线全部可解，障碍行数均超过版本3的1.2倍，100秒10单、3心、每局/日奖励和6分钟有效期保持。新增必要迁移202610080005_north_runner_harder_routes.sql，沿用用户已授权新增必要物理迁移文件范围；PGlite新旧1/2/3/4开局与回放、日限/身份/时间/幂等通过。生产迁移已事务成功，精确源码及权限核验以本次SQL结果为准，不创建生产测试局或发放测试奖励。</ns0:t>
+      </ns0:r>
+    </ns0:p>
+    <ns0:p>
+      <ns0:r>
+        <ns0:t>最终3597/3597全量、双端正常授权聊天门禁、上述8条手动回复浏览器流程通过。失败夹具签名误用(c,task,payload)的后两参数以及初始化缺S.food.north均已修正；不是设备根因。元数据新字段保留原deliveryConsumeMemoryTags绑定后再赋值，真实外卖记忆回归通过。只改本轮范围，保护12项现场、私人伴生/原生签名，复用既有日志截图及预览，无新工作树、临时脚本或私人包；维护Word只追加，未检验分页。提交推送及Pages线上资源核验后才称发布。</ns0:t>
       </ns0:r>
     </ns0:p>
     <ns0:sectPr ns0:rsidR="00FC693F" ns0:rsidRPr="0006063C" ns0:rsidSect="00034616">

</xml_diff>

<commit_message>
fix: release v1632 align nearby shop cards and use fixed dessert menu for role orders
</commit_message>
<xml_diff>
--- a/docs/maintenance/AI开发项目_Bug修改规范.docx
+++ b/docs/maintenance/AI开发项目_Bug修改规范.docx
@@ -12456,6 +12456,21 @@
     <ns0:p>
       <ns0:r>
         <ns0:t>最终3597/3597全量、双端正常授权聊天门禁、上述8条手动回复浏览器流程通过。失败夹具签名误用(c,task,payload)的后两参数以及初始化缺S.food.north均已修正；不是设备根因。元数据新字段保留原deliveryConsumeMemoryTags绑定后再赋值，真实外卖记忆回归通过。只改本轮范围，保护12项现场、私人伴生/原生签名，复用既有日志截图及预览，无新工作树、临时脚本或私人包；维护Word只追加，未检验分页。提交推送及Pages线上资源核验后才称发布。</ns0:t>
+      </ns0:r>
+    </ns0:p>
+    <ns0:p>
+      <ns0:r>
+        <ns0:t>2026-10-08 网页v1632/私人共享源码v1633：用户截图指出固定甜品店与奶茶店卡片布局不一致。复用northFixedShopCard，首页/搜索推荐/查询结果统一原图、月售、店铺配送、起送/配送费、右侧距离时间、下方橙色4.9分、商圈及模拟数据说明；保留甜品包起送1500/配送190与全部13商品。两家固定模拟店距离按原地址种子限定0.4至0.9km，其余商家范围不变，时间按原公式随距离更新。用户明确要求移除额外叉叉：删除三个入口清空按钮及其独立处理，只保留oninput同步、空值保存、迟到响应失效；直接删字后重绘/返回不回填。浏览器首页输入focus会切到搜索页，首次fill旧首页节点无效，夹具改为先click再fill，未误改业务。</ns0:t>
+      </ns0:r>
+    </ns0:p>
+    <ns0:p>
+      <ns0:r>
+        <ns0:t>角色新截图有未付款失败提示，不能算设备成功。审计发现补全意图提示禁止编造价格却未传本机菜单，明确固定店仍先依赖云钱包。改为传原本机菜单无图片、固定品名/店名/价格/规格只来自该菜单；兼容结构字段无需角色猜价格，无规格中性词仅在商品确无规格时接受。明确固定模拟店在幂等意图创建后直接走本机回执，不调用云钱包；真人订单继续云端校验，网络失败不偷换虚拟成功。只有唯一精确本机匹配且用户未要求真人/真实店铺时补全本机店名；保留角色拒绝、余额/订单安全和重复请求防护。双端新回归旧HEAD失败，本轮67专项通过；真实双端浏览器补全用户蓝莓请求，原菜单15元/无规格、原蓝莓图、可见一张卡、重复为null，模型及云端是受控边界，未调用用户真实模型、未扣真实余额。此截图实际失败原因仍缺设备诊断，未宣称现场修复。</ns0:t>
+      </ns0:r>
+    </ns0:p>
+    <ns0:p>
+      <ns0:r>
+        <ns0:t>版本只递增当前入口/缓存/对应测试，维护历史只追加；沿用授权工作树和必要双端共享源，不打私人包、不迁移数据库，保护并行好友SQL和11个继承测试。最终全量/聊天门禁、提交/Pages上线以固定日志核验为准；Word只追加未检验分页。</ns0:t>
       </ns0:r>
     </ns0:p>
     <ns0:sectPr ns0:rsidR="00FC693F" ns0:rsidRPr="0006063C" ns0:rsidSect="00034616">

</xml_diff>

<commit_message>
fix: release v1634 validate real multi-item orders and summarize cards by merchant
</commit_message>
<xml_diff>
--- a/docs/maintenance/AI开发项目_Bug修改规范.docx
+++ b/docs/maintenance/AI开发项目_Bug修改规范.docx
@@ -12471,6 +12471,31 @@
     <ns0:p>
       <ns0:r>
         <ns0:t>版本只递增当前入口/缓存/对应测试，维护历史只追加；沿用授权工作树和必要双端共享源，不打私人包、不迁移数据库，保护并行好友SQL和11个继承测试。最终全量/聊天门禁、提交/Pages上线以固定日志核验为准；Word只追加未检验分页。</ns0:t>
+      </ns0:r>
+    </ns0:p>
+    <ns0:p>
+      <ns0:r>
+        <ns0:t>2026-10-08 网页v1634/私人共享源码v1635继续修复：用户确认固定虚拟甜品成功，真人点餐失败；新截图用户要宋式番茄炖牛腩、角色承诺给点但出现未付款通用提示。只读线上公开目录/菜单确认该菜在闲云野鹤居，3700分、库存2、specGroups空、起送4800、配送190；这些是读取时快照，不代表用户当时余额或失败原因。角色菜单RPC用无效诊断身份探测返回market-auth-required，接口存在；无真实身份请求、无真实付款。复现模型给熟食热的但菜单没有温度规格导致校验失败，模型仅选3700菜也被起送价直接拒绝。修复仅对饮品保留模型温度默认；熟食不把模型的温度当成用户要求，用户明确温度仍严格校验。先完整校验模型选择，只在错误恰为未达起送价时用同店真实库存/实际可确定规格，最多增加3份，搜索最低商品总价的少量组合，报价/库存/云余额/优惠仍由后端核对；有忌口或禁止凑单不自动增购。读取时菜单的最低可解组合是牛腩3700+糯米藕1000+米饭200=4900，配送后5090，无券；没有替用户付款。</ns0:t>
+      </ns0:r>
+    </ns0:p>
+    <ns0:p>
+      <ns0:r>
+        <ns0:t>真人动作补全不再要求模型猜未知价格：用户要吃且角色承诺帮点时可解析结构化商品/规格/数量，未知真人价使用仅搜索的内部占位并强制真实目录报价，禁止将占位变成一元模拟回执。拒绝、普通个人到达及背景资格规则保留；多字段禁止控制标签注入。失败消息补显示安全的阶段/原因，如菜单、规格、起送价或云余额，保留付款未知时不重复支付；不展示原始模型/接口/账号秘密。新双端回归旧HEAD失败。实际replyGenerationRun用用户牛腩原句、3小时前用户消息及旧助手好受控测试，两端第一轮1张真人卡、重复仍1张、结账仅一次、金额5090、错误0；模型及付款均是夹具，未称原设备实测成功。</ns0:t>
+      </ns0:r>
+    </ns0:p>
+    <ns0:p>
+      <ns0:r>
+        <ns0:t>用户追加删除后编辑旧店复活、应可重开：确认现有删除只停公开并写本机deleted归档，云端shop_mine会把未公开旧店重新导入，所有云店仍计3店限额。前端阻止deleted归档重新进入编辑，新回归旧实现失败、双端通过。完整云端软删除/释放名额方案已在内存准备，拟新增deleted_at、shop_delete、活动店统计与编辑/保存过滤、保留旧订单和账目/库存，不退创业费；本地PGlite草案检验幂等、编辑空白、活动名额0、重开新ID、跨店主拒绝与余额保持通过。依据AGENTS新增文件规则已请求用户批准必要迁移文件，但尚未收到答复；本轮不新增迁移、不部署云删除、不能称名额已释放。草案夹具补storage/service_role/cron兼容才能加载既有迁移，不把环境夹具问题当成生产故障，密码哈希仅测试替身不作为生产安全验收。</ns0:t>
+      </ns0:r>
+    </ns0:p>
+    <ns0:p>
+      <ns0:r>
+        <ns0:t>用户追加一次点多样、聊天用商家图标、详情看全部：多标签按同一用户请求合成一次处理，真人计划items记录本轮全部要求，逐项验证商品、份数和规格；明确要的第二道菜不当额外凑单，缺任何要求即拒绝，不跨店。不改变实际quote/role_checkout权限/账目；多商品回执记录全部商品数量，额外凑单说明仅算真正多买部分。角色多商品真人卡显示商家封面/种类份数，删除卡内商品展开，完整内容在原订单详情；封面从公开店铺只读补充，读取失败不丢付款回执。本人赠餐默认旧单品展开保持。固定虚拟同店多标签合成一张可恢复卡，原商品图片/规格/数量/行价快照全部放详情和模型记忆；单品仍用原单品图。四条实际手动回复网页/私人×真人/固定虚拟受控流程均1卡、重复不增加；真人三商品5090、一次付款、p_topup=false；虚拟两蛋糕3000、0云付款；商家图标及完整详情通过。首次真人详情夹具缺order响应导致auto_delivery_at错误，补真实结构后通过；首次封面夹具用dataURL被真人URL白名单拒绝，改规范公网路径夹具后通过，未放宽图片白名单。</ns0:t>
+      </ns0:r>
+    </ns0:p>
+    <ns0:p>
+      <ns0:r>
+        <ns0:t>使用原工作树、测试、固定日志与内存草案，无新文件/工作树/临时脚本/包，保护12项并行现场。维护Word只追加，未检验分页；最终全量和聊天门禁、提交/Pages资源核对以固定日志为准。真实用户模型、iPhone以及云端删除重开仍未验收，不借受控测试声称全部完成。</ns0:t>
       </ns0:r>
     </ns0:p>
     <ns0:sectPr ns0:rsidR="00FC693F" ns0:rsidRPr="0006063C" ns0:rsidSect="00034616">

</xml_diff>

<commit_message>
fix: release v1636 role-owned shop queries, product order and shared coupon tickets
</commit_message>
<xml_diff>
--- a/docs/maintenance/AI开发项目_Bug修改规范.docx
+++ b/docs/maintenance/AI开发项目_Bug修改规范.docx
@@ -12496,6 +12496,61 @@
     <ns0:p>
       <ns0:r>
         <ns0:t>使用原工作树、测试、固定日志与内存草案，无新文件/工作树/临时脚本/包，保护12项并行现场。维护Word只追加，未检验分页；最终全量和聊天门禁、提交/Pages资源核对以固定日志为准。真实用户模型、iPhone以及云端删除重开仍未验收，不借受控测试声称全部完成。</ns0:t>
+      </ns0:r>
+    </ns0:p>
+    <ns0:p>
+      <ns0:r>
+        <ns0:t>2026-10-08 网页v1636/私人共享源码v1637：用户要求店铺商品调整位置。编辑我的店铺的商品行增加同分组上移/下移，首尾禁用；只交换当前草稿同组相邻商品引用，其他组所在槽位不移动，不改ID、图片、价格、分组、规格或上下架。账户不匹配、非编辑页、固定内置店、保存/发布/上传期间、商品弹窗未关闭及无效方向/ID不操作；移动设置dirty，保存前预览可见、保存后在本机生效，公开店仍需发布更新。重用现有可换行商品操作按钮样式，说明同组顺序，无拖拽或新数据库文件。</ns0:t>
+      </ns0:r>
+    </ns0:p>
+    <ns0:p>
+      <ns0:r>
+        <ns0:t>发布的商品副本按数组位置添加_northDisplayOrder，现有后台保留商品JSON额外字段，不改变交易计价/库存。点单页新鲜及缓存读取仅在全部位置为0至49整数且不重复时排序副本；旧店无位置字段及不完整/异常位置保留原返回顺序。避免依赖数据库jsonb_agg隐含顺序，受控测试特意倒序返回云商品仍按设定恢复。店铺包导出/导入沿用原数组顺序，导入继续原有重新生成ID和不导入交易资金规则。</ns0:t>
+      </ns0:r>
+    </ns0:p>
+    <ns0:p>
+      <ns0:r>
+        <ns0:t>缺少移动功能的回归在旧实现失败。双端实际HTML点击商品B上移、保存本机、预览、实际发布序列化、倒序云端响应显示、真实导出Blob和导入草稿均保持B/X/A/C顺序，另组X原槽位保持；保存商品ID/金额/分组/说明不变，页面错误0。模型、云端与文件保存边界是夹具，未操作用户真实店铺或发布商品。移动首尾、不活跃账户、保存中不变专项通过。首个新回归写入转义出现夹具SyntaxError已修正，随后缺少handler的旧版实质回归失败；不当成业务错误。</ns0:t>
+      </ns0:r>
+    </ns0:p>
+    <ns0:p>
+      <ns0:r>
+        <ns0:t>复用原工作树、维护文档、测试和固定日志，无新增文件/目录/脚本/工作树/包，仍保留12项并行现场；Word只追加未检验分页。此前店铺完整云删除/释放名额迁移的新增文件批准仍待回复，本轮不部署该草案，不称删除重开全部完成。全量/聊天门禁及Pages结果以固定日志和上线核对为准；iPhone现场未验证。</ns0:t>
+      </ns0:r>
+    </ns0:p>
+    <ns0:p>
+      <ns0:r>
+        <ns0:t>v1636回归补充：第一次全量卡在market-store-bulk-stock独立VM缓存夹具，该夹具仅加载northMarketOpen、漏掉新northMerchantOrderedProducts，失败清缓存后第二次请求的延迟Promise无人resolve。只终止经PID/父子命令验证的本轮测试进程，未动旧预览或其他Node；补加载真实排序函数，不mock实现。商品规格入口独立夹具也补真实northMarketAttr依赖。专项64/64通过后重新完整回归；不得把夹具依赖缺失误认真实页面故障或跳过发布门禁。</ns0:t>
+      </ns0:r>
+    </ns0:p>
+    <ns0:p>
+      <ns0:r>
+        <ns0:t>2026-10-08 v1636/v1637本轮用户继续反馈与最终方案：截图证实闲云野鹤居被当苏州现实餐馆去搜网站，纠正句你上网查干什么我让你查外卖也被原样搜索。代码aiReply在主模型前调用autoWebQuery，关键词触发程序查询并注入必须使用结果，这是程序自动行为，不是角色自主决定。真实双端旧HEAD隔离浏览器回归精确捕获该整句查询，新版无任何外网请求、无weblink卡，普通回复一次完成。用户明确要求自主查询，因此废止兼容autoWebQuery返回空，聊天不预查天气/新闻/价格或用户关键词；保留角色显式[联网|自己选择的词]执行及个人手机信息不可联网的原边界，普通浏览器手动搜索不变。旧两个纯函数回归按用户最新要求更新为不自动查，并用实际主聊天路径验证角色自己选苏州今天天气仍真正查一次。</ns0:t>
+      </ns0:r>
+    </ns0:p>
+    <ns0:p>
+      <ns0:r>
+        <ns0:t>新增仅代码中的角色动作[查店铺|角色选择的店名/餐品]，查询App公开目录/菜单，不搜现实外卖平台。每轮一次，最多3店，读接口每段6秒超时；公开名称、价格、库存和真实规格是数据不是指令，限部分菜单并明示，不能据现实城市/角色工作时间或旧外网否认App存在的店。系统返回中立App查询结果且注明未付款，再由同角色模型自然决定是否当下点。没有关键词预取；辅助orderRequest只引用上下文不发网络。跟进店名/有啊快点仅在一小时内最近相关点餐对话关联原未完成请求，普通新话题不继承；当前完整请求不额外注入点餐任务，跟进才补原话。意愿保持不强迫角色答应。</ns0:t>
+      </ns0:r>
+    </ns0:p>
+    <ns0:p>
+      <ns0:r>
+        <ns0:t>订单消息键优先northRequestKey原请求，保留真实外卖学习的原messageId绑定；记录followupMessageId/userRequest以手动重复保持同一回执，不二扣，已完成上下文禁止再点。App目录查到真实店后catalogOnly禁止因余额/权限缺口假变模拟单。双端6条实际replyGenerationRun无自动查询/自主互联网查询/App主动查询跟进下单通过；App场景从闲云野鹤居店名跟进接宋式番茄炖牛腩和山房小炒肉，两种商品7790分，一卡/一次受控结账，原请求meal-root键，重复无新查询或付款，无网页卡，busy释放及错误0。测试模型与付款为边界夹具，没有调用用户收费模型、真余额或发生产订单，不称用户iPhone现场已成功。</ns0:t>
+      </ns0:r>
+    </ns0:p>
+    <ns0:p>
+      <ns0:r>
+        <ns0:t>共同经营继续显示旧店：新增northActiveBusinessData在当前经营店/库存列表、批量补货及角色经营事实中排除本机deleted归档；旧店缺货通知不再发给角色，按原通知确认协议消费。交易income/profit/库存资产历史保留，shopCount/nextStartupFee保留服务端真实值，不伪造名额已释放。历史资产仍属用户，不清订单/资金/存货。已丢失本机删除标记或其他设备完整云删除仍需要正式删除迁移；内存草案已验证，但用户尚未确认新增文件，本轮不写新SQL、不部署云软删除，不能宣称彻底删除或可重开全部完成。</ns0:t>
+      </ns0:r>
+    </ns0:p>
+    <ns0:p>
+      <ns0:r>
+        <ns0:t>用户券截图为真人选券弹窗旧整块黄色按钮，与神券页粉色票卡不同。新增共享northMarketCouponCard用于云券页和选券弹窗，沿用原north-voucher粉色/红面额/虚线footer，门槛和有效期分行、小选择按钮及已选择标记；不新增券包、不混本机券/云券，不改过滤/锁定请求/每单一券或配送费不抵规则。旧HEAD券卡回归失败；双端实际从商品规格加购物车到真实结算/选券，券卡数量/面额颜色通过，3890选300券变3590、取消回3890，配送190不变，错误0。本地预览图由受控数据生成，非用户券账变动。</ns0:t>
+      </ns0:r>
+    </ns0:p>
+    <ns0:p>
+      <ns0:r>
+        <ns0:t>最终3632/3632全量、双端正常/原文、现有手机授权与有笔记聊天/持久化/自动检查门禁通过。此前全量排序依赖夹具和群禁言静态尾部邻接检查已修：独立VM加载真实排序和属性转义依赖；App上下文追加放lifeNote后，保留thoughtTurnPrompt/usageTruth/wxGroupMutePrompt原连续绑定，不放宽原检查。无新文件/脚本/目录/工作树/包，保护原12项现场；Word只追加未检验分页。网页v1636推送及Pages字节核对后才称上线，私人共享源码v1637/iOS439桥42不打包；生产数据库不变。</ns0:t>
       </ns0:r>
     </ns0:p>
     <ns0:sectPr ns0:rsidR="00FC693F" ns0:rsidRPr="0006063C" ns0:rsidSect="00034616">

</xml_diff>

<commit_message>
fix: release v1638 shop deletion, ordering continuation and natural posts
</commit_message>
<xml_diff>
--- a/docs/maintenance/AI开发项目_Bug修改规范.docx
+++ b/docs/maintenance/AI开发项目_Bug修改规范.docx
@@ -12551,6 +12551,16 @@
     <ns0:p>
       <ns0:r>
         <ns0:t>最终3632/3632全量、双端正常/原文、现有手机授权与有笔记聊天/持久化/自动检查门禁通过。此前全量排序依赖夹具和群禁言静态尾部邻接检查已修：独立VM加载真实排序和属性转义依赖；App上下文追加放lifeNote后，保留thoughtTurnPrompt/usageTruth/wxGroupMutePrompt原连续绑定，不放宽原检查。无新文件/脚本/目录/工作树/包，保护原12项现场；Word只追加未检验分页。网页v1636推送及Pages字节核对后才称上线，私人共享源码v1637/iOS439桥42不打包；生产数据库不变。</ns0:t>
+      </ns0:r>
+    </ns0:p>
+    <ns0:p>
+      <ns0:r>
+        <ns0:t>2026-10-08 网页v1638 / 私人共享源码v1639：商品上移下移改为相邻显示行交换，跨分组也只移动一个位置。角色查店续写保留原始非空动作消息，接入既有主模型与已配置辅助模型回退；彻底失败持久显示未付款提示，不自动循环查店或重复扣款。正式新增202610080006_north_market_shop_delete.sql并生产执行，核验deleted_state/functions_exact/api_acl/rls_preserved均true；软删除保留历史订单、收入、钱包和库存资产，当前店铺/经营列表不再展示，释放开店名额。对以前本机删除且云端版本未变化的店自动同步删除；版本冲突不覆盖其他设备新改动，共同经营提供本人删店入口。朋友圈和X增加按角色近期起手句的自然表达约束，时间只是生活背景，避免重复报时及固定今天/刚刚句式；与内容有关的准确时间保留，不修改已发内容，也不新增润色模型调用。用户明确授权提出的问题直接修改，无需等待本次代理确认；应用内删除确认仍保留。仅修改当前工作树，保护原12项继承现场和私人原生差异，不打私人包。隔离SQL和受控聊天/页面回归不能替代用户真实模型、生产真人付款、Mac或iPhone验收。维护Word仅追加，未核验分页。最终测试及Pages结果以固定日志和线上发布记录为准。</ns0:t>
+      </ns0:r>
+    </ns0:p>
+    <ns0:p>
+      <ns0:r>
+        <ns0:t>最终发布前核验：3648/3648全量测试通过，双端正常授权聊天门禁通过、pageErrors=0。朋友圈/X真实提示构造验证只带当前角色近期起手句、不改历史且没有额外润色请求；受控模型不能证明真实模型表达必然一致。旧查店实现空assistant请求在严格接口夹具失败，新实现双端通过；订单失败提示一次且未支付，配置辅助模型可正常回退。生产删除SQL四项只读核验全true，未在生产创建测试订单、删除用户数据或发放测试资金。修正测试夹具漏载新提示依赖及旧源码正则断言后，最终全量重新运行通过。保留当前工作树、原12项现场、8778预览及唯一历史证据；本轮重复临时检查日志并入固定north-tests.log后移除。</ns0:t>
       </ns0:r>
     </ns0:p>
     <ns0:sectPr ns0:rsidR="00FC693F" ns0:rsidRPr="0006063C" ns0:rsidSect="00034616">

</xml_diff>

<commit_message>
fix: release v1640 visible shop lookup, game icon cache and McDonalds
</commit_message>
<xml_diff>
--- a/docs/maintenance/AI开发项目_Bug修改规范.docx
+++ b/docs/maintenance/AI开发项目_Bug修改规范.docx
@@ -12561,6 +12561,16 @@
     <ns0:p>
       <ns0:r>
         <ns0:t>最终发布前核验：3648/3648全量测试通过，双端正常授权聊天门禁通过、pageErrors=0。朋友圈/X真实提示构造验证只带当前角色近期起手句、不改历史且没有额外润色请求；受控模型不能证明真实模型表达必然一致。旧查店实现空assistant请求在严格接口夹具失败，新实现双端通过；订单失败提示一次且未支付，配置辅助模型可正常回退。生产删除SQL四项只读核验全true，未在生产创建测试订单、删除用户数据或发放测试资金。修正测试夹具漏载新提示依赖及旧源码正则断言后，最终全量重新运行通过。保留当前工作树、原12项现场、8778预览及唯一历史证据；本轮重复临时检查日志并入固定north-tests.log后移除。</ns0:t>
+      </ns0:r>
+    </ns0:p>
+    <ns0:p>
+      <ns0:r>
+        <ns0:t>2026-10-08 网页v1640 / 私人共享源码v1641：新增用户明确提供的麦当劳固定模拟店资源（双端），原20商品、图片、价格、分组、规格完整保留，仅固定店身份、营业状态、修订号与模拟评分4.9归一化；无云店身份、钱包、库存或订单导入。既有甜品/奶茶店不覆盖。像素少女及电子宠物资源已在v1542更换，GLASS_ICON_CACHE仍为永久v1且ignoreSearch=true，可能持续命中更新前图；升级独立图标缓存v2和图标资源戳，不改用户自定义图标或清存档。查App店铺改为真实目录结果卡，显示对应店名、商品、价格、起送/配送及完整店铺入口，明确尚未付款，查询卡不是付款订单卡。相同用户消息的同词查询更新同一结果卡，防止灰字不算回复导致自动重复查店。续写明确携带当前点餐请求及下一步决策，仍由角色决定点/问/拒绝，不依据用户关键词强制付款或现实营业时间否认App店。只返回静默或重复查店标签不算成功续写，保留失败说明。本人真实支付、账户/情侣、库存/报价/未知去重保护不放宽。正常授权聊天与全量验收以本轮最终固定日志为准，没有调用用户收费模型、生产测试付款、Mac编译或iPhone现场验证。仅当前工作树，原12项其他聊天现场保护，私人原生与伴生差异不复制。维护Word仅追加未验证分页。必要正式新资源由本轮导入店铺要求及直接修改授权覆盖。</ns0:t>
+      </ns0:r>
+    </ns0:p>
+    <ns0:p>
+      <ns0:r>
+        <ns0:t>最终核验：3656/3656全量通过，双端正常授权聊天门禁pageErrors=0；新增查店信息/静默/重复指令六条实页面回归通过，查询卡完整店铺入口双端通过；相同信息卡回归在旧HEAD双端失败。独立图标缓存旧v1命中回归验证新版改读v2/current，激活仅清旧生成图标缓存，用户自定义图标和存档不清。麦当劳页面20商品、原图/价格/规格摘要校验、重复加载不重复添加及私人资源清单覆盖通过，截图merchant-mcdonalds-proof.png保留。本轮早期定向命令误覆盖eight-browser.log旧详细输出，无法完整恢复；原线上发布记录、meituan-home.png/meituan-runner.png唯一截图仍保留，不声称历史浏览器日志完整保留。首次截图夹具未进入food路由，随后正确进入；等待所有懒加载图片造成超时，改只等待当前可见图，最终页面截图无错误。首次全量缺私人资源清单新条目，补入后重新全量通过。未创建本轮无用脚本、目录或工作树，无需删除唯一证据；原12项其他聊天修改未提交。</ns0:t>
       </ns0:r>
     </ns0:p>
     <ns0:sectPr ns0:rsidR="00FC693F" ns0:rsidRPr="0006063C" ns0:rsidSect="00034616">

</xml_diff>

<commit_message>
fix: release v1642 order execution, personal wardrobe and new shops
</commit_message>
<xml_diff>
--- a/docs/maintenance/AI开发项目_Bug修改规范.docx
+++ b/docs/maintenance/AI开发项目_Bug修改规范.docx
@@ -12571,6 +12571,22 @@
     <ns0:p>
       <ns0:r>
         <ns0:t>最终核验：3656/3656全量通过，双端正常授权聊天门禁pageErrors=0；新增查店信息/静默/重复指令六条实页面回归通过，查询卡完整店铺入口双端通过；相同信息卡回归在旧HEAD双端失败。独立图标缓存旧v1命中回归验证新版改读v2/current，激活仅清旧生成图标缓存，用户自定义图标和存档不清。麦当劳页面20商品、原图/价格/规格摘要校验、重复加载不重复添加及私人资源清单覆盖通过，截图merchant-mcdonalds-proof.png保留。本轮早期定向命令误覆盖eight-browser.log旧详细输出，无法完整恢复；原线上发布记录、meituan-home.png/meituan-runner.png唯一截图仍保留，不声称历史浏览器日志完整保留。首次截图夹具未进入food路由，随后正确进入；等待所有懒加载图片造成超时，改只等待当前可见图，最终页面截图无错误。首次全量缺私人资源清单新条目，补入后重新全量通过。未创建本轮无用脚本、目录或工作树，无需删除唯一证据；原12项其他聊天修改未提交。</ns0:t>
+      </ns0:r>
+    </ns0:p>
+    <ns0:p>
+      <ns0:r>
+        <ns0:t>2026-10-08 网页v1642 / 私人共享源码v1643：本轮同时处理查店后不执行、个人衣柜、角色照片构图和三家新店。点餐修正只查到了而无口头承诺时漏过执行判断；我就想现在吃顿饭这类催促继续绑定前面尚未完成的具体菜品；多菜同店完整报价、库存、云端情侣、角色余额、未知付款原请求去重不放宽。查询卡显示继续处理/核对付款/失败/已有回执等实际阶段，避免误把查询当完成；本轮自己的明确失败不触发普通空回复的自动重复点单。纯图片、纯查询或明确不下单不消费错误点餐标签。空角色云余额与云端关系不一致均如实提示，不伪造虚拟付款或自动从本人转钱。</ns0:t>
+        <ns0:br/>
+        <ns0:t>个人资料新增我的形象工作室与衣柜，复用角色原有多角度身份参考、衣物、精确时间、替换/删除/测试功能；按当前账号独立保存，normalizeAccount保留该字段，默认关闭，关闭时不注入本人外观参考。角色与本人参考标明归属，最多4张；手/局部/背影/不露脸时不发送脸部身份参考，用户当前主体、范围和视角优先于AI描述及参考照原姿势。允许露脸不再等于每图必须露脸；明确正侧脸仍按权限和参考执行。否定句不跨标点误判，别露脸与不要遮脸分开；正侧面参考按要求优先排序；同名衣物以选定ID绑定避免第二次随机换衣。本人单人照不硬加入角色，妈妈/女同事等其他明确人物不套用本人形象。参考图读取失败、账号切换、角色失效时停止；参考API不支持时只尝试携带参考的兼容通道，不能静默丢图变成随机人物；已成功却没图片、鉴权/审核等非兼容错误不再自动换通道重复生成。衣物缩略图懒加载降低多图同时解码压力。</ns0:t>
+        <ns0:br/>
+        <ns0:t>用户提供瑞幸咖啡17商品、NORTH早餐店21商品、NORTH水果捞18商品，双端必要固定资源按原包保留图片、价格、分组、规格，模拟评分4.9；不导入云店身份、资金、库存或订单，既有店不覆盖。每轮APP_VER版本号与副标题必须一起更新为本轮真实内容，本轮显示点餐执行·形象衣柜与构图·新增店铺，不能停在伴生旧说明。私人原生iOS439/桥42及有意的公开私人差异保留，未打新私人包。</ns0:t>
+        <ns0:br/>
+        <ns0:t>证据分层：源代码/受控HTTP真实页面/GPT参考编辑请求与Gemini兼容多模态请求/保存刷新/正常授权聊天/Pages各自核验。没有调用用户收费聊天或绘图API，没有生产测试付款；合成色块参考测试不能证明真实模型的脸一致、手指/手势正确或每张视觉质量。没有Mac/iPhone现场验收。维护Word只追加，分页未验证。所有检查复用固定日志，不创建工作树或重复脚本；保护原12项其他聊天现场与独有历史截图。</ns0:t>
+      </ns0:r>
+    </ns0:p>
+    <ns0:p>
+      <ns0:r>
+        <ns0:t>最终发布前核验：3672/3672全量通过；正常授权聊天门禁网页/私人均pageErrors=0，最后个人衣柜文字/布局调整的双端真实页面专项再通过。旧v1640查到了+催促的同一回归双端失败，新版一次查询、一笔两菜回执、无重复付款；进度提示在续写未完成时可见，纯查询不付，图片-only/明确不下单即使模型给错误点餐标签也不执行。零角色余额/云情侣不对应有具体失败提示。手部/背影/遮脸/正侧脸与否定句/重复衣物名/本人单人/其他明确女性/开启关闭/保存刷新/账号切换/参考丢失/GPT编辑和Gemini带图兼容/不支持参考不丢图等回归覆盖。新三包17+21+18商品逐字段摘要一致，实际页面全部商品数正确；固定菜单决策请求实测22185字符且不含内嵌图片，尚未触及90000限制。六家模拟店包括之前三家；未做真实手机数量性能压测。个人衣柜界面证据personal-wardrobe-proof.png保留。原11个继承测试内容规范化后仍一致，好友SQL32新增17删除原样，均不提交。仅新增本轮用户要求的正式店铺资源（双端）及必要界面截图，没有重复脚本/工作树/目录，无本轮无用临时文件需要清理。Pages与线上文件最终结果见固定online-release-result.json。</ns0:t>
       </ns0:r>
     </ns0:p>
     <ns0:sectPr ns0:rsidR="00FC693F" ns0:rsidRPr="0006063C" ns0:rsidSect="00034616">

</xml_diff>

<commit_message>
feat: release v1644 NORTH pharmacy and bottom wardrobe entry
</commit_message>
<xml_diff>
--- a/docs/maintenance/AI开发项目_Bug修改规范.docx
+++ b/docs/maintenance/AI开发项目_Bug修改规范.docx
@@ -12587,6 +12587,18 @@
     <ns0:p>
       <ns0:r>
         <ns0:t>最终发布前核验：3672/3672全量通过；正常授权聊天门禁网页/私人均pageErrors=0，最后个人衣柜文字/布局调整的双端真实页面专项再通过。旧v1640查到了+催促的同一回归双端失败，新版一次查询、一笔两菜回执、无重复付款；进度提示在续写未完成时可见，纯查询不付，图片-only/明确不下单即使模型给错误点餐标签也不执行。零角色余额/云情侣不对应有具体失败提示。手部/背影/遮脸/正侧脸与否定句/重复衣物名/本人单人/其他明确女性/开启关闭/保存刷新/账号切换/参考丢失/GPT编辑和Gemini带图兼容/不支持参考不丢图等回归覆盖。新三包17+21+18商品逐字段摘要一致，实际页面全部商品数正确；固定菜单决策请求实测22185字符且不含内嵌图片，尚未触及90000限制。六家模拟店包括之前三家；未做真实手机数量性能压测。个人衣柜界面证据personal-wardrobe-proof.png保留。原11个继承测试内容规范化后仍一致，好友SQL32新增17删除原样，均不提交。仅新增本轮用户要求的正式店铺资源（双端）及必要界面截图，没有重复脚本/工作树/目录，无本轮无用临时文件需要清理。Pages与线上文件最终结果见固定online-release-result.json。</ns0:t>
+      </ns0:r>
+    </ns0:p>
+    <ns0:p>
+      <ns0:r>
+        <ns0:t>2026-10-08 网页v1644 / 私人共享源码v1645：用户分三批提供药店图片，第1张封面，其余10+10+4为24个商品；创建固定NORTH药店，原25张图片逐字节保留，后续继续追加同一店并保留稳定商品ID。仅依包装录入名称和数量/容量，不推断成分、药效、剂量或真实药品认证；价格为明确的模拟值、模拟评分4.9，起送0避免自动凑药，配送沿用模拟。五组为护理用品7、口腔用品2、片剂与胶囊9、液体与贴剂4、检测用品2。布洛芬缓释胶囊和缓解疼痛胶囊是两张不同包装的原始标题，分别保留，不根据英文图片擅自合并成真实等效药。首页分类按用户要求为看病买药，固定店带medicine类别，分类搜索命中本机店不调用AI生成；药店页使用商品和包装示意提示，避免餐馆的点菜/适量点餐文字。</ns0:t>
+        <ns0:br/>
+        <ns0:t>个人资料页的我的形象工作室与衣柜移到全部原有资料组之后，保留原有资料顺序；资料弹窗入口原本已经位于表单底部。双端网页实页面核验24商品、分类进入、分类筛选、无额外AI调用、衣柜最后一行、原保存刷新和图片请求保护。测试截图merchant-pharmacy-proof.png保留，原截图不覆盖。所有v1642点餐执行/个人衣柜/构图/前六家店修复继承；只追加本轮必要药店资源并同步版本副标题，不新增工作树/脚本/重复目录，不碰其他聊天SQL与11个继承测试。无云店创建、创业费、生产付款、真实用药建议、私人安装包、Mac或真机验证。维护Word仅追加，分页未核验。</ns0:t>
+      </ns0:r>
+    </ns0:p>
+    <ns0:p>
+      <ns0:r>
+        <ns0:t>最终v1644/v1645验证：3677/3677全量测试通过，双端正常授权聊天门禁通过、pageErrors=0。药店原25张图片摘要一致，24商品唯一ID、五分类总数正确，网页/私人实际看病买药进入店铺、24商品、检测两项/片剂九项筛选、无AI生成调用均通过；个人资料最后一行入口与保存刷新/参考绑定旧回归通过。用户原图未改，价格明确模拟，未作实际诊療/药物身份/疗效判断或生产付款。没有重复脚本/目录/工作树，保留必要药店界面截图及原独有证据；原12项继承现场不纳入发布。线上成功与字节核对以online-release-result.json本轮记录为准；私人仍仅共享源码，不是安装包。</ns0:t>
       </ns0:r>
     </ns0:p>
     <ns0:sectPr ns0:rsidR="00FC693F" ns0:rsidRPr="0006063C" ns0:rsidSect="00034616">

</xml_diff>

<commit_message>
fix: isolate optional app launch failures web v1646 private v1647
</commit_message>
<xml_diff>
--- a/docs/maintenance/AI开发项目_Bug修改规范.docx
+++ b/docs/maintenance/AI开发项目_Bug修改规范.docx
@@ -12599,6 +12599,16 @@
     <ns0:p>
       <ns0:r>
         <ns0:t>最终v1644/v1645验证：3677/3677全量测试通过，双端正常授权聊天门禁通过、pageErrors=0。药店原25张图片摘要一致，24商品唯一ID、五分类总数正确，网页/私人实际看病买药进入店铺、24商品、检测两项/片剂九项筛选、无AI生成调用均通过；个人资料最后一行入口与保存刷新/参考绑定旧回归通过。用户原图未改，价格明确模拟，未作实际诊療/药物身份/疗效判断或生产付款。没有重复脚本/目录/工作树，保留必要药店界面截图及原独有证据；原12项继承现场不纳入发布。线上成功与字节核对以online-release-result.json本轮记录为准；私人仍仅共享源码，不是安装包。</ns0:t>
+      </ns0:r>
+    </ns0:p>
+    <ns0:p>
+      <ns0:r>
+        <ns0:t xml:space="preserve">工程规则：应用分发器不得在打开某个应用时解析全部可选组件入口；延迟到选择该组件时再调用，并测试任一可选脚本缺失时独立应用、返回、锁定和禁闭仍正常。不能仅凭症状断言所有用户同一根因，也不以清空存档/撤除管控修复组件缺失。</ns0:t>
+      </ns0:r>
+    </ns0:p>
+    <ns0:p>
+      <ns0:r>
+        <ns0:t xml:space="preserve">维护Word时先识别正文命名空间，不能假定前缀固定为w；追加必须位于正文最终sectPr之前，写后解析XML并核对原有段落完整保留。全量测试开始前完成版本与编译说明同步，测试期间不得修改其输入文件。</ns0:t>
       </ns0:r>
     </ns0:p>
     <ns0:sectPr ns0:rsidR="00FC693F" ns0:rsidRPr="0006063C" ns0:rsidSect="00034616">

</xml_diff>

<commit_message>
feat: share stores and distinguish business orders web v1648 private v1649
</commit_message>
<xml_diff>
--- a/docs/maintenance/AI开发项目_Bug修改规范.docx
+++ b/docs/maintenance/AI开发项目_Bug修改规范.docx
@@ -12609,6 +12609,16 @@
     <ns0:p>
       <ns0:r>
         <ns0:t xml:space="preserve">维护Word时先识别正文命名空间，不能假定前缀固定为w；追加必须位于正文最终sectPr之前，写后解析XML并核对原有段落完整保留。全量测试开始前完成版本与编译说明同步，测试期间不得修改其输入文件。</ns0:t>
+      </ns0:r>
+    </ns0:p>
+    <ns0:p>
+      <ns0:r>
+        <ns0:t xml:space="preserve">工程补充：公开分享只能传公开店铺定位/公开商品数据；顾客订单与钱包不能随卡片外发。真人点单按店ID读取最新菜单并经过原报价和付款，不信任消息价格，不把查询当付款。角色提醒禁止硬编码台词兜底；批次合并、持久化五分钟冷却、并发互斥、保存成功才确认通知。检查订单必须标明购买/顾客收单/角色代买，收货人与买家不同，读取失败不可伪造为空，分页不可称全部，缓存绑定存档、当前账户、角色和手机号。私人共享更改须按最小差异应用，不能整行覆盖已有不同的伴生实现。</ns0:t>
+      </ns0:r>
+    </ns0:p>
+    <ns0:p>
+      <ns0:r>
+        <ns0:t>2026-10-08 发布候选网页v1648 / 私人共享源码v1649：美团店铺分享卡片、角色口语经营提醒和查手机订单分类。沿用用户此前改完推送、不打包的授权；前段本地候选记录描述的是当时进度，本段进入正式发布核验。全量 Node 3690/3690 通过，网页与私人授权正常聊天检查通过；受控浏览器验证角色分享、好友协议发送与接收、完整菜单打开和选规格，未向真实用户发消息或进行生产付款。原生 iOS439/桥42保持，私人伴生功能差异保持，不生成覆盖包；Mac编译与真机未验证。</ns0:t>
       </ns0:r>
     </ns0:p>
     <ns0:sectPr ns0:rsidR="00FC693F" ns0:rsidRPr="0006063C" ns0:rsidSect="00034616">

</xml_diff>

<commit_message>
feat: opening rewards role payment and three minute runner web v1650 private v1651
</commit_message>
<xml_diff>
--- a/docs/maintenance/AI开发项目_Bug修改规范.docx
+++ b/docs/maintenance/AI开发项目_Bug修改规范.docx
@@ -12619,6 +12619,26 @@
     <ns0:p>
       <ns0:r>
         <ns0:t>2026-10-08 发布候选网页v1648 / 私人共享源码v1649：美团店铺分享卡片、角色口语经营提醒和查手机订单分类。沿用用户此前改完推送、不打包的授权；前段本地候选记录描述的是当时进度，本段进入正式发布核验。全量 Node 3690/3690 通过，网页与私人授权正常聊天检查通过；受控浏览器验证角色分享、好友协议发送与接收、完整菜单打开和选规格，未向真实用户发消息或进行生产付款。原生 iOS439/桥42保持，私人伴生功能差异保持，不生成覆盖包；Mac编译与真机未验证。</ns0:t>
+      </ns0:r>
+    </ns0:p>
+    <ns0:p>
+      <ns0:r>
+        <ns0:t>2026-10-08 网页v1650 / 私人共享源码v1651：开店1000额度奖励。每个有效授权小手机账号终身一次，已有或新建未删除的本人云端店铺都可领，空菜单与未公开不阻止；本机导入包不构成云店资格。钱包显示未开店/可领取/已领取，共同经营入口可进入领取；到账本人美团云端可用余额，与首次500、管理员补额度、情侣余额、店铺收入和创业净利润分离。后台本人身份验证，店主锁后钱包锁与创建/删除同序，固定请求ID和每owner唯一奖励索引；删除重开、多店、重复或未知结果重试不增发。金额固定100000分，无客户端金额参数。失败不修改本机钱包，账号/状态/手机号/凭据变化废弃旧响应。新增必要迁移202610080007，既有正式迁移不重写。正式DB事务回滚测试通过无店拒领/开第一店/1000与首次500独立/重复/删除重开/错误身份/唯一账本；已正式部署领取接口，部署时0人领取、16个未删除店主符合条件，未替真实用户代领。浏览器/完整回归/核心聊天结果见本轮固定日志。维护Word只追加且XML与历史段落核验，分页未核验。继续改完推送、不打包，原生iOS439/桥42和私人伴生差异保持。</ns0:t>
+      </ns0:r>
+    </ns0:p>
+    <ns0:p>
+      <ns0:r>
+        <ns0:t>本轮追加真人评价大图修复：旧店铺公开评价与我的/顾客评价仅渲染span缩略图，无点击处理；改为按当前页订单ID与图片索引查原图，连接既有viewImg查看器，关闭返回原评价，写评价已上传图同样可查看且删除按钮独立。只允许既有north-market公开图片路径，账号切换、无效索引、失效页面和危险URL不打开；不修改图片上传、评分、订单、买卖权限。旧实际渲染双端无查看入口的回归失败，新VM与网页/私人实际HTML在公开、本人、店铺顾客、草稿四入口均打开解码并关闭成功，草稿删除入口保留，pageErrors0。最终版本说明为开店奖励与评价大图预览（网页v1650/私人源码v1651），两项合并发布、不打包。</ns0:t>
+      </ns0:r>
+    </ns0:p>
+    <ns0:p>
+      <ns0:r>
+        <ns0:t>本轮累计追加：角色代付同意后自动执行order_create，不再点继续确认或输入本人PIN；拒绝、失效授权、保存失败不付款，未知结果仍按原client查单，已付款不重发；本人订单、拼单、充值、补货和创业支付仍校验密码。后台仅将原order_create的本人PIN错误锁定/验证/清零段包在p_role为空分支，原云关系与revision、报价、规格、库存、预约、备注、coupon和原请求幂等全部保留；已有免PIN角色自点接口权限不扩大。自动代付不强制跳转用户所在页面。DB旧角色空PIN付款阻挡复现，新事务验证空PIN角色付款/角色资金单扣/重复重放/本人空PIN拒付/云关系revision错误拒付均通过并回滚。资产栏原只数northMyOrders本机购买记录，店主顾客订单显示0；钱包新增按已认证owner查询全部云端购买数、顾客收单数和未删除店数，资产明确顾客订单/购买订单与对应入口，无缓存显示—，不把首页21条分页当总数。收入nowrap、增加收入列空间与小屏字级，320/390宽实际不折行。用户最终要求单局最多3分钟：新physics5为10800tick/18单，前100秒提速后保持900速度，32路线完整可解；旧1-4继续6000tick/10单，新老局后台同版本重放兼容。奖励每日10000分即100额度，北京00:00重置；每10秒1额度，满局18，尾局按剩额截断，重复领取不增发。每日和时长都由服务器控制，不信任客户端得分，保留6分钟会话有效期。PGlite真实PostgreSQL验证达到100/超限0/最后3额度截断/新3分钟18/旧100秒10/过快/错身份/重放；双端真实HTML代付无PIN单付、留在原页面、83顾客订单、收入单行、跑酷3分钟/100与新局版本5通过，无pageErrors。生产SQL最终已COMMIT，四项接口规则核验true，临时事务测试profiles0。以网页v1650/私人共享源码v1651合并发布，不打包；最终全量与聊天门禁记录在固定日志，不声称真机或真实模型同意/付款验收。</ns0:t>
+      </ns0:r>
+    </ns0:p>
+    <ns0:p>
+      <ns0:r>
+        <ns0:t>最终发布前核验：3703/3703全量通过，605项永久继承检查通过，双端正常授权聊天门禁通过。全量首次仅2条旧跑酷静态marker因用户改3分钟不匹配，定向更新g.orders按新旧版本18/10与启动physics5，原分离账本/音乐/游戏重放/旧局回归保留，复跑全量零失败。网页/私人实际页面奖励领取与重复防重、评价四入口大图/关闭/草稿删除、角色同意无二次PIN单付且留在原页面、顾客云端订单计数83（fixture，不是用户真实数）、320与390宽收入1051.00单行、游戏3分钟/18与100日上限均通过，pageErrors0。旧资产实际渲染0忽略seller83复现；旧游戏3分钟回归失败，新32种子三分钟完整存活，真实PostgreSQL多局100上限与尾局截断通过。生产回滚测试和正式COMMIT确认，auth/本人PIN/关系revision/原请求去重/元数据保留；测试数据全部回滚。未打包、未进行真实用户测试消费、未声称Mac/iPhone实测。旧文档段落逐项XML一致，ZIP校验通过。多余本轮临时测试日志合并进north-tests.log后删除，只保留必要界面证据；12项继承改动与其他工作区不纳入本轮提交。</ns0:t>
       </ns0:r>
     </ns0:p>
     <ns0:sectPr ns0:rsidR="00FC693F" ns0:rsidRPr="0006063C" ns0:rsidSect="00034616">

</xml_diff>

<commit_message>
fix: shared restaurant purchase and final runner rules web v1652 private v1653
</commit_message>
<xml_diff>
--- a/docs/maintenance/AI开发项目_Bug修改规范.docx
+++ b/docs/maintenance/AI开发项目_Bug修改规范.docx
@@ -12639,6 +12639,21 @@
     <ns0:p>
       <ns0:r>
         <ns0:t>最终发布前核验：3703/3703全量通过，605项永久继承检查通过，双端正常授权聊天门禁通过。全量首次仅2条旧跑酷静态marker因用户改3分钟不匹配，定向更新g.orders按新旧版本18/10与启动physics5，原分离账本/音乐/游戏重放/旧局回归保留，复跑全量零失败。网页/私人实际页面奖励领取与重复防重、评价四入口大图/关闭/草稿删除、角色同意无二次PIN单付且留在原页面、顾客云端订单计数83（fixture，不是用户真实数）、320与390宽收入1051.00单行、游戏3分钟/18与100日上限均通过，pageErrors0。旧资产实际渲染0忽略seller83复现；旧游戏3分钟回归失败，新32种子三分钟完整存活，真实PostgreSQL多局100上限与尾局截断通过。生产回滚测试和正式COMMIT确认，auth/本人PIN/关系revision/原请求去重/元数据保留；测试数据全部回滚。未打包、未进行真实用户测试消费、未声称Mac/iPhone实测。旧文档段落逐项XML一致，ZIP校验通过。多余本轮临时测试日志合并进north-tests.log后删除，只保留必要界面证据；12项继承改动与其他工作区不纳入本轮提交。</ns0:t>
+      </ns0:r>
+    </ns0:p>
+    <ns0:p>
+      <ns0:r>
+        <ns0:t>2026-10-08 网页v1652 / 私人共享源码v1653：用户截图分享闲云野鹤居后说给我买，仍停查询完成未提交。确认两处漏口：northRoleOrderRequest把短购买请求当成无上下文的新文本；ensureAction食物关键词偏奶茶/蛋糕，牛腩/小炒肉直接购买也可能漏判。新短请求绑定20分钟内、同角色最近16条里的cloud分享与其后近期角色餐品讨论，当前购买消息ID作为幂等锚；不自动搜索、不凭分享或过期闲聊构造用户购买授权。判断阶段传不含图片的50条以内分享商品ID/正式名/价格，区分聊天提到、用户自己买过与这次要代买，名称简称由角色解析；实际选择仍读指定店最新完整菜单和规格、报价、库存、云情侣revision、角色余额、券和原请求防重。正餐关键词加入牛腩/小炒肉/米饭/面条/炒饭/肉类，其他模式、拒绝、只查询、只图片的保护保持。旧v1650新增短购买与牛腩直接购买回归4项失败，新定向89项通过。完整微信HTML双端×普通/原文4组合，以正常buildSystem/aiReply及受控HTTP模型/RPC边界执行，均一次指定店付款、两道菜7790分、一张回执、无目录搜索与pageerror；不是用户实际订单，不作生产测试消费。第一次浏览器fixture用startsWith匹配被角色人设前缀包裹的规划提示而返回错误样本，改为按任务匹配后四组合通过；并非再次修改产品规则。源码、正常聊天门禁与全量末尾见固定日志；开店1000、免二次密码代付、订单计数/收入、评价大图、三分钟每日100及全部已有修复继续继承。iOS439/桥42与私人伴生差异不改，推送不打包，维护Word只追加XML历史核验、分页未验证。</ns0:t>
+      </ns0:r>
+    </ns0:p>
+    <ns0:p>
+      <ns0:r>
+        <ns0:t>用户本轮最终追加覆盖前面三分钟候选：新跑酷局150秒/9000tick，最多25单，每6秒1单即满局25额度，每日100额度不变。新增必要正式迁移202610080008，旧007不重写；physics6与旧1-5并存，1-4旧100秒10单、旧5三分钟18单与已领取回执不改变，reward范围扩至2500分。后台原身份、服务器计时、操作事件重放、防重与每日剩额截断保持。首个v6重放测试发现旧初始速度分支in(3,4,5)遗漏新6导致与前端400不同，补到(3,4,5,6)，真实PostgreSQL新150秒25单三次奖励2500/2500/2200（此前旧局2800）累计10000分并重放不增发，旧5回执1800保留，32种子150秒完整可解。正式SQL已COMMIT，150秒/6秒每单/每日100三项核验true。另按用户要求，所有shopquery中间卡在bubbleRow和buildPart都返回空，内部查询记录、点单上下文和最终订单/失败信息保留，不产生空头像，历史查询卡同样隐藏。短购买元数据增加actualText只用于当前用户禁止购买/图片判断，历史角色引用只查不下单不覆盖当前给我买，当前用户只查询仍拒付；未改变角色当轮明确拒绝/余额/库存保护。实际双端普通/原文查店铺标签→内部一条query→购买两道菜一笔77.90→仅最终订单卡均通过，未调用目录搜索；新游戏实际HTML150秒/25单与启动physics6专项验证。最终网页v1652/私人源码v1653说明更新为分享点单修复·150秒跑酷，完整回归与聊天门禁以固定日志本轮最后结果为准。所有上轮奖励/代付/收入/评价等继承，不打包，不产生真实用户测试订单；截图是受控数据，真机未验证。</ns0:t>
+      </ns0:r>
+    </ns0:p>
+    <ns0:p>
+      <ns0:r>
+        <ns0:t>最终发布前核验：3712/3712全量通过，正常授权聊天网页/私人均通过pageErrors0。隐藏查询卡后旧cache-version测试仍期待App店铺查询卡/查看店铺可见，progress fixture直接读空DOM导致挂起；中断旧候选，按用户最终设计改为内部查询记录及两商品菜单保留、聊天无中间查询卡、最终付款回执或明确失败仍显示，progress可选读取空值，保留无辅助模型/503/空回复/禁止误用用户句子搜索与纯查询不付等验证；定向52/52通过后复跑全部3712通过。双端×普通/原文四组合执行实际查店铺标签后生成一条内部查询、一笔两菜77.90回执，屏幕不再显示App查询卡，最终截图已检查。150秒/25单实际HTML与新启动6验证，真实PostgreSQL重放及旧模式保留通过，生产最终结算prosrc去空白hash与008迁移一致true。临时后台页关闭，测试日志复用；所有旧文档段落和ZIP内容核验保持，分页未核验。新功能源代码/网页部署与Mac/iPhone不同；私人仅共享源码，不打包，不进行生产测试付款或真实付费模型调用。12项继承现场保护，提交仅本轮74路径，前轮所有修复通过永久继承门禁。</ns0:t>
       </ns0:r>
     </ns0:p>
     <ns0:sectPr ns0:rsidR="00FC693F" ns0:rsidRPr="0006063C" ns0:rsidSect="00034616">

</xml_diff>

<commit_message>
fix: missing flight component cannot block chat web v1654 private v1655
</commit_message>
<xml_diff>
--- a/docs/maintenance/AI开发项目_Bug修改规范.docx
+++ b/docs/maintenance/AI开发项目_Bug修改规范.docx
@@ -12654,6 +12654,16 @@
     <ns0:p>
       <ns0:r>
         <ns0:t>最终发布前核验：3712/3712全量通过，正常授权聊天网页/私人均通过pageErrors0。隐藏查询卡后旧cache-version测试仍期待App店铺查询卡/查看店铺可见，progress fixture直接读空DOM导致挂起；中断旧候选，按用户最终设计改为内部查询记录及两商品菜单保留、聊天无中间查询卡、最终付款回执或明确失败仍显示，progress可选读取空值，保留无辅助模型/503/空回复/禁止误用用户句子搜索与纯查询不付等验证；定向52/52通过后复跑全部3712通过。双端×普通/原文四组合执行实际查店铺标签后生成一条内部查询、一笔两菜77.90回执，屏幕不再显示App查询卡，最终截图已检查。150秒/25单实际HTML与新启动6验证，真实PostgreSQL重放及旧模式保留通过，生产最终结算prosrc去空白hash与008迁移一致true。临时后台页关闭，测试日志复用；所有旧文档段落和ZIP内容核验保持，分页未核验。新功能源代码/网页部署与Mac/iPhone不同；私人仅共享源码，不打包，不进行生产测试付款或真实付费模型调用。12项继承现场保护，提交仅本轮74路径，前轮所有修复通过永久继承门禁。</ns0:t>
+      </ns0:r>
+    </ns0:p>
+    <ns0:p>
+      <ns0:r>
+        <ns0:t>2026-10-08 网页v1654 / 私人共享源码v1655：用户截图所有文本模型未回复，Safari报Cant find variable NorthTravelFlight。源码确认buildSystem对每个主账号角色调用NorthFlightBooking.rolePrompt，booking脚本独立加载后quote直接读取缺失的NorthTravelFlight.state，模型HTTP请求前ReferenceError；仅正常全组件载入门禁不能覆盖此故障。最小修复booking独立组件：flightReady判断存在与state方法，quote在缺组件/空state返回null；rolePrompt现有订单仍按账号角色读取，非法查询缺people不注入查询；checkDue活跃页面判断补typeof守卫，普通聊天刷新不被组件缺失阻断；明确roleDirect订机票缺查询组件返回false，沿原失败回执，不造订单不扣款。没有注册假机票组件、不删除旅行/聊天/模型配置、不禁用旅行全模块。旧HEAD双端真实模块回归2项均因ReferenceError失败，新有历史机票订单、提示词、due刷新、不扣款、后续加载恢复查询与空state/缺people验证通过。授权聊天脚本增加可选NORTH_MISSING_FLIGHT=1，真正阻断travel-flight.js但保留booking组件及已有机票记录，以原buildSystem/myActivity、普通/原文、权限与笔记、手动/自动回复、保存刷新进行双端真实HTML验收；第一次缺组件门禁通过，最终版本全量/健康门禁/缺组件门禁以本轮固定日志末尾为准。不调用真实收费模型或发测试消息。网页/私人最小同改，iOS439/桥42及私人伴生差异保持，改完推送不打包；不声称iPhone现场验证或确认航班脚本缺载的网络唯一原因。维护Word只追加，分页未核验；固定工作树、脚本、日志复用。</ns0:t>
+      </ns0:r>
+    </ns0:p>
+    <ns0:p>
+      <ns0:r>
+        <ns0:t>最终发布前核验：3715/3715全量通过。正常完整组件门禁通过；NORTH_MISSING_FLIGHT=1真实阻断机票查询脚本而保留booking与历史机票记录的双端门禁通过，16种权限/原文/笔记组合及手动/自动回复、忙碌释放与保存刷新数据均通过pageErrors0；没有mock buildSystem或myActivity。截图在预览授权环境的实际聊天阶段、动画完成后捕获并检查可见两条回复，避免重载后授权遮罩被误当聊天证据。旧HEAD模块回归2项ReferenceError失败，新空state与缺people查询可读历史、不订票不扣款、动态组件恢复读查询验证通过。本轮只flight-booking三消费者与查询数据保护、QA脚本/测试、版本与维护记录；其他旅行功能、模型设置、聊天记录与全部旧修复继承，私人伴生/原生/签名不动。维护历史段落逐项一致、ZIP和XML校验通过，未验证Word分页。不打包，不调用用户收费模型或真实发消息，未进行iPhone验收。固定日志复用，无新增源码副本/工作树/重复脚本；只保留必要聊天证据，12项继承现场排除提交。</ns0:t>
       </ns0:r>
     </ns0:p>
     <ns0:sectPr ns0:rsidR="00FC693F" ns0:rsidRPr="0006063C" ns0:rsidSect="00034616">

</xml_diff>

<commit_message>
fix: cloud-funded startups, lifetime shop reward tiers and empty-stock batch restocking
</commit_message>
<xml_diff>
--- a/docs/maintenance/AI开发项目_Bug修改规范.docx
+++ b/docs/maintenance/AI开发项目_Bug修改规范.docx
@@ -12664,6 +12664,31 @@
     <ns0:p>
       <ns0:r>
         <ns0:t>最终发布前核验：3715/3715全量通过。正常完整组件门禁通过；NORTH_MISSING_FLIGHT=1真实阻断机票查询脚本而保留booking与历史机票记录的双端门禁通过，16种权限/原文/笔记组合及手动/自动回复、忙碌释放与保存刷新数据均通过pageErrors0；没有mock buildSystem或myActivity。截图在预览授权环境的实际聊天阶段、动画完成后捕获并检查可见两条回复，避免重载后授权遮罩被误当聊天证据。旧HEAD模块回归2项ReferenceError失败，新空state与缺people查询可读历史、不订票不扣款、动态组件恢复读查询验证通过。本轮只flight-booking三消费者与查询数据保护、QA脚本/测试、版本与维护记录；其他旅行功能、模型设置、聊天记录与全部旧修复继承，私人伴生/原生/签名不动。维护历史段落逐项一致、ZIP和XML校验通过，未验证Word分页。不打包，不调用用户收费模型或真实发消息，未进行iPhone验收。固定日志复用，无新增源码副本/工作树/重复脚本；只保留必要聊天证据，12项继承现场排除提交。</ns0:t>
+      </ns0:r>
+    </ns0:p>
+    <ns0:p>
+      <ns0:r>
+        <ns0:t>2026-10-08 本地候选：云端余额开店、三档开店奖励与缺货多选补货（未提交、未推送、未部署、未重打包）。用户截图余额773.03、已实现利润129，第二家200被利润门槛阻止；现有前端和后台均要求利润/未提现收入，不是余额不足。用户明确改为本人美团云端余额支付，不要求利润；第一家免费、第二家200、第三家500，仍核验PIN、实际金额、三家上限及原请求幂等。新增必要202610080009迁移，不重写已执行旧迁移。开店奖励改为同时拥有1/2/3家未删除本人云店，每档1000、累计3000；旧shop_reward账本迁为第一档，按owner+档位唯一，明确档位请求和原owner/wallet锁防重复、顺序领取、删店不重置。旧两参数API仅领取第一档，未知结果重试不自动推进档位。奖励仍不计经营收入/净利润/情侣余额，不重复首次500或管理员发币。</ns0:t>
+      </ns0:r>
+    </ns0:p>
+    <ns0:p>
+      <ns0:r>
+        <ns0:t>用户追加多选补货，随后要求一键补货只补无货商品。所有批量入口只允许库存0且有效可补货商品；有库存跳过，可勾选部分缺货商品并填写每件数量。新stock_empty_batch保留现有整批成本40%、PIN、身份、金额、余额、库存锁、原请求重放和事务；提交前库存已恢复则整批不扣款/不入库，重复成功请求先返回原回执，不因库存恢复再次补货。单项手动补货和旧已保存批量请求路径保留。网页和私人只同步commerce-ui共享交易界面；不动原生/签名/私人伴生。</ns0:t>
+      </ns0:r>
+    </ns0:p>
+    <ns0:p>
+      <ns0:r>
+        <ns0:t>证据：六项新UI回归在旧HEAD失败，新实现通过；隔离PGlite证明旧余额足够但净利润拦截，再验证旧奖励继承、无店拒领、顺序、1/2/3档、删除重开、重复请求、错误身份/PIN、三店上限、200/500余额扣费与混合库存整批回滚、重放防重。双端真实HTML（390宽）勾选缺货A/C、跳过有货B、选一项只发一项到empty_batch、800分报价和pageErrors0均通过；HTTP/RPC为受控fixture，不是生产订单/发币或用户真实模型。正常及缺航班组件的双端授权聊天门禁通过。第一次全量未设置NODE_PATH而缺Playwright失败，补正确依赖路径后3723通过；最终缺货限制追加后的全量结果另记。首次SQL夹具漏unit导致真实catalog触发器拒绝，补合法商品unit及库存update后隔离通过，未放宽生产约束。</ns0:t>
+      </ns0:r>
+    </ns0:p>
+    <ns0:p>
+      <ns0:r>
+        <ns0:t>复用原工作区/脚本/测试/维护文档，无新临时源码目录、版本脚本或截图副本；保留好友SQL和11个继承测试行尾现场。最新已交付ZIP仍v1655/iOS439，包含前一提交，不含本轮未提交新增功能；生产后台、网页与私人安装均尚未更新。Word只追加原XML与历史段落核对，未验证分页。</ns0:t>
+      </ns0:r>
+    </ns0:p>
+    <ns0:p>
+      <ns0:r>
+        <ns0:t>2026-10-08 最终本地验收：缺货-only规则追加后，全量3723/3723、0失败；双端390宽完整HTML只显示缺货选择框、批量排除有货B、多选只提交A、明确stock_empty_batch及800分、pageErrors0通过。正常及NORTH_MISSING_FLIGHT=1双端授权聊天均通过。SQL真实隔离重放覆盖混合库存整批回滚、库存恢复后新请求拒绝、原请求重试返回同一回执。DOCX追加首次使用utf8编码声明及序列化命名空间导致XML校验失败，已修正为保留原XML字节/命名空间直接追加，并验证ZIP/XML和其他包成员与原提交一致；未验证Word分页。本轮没有提交、推送、生产数据库迁移、发币或新私人ZIP；没有新增临时目录或脚本副本，原12项受保护现场保留。</ns0:t>
       </ns0:r>
     </ns0:p>
     <ns0:sectPr ns0:rsidR="00FC693F" ns0:rsidRPr="0006063C" ns0:rsidSect="00034616">

</xml_diff>

<commit_message>
fix: role liked-only gallery and deleted-shop customer orders web v1660 private v1661
</commit_message>
<xml_diff>
--- a/docs/maintenance/AI开发项目_Bug修改规范.docx
+++ b/docs/maintenance/AI开发项目_Bug修改规范.docx
@@ -12699,6 +12699,26 @@
     <ns0:p>
       <ns0:r>
         <ns0:t>生产202610080009迁移已事务COMMIT，函数prosrc MD5逐项与本地一致；六项funcs/tiers/old12/fee500/acl/rls全true，原12笔开店奖励原金额保留为第一档，不代领、不新发。生产默认权限与PGlite不同，内部state函数默认给anon/authenticated EXECUTE；已显式收回public/anon/authenticated，保留身份核验的reward及empty_batch接口，修正同一新迁移的权限定义。只读连接前两次超时、select1后恢复，未重启/升级套餐。保存一份必要生产验收图到既有eight-chat目录shop-reward-deployment.png，无新目录或脚本。旧好友SQL及11项行尾现场保留；唯一最新ZIP仍1655，未含本轮源码。</ns0:t>
+      </ns0:r>
+    </ns0:p>
+    <ns0:p>
+      <ns0:r>
+        <ns0:t>2026-10-08 网页候选v1660 / 私人共享源码v1661：角色点赞图库、净利润与顾客订单。用户要求保留净利润显示，核实现有经营账本仍显示已实现净利润；取消利润开店门槛不删除统计。正/零/负利润都显示，统计仍包含历史已完成订单、已售成本及创业费。新增必要202610080010迁移：店主顾客订单只读取未删除店铺，过滤在LIMIT21/游标分页前；sellerOrderCount同口径。买家列表、拼单成员、原client核对、授权历史详情及结算不变，不删除订单/库存/资金。删除两入口同步清空my/business/wallet与分页缓存，旧缓存按本人已删除店铺和云端shop_deleted过滤，修订冲突不误隐藏。隔离25订单（22已删除店铺、3当前店铺）旧API第一页21全部被旧店占据，修后3当前订单可见；买家IDs/client/详情、账本、余额及利润保持，生产利润函数MD5 fc9b46b36b6c163340692cd8c2079fbf前后不变。生产迁移事务成功，orders_exact/profit_unchanged/active_count/api_acl/orders_rls五项全true；MD5核对统一CRLF/LF。未创建生产测试订单或代用户操作资金。</ns0:t>
+      </ns0:r>
+    </ns0:p>
+    <ns0:p>
+      <ns0:r>
+        <ns0:t>用户追加查角色手机相册仍旧，要求沿用本人当前图库，仅同步这个角色点过赞的照片，其他按钮模拟不可点。photo-album.js追加只读投影与角色图库/大图；只取当前账号活跃items里当前角色roleLikes的有效已保存记录，排除仅本人收藏、其他角色喜欢、其他账号、最近删除和旧S.spy.album生成记录，不复制图片或修改用户相册。原图库玻璃按钮/布局/SVG/Blob与IDB加载复用；查看图片及返回可操作，排序/选择/精选集/搜索与大图分享/喜欢/信息/调整/删除均disabled并标记模拟按钮不可点击。受现有情侣/查手机权限/手机解锁/当前角色路由控制，点击前重新核对账号、S、快照与照片仍有效；撤回点赞/删除后不再读旧引用，取消查手机权限关闭角色图库。缺组件显示明确未加载，不回退旧假相册，不新增模型/识图调用；成功角色点赞时仅刷新当前角色图库。</ns0:t>
+      </ns0:r>
+    </ns0:p>
+    <ns0:p>
+      <ns0:r>
+        <ns0:t>回归：四项新角色图库行为旧HEAD失败，新通过；净利润/列表四项和永久保护通过；最新全量3743/3743、0失败，正常及缺航班组件双端授权聊天pageErrors0。Edge两端真实完整HTML：仅1张当前角色点赞照片、原Blob缩略图与大图解码、图库5及大图6个模拟按钮disabled、实际返回、原用户相册JSON不变、账号切换、点赞撤销和权限撤回均通过。首次大图检查发现新增onclick沿用esc不处理引号导致事件截断，已补属性转义并把夹具esc改为真实规则；单图独立覆盖原三滑块-100%偏移，不改用户原相册滑动。首次隔离利润预期忽略空items触发器将stock_cost设0，按真实触发器核对为-65000，不修改业务利润计算。受控PNG只证明测试图库，不冒充用户真实角色点赞或iPhone验收。</ns0:t>
+      </ns0:r>
+    </ns0:p>
+    <ns0:p>
+      <ns0:r>
+        <ns0:t>复用现有工作树、脚本、日志和截图目录；本轮必要role-liked-gallery.png及deleted-shop-orders-deployment.png各一份，未新增源码副本/工作树/版本脚本。12项原现场及其他工作区保留；原生iOS439/桥42/签名/私人伴生不改，最新实际私人ZIP仍1655，不含本轮新功能。Git默认Schannel只读握手失败，改为单次命令OpenSSL且sslVerify=true核对远程cde6052f，未改全局配置或关闭证书验证。发布结果见online-release-result.json；不重打包，未Mac/iPhone验收。维护Word直接追加原XML，保留历史，ZIP/XML可读，未验证分页。</ns0:t>
       </ns0:r>
     </ns0:p>
     <ns0:sectPr ns0:rsidR="00FC693F" ns0:rsidRPr="0006063C" ns0:rsidSect="00034616">

</xml_diff>

<commit_message>
feat: calendar role participation and per-shop replenishment
</commit_message>
<xml_diff>
--- a/docs/maintenance/AI开发项目_Bug修改规范.docx
+++ b/docs/maintenance/AI开发项目_Bug修改规范.docx
@@ -12719,6 +12719,406 @@
     <ns0:p>
       <ns0:r>
         <ns0:t>复用现有工作树、脚本、日志和截图目录；本轮必要role-liked-gallery.png及deleted-shop-orders-deployment.png各一份，未新增源码副本/工作树/版本脚本。12项原现场及其他工作区保留；原生iOS439/桥42/签名/私人伴生不改，最新实际私人ZIP仍1655，不含本轮新功能。Git默认Schannel只读握手失败，改为单次命令OpenSSL且sslVerify=true核对远程cde6052f，未改全局配置或关闭证书验证。发布结果见online-release-result.json；不重打包，未Mac/iPhone验收。维护Word直接追加原XML，保留历史，ZIP/XML可读，未验证分页。</ns0:t>
+      </ns0:r>
+    </ns0:p>
+    <ns0:p>
+      <ns0:r>
+        <ns0:t>2026-10-08 日历第一页面本地候选，用户明确只看截图、不提交、不推送、不打包。按两张参考重做黑色月视图，去掉搜索左侧视图切换按钮和底部收件箱，复用相册photo-album-glass挖空细高光环，不画整层白雾、不改已交付玻璃。周一至周日、周末灰色、今日红色、选中其他日期白圆、农历按Intl chinese/UTC纯日期计算、初一显示农历月份与红线；真实无记录的日期不画假蓝点。1–12月原生纵向滚动/scroll-snap，月行数真实4/5/6，不加相邻月份假日期；切月更新选中日期与当天真实列表，不整页重绘滚动过程。今天只定位本机今天、不新增日程；目标自省是已有日程卡而非点击今天生成。顶部+沿用真实新增弹窗；底部日历保留日程删除/日期定位、经期和心情旧记录功能；搜索、年视图和新详情页标开发中，后续页面未重做。</ns0:t>
+      </ns0:r>
+    </ns0:p>
+    <ns0:p>
+      <ns0:r>
+        <ns0:t>共享网页与私人app.js及glass-theme.css同范围更新，保留私人性能保护与原生/签名，APP_VER1660/1661未升、HEAD73f2d421未变。日程、经期、婚礼、心情与提醒链不重写；新增日期展示只读现有存档，时间/位置只用记录，不猜默认时长、位置或新目标。Apple月视图官方资料区分日程指示与当天列表，MDN Intl支持真实农历。新日期单元检测真实各月长度、农历2026-10-01廿一/10-08廿八/10-10九月、记录才有点、经期跨度与婚礼消费兼容，专项84通过；全量3745/3745、0失败；管理入口最后补回原日期定位，定向10通过，核心聊天双场景结果见日志。</ns0:t>
+      </ns0:r>
+    </ns0:p>
+    <ns0:p>
+      <ns0:r>
+        <ns0:t>Edge完整网页/私人HTML实际滚轮十月→十一月→十月、1–12月切换、今天不改S.calendar、新增普通日程并从正常入口刷新读回、农历及当天05:00–05:30卡片、开发中反馈、320/390/430无横向溢出、pageErrors0通过。首次存档QA直接重载northPreview会重建隔离预览，调整为正常入口只读验证保存再回受控预览截图；正常入口授权遮罩仍生效，未撤授权。两张必要证据calendar-month-empty.png/calendar-month-today.png沿用eight-chat目录，目标自省为隔离测试记录，不是用户存档。未验证真实iPhone手势/帧率；未调用收费模型或操作真实用户记录。保护原好友SQL/11行尾测试及其他工作区，未新增工作树、源码副本或版本脚本；只改现有维护记录，保留XML原文，未验证Word分页。</ns0:t>
+      </ns0:r>
+    </ns0:p>
+    <ns0:p>
+      <ns0:r>
+        <ns0:t>2026-10-09 日历年总览本地候选：延续用户不提交、不推送、不打包、先看图的要求。月页右滑/左上年份进入年总览，年页左滑回月页；年度12个月三列布局、真实周一对齐/闰年与农历初一细红线，干支生肖由Intl Chinese的年名与地支读取。今天按手机实际日期回当前年/日期；当前年/当前月标红，浏览其他年份白色，明确选择的年份标红，点月份或小日期打开准确月/日期，浏览不改系统Date、日程/经期/心情存档。仍去掉收件箱小盒子，搜索继续开发中，+和记录管理沿用已有真实功能，日期定位可跳远年。</ns0:t>
+      </ns0:r>
+    </ns0:p>
+    <ns0:p>
+      <ns0:r>
+        <ns0:t>范围1900–2100，初始只建附近3年、按需前后延伸，最多5个年份DOM；到范围端点停止，不一次性建201年全部日期。滚动仅插入/移除年份段并补偿位置，不整页重绘；可见年份记录在挥发UI中心，后台重绘不跳回几年前，滚动本身不把浏览年份当成已选年份。手势横向阈值70px/垂向45px，竖向滚动不抢，校验当前路由/状态/账号；用单调performance时钟做防误触，避免系统时间变化。首次QA右滑防误触阻住随后真实月份点击，改为明确年页点击清除旧月页抑制，并禁止过期年页回调打开月页。</ns0:t>
+      </ns0:r>
+    </ns0:p>
+    <ns0:p>
+      <ns0:r>
+        <ns0:t>最新全量3746/3746、0失败；最后可见年跟踪补充定向11通过；正常及缺航班组件双端聊天门禁pageErrors0。Edge完整双HTML实际鼠标指针右滑、2026当前红/2027浏览白/选中红、小日期2027-02-07打开、连续12次边缘加载DOM&lt;=5、1900/2100边界、今天回2026-10-09、定位1999-06-01、320/390/430无横向溢出、日程/经期/心情JSON完全不变均通过。两张必要calendar-year-current.png/calendar-year-future.png在已有eight-chat目录，冻结测试日期为客户端2026-10-09，当前9号红圈；不伪造用户目标/系统时间/电量。非真实iPhone手势与帧率验收。</ns0:t>
+      </ns0:r>
+    </ns0:p>
+    <ns0:p>
+      <ns0:r>
+        <ns0:t>只复用原工作树、现有app.js/glass-theme.css/测试/维护记录；网页及私人同范围，私人性能环与原生/签名/桥保持。不新增工作树、源码副本、重复版本脚本或截图目录，保留原12项现场。HEAD仍73f2d421，暂无暂存，无提交/推送/新包；Word原XML直接追加并核对原字节保留，未核验分页。</ns0:t>
+      </ns0:r>
+    </ns0:p>
+    <ns0:p>
+      <ns0:r>
+        <ns0:t xml:space="preserve">2026-10-09 日历管理、添加日历与双向卡片：本地候选，不提交、不推送、不打包。</ns0:t>
+      </ns0:r>
+    </ns0:p>
+    <ns0:p>
+      <ns0:r>
+        <ns0:t xml:space="preserve">用户账户下从空列表开始，不复制参考图样例。独立添加/编辑页提供名称、用户姓名账户、角色多选、7种颜色、提醒；已有日程只在真实旧记录存在时显示，旧数据不自动迁移。新增日程可选所属日历、提醒事项可标记完成；显示开关只筛选，不删除。已拒绝邀请和外部订阅明确开发中；不假装iCloud/Siri或关闭App后的后台通知。保留经期/心情/定位日期/婚礼。</ns0:t>
+      </ns0:r>
+    </ns0:p>
+    <ns0:p>
+      <ns0:r>
+        <ns0:t xml:space="preserve">新日历只给指定角色读取，恋人提示与远程快照同步过滤；隐藏、共享和提醒权限独立，撤销后旧卡不可读。角色个人roleCalendar按账户和角色存储，与用户日历分离；模型自行明确记录或分享才执行，没有强制分享频率，不复制用户日程，无记录不造卡。同一回复去重，之后新回复可再次分享。双方卡片均用calendarShared独立路由并可返回原聊天，角色卡只读明确分享的记录ID。</ns0:t>
+      </ns0:r>
+    </ns0:p>
+    <ns0:p>
+      <ns0:r>
+        <ns0:t xml:space="preserve">保存等待存档完成；失败仅移除本次新增记录/卡片，保留并发其他消息。名称/ID属性转义、颜色校验，旧安卓避免可选链。检查消费者含月/年显示、新增、提醒、角色/情侣提示、远程查看、聊天与通话动作；完整S存档/备份自然保留新增字段。原生桥、签名、私人后台任务包装与性能环不改。</ns0:t>
+      </ns0:r>
+    </ns0:p>
+    <ns0:p>
+      <ns0:r>
+        <ns0:t xml:space="preserve">失败与修正：纯插入补丁断言及整段两端相等断言都在写入前停止；两端原有nativeBackgroundTask差异继续保留。卡片点击冒泡到消息菜单使详情被覆盖，补stopPropagation；首次全量3747中1项旧安卓语法失败，去掉新可选链后全量3748/3748。最后提醒所属日历/颜色/失败窄回滚改动，日历/经期/婚礼/远程/安卓专项45通过；补并发消息防丢测试后9项日历单元通过。正常与缺航班组件双端核心聊天门禁通过，pageErrors0。</ns0:t>
+      </ns0:r>
+    </ns0:p>
+    <ns0:p>
+      <ns0:r>
+        <ns0:t xml:space="preserve">Edge完整双HTML隔离验证：空列表/独立添加/联系人选择/保存回列表、隐藏不删/仍按授权可读、提醒关闭、撤销、账户隔离、卡片独立页及返回、提醒完成筛选、正常入口刷新读回、320/390/430无横向溢出均通过。真实aiReply与buildSystem配受控HTTP模型，一次调用保存角色个人记录并发卡，卡片可见、内部标签不漏；无记录不造卡、去重与用户记录不变通过。真实模型自主决定、Mac/Xcode与iPhone未验收。截图最初夹具字面\n与未滚入视口导致展示不正确，修正换行与可见位置、等待提示淡出后重跑；不是产品故障。</ns0:t>
+      </ns0:r>
+    </ns0:p>
+    <ns0:p>
+      <ns0:r>
+        <ns0:t xml:space="preserve">沿用eight-chat现有目录保存6张必要证据calendar-list-empty/create/list-saved/share-card/role-share/role-detail.png；示例是测试存档，不是用户记录。截图总览仅追加本轮区，保留前阶段证据。HEAD73f2d421，未暂存，网页1660/私人1661版本未改，旧私人源ZIP不含候选。好友SQL/11个行尾现场与其他工作区保留，无新工作树/源码副本/版本脚本/临时备份；测试进程已结束。Word原XML只追加并验证历史字节，未验证分页。</ns0:t>
+      </ns0:r>
+    </ns0:p>
+    <ns0:p>
+      <ns0:r>
+        <ns0:t xml:space="preserve">参考Apple共享日历 https://support.apple.com/zh-cn/guide/iphone/iph7613c4fb/ios ，多日历显示/提醒 https://support.apple.com/zh-cn/guide/iphone/iph3d1110d4/27/ios/27 ，计划提醒 https://support.apple.com/zh-cn/guide/iphone/iph14f1d32a5/27/ios/27 。</ns0:t>
+      </ns0:r>
+    </ns0:p>
+    <ns0:p>
+      <ns0:r>
+        <ns0:t xml:space="preserve">2026-10-09 日历按钮与卡片视觉复核：本地预览，无提交/推送/打包。</ns0:t>
+      </ns0:r>
+    </ns0:p>
+    <ns0:p>
+      <ns0:r>
+        <ns0:t xml:space="preserve">用户反馈添加页左右按钮、联系人右侧图标、分享卡片亮边及详情返回按钮生硬；要求移除外部日历订阅，其他保留。统一改圆角SVG关闭/确认/返回/勾选/信息/右箭头，按钮44px真实点击区不变，确认底色略亮。关闭与分享卡去掉浏览器默认凸起边框；沿用磨砂+独立mask空心环定稿，局部细边0.7px，渐变低强度、提亮1.25–1.3，不在整个底层铺白。卡片18px圆角，用户与角色卡同样式；没有全局改相册/聊天气泡材质。</ns0:t>
+      </ns0:r>
+    </ns0:p>
+    <ns0:p>
+      <ns0:r>
+        <ns0:t xml:space="preserve">外部订阅行从管理列表删除，其他记录工具/定位/完成筛选/添加入口、账户与共享角色、颜色/提醒、授权撤销及独立页返回保留。独立详情初次字符替换因已有反斜线引号未命中，截图发现返回图标过小，精确替换该函数段为SVG并实际检查svg节点后重跑；未留下未修的字符按钮。</ns0:t>
+      </ns0:r>
+    </ns0:p>
+    <ns0:p>
+      <ns0:r>
+        <ns0:t xml:space="preserve">日历/经期/玻璃环专项16通过。Edge完整网页与私人HTML均验证左右按钮svg/默认border0、联系人与颜色右箭头、外部订阅缺席、添加保存/共享撤销/账户隔离/提醒完成/持久化重载/角色实际aiReply发卡/独立页打开与返回，pageErrors0；320/390/430无横向溢出。沿用6张固定预览图更新，实际浏览器视觉检查确认柔和边缘，不冒充iPhone实拍。只改现有app.js/glass-theme.css及维护记录，保留私人后台任务包装、原有SQL/11行尾现场，HEAD73f2d421、暂存为空。没有本轮新增临时文件，浏览器与测试服务已结束。三DOCX保留历史XML只追加，未验证Word分页。</ns0:t>
+      </ns0:r>
+    </ns0:p>
+    <ns0:p>
+      <ns0:r>
+        <ns0:t xml:space="preserve">2026-10-09 自定义日历标签颜色、圆头与分享卡片外观：本地候选，未提交/推送/打包。</ns0:t>
+      </ns0:r>
+    </ns0:p>
+    <ns0:p>
+      <ns0:r>
+        <ns0:t xml:space="preserve">用户要求联系人小人圆头适当放大、颜色页参照红橙黄绿蓝紫褐+自定义、卡片外观更丰富；随后明确自定义必须含网格/光谱/滑块。圆头半径由3到3.7，头心微调5.5；保留原圆角SVG与细高光。旧粉色等已存色值仍按有效HEX保留，不强行映射到其他预置颜色；自定义名称正确显示，修掉非预置色误显示蓝色的旧回退。</ns0:t>
+      </ns0:r>
+    </ns0:p>
+    <ns0:p>
+      <ns0:r>
+        <ns0:t xml:space="preserve">调色板共用6位HEX状态：12列×10行真实网格、指针捕获光谱拖动与亮度、RGB三滑块/数值/当前其他通道组成的渐变轨道、可手输HEX、即时预览。亮度调到0再回升保留当前色相/饱和度，不因黑色RGB丢失拖动目标；切换页签不重置颜色。使用颜色只更新待保存日历草稿，确认日历后才保存标签；＋收藏常用色按账户保存/去重最多12项。HEX只接受六位有效字符，无透明度或伪取色器。日历列表、日程点/条和用户分享卡沿用同一实际色值。</ns0:t>
+      </ns0:r>
+    </ns0:p>
+    <ns0:p>
+      <ns0:r>
+        <ns0:t xml:space="preserve">用户与角色分享卡外观含图标底座、共享日历/日程分享类别、真实名称、分享双方与数量；角色卡另含实际分享日期。外观只加元数据，不把日程标题塞进外层，不生成虚构行程；授权撤销/他角色/他账户仍不暴露内容。卡片细环强度不增加。联系人选择函数在替换旧调色区时边界曾被覆盖，定向搜索当场发现并补回原行为+账户校验，双端联系人实际选择通过；没有留下缺失函数。持久化QA首次按列表第一个位置检查颜色失败，原因是编辑保存后排序变化，改按真实日历ID核对，颜色和收藏读回通过，不当作产品数据丢失。</ns0:t>
+      </ns0:r>
+    </ns0:p>
+    <ns0:p>
+      <ns0:r>
+        <ns0:t xml:space="preserve">最终日历/颜色数学/经期/玻璃环/旧安卓专项21/21通过；颜色验证含拒绝非法HEX、RGB/HSV主色及多色往返。Edge完整双HTML真实点网格、切标签、指针拖光谱、0亮度恢复、设置RGB124/108/242得到#7C6CF2、收藏、使用并保存日历、正常入口刷新按ID读回自定义和收藏均通过；共享撤销/账户隔离/提醒完成/角色实际aiReply发卡及独立页返回也通过，pageErrors0，320/390/430无横向溢出。模型HTTP仍隔离受控，非真实模型/iPhone验收。</ns0:t>
+      </ns0:r>
+    </ns0:p>
+    <ns0:p>
+      <ns0:r>
+        <ns0:t xml:space="preserve">沿用eight-chat目录更新已有卡片/添加页图，新增本功能必要calendar-colors/grid/spectrum/sliders四张预览证据，不新增工作树、源码副本、脚本或截图目录。HEAD73f2d421/暂无暂存/网页1660私人1661版本不变；原好友SQL、11行尾现场、私人northNativeBackgroundTask/原生签名桥保持。无本轮临时文件，测试服务和浏览器结束。三维护DOCX原XML字节保留只追加，未核验Word分页。</ns0:t>
+      </ns0:r>
+    </ns0:p>
+    <ns0:p>
+      <ns0:r>
+        <ns0:t xml:space="preserve">2026-10-09 新项目编辑器及四类小弹窗、URL与备注：本地候选，未提交/推送/打包。</ns0:t>
+      </ns0:r>
+    </ns0:p>
+    <ns0:p>
+      <ns0:r>
+        <ns0:t xml:space="preserve">按图片实际内容：第1新项目主表单，第2行程时间，第3重复，第4所属日历，第5提前提醒；用户再次强调最后一张为提醒，后补URL/备注为同一页最下方。已查Apple官方新建/编辑日程、URL/备注资料与RFC5545真实日期重复规则，未复制图片里的iCloud/工作/个人等样例账户或虚构订阅。</ns0:t>
+      </ns0:r>
+    </ns0:p>
+    <ns0:p>
+      <ns0:r>
+        <ns0:t xml:space="preserve">月/年右上＋改为独立新项目表单，日程/提醒事项两类型，标题、位置或视频通话文字、全天、开始/结束日期时间、行程预留、重复、所属日历、提前提醒、底部URL/备注在同一个滚动体。四个对应弹窗均读真实草稿/当前账户日历，选中打勾；行程无/5/15/30/60/90/120分钟；重复永不/每天/每周/每2周/每月/每年/自定义间隔1–99与可选截止；提醒无/开始时/提前5/10/15/30/60/120分钟/1/2/7天。受邀人后续流程明确点击反馈开发中。没有新增虚构会议通话服务。</ns0:t>
+      </ns0:r>
+    </ns0:p>
+    <ns0:p>
+      <ns0:r>
+        <ns0:t xml:space="preserve">确认保存真实起止时间、全天、位置、行程时间、repeat规则、calendarId、提醒偏移、URL与备注、owner/editorVersion；取消/验证失败不写S。开始字段移动保留时长，结束必须晚于开始；只接受有效http/https URL，不自动访问链接。日程详情与已授权共享页展示位置/重复/URL/备注，链接noopener/noreferrer、文字转义；角色共享摘要按已有许可读取，备注超过400字标注节选。原经期/婚礼/旧添加入口与保存数据不迁移；旧未分类情侣规则保持，新建默认日历记录按账户隔离不自动给其他角色。</ns0:t>
+      </ns0:r>
+    </ns0:p>
+    <ns0:p>
+      <ns0:r>
+        <ns0:t xml:space="preserve">重复按日期锚点展开，不一次写全年重复副本；每月31日跳过不存在月份，2月29日年度跳过非闰年；跨天扩展到实际可见日期，午夜结束按独占边界，重复提醒事项只完成所选一次。所选预留时长显示实际建议出发时间，不冒充地图交通查询。新提前提醒在小手机运行时按开始/偏移、到期范围、所属日历提醒许可执行；隐藏显示不取消提醒、其他账户/完成项/过期项不提示。持久化成功后才提示，稳定account+event+occurrence+offset标记防重复；失败回滚本轮标记。多个同时到期汇总提示，未开发关闭App系统通知；全天按09:00计算并在表单说明。</ns0:t>
+      </ns0:r>
+    </ns0:p>
+    <ns0:p>
+      <ns0:r>
+        <ns0:t xml:space="preserve">两端Edge完整HTML验证顶部＋、四弹窗选择/另一账户日历不可见、空标题不保存、保存后每周10月16日展开、30分钟出发21:30/15分钟前、URL/多行备注详情与正常入口重载、全天隐藏时间、任务自定义每天至12号及只完成11号、定时提醒提前边界/一次性/关闭日历/另一账号/存档失败不提示、320/390/430无横向溢出，pageErrors0。首次提醒弹窗估计高度过小使最后选项在底部被裁，增大高度估计并用可用高度滚动约束修正；备注font简写无效导致小字，拆成继承字体/18px/行高，截图重核。主程序首次3750中1项私人查店浏览器启动30秒超时，单独正确NODE_PATH复核1.5秒通过，未改无关查店；一次复核遗漏NODE_PATH导致依赖缺失，仅修正命令配置。限制测试并发4重新全量3750/3750通过；最后新增提醒边界/合并提示专项及日历/经期16通过。正常和缺可选航班组件双端真实核心聊天门禁通过、pageErrors0；模型HTTP为受控响应，不是实际收费模型/iPhone/Mac验收。</ns0:t>
+      </ns0:r>
+    </ns0:p>
+    <ns0:p>
+      <ns0:r>
+        <ns0:t xml:space="preserve">复用eight-chat目录增加本阶段必要new-event/travel/repeat/calendar/alert/notes/saved七张页面证据，测试日期2026-10-09，示例人物/链接/日程不是用户存档。旧截图/唯一包保留，截图总览只追加。保护好友SQL、11个行尾现场、私人nativeBackgroundTask/原生桥/签名等差异；不创建工作树、源码副本、版本脚本或备份。HEAD73f2d421，暂无暂存，网页1660/私人1661版本保持；旧私人包不含此候选。浏览器/服务测试结束，无本轮临时文件。三DOCX原XML保留只追加，未验证Word分页。</ns0:t>
+      </ns0:r>
+    </ns0:p>
+    <ns0:p>
+      <ns0:r>
+        <ns0:t xml:space="preserve">资料：https://support.apple.com/zh-cn/guide/iphone/-iph3d110f84/ios ，https://support.apple.com/en-asia/guide/calendar/icl58679aba2/mac ，https://www.rfc-editor.org/errata/eid4271 。</ns0:t>
+      </ns0:r>
+    </ns0:p>
+    <ns0:p>
+      <ns0:r>
+        <ns0:t xml:space="preserve">2026-10-09 重复菜单底部、页内日期/时间展开与角色受邀人：本地候选，未提交/推送/打包。</ns0:t>
+      </ns0:r>
+    </ns0:p>
+    <ns0:p>
+      <ns0:r>
+        <ns0:t xml:space="preserve">用户指出重复菜单自定义只露半字，给出同页展开月历/时间滚轮、内容自然下移，以及＋选择任意角色好友并按人设提醒。重复菜单高度估计改360px并继续限制可用高度滚动，现自定义完整可见。开始/结束四个按钮各自在时间卡内展开，月份周一对齐/真实天数/红色选中/前后月/年份月份跳转，小时与分钟真实滚轮双列scroll-snap与中心选中带，按参考5分钟步进并保留已有非整5分钟值；小时跨日、开始变化保留时长，全天关闭时间展开。结束和行程时间被文档流推下而非覆盖；真实设备时区显示首尔/北京等实际映射，未硬写参考北京或伪造系统状态栏/键盘。</ns0:t>
+      </ns0:r>
+    </ns0:p>
+    <ns0:p>
+      <ns0:r>
+        <ns0:t xml:space="preserve">新增添加受邀人/角色好友多选页：＋显示真实头像昵称，搜索/取消/确认/已选chips移除；主账号活跃角色与副账号已添加好友、未删除未拉黑边界保留。新项目保存invitees及每位角色独立calendarinvite卡，一起等待存档成功，失败只撤本轮记录/卡片且保留其他并发消息。只新增单条日程许可，不自动共享整本日历；旧整本共享仍按原规则。卡片在原角色聊天可打开独立只读页；删除事件/撤销邀请/换账户后旧卡不可用，已有聊天历史不清。</ns0:t>
+      </ns0:r>
+    </ns0:p>
+    <ns0:p>
+      <ns0:r>
+        <ns0:t xml:space="preserve">受邀角色通过已有featureEventNote/scheduleFeatureReply/aiReply真实模型链路，读取这条日程标题/位置/起止/出发/重复/URL/备注节选，人物语气不由前端固定模板代替。按所选提前时间，无提醒时默认开始时，全天09:00；尊重日历提醒关闭、角色忙碌/通话/共同生活等原有静默；失败未标成功可后续重试，成功按account+event+occurrence+lead+role防重复。作用域URI元数据验证角色/账户/当前邀请/未完成/未过期/重复实例/提醒偏移，并在模型发出、等待后、可见气泡前校验。排队旧邀请在删除、撤销或过期后移除，派发前再验，避免阻住之后普通聊天；内部作用域标签从可见回复剥离。关闭App系统通知仍未做，不伪造角色接受邀请或真实邮件发送。</ns0:t>
+      </ns0:r>
+    </ns0:p>
+    <ns0:p>
+      <ns0:r>
+        <ns0:t xml:space="preserve">两端Edge完整HTML实际展开/选择开始和结束日期、滚轮将22:00滑到04:15并保留时长、全天时间隐藏、重复自定义完整可见、多选真实角色头像昵称、保存invite卡、只读返回、单次真实aiReply受控HTTP响应提供书店/咖啡备注且无另一个未共享事项、一轮1调用且重复tick不再发、撤销使作用域失效、账户隔离、提前边界/日历关闭/失败回滚/重载、320/390/430无溢出，pageErrors0通过。提醒时钟为隔离测试2026-10-09，不修改用户设备时钟或存档；角色回复为受控模型测试，不冒充真实模型人设/收费模型/iPhone/Mac验收。</ns0:t>
+      </ns0:r>
+    </ns0:p>
+    <ns0:p>
+      <ns0:r>
+        <ns0:t xml:space="preserve">首次接收人按钮缺稳定aria-label导致QA精确定位超时，补受邀人标签后实际点击通过。首次全量3751有5失败：旧相册、登录、诊断独立抽取的功能队列新增无条件日历函数依赖；把新校验严格限定为带受邀作用域标记的事件，普通功能保持原依赖，真受邀提醒仍必验。没有改老回归或放宽邀请权限；相关128专项通过，新邀请边界/失败重试/成功去重/撤销/其他账号/过期与日历经期17通过，最终完整3752/3752通过。最后分钟5步进与时区名称映射后双端实际操作再次通过。正常及缺可选航班组件双端核心聊天门禁通过，pageErrors0。</ns0:t>
+      </ns0:r>
+    </ns0:p>
+    <ns0:p>
+      <ns0:r>
+        <ns0:t xml:space="preserve">复用eight-chat目录更新repeat等原固定图，新增本阶段必要inline-start-date/start-time/end-date/end-time与event-invitees/invite-card六张证据，其他历史唯一图/包保持；截图总览仅追加本轮展示。既有好友SQL、11行尾现场、私人northNativeBackgroundTask/签名/原生桥/其他工作区不改；两端日历段除原生包装外相等，diff检查与暂存为空。HEAD73f2d421/网页1660私人1661保持，当前私人安装包不含此未提交候选。所有QA服务浏览器结束，本轮无可清理临时源码、备份或新工作树。三维护DOCX原XML只追加并验字节保留，未验证分页。</ns0:t>
+      </ns0:r>
+    </ns0:p>
+    <ns0:p>
+      <ns0:r>
+        <ns0:t xml:space="preserve">参考Apple官方日程邀请（邀请单条日程与共享整日历不同）：https://support.apple.com/zh-cn/guide/iphone/iph82c5721ca/27/ios/27 。角色预约提醒为小手机适配，未调用iCloud邮件。</ns0:t>
+      </ns0:r>
+    </ns0:p>
+    <ns0:p>
+      <ns0:r>
+        <ns0:t xml:space="preserve">2026-10-09 轻量提醒事项、真实日程详情与用户补充的统一封面/绿色开关：本地候选，无提交/推送/打包。</ns0:t>
+      </ns0:r>
+    </ns0:p>
+    <ns0:p>
+      <ns0:r>
+        <ns0:t xml:space="preserve">用户确认上轮研究建议，要求做提醒事项页面，日程应在首页以自己的标题显示，点开详情严格读创建内容，不照抄目标自省参考；后补纠正两个绿色开关形态、目标封面格式应与递交作品示例一致而内容各自不同。本轮按日历中新建的普通日程/待办处理，没有改共同目标/角色任务便签的奖惩逻辑，也不创建第二套任务系统。</ns0:t>
+      </ns0:r>
+    </ns0:p>
+    <ns0:p>
+      <ns0:r>
+        <ns0:t xml:space="preserve">新提醒事项分离表单：标题/备注、可选日期与时间、重复、现有日历分类；无开始结束/行程时间/必填地点。新记录reminderVersion2，未设日期存空date且repeat none，首页未安排日期真实显示；只设日期显示待办、不凭空造时长，启用时间按实际时间提醒。完成圆圈可勾选/撤销，重复只完成这一次，未完成仍存在；无角色任务验收/奖励/惩罚调用。已完成单项改为重复时只继承当前一次完成，改回单项时准确继承完成状态；旧提醒字段/旧日程不批量迁移。</ns0:t>
+      </ns0:r>
+    </ns0:p>
+    <ns0:p>
+      <ns0:r>
+        <ns0:t xml:space="preserve">首页当天标题来自保存记录；点开calendarDetail独立页，真实名称/所点重复日期/起止/颜色/地点/行程/受邀人/URL/备注/重复/跳过日期，编辑回填保存原ID并检查修订防覆盖；取消编辑回原详情。重复编辑明确整组，删除区分只删一次与整组，失败回滚保留其他记录/消息，旧邀请取消后不可读。没有结束时间的旧记录不伪造持续1小时；时长图只画已知区间。日历详情和共享页纳入原calendar软件时长映射，避免新路由绕开计时；原权限边界保持。</ns0:t>
+      </ns0:r>
+    </ns0:p>
+    <ns0:p>
+      <ns0:r>
+        <ns0:t xml:space="preserve">提醒事项与日程现在共用首页左色条/标题/摘要/右时间封面结构及独立详情壳；提醒完成圆圈为右侧独立动作，点击不串成详情。已设时间的待办在同一灰色时间轴框中画真实时间点；有原始结束时间的旧记录继续画其已存时间段，无时间/日期不造假时间轴。页面内容不是复制递交作品样例，标题/日期/备注/分类/时间均读取对应记录。</ns0:t>
+      </ns0:r>
+    </ns0:p>
+    <ns0:p>
+      <ns0:r>
+        <ns0:t xml:space="preserve">绿色开关曾因通用子button flex样式拉长到约140px且off底透明，视觉QA发现后把文本按钮选择器排除cal-switch，并局部固定62×32、白圆28、内部2px间距、on位移30px；两个开关逐一实际检查宽高/状态/位置，off灰色on绿色，未选日期时间值灰色，后续用户纠正按两处同样结构核对。初次构造表单补丁边界查找失败，在写入前中断，改为独立轻量表单渲染而非大范围字符串包裹，没有破坏半写入状态。</ns0:t>
+      </ns0:r>
+    </ns0:p>
+    <ns0:p>
+      <ns0:r>
+        <ns0:t xml:space="preserve">Edge完整网页和私人HTML验证：无日期创建/首页找到/勾选/撤销，详情编辑同ID不增记录，实际创建递交作品说明09:35–10:20/工作室/链接/多行备注/每天而非目标自省，详情及重载完全对应，改11:10–12:05更新原ID，只删除10月13日不影响14日，阅读一章书07:25仅完成14日且15日仍待办，未设时长未被虚构，两个绿色开关尺寸位置正确，统一封面和时间点，320/390/430无横向溢出，pageErrors0。原全量3754/3754通过；最后开关/统一封面补改后，日历/经期/旧安卓专项23通过且双端实际QA重跑通过。正常与缺航班组件双端核心聊天门禁通过，pageErrors0，模型受控不冒充真实模型/Mac/iPhone验收。</ns0:t>
+      </ns0:r>
+    </ns0:p>
+    <ns0:p>
+      <ns0:r>
+        <ns0:t xml:space="preserve">沿用eight-chat原目录新增本阶段必要reminder-form/undated/dated、home-created-event、event-detail、home-matched-covers、reminder-detail等页面证据，旧saved-detail原固定位置更新独立详情用途。全部图为隔离测试例，不操作用户真实存档；截图总览只追加。保留SQL与11行尾现场，日历两端除原有nativeBackgroundTask包装相同，原生桥/签名/其他工作区不改。HEAD73f2d421，暂无暂存，网页1660私人1661不变，当前私人包不含未提交候选。没有新工作树、源码副本、版本脚本或备份，本轮无可删临时文件，所有浏览器服务结束。三DOCX原XML字节保留追加，未验证Word分页。</ns0:t>
+      </ns0:r>
+    </ns0:p>
+    <ns0:p>
+      <ns0:r>
+        <ns0:t xml:space="preserve">2026-10-09 日视图独立滑动与顶部本地搜索：本地候选，未提交/推送/打包。</ns0:t>
+      </ns0:r>
+    </ns0:p>
+    <ns0:p>
+      <ns0:r>
+        <ns0:t xml:space="preserve">用户确认轻量日视图：上方日期独立左右滑动、下方时间独立上下滑动，顶部沿用已经认可的年/back、搜索、＋按钮而非照搬参考多日图标。今天定位实际当天并进入日视图；左上同风格按钮返回月历。日期条五周DOM/35天，滚到边缘前后换两周并补偿位置，不改所选日期，点日期才切换日视图；1900–2100与原年视图范围一致。小时轴0–24，红色当前分钟只在今日显示，每分钟更新/回前台刷新，后台隐藏时不做UI更新；全天/无具体时间/未安排日期分别放置，不造出虚构时长。跨午夜只显示当天部分，真实重叠分列，接近的短记录预留可读标签空间但不改保存时长，周末灰/今天红与原风格一致。新建/改期返回日视图可定位记录时段。</ns0:t>
+      </ns0:r>
+    </ns0:p>
+    <ns0:p>
+      <ns0:r>
+        <ns0:t xml:space="preserve">按Apple官方搜索定义，匹配标题、受邀角色名字昵称、位置和备注，额外支持已存URL/日历名与完整日期；NFKC规范化、多词AND、本机直接查S.calendar，不发送模型或网络查询，不引入Siri/假键盘或语音按钮。只检索当前账户/当前显示分类/完成显示设置内的真实记录；跨账户和隐藏分类无结果，原未分账户旧数据按既有兼容规则。普通记录跨过去未来按日期排；重复按整组一条返回可见真实实例，具体日期可查询该实例，跳过/完成规则生效。无日期待办分组未安排日期，未找到明确空结果。首屏100条、显示更多继续100，避免长结果一次建大量DOM；日期头、公历星期/真实农历、色条/标题/实际起止，每卡打开已有独立详情，回退保留查询，关闭/今天退出搜索恢复原视图。</ns0:t>
+      </ns0:r>
+    </ns0:p>
+    <ns0:p>
+      <ns0:r>
+        <ns0:t xml:space="preserve">搜索框顶部下落动画，输入只刷新结果容器、保留输入焦点与系统键盘，不整页重绘；清空与关闭可用，底部沿用今天/日历管理。账户更换清查询并取消旧回调。日视图用原记录展开，不写重复副本，不改日期时间或提醒状态；新DOM回调核对S/账号/路由，原角色提醒/版权/财务/任务奖惩与原生差异不变。</ns0:t>
+      </ns0:r>
+    </ns0:p>
+    <ns0:p>
+      <ns0:r>
+        <ns0:t xml:space="preserve">首次新日视图焦点字段导致抽取的保存单元缺少_calDayView测试上下文变量，仅补真实挥发UI状态false，未放宽业务校验；25项日历/经期/旧安卓专项通过。完整3756/3756、0失败；最后周末/短标签/搜索底部/回前台分钟刷新改动后双端实际QA重跑通过。正常与缺可选航班组件双端核心聊天門禁均通过、pageErrors0。Edge完整web/private HTML检查：今天红线21:30→推进测试钟21:31更新、真实农历八月廿九、碰撞两列、上下左右互不影响、跨周点10/16无今天红线、五次边缘加载仍5周DOM、今天返回当天、顶部展开/清空/关闭、标题/小北/工作室/封面备注/URL/完整日期、2024过去记录、隐藏与其他账户不见、点12:30–13:15真实详情及返回保留关键字、320/430无溢出、整个S.calendar JSON不变均通过。测试日期/时钟为隔离夹具2026-10-09，图21:30不冒充用户当前手机时刻；不是iPhone或真实收费模型验收。</ns0:t>
+      </ns0:r>
+    </ns0:p>
+    <ns0:p>
+      <ns0:r>
+        <ns0:t xml:space="preserve">沿用eight-chat目录新增必要calendar-day-view/search-expanded/search-results三图，内容从隔离测试存档读取，不复制照片中的智能君示例；前轮唯一图/包保留、总览只追加。HEAD73f2d421/暂存为空/网页1660私人1661不变，私人包不含未提交候选。保留好友SQL/11行尾现场、northNativeBackgroundTask旧封装、签名原生桥和其他工作区；两端日历段一致（原封装例外）。无本轮临时源码、备份或新工作树，所有测试浏览器服务结束。三维护DOCX原XML只追加、历史字节保留，未验证Word分页。</ns0:t>
+      </ns0:r>
+    </ns0:p>
+    <ns0:p>
+      <ns0:r>
+        <ns0:t xml:space="preserve">搜索依据：https://support.apple.com/zh-cn/guide/iphone/iph2c9ef44ad/ios ，日历视图说明：https://support.apple.com/zh-cn/guide/iphone/iphfd1054569/27/ios/27 。</ns0:t>
+      </ns0:r>
+    </ns0:p>
+    <ns0:p>
+      <ns0:r>
+        <ns0:t xml:space="preserve">2026-10-09 日视图细条修正与日历完整逻辑复核：本地候选，未提交/推送/打包。</ns0:t>
+      </ns0:r>
+    </ns0:p>
+    <ns0:p>
+      <ns0:r>
+        <ns0:t xml:space="preserve">用户指出晚间创作计划色块太粗，要求按参考细条、排查全部逻辑并打开完整可操作预览。根因是整段时长都填背景，一小时厚56px。改为22px细标题条/3px左色线，时长保留1px低强度纵线，实际点击区/起止时间不改，重叠仍分列。隐藏日视图桌面白滚动条但保留原生滚动，认可的顶部玻璃按钮不改。</ns0:t>
+      </ns0:r>
+    </ns0:p>
+    <ns0:p>
+      <ns0:r>
+        <ns0:t xml:space="preserve">发现重复待办旧页面可以把被排除或不存在的日期记为完成，空日期还可能误改整组完成。回归先在旧实现失败，再按calOccurrenceStarts核对本次真实实例后才写入；覆盖每周非实例/排除日期/空日期拒绝、有效日期完成与撤回。</ns0:t>
+      </ns0:r>
+    </ns0:p>
+    <ns0:p>
+      <ns0:r>
+        <ns0:t xml:space="preserve">项目原有tests/*.test.mjs全量3757/3757、0失败；正常与缺可选航班组件双端核心聊天門禁均通过、pageErrors0。双端完整浏览器复核独立日期/时间滑动、跨午夜、重叠分列、实际分钟与农历、搜索多字段/过去/隐藏分类/账户隔离/详情返回、320/430布局、记录JSON不变；新建/详情编辑同ID/单次删除/待办完成/正常保存重载、受邀角色真实buildSystem与aiReply路径均通过。首次运行漏NODE_PATH导致Playwright缺失；默认无参数还带入缺运行时的独立服务测试，后明确使用既有项目tests集合并补依赖环境，未修改其他服务或把失败当通过。</ns0:t>
+      </ns0:r>
+    </ns0:p>
+    <ns0:p>
+      <ns0:r>
+        <ns0:t xml:space="preserve">完整本地预览直接读取现有源码，只有HTTP响应内存注入隔离示例与sessionStorage保存，无新源码副本/脚本/目录；同页刷新保存操作，关闭本页后测试数据可丢弃，正式存档不动。旧8787受SW缓存替代，改独立端口及SW明确直取的预览路径，实际刷新/搜索/详情读回验证通过。保留127.0.0.1:59656/theme-real-preview.html服务和Codex页面供用户操作；其他本轮QA浏览器/服务结束。外部连接隔离，真实模型主动提醒/闭App系统通知/原生打包/iPhone没有作为已验收。</ns0:t>
+      </ns0:r>
+    </ns0:p>
+    <ns0:p>
+      <ns0:r>
+        <ns0:t xml:space="preserve">沿用固定calendar-day-view.png与原维护文档；无本轮新增临时文件。HEAD73f2d421/暂存为空/版本1660与1661不变，好友SQL/11行尾现场/私人后台包装/签名桥保持。三DOCX保留原XML字节只追加，未验证Word分页。初次维护追加按w前缀定位失败未写入，核对实际ns0前缀后适配追加。</ns0:t>
+      </ns0:r>
+    </ns0:p>
+    <ns0:p>
+      <ns0:r>
+        <ns0:t xml:space="preserve">2026-10-09 日历颜色即时生效、旧入口融合、邀请拒绝与角色口头安排：本地候选，未提交/推送/打包。</ns0:t>
+      </ns0:r>
+    </ns0:p>
+    <ns0:p>
+      <ns0:r>
+        <ns0:t xml:space="preserve">用户反馈自定义小弹框生硬、选红色标签不变、移除联系人白块，要求去掉每日心情、融入经期/日期定位、补全已拒绝邀请开关；后补口头让角色帮忙安排日程、按角色性格问清日期/时间/名称而非固定模板。颜色根因是只改草稿，已有日历标签读取保存值。已有日历预置/自定义颜色立即只保存color字段，不提前提交其他名称/共享/提醒草稿；保存失败回退，新日历仍随创建保存。自定义重复弹层用磨砂+独立mask细环、圆角胶囊深色表单，调色板同风格圆角体；移除联系人按钮背景/边框/阴影透明。</ns0:t>
+      </ns0:r>
+    </ns0:p>
+    <ns0:p>
+      <ns0:r>
+        <ns0:t xml:space="preserve">每日心情入口和定时生成退出日历，历史数据与角色自身情绪系统保持。经期管理/编辑改成新独立页面，复用S.periods及原开始/结束/预测上下文；首页点经期记录进入同页面。日期跨度每天标点，显示开关隐藏点/行但不删记录，提醒开关管开始关心和临近预测，选择指定角色可在开始日关心。新记录限定当前账户，旧历史按既有规则保留；拒绝未来的实际记录与重叠段，进行中留空结束并可补齐，失败回滚。旧“定位日期”改“跳转到日期”新页面，年/月/前后月/真实日期网格直接切所选日期，1900–2100及闰日可用，旧白色弹窗不再作为入口。</ns0:t>
+      </ns0:r>
+    </ns0:p>
+    <ns0:p>
+      <ns0:r>
+        <ns0:t xml:space="preserve">Apple官方：显示已拒绝日程是查看自己拒绝的收到邀请；不是别人拒绝参加就隐藏自己的日程，不会自动改回接受。角色普通分享保持只读；新增明确邀请标签[邀请你参加日程|日期|时间或全天|事项]，仅指定角色自己的那一条发卡，不泄漏同日未邀请事项；玩家接受/可能/拒绝在独立页实际保存。拒绝默认从月/日/搜索过滤，打开显示后可见但仍不提醒；改回接受恢复提醒，保存失败回退，重复发卡不重建/重置已答复记录。角色上下文可知道实际答复，但不强制角色邀请。</ns0:t>
+      </ns0:r>
+    </ns0:p>
+    <ns0:p>
+      <ns0:r>
+        <ns0:t xml:space="preserve">旧口头[日程|日期|标题]只有日期标题，聊天/通话分别直接push。现在二者都调用calPlayerConsume：明确JSON日期/开始时间或全天/标题，可选结束/重复/提前分钟/分类/地点/备注；不明日期、缺时间、非法结束/分类/提醒拒绝写入，不编默认时长；已知跨天结束日期还必须提供准确结束时间。按实际完成保存发calendarcreated卡，独立详情可编辑，重试按账户/角色/轮次/实际内容去重，失败回滚记录和卡并抑制虚假保存确认。旧协议兼容为全天且需合法日期与非空标题，旧双写入口移除；普通日程提示统一，不影响婚礼特殊路径。角色按自己性格自由追问已有信息/教真实入口，无固定问答脚本。</ns0:t>
+      </ns0:r>
+    </ns0:p>
+    <ns0:p>
+      <ns0:r>
+        <ns0:t xml:space="preserve">新增颜色失败回归先在旧实现失败后修复；邀请选定内容/拒绝显示不恢复提醒/状态失败回滚及口头缺信息/重复/失败回滚真实单元通过。全量3760/3760、0失败；正常与缺可选航班组件双端核心聊天門禁通过、pageErrors0。最后跨日缺结束时间拒绝属额外收紧校验，日历/经期专项继续核对。Edge完整web/private HTML真实点选颜色、HEX、自定义菜单/联系人移除样式、经期保存/显示/提醒开关、2028-02-29跳转、实际aiReply+buildSystem受控HTTP模型保存10:15–11:30每周15分钟书店日程并点卡详情、实际角色发邀请/拒绝/显示/接受均通过、pageErrors0。</ns0:t>
+      </ns0:r>
+    </ns0:p>
+    <ns0:p>
+      <ns0:r>
+        <ns0:t xml:space="preserve">实际点新建日程卡曾连带冒出消息操作菜单，根因事件冒泡；已按原分享卡规范stopPropagation，双端重跑通过。QA先误把红色预置认作#ff3b30，核对实际#ff453a后修正；调色保存不曾错误。另QA模型夹具将换行写成字面反斜线n，改真实换行后才验证完整流程；自定义菜单要先点遮罩关闭，点击角落在圆角裁切外失败后选内部遮罩，未强制绕过产品点击层。</ns0:t>
+      </ns0:r>
+    </ns0:p>
+    <ns0:p>
+      <ns0:r>
+        <ns0:t xml:space="preserve">沿用固定预览目录截图与维护文档，无新工作树/源码副本/版本脚本/临时文件。完整用户预览保存原测试日历443和提醒，服务继续127.0.0.1:59656；sessionStorage补保存经期。既有SW缓存导致多次刷新仍旧脚本，HTTP预览使用虚拟实时app/CSS资源路径与iframe请求标记，不改生产SW/版本/门禁。保留预览服务与标签，其余QA浏览器/服务结束；HEAD73f2d421/暂存为空，SQL及11行尾现场、私人后台包装/原生桥签名未动。三DOCX旧XML只追加，未验证Word分页；真正模型的人设追问/真实麦克风通话/iPhone/闭App系统通知未冒充已验收。</ns0:t>
+      </ns0:r>
+    </ns0:p>
+    <ns0:p>
+      <ns0:r>
+        <ns0:t xml:space="preserve">官方依据：https://support.apple.com/zh-cn/guide/iphone/iphc0eddfe3c/27/ios/27 。</ns0:t>
+      </ns0:r>
+    </ns0:p>
+    <ns0:p>
+      <ns0:r>
+        <ns0:t xml:space="preserve">2026-10-09 最终预览复核补记：既有SW对中文HTML导航仍返回旧缓存，最终仅在HTTP预览内改用ASCII theme-real-preview.html承载内嵌实际日历，配合虚拟实时app/CSS路径，不改生产SW。Codex浏览器实际确认经期/跳转新入口、已拒绝开关可用，创作计划选红后编辑页和管理页同步红色，用户原443日历保留。经期等独立页隐藏桌面白滚动条而保留滚动。最后跨日结束日期缺结束时间的新增拒绝条件及失败/去重专项25/25通过；全量3760通过及双端正常/缺航班核心門禁记录如上。没有本轮临时文件，所有QA服务结束，仅保留59656预览与浏览器供用户操作。</ns0:t>
+      </ns0:r>
+    </ns0:p>
+    <ns0:p>
+      <ns0:r>
+        <ns0:t xml:space="preserve">2026-10-09 角色融入日历：本地候选，未提交、推送或打包。</ns0:t>
+      </ns0:r>
+    </ns0:p>
+    <ns0:p>
+      <ns0:r>
+        <ns0:t xml:space="preserve">用户授权角色安排后分享真实日程、按性格互动，要求检查各功能冲突并展示新增卡片。复用原工作树与固定预览，不改签名/原生桥/私人后台包装/并行SQL。</ns0:t>
+      </ns0:r>
+    </ns0:p>
+    <ns0:p>
+      <ns0:r>
+        <ns0:t xml:space="preserve">角色创建成功后的calendarcreated卡改为“为你安排·日程分享”，显示真实名称、日期、开始/结束、分类、重复和地点，点开现有可编辑独立详情。msgToText读取实际记录作为已保存事实；失败仍回滚，缺信息不保存，不虚构时长，角色自己的安排仍独立。角色分享卡增加前三项时间/名称预览，按真实时间排序，邀请和普通分享不同。</ns0:t>
+      </ns0:r>
+    </ns0:p>
+    <ns0:p>
+      <ns0:r>
+        <ns0:t xml:space="preserve">新增每个受邀角色单独参与设置：只告知/一起参与/帮我提醒，新邀请默认只告知，旧记录保持原提醒；角色可按性格自由回应accepted/tentative/declined，执行层仅允许当前账户和被邀请的该角色操作，失败回滚，非受邀秘密记录不可改。收到/分享日程不自动证明角色已经同意。取消参与或待定阻止提醒，关闭开关后排队中的功能事件重新验证权限、revision、日期与完成状态。</ns0:t>
+      </ns0:r>
+    </ns0:p>
+    <ns0:p>
+      <ns0:r>
+        <ns0:t xml:space="preserve">提前准备、结束后关心单独默认关闭；准备窗口在提醒之前且不与到时提醒重合，结束关心有准确结束时间才在结束后30分钟至6小时且不跨当天补发，每角色/事项/重复实例/阶段成功后仅一次。复用既有featureEvent队列与aiReply/buildSystem、人设、主动消息/在线/账户/忙碌/失败机制，不开独立模型定时器、不改变普通聊天和经期/婚礼/待办功能。开启关心会发生原模型调用和额度使用，关闭App系统准点通知仍未实现。新增事件确认完成只由玩家点击，记录该次重复日期，不把时间结束当完成，不替用户延期或删除。角色看到真实完成日期，可提出建议，执行仍由用户编辑。</ns0:t>
+      </ns0:r>
+    </ns0:p>
+    <ns0:p>
+      <ns0:r>
+        <ns0:t xml:space="preserve">先加回归旧实现实际失败：只告知仍发送角色提醒1次；修复后通过。重复每日安排实测发现今天结束关心与明天准备同刻触发，收窄准备窗口而非整天提前，专项覆盖复发、完成后取消排队、撤权、失败回滚。实际完整页面又发现详情没有继承sheet开关/分段样式（尺寸为零/白底）及calCall已转义再送calSwitch重复转义导致点击不生效，分别补详情作用域样式、只在最终HTML转义一次；实际双端开/关均读取到保存值，不用force点击。保存参与设置保留详情滚动位置。</ns0:t>
+      </ns0:r>
+    </ns0:p>
+    <ns0:p>
+      <ns0:r>
+        <ns0:t xml:space="preserve">日历/经期专项28/28通过；全量3763/3763、0失败两轮通过，最后卡片排序、隐藏无效回应标签、详情保存滚动位置的小调整后专项和实际双端完整页面再验。正常与NORTH_MISSING_FLIGHT=1核心聊天门禁均双端通过、pageErrors0。完整HTML受控aiReply/buildSystem保存真实书店日程并发可点卡、读取备注准备关心、受邀角色协议回应、独立分享/邀请/拒绝显示与接受、设置开关开启和关闭均通过。受控HTTP模型不等于真人模型的人设自然度或真实麦克风/后台/iPhone验收，未消费用户模型额度。</ns0:t>
+      </ns0:r>
+    </ns0:p>
+    <ns0:p>
+      <ns0:r>
+        <ns0:t xml:space="preserve">沿用固定calendar-share-card.png、calendar-event-invitees.png、calendar-role-share.png、calendar-role-detail.png，截图为隔离测试数据；完整59656预览保留用户原测试存档和独立sessionStorage，未混入正式存档。无新增临时文件/工作树/脚本/目录；QA浏览器与临时服务正常结束，仅保留用户59656预览服务/标签。好友SQL32增17删及11行尾现场未动、暂存为空、HEAD73f2d421不变。三DOCX原XML字节保留追加，XML可解析；未验证Word分页。</ns0:t>
       </ns0:r>
     </ns0:p>
     <ns0:sectPr ns0:rsidR="00FC693F" ns0:rsidRPr="0006063C" ns0:rsidSect="00034616">

</xml_diff>

<commit_message>
feat: interactive calendar and single-shop restock web v1664 private v1665
</commit_message>
<xml_diff>
--- a/docs/maintenance/AI开发项目_Bug修改规范.docx
+++ b/docs/maintenance/AI开发项目_Bug修改规范.docx
@@ -13119,6 +13119,51 @@
     <ns0:p>
       <ns0:r>
         <ns0:t xml:space="preserve">沿用固定calendar-share-card.png、calendar-event-invitees.png、calendar-role-share.png、calendar-role-detail.png，截图为隔离测试数据；完整59656预览保留用户原测试存档和独立sessionStorage，未混入正式存档。无新增临时文件/工作树/脚本/目录；QA浏览器与临时服务正常结束，仅保留用户59656预览服务/标签。好友SQL32增17删及11行尾现场未动、暂存为空、HEAD73f2d421不变。三DOCX原XML字节保留追加，XML可解析；未验证Word分页。</ns0:t>
+      </ns0:r>
+    </ns0:p>
+    <ns0:p>
+      <ns0:r>
+        <ns0:t xml:space="preserve">2026-10-09 用户授权全部推送、暂不打包：网页v1664 / 私人共享源码v1665 / iOS1.0.439(build439) / bridge42。</ns0:t>
+      </ns0:r>
+    </ns0:p>
+    <ns0:p>
+      <ns0:r>
+        <ns0:t xml:space="preserve">包含当前完整日历改造及角色日程创建分享、邀请参与、可选准备/结束关心、自定义颜色、经期融合、搜索和日视图；本轮真人店补货改为分店操作。已提交远程d192fd0的像素少女与电子宠物断网自动重下按原实现继承，不覆盖。合并仅README追加位置冲突，保留双方记录；没有reset/stash/新工作树/源码副本。</ns0:t>
+      </ns0:r>
+    </ns0:p>
+    <ns0:p>
+      <ns0:r>
+        <ns0:t xml:space="preserve">补货根因：旧一键虽筛quantity===0，但遍历全部店的stock，导致跨店集中补货。新增按当前账户/存档/有效店铺保存的店铺选择，仅渲染当前店库存，切店清空勾选和未确认补货草稿；正在加载的空数据不重置当前店，提交完成刷新保留选择。报价拒绝混店，确认显示店名。一键只选当前店price有效且库存0商品，继续原stock_empty_batch核验；多选只针对当前店明确勾选的可补商品，可逐件输入不同数量（或统一数量），继续原stock_batch完整事务。已有库存不会自动进入一键，多选已有库存必须明确勾选。两种路径都保留PIN、当前身份、金额核对、余额/库存上限和原request幂等。未改数据库旧批量RPC或历史回执规则，不重放真实用户补货或扣款。</ns0:t>
+      </ns0:r>
+    </ns0:p>
+    <ns0:p>
+      <ns0:r>
+        <ns0:t xml:space="preserve">回归先在旧网页与私人实现失败：勾选s1/s2后实际包含A,C，单店要求应仅A；修复后通过。74项补货/店铺专项通过，包含同产品ID跨店隔离、切店清选择、加载刷新保留店、已库存跳过、逐件3/5份精确44.00、混店报价拒绝、账号/存档切换、利润正零负显示等。完整双端HTML实际点击切店、多选逐件数量、PIN和RPC请求，验证只提交s1商品a3份/b5份，两家其他店库存不变；另店一键调用stock_empty_batch且仅该店零库存，pageErrors0。受控云端回执不是生产交易验收，未消费真人余额。</ns0:t>
+      </ns0:r>
+    </ns0:p>
+    <ns0:p>
+      <ns0:r>
+        <ns0:t xml:space="preserve">发布前全量发现旧安卓解析会被新增滚动保存optional chaining阻断，改显式判空；同时新日历保存去掉新增Object.fromEntries依赖，用普通reduce并验证该API不存在时仍保存。新继承守卫初次参数标记写成calPeriodOpen()而实际有id，修正守卫描述，不更改经期函数。失败先拦截未推送，修复后723项定向及日历/旧安卓28项通过，再运行最终全量和两套正常/缺航班核心聊天门禁。正式发布结论以固定.codex_tmp/online-release-result.json中的准确提交、Pages完成和线上HTML/app/commerce/CSS/SW逐字节匹配为准，不把本地测试或git push当线上完成。</ns0:t>
+      </ns0:r>
+    </ns0:p>
+    <ns0:p>
+      <ns0:r>
+        <ns0:t xml:space="preserve">原并行supabase_phone_friends_update_v416.sql(32增17删)及11个继承行尾测试现场保护，不纳入提交；原生签名、桥、私人时长采集/管控/共享屏幕与后台calendar包装保持。所有本轮运行逻辑属于两边共有日历/补货，私人App安装包本次不生成。三DOCX旧XML原字节保留追加且可解析，Word分页未验。</ns0:t>
+      </ns0:r>
+    </ns0:p>
+    <ns0:p>
+      <ns0:r>
+        <ns0:t xml:space="preserve">固定预览和必要截图保留，QA临时服务/浏览器正常结束；不创建新临时文件/目录/脚本，无需删除其他聊天资料。既有59656用户预览服务保留，不动用户存档。真实模型自然度、关App系统通知、Mac/iPhone仍需相应层级实际验收。</ns0:t>
+      </ns0:r>
+    </ns0:p>
+    <ns0:p>
+      <ns0:r>
+        <ns0:t xml:space="preserve">2026-10-09 发布复核补记：合并远程下载恢复后，home-entry-stability旧夹具立即要求组件尚未加载而实际组件异步重下；仅等待失败仍失败。暂停评估后只读诊断确认Service Worker绕过page.route模拟缺文件，拿到完整pixel-home后进入真实绑定检查。缺组件夹具设置serviceWorkers:block并等待组件下载失败，双端13/13通过；生产SW及三次下载恢复不改。经营加载时data为空会重置店铺选择，也已修复并在真实双端PIN补货刷新后核对仍选饮品店。最终发布前再运行完整全量，结果另以本轮实际输出与online-release-result.json为准；不得沿用失败轮次为通过。</ns0:t>
+      </ns0:r>
+    </ns0:p>
+    <ns0:p>
+      <ns0:r>
+        <ns0:t xml:space="preserve">2026-10-09 最终候选验收：完整tests/*.test.mjs 3769/3769通过、0失败（106476ms）。正常及NORTH_MISSING_FLIGHT=1双端核心聊天门禁通过，pageErrors0；单店补货两端完整HTML逐件数量/PIN/请求隔离/刷新留店通过；最终日历角色流程两端受控aiReply、卡片、颜色、经期、邀请、参与设置与关心通过。发布提交包括当前全部日历候选和补货以及远程d192fd0继承；私人原生/iOS439/桥42不改、不打包。发布结果另由固定online-release-result.json记录Pages及准确提交线上逐字节验证。</ns0:t>
       </ns0:r>
     </ns0:p>
     <ns0:sectPr ns0:rsidR="00FC693F" ns0:rsidRPr="0006063C" ns0:rsidSect="00034616">

</xml_diff>

<commit_message>
fix: calendar home exit and note spacing with Warm Yan shop web v1666 private v1667
</commit_message>
<xml_diff>
--- a/docs/maintenance/AI开发项目_Bug修改规范.docx
+++ b/docs/maintenance/AI开发项目_Bug修改规范.docx
@@ -13164,6 +13164,46 @@
     <ns0:p>
       <ns0:r>
         <ns0:t xml:space="preserve">2026-10-09 最终候选验收：完整tests/*.test.mjs 3769/3769通过、0失败（106476ms）。正常及NORTH_MISSING_FLIGHT=1双端核心聊天门禁通过，pageErrors0；单店补货两端完整HTML逐件数量/PIN/请求隔离/刷新留店通过；最终日历角色流程两端受控aiReply、卡片、颜色、经期、邀请、参与设置与关心通过。发布提交包括当前全部日历候选和补货以及远程d192fd0继承；私人原生/iOS439/桥42不改、不打包。发布结果另由固定online-release-result.json记录Pages及准确提交线上逐字节验证。</ns0:t>
+      </ns0:r>
+    </ns0:p>
+    <ns0:p>
+      <ns0:r>
+        <ns0:t xml:space="preserve">2026-10-09 用户要求修正经期文字贴框、添加日历主屏幕返回、加入暖燕店铺并直接推送：网页v1666/私人共享源码v1667候选；iOS439/桥42不改，不打包。</ns0:t>
+      </ns0:r>
+    </ns0:p>
+    <ns0:p>
+      <ns0:r>
+        <ns0:t xml:space="preserve">经期列表与编辑两处说明沿用cal-sheet-note的旧margin-top:-22，导致段落压在卡片底边。只给经期说明加cal-period-note，以正上间距替代，不影响其他创建日历说明布局。完整双端页面实测说明顶部比卡片底部低12px，列表/编辑均通过。</ns0:t>
+      </ns0:r>
+    </ns0:p>
+    <ns0:p>
+      <ns0:r>
+        <ns0:t xml:space="preserve">旧日历左侧箭头实际进入年总览，日视图箭头只返回月历，年页也无主屏幕退出。新增独立calHomeButton/calHome到月/日/年页左侧，原年/月入口独立保留，保存中不退出；调用原home()，不写存档或删除记录。旧完整页面回归确实0个返回主屏幕按钮，修复后3个视图实际点击均返回home，日程/经期JSON不变。</ns0:t>
+      </ns0:r>
+    </ns0:p>
+    <ns0:p>
+      <ns0:r>
+        <ns0:t xml:space="preserve">用户提供north-shop-pack v1暖燕，13件商品3分组：姨妈热饮/养生汤/暖宝宝；原封面和13图片、名称/简介/分组/价格/起送2000分/配送190分/配送16分钟全部保留，默认规格为空也保留。作为美团内置模拟店north-nuanyan，不占用户个人云店名额、不冒充已经公开发布真人云店、不导入账号/金额/订单/库存。复用assets/north-dessert-shop.js追加白名单资料，既有NORTH甜品店旧对象原值不变，私人资源逐字节一致，无新增模块/目录/副本。13 JPEG头尾与原图片在完整页面解码验证通过，三组7/3/3显示正确、加入购物车按原价25.00，未执行真实扣款。</ns0:t>
+      </ns0:r>
+    </ns0:p>
+    <ns0:p>
+      <ns0:r>
+        <ns0:t xml:space="preserve">专项100/100通过；两端完整页面说明间距/三视图返回/商品分组/图片/购物车及pageErrors0通过；正常和NORTH_MISSING_FLIGHT=1核心聊天双端门禁通过。最终全量及发布结论以当前输出和固定online-release-result.json准确提交/Pages/线上逐字节核验为准。</ns0:t>
+      </ns0:r>
+    </ns0:p>
+    <ns0:p>
+      <ns0:r>
+        <ns0:t xml:space="preserve">复用原固定预览、截图和维护文档，用户附件原文件未修改；不新建工作树或脚本，不覆盖原生签名、桥、私人伴生后台。原并行SQL32增17删、11行尾测试现场保留排除提交。QA服务与浏览器正常结束，只保留原用户59656预览。三DOCX旧XML保留追加可解析，Word分页/真实iPhone未验。</ns0:t>
+      </ns0:r>
+    </ns0:p>
+    <ns0:p>
+      <ns0:r>
+        <ns0:t xml:space="preserve">2026-10-09 发布一致性失败补记：为保留历史版本注释，本轮app.js仅更新启动标记/APP_VER，漏更新了实际registerSW中的sw.js?v=1664&amp;r=v1664缓存注册URL，多个版本守卫因此失败。已精确同步实际URL至1666，历史v1664注释保持，不全局改历史数字；相关启动/缓存/原生兼容10项通过，再重跑最终全量。未在失败状态提交或推送。</ns0:t>
+      </ns0:r>
+    </ns0:p>
+    <ns0:p>
+      <ns0:r>
+        <ns0:t xml:space="preserve">2026-10-09 最终验收补记：完整tests/*.test.mjs 3772/3772通过，0失败（106002ms）；两套正常/缺航班核心聊天双端门禁pageErrors0，新页面双端三视图返回、经期两处说明12px分离、暖燕13商品分组/图片/25.00购物车通过。网页v1666/私人共享源码v1667，当前用户授权直接推送，原生439/桥42保持、无本轮包。发布成功以固定online-release-result.json准确提交及Pages/线上资源匹配记录为准。</ns0:t>
       </ns0:r>
     </ns0:p>
     <ns0:sectPr ns0:rsidR="00FC693F" ns0:rsidRPr="0006063C" ns0:rsidSect="00034616">

</xml_diff>

<commit_message>
build: complete private v1667 iOS439 source package
</commit_message>
<xml_diff>
--- a/docs/maintenance/AI开发项目_Bug修改规范.docx
+++ b/docs/maintenance/AI开发项目_Bug修改规范.docx
@@ -13204,6 +13204,26 @@
     <ns0:p>
       <ns0:r>
         <ns0:t xml:space="preserve">2026-10-09 最终验收补记：完整tests/*.test.mjs 3772/3772通过，0失败（106002ms）；两套正常/缺航班核心聊天双端门禁pageErrors0，新页面双端三视图返回、经期两处说明12px分离、暖燕13商品分组/图片/25.00购物车通过。网页v1666/私人共享源码v1667，当前用户授权直接推送，原生439/桥42保持、无本轮包。发布成功以固定online-release-result.json准确提交及Pages/线上资源匹配记录为准。</ns0:t>
+      </ns0:r>
+    </ns0:p>
+    <ns0:p>
+      <ns0:r>
+        <ns0:t xml:space="preserve">2026-10-09 用户授权完整私人版本打包：v1667/iOS1.0.439(build439)/桥42，运行代码准确基于已发布并全量3772通过的4616f99d。上一实际交付v1655/SHA256=5f7ab9f5af6beb84802b017fe1a48c865d608c2ca0ea2464f06bab266a5b5843。</ns0:t>
+      </ns0:r>
+    </ns0:p>
+    <ns0:p>
+      <ns0:r>
+        <ns0:t xml:space="preserve">沿用scripts/package_private_v1533_ios438.py，不新增脚本/目录/工作树。更新打包配置到1667并以最近已交付1655作完整manifest/旧文件/原生签名/私人public-north-policy/runtime/性能守卫继承检查；保留原validate所有旧功能守卫。每个文件只由git cat-file读取准确已提交项目，dirty私人源码拒绝打包，输出若已存在拒绝覆盖；ZIP全成员CRC/解压原字节/manifest哈希再验，不创建解压副本。</ns0:t>
+      </ns0:r>
+    </ns0:p>
+    <ns0:p>
+      <ns0:r>
+        <ns0:t xml:space="preserve">新增打包守卫覆盖当前日历月/年/日/搜索、真实事项/角色安排分享/邀请参与和可选关心、颜色经期与返回按钮，角色仅点赞图库，单店零库存一键/逐件多选、云端创业费/奖励、暖燕13商品、像素/宠物下载恢复及私人calendar后台包装。1767个项目文件读取并原validate通过，私人打包/原生云备份/项目范围17项专项通过。所有运行资源需逐字节等于4616f99d审阅私有源，只有当前Mac编译说明按交付更新。</ns0:t>
+      </ns0:r>
+    </ns0:p>
+    <ns0:p>
+      <ns0:r>
+        <ns0:t xml:space="preserve">更新Mac说明和打包辅助，原生代码/Team/BundleID/entitlements/桥/iOS版本未改；不把网页伴生删除覆盖到私人。保护并行好友SQL和11行尾测试，不纳入本包；其他工作区候选不复制。SOURCE_STATE区分包源提交、网页源提交4616f99d、3772测试证据来源、受控HTTP模型和真实模型未验。交付为Mac/Xcode源码覆盖包，非IPA；Mac编译签名、真iPhone、真实角色模型/麦克风日程及关闭App系统通知未作为通过。最终ZIP结果以本次命令输出及包内SOURCE_STATE/SHA256SUMS为准。</ns0:t>
       </ns0:r>
     </ns0:p>
     <ns0:sectPr ns0:rsidR="00FC693F" ns0:rsidRPr="0006063C" ns0:rsidSect="00034616">

</xml_diff>

<commit_message>
feat: recover deleted local and cloud shops web v1668 private v1669
</commit_message>
<xml_diff>
--- a/docs/maintenance/AI开发项目_Bug修改规范.docx
+++ b/docs/maintenance/AI开发项目_Bug修改规范.docx
@@ -13224,6 +13224,41 @@
     <ns0:p>
       <ns0:r>
         <ns0:t xml:space="preserve">更新Mac说明和打包辅助，原生代码/Team/BundleID/entitlements/桥/iOS版本未改；不把网页伴生删除覆盖到私人。保护并行好友SQL和11行尾测试，不纳入本包；其他工作区候选不复制。SOURCE_STATE区分包源提交、网页源提交4616f99d、3772测试证据来源、受控HTTP模型和真实模型未验。交付为Mac/Xcode源码覆盖包，非IPA；Mac编译签名、真iPhone、真实角色模型/麦克风日程及关闭App系统通知未作为通过。最终ZIP结果以本次命令输出及包内SOURCE_STATE/SHA256SUMS为准。</ns0:t>
+      </ns0:r>
+    </ns0:p>
+    <ns0:p>
+      <ns0:r>
+        <ns0:t xml:space="preserve">2026-10-09 打包途中用户追加误删店铺恢复需求：先按4616f99d运行源完整生成1667私人候选（1769文件/1768manifest/189498817字节/SHA256 aac04e8a16f2212340a9cf2baefcd5d22d601bb3d60915625b40d27a43ec2b1d），未交付该候选，继续补恢复并准备交付含恢复的1669。</ns0:t>
+      </ns0:r>
+    </ns0:p>
+    <ns0:p>
+      <ns0:r>
+        <ns0:t xml:space="preserve">确认既有删除是软删除：真人店只更新deleted_at/published/revision，本机店归档在当前账号merchantLibrary，保留商品/库存/账目。新增必要迁移202610090001_north_market_shop_restore.sql，不改旧删除迁移：本人身份验证，按owner锁和店铺revision恢复原ID，最多3家有效云店，保持未公开，不写钱包或ledger，不重新发奖励，重复未知回执重试返回同一店；读取归档按50家游标分页，不泄露他人店。</ns0:t>
+      </ns0:r>
+    </ns0:p>
+    <ns0:p>
+      <ns0:r>
+        <ns0:t xml:space="preserve">美团我的功能、共同经营新增已删除店铺恢复入口。恢复并切换编辑前保留当前店到库；本机只恢复当前账号完整归档，保存失败回滚。云端只依据本人恢复回执重建原菜单、原图片、原商品ID/云店ID/最新版本，并清掉删除缓存；未知回执不假造成功。较新云端活店revision会覆盖旧本机删除标记的隐藏判断，既有旧实现对该场景实际返回0行，修复后1行；刷新/重试不再误隐藏。恢复时显示恢复中并禁用，跨账号迟到响应不改新账号忙碌状态；读取云端失败明确显示错误，本机归档仍可操作。</ns0:t>
+      </ns0:r>
+    </ns0:p>
+    <ns0:p>
+      <ns0:r>
+        <ns0:t xml:space="preserve">隔离PGlite真实SQL验证所有权、版本冲突、3家上限、重复恢复、商品/库存/ledger不变和55条分页；本机失败保存/当前店保留/他人账号隔离通过。78项后增旧删除标记回归79项通过。两端完整HTML实际点击本机与云店恢复、原13商品恢复、原云ID/revision、没有收费RPC、默认停止公开/pageErrors0通过。初次QA只等S里ID改变便点下一次恢复，实际存档还在写，Busy/Saving保护令下一次不执行；停止编辑并用只在测试HTTP响应注入的诊断确认，改等最终编辑页出现，未强制点击，产品补明确忙碌状态，两端通过。</ns0:t>
+      </ns0:r>
+    </ns0:p>
+    <ns0:p>
+      <ns0:r>
+        <ns0:t xml:space="preserve">通过既有已登录Supabase后台真实执行恢复迁移COMMIT，Success No rows returned；只读核对restore_api/deleted_list_api/owner_checked/restored_unpublished/rpc_granted均true。没有修改用户具体店铺，也没有生产测试商铺/订单/资金；用户尚未提供误删店名，新增入口让本人选择。源码3772基线，最终1668网页/1669私人候选全量与聊天门禁正在核对；成功以本轮输出、Pages和ZIP证明为准。</ns0:t>
+      </ns0:r>
+    </ns0:p>
+    <ns0:p>
+      <ns0:r>
+        <ns0:t xml:space="preserve">保护原好友SQL32增17删、11行尾测试、原生签名/桥42/iOS439与私人伴生/云备份。复用固定工作区和打包脚本，不新增工作树/临时目录/脚本；仅新恢复迁移属于新功能必要实现。已生成但未交付1667候选待1669完整校验后安全清理，历史已交付ZIP不动。Mac编译/签名/真机/真人模型仍未验证。</ns0:t>
+      </ns0:r>
+    </ns0:p>
+    <ns0:p>
+      <ns0:r>
+        <ns0:t xml:space="preserve">2026-10-09 恢复功能最终验收：完整tests/*.test.mjs 3777/3777、0失败（108888ms）；正常和缺可选航班组件两套双端聊天门禁通过。隔离SQL、本机/云店完整页面恢复及原商品/保存失败/分页/库存账本无变化通过。全量曾揭示旧删除记录无revision会被新版导入分支误放行，改为仅两个合法整数版本且云端严格较新时允许重新导入；未知/缺版本保持删除并提示恢复，不再打开空白新店。172项复验及最终全量通过。真实后台恢复接口已经COMMIT并只读核验五项true，未替用户恢复具体记录。发布v1668/私人v1669并将新功能放入最终私人包，1667未交付候选稍后安全清理。</ns0:t>
       </ns0:r>
     </ns0:p>
     <ns0:sectPr ns0:rsidR="00FC693F" ns0:rsidRPr="0006063C" ns0:rsidSect="00034616">

</xml_diff>

<commit_message>
fix: calendar visibility streaming settings and session lookup web v1670 private v1671
</commit_message>
<xml_diff>
--- a/docs/maintenance/AI开发项目_Bug修改规范.docx
+++ b/docs/maintenance/AI开发项目_Bug修改规范.docx
@@ -13259,6 +13259,16 @@
     <ns0:p>
       <ns0:r>
         <ns0:t xml:space="preserve">2026-10-09 恢复功能最终验收：完整tests/*.test.mjs 3777/3777、0失败（108888ms）；正常和缺可选航班组件两套双端聊天门禁通过。隔离SQL、本机/云店完整页面恢复及原商品/保存失败/分页/库存账本无变化通过。全量曾揭示旧删除记录无revision会被新版导入分支误放行，改为仅两个合法整数版本且云端严格较新时允许重新导入；未知/缺版本保持删除并提示恢复，不再打开空白新店。172项复验及最终全量通过。真实后台恢复接口已经COMMIT并只读核验五项true，未替用户恢复具体记录。发布v1668/私人v1669并将新功能放入最终私人包，1667未交付候选稍后安全清理。</ns0:t>
+      </ns0:r>
+    </ns0:p>
+    <ns0:p>
+      <ns0:r>
+        <ns0:t xml:space="preserve">2026-10-11 网页v1670 / 私人共享源码v1671（本轮不打包）：用户报告自己新建勾选返回首页但不显示、第7项无反应、安卓Edge旧版本不更新/授权暂无法恢复，并要求网络连接流式开关。已复现隐藏分类默认选择、默认新编辑记录被legacyVisible隐藏；修复默认只选可见分类，无可见分类用默认日历，新编辑默认记录不受旧记录开关影响，显式隐藏分类仍保留。两端实际HTML创建保存可见、只告知取消提醒/prepare/followup、流式开关存档重开及正常/缺航班组件聊天门禁通过，pageErrors0。第7项原具体症状未单独确认，不据受控模型承诺真机主动发言。授权错误源是服务器409 license-session-missing，原客户端未继续其他已配置入口；仅session_check/list在该精确错误下带原token核对其他已有入口，不创建授权、不清空存档、不增加写请求重试。新的失败回归在旧代码实际报错，修复后通过。补前台/pageshow/controllerchange/activated更新查询；无法取得旧安卓完整网址，旧网址/网络/双端均无授权记录仍可能无法恢复，未声称真机已恢复。流式默认关闭，启用发送stream:true；解析SSE/UTF8碎片/正文/finish/usage，忽略推理字段，收齐再返回，断流/格式错误拒绝半截操作，不重复付费请求；允许接口返回完整JSON。诊断模块提升为更新必需资源，防止新核心搭配旧解析器。网页/私人分别定点修改保留私人独立拦截链及伴生差异。新增UTF8候选测试最初错误地要求私人走网页诊断钩子，保留私人链并纠正夹具；版本测试先发现Mac说明未更新，追加新源码说明而保留历史包声明。680项定向回归通过；最终全量结果以固定full-tests.log为准。原生iOS439/桥42/签名配置不改，保留1669唯一已交付ZIP和其他聊天12项脏文件，无Mac/安卓/iPhone真人模型验收。复用固定日志/既有脚本/工作区，不新增临时目录或版本复制品。</ns0:t>
+      </ns0:r>
+    </ns0:p>
+    <ns0:p>
+      <ns0:r>
+        <ns0:t xml:space="preserve">2026-10-11 最终验收：全量3786/3786通过，0失败，115127ms；680项专项、两端实际日程与参与开关/流式设置持久化、正常及缺可选航班组件聊天门禁通过，pageErrors0。普通JSON、流式UTF8三字节碎片、断流不交付半截操作、精确409授权只读入口核对通过。首次全量仅Mac说明当前版本断言未同步失败，追加1671源码说明后全量通过。私人Swift与HEAD规范化内容相同且Git diff为空，不能把Git CRLF差异当原生修改；1669已交付ZIP SHA256仍dcb9d666c0128aa8e688b1045300b85fcc1854584a51fb4d2d20c7c97172b0d3。网页准备发布1670，私人共享源码1671，本轮不打包；真实安卓旧网址、账号恢复、真人模型主动提醒尚未验。固定日志复用，无新增临时产物需删除，其他聊天原好友SQL和11测试行尾保持。</ns0:t>
       </ns0:r>
     </ns0:p>
     <ns0:sectPr ns0:rsidR="00FC693F" ns0:rsidRPr="0006063C" ns0:rsidSect="00034616">

</xml_diff>

<commit_message>
fix: encoded PWA update navigation bypasses stale shell web v1672
</commit_message>
<xml_diff>
--- a/docs/maintenance/AI开发项目_Bug修改规范.docx
+++ b/docs/maintenance/AI开发项目_Bug修改规范.docx
@@ -13269,6 +13269,16 @@
     <ns0:p>
       <ns0:r>
         <ns0:t xml:space="preserve">2026-10-11 最终验收：全量3786/3786通过，0失败，115127ms；680项专项、两端实际日程与参与开关/流式设置持久化、正常及缺可选航班组件聊天门禁通过，pageErrors0。普通JSON、流式UTF8三字节碎片、断流不交付半截操作、精确409授权只读入口核对通过。首次全量仅Mac说明当前版本断言未同步失败，追加1671源码说明后全量通过。私人Swift与HEAD规范化内容相同且Git diff为空，不能把Git CRLF差异当原生修改；1669已交付ZIP SHA256仍dcb9d666c0128aa8e688b1045300b85fcc1854584a51fb4d2d20c7c97172b0d3。网页准备发布1670，私人共享源码1671，本轮不打包；真实安卓旧网址、账号恢复、真人模型主动提醒尚未验。固定日志复用，无新增临时产物需删除，其他聊天原好友SQL和11测试行尾保持。</ns0:t>
+      </ns0:r>
+    </ns0:p>
+    <ns0:p>
+      <ns0:r>
+        <ns0:t xml:space="preserve">2026-10-11 网页v1672主屏幕更新第二轮：用户明确苹果主屏幕安装PWA刷不出版本，前轮v1670仅补前台/激活查询，不能据线上发布宣称用户已恢复。线上实际1670文件再次核实，用户入口是PWA不是私人App。复现Service Worker中小手机.html匹配直接使用URL.pathname：中文实际percent encoded，使open/reload/from/northPreview例外永远失配；立即更新north_update参数也未纳入explicit。新增真实旧实现失败回归，正确匹配decodedPath；仅显式更新/重载及浏览器cache reload/no-cache走校验后的网络HTML，失败仍回退原缓存。普通离线启动不变，不强制导航/退出、不删授权/存档。浏览器真实安装原c31fd8f1的1670 SW后更新1672，再访问编码中文north_update链接，网络HTML1672通过，原localStorage与IndexedDB记录保留。源码627项定向通过；正常双端授权聊天与最终全量以固定日志为准。该修复只针对网页PWA，私人1671源码、1669已交付包、原生/签名/伴生完全不改。Web浏览器受控证明不是苹果真机验收，不承诺所有旧版本/其他网址/网络都已恢复；绝不指导删除主屏幕App或Safari全站数据来掩盖更新问题。复用现有测试/维护记录/日志与工作树，没有新增脚本、目录、临时副本。新规则：URL.pathname比较中文必须解码；用户点击更新和浏览器重载必须有行为回归；PWA/Safari存储上下文需分别核实。</ns0:t>
+      </ns0:r>
+    </ns0:p>
+    <ns0:p>
+      <ns0:r>
+        <ns0:t xml:space="preserve">2026-10-11 v1672最终验收：完整3788/3788、0失败、119185ms；627项定向与真实已安装SW升级保持localStorage/IndexedDB测试通过；正常双端完整授权聊天门禁pageErrors0。只修网页更新匹配/重载，不强制刷新用户当前页面，私人1671与已交付1669源码包完全不改。苹果真机是否恢复仍需用户重新打开实际主屏幕PWA核对。Git只提交本轮文件，原12项脏文件保留；固定证据复用，没有新的临时目录/副本/安装包。</ns0:t>
       </ns0:r>
     </ns0:p>
     <ns0:sectPr ns0:rsidR="00FC693F" ns0:rsidRPr="0006063C" ns0:rsidSect="00034616">

</xml_diff>

<commit_message>
fix: isolate role actions and fresh context web v1674 private v1675
</commit_message>
<xml_diff>
--- a/docs/maintenance/AI开发项目_Bug修改规范.docx
+++ b/docs/maintenance/AI开发项目_Bug修改规范.docx
@@ -13279,6 +13279,41 @@
     <ns0:p>
       <ns0:r>
         <ns0:t xml:space="preserve">2026-10-11 v1672最终验收：完整3788/3788、0失败、119185ms；627项定向与真实已安装SW升级保持localStorage/IndexedDB测试通过；正常双端完整授权聊天门禁pageErrors0。只修网页更新匹配/重载，不强制刷新用户当前页面，私人1671与已交付1669源码包完全不改。苹果真机是否恢复仍需用户重新打开实际主屏幕PWA核对。Git只提交本轮文件，原12项脏文件保留；固定证据复用，没有新的临时目录/副本/安装包。</ns0:t>
+      </ns0:r>
+    </ns0:p>
+    <ns0:p>
+      <ns0:r>
+        <ns0:t xml:space="preserve">2026-10-11 v1674网页 / v1675私人源码：角色执行与上下文修复</ns0:t>
+      </ns0:r>
+    </ns0:p>
+    <ns0:p>
+      <ns0:r>
+        <ns0:t xml:space="preserve">用户私人v1669、主模型反馈：拒绝解锁仍解、微信目标串放映室、思考内静默全锁、NORTH奶茶误走云钱包、隔轮重复下单/旧图片/旧争执重播、后台主动旧话题、延安上海下周一早上机票失败无回复。用户明确：全锁必须先在聊天中说明。</ns0:t>
+      </ns0:r>
+    </ns0:p>
+    <ns0:p>
+      <ns0:r>
+        <ns0:t xml:space="preserve">修复：动作包络排除内心/HTML思考；显式已知App优先，全部目标须完整匹配；解锁拒绝按应用作用域核对。线上App锁/解指令等最终回复生成并保存后提交；全锁需本轮新可见说明和成功落盘，共享派发器同样防止共同生活等入口绕过，单应用与既有每日限额保持。迟到应用别名解析/确认在新消息或账号变化后作废。固定NORTH奶茶已知菜单进入原虚拟店付款链，缺杯型/糖度采用已有菜单默认值，显式错误规格仍拒绝；真实云店报价/角色余额/原client未知付款恢复不改。已完成同日同规格旧请求重放阻止，明确新购买/角色主动再点继续允许。</ns0:t>
+      </ns0:r>
+    </ns0:p>
+    <ns0:p>
+      <ns0:r>
+        <ns0:t xml:space="preserve">历史图片保留记忆但仅当前图片或明确回指才施加本轮图片事实；已过去“让我滚”不再标为刚才，不清空记忆。后台验证conversationBoundary.userAt与last_user_at一致后优先最新轮，已结束输入不再当新请求。延安加入既有模拟城市，按周一周界解析下周一，早上过滤航班；失败保留实际原因，有限修正说明无新执行/扣款，空回复写实际失败回执，不虚构出票。电话新增机票标签消费；真实模型和电话实机仍未验证。</ns0:t>
+      </ns0:r>
+    </ns0:p>
+    <ns0:p>
+      <ns0:r>
+        <ns0:t xml:space="preserve">失败与回归：旧源码双端静默全锁行为实际重现；此前已分别重现错误目标、旧图片强制事实、固定奶茶钱包错误及机票静默。一次测试夹具缺S.food造成假失败，补真实状态后原消费链通过；literal双引号破坏旧简易源码提取器，改等价十六进制；网页独有diagnostic outcome参数引起旧逐字一致检查，保留私人差异并检查两端同一保存说明规则。全量3822中1项旧逐字检查失败已修正，最终完整回归待核对。正常/缺可选机票组件双端授权页面通过，用户模型HTTP受控，无真实下单/收费模型。一次私人手动回复等待超时，补诊断复验通过，不改业务超时兜底。</ns0:t>
+      </ns0:r>
+    </ns0:p>
+    <ns0:p>
+      <ns0:r>
+        <ns0:t xml:space="preserve">保护：不动Swift/签名/桥42/iOS439、公版North独立后台、模型配置、用户数据、未知交易幂等和其他聊天。发布范围隔离另一个聊天尚未授权发布的delivery连接诊断两文件/测试/历史段落及原好友SQL与11项测试现场；使用已存在固定日志和脚本。尚无Mac签名编译、真实iPhone安装、用户主模型复测，私人1669不会因网页发布自动升级。</ns0:t>
+      </ns0:r>
+    </ns0:p>
+    <ns0:p>
+      <ns0:r>
+        <ns0:t>2026-10-11 最终验收补充：源代码完整3824/3824、0失败（136360ms）；正常与缺可选机票组件的网页/私人双端授权聊天门禁、手动/自动查看、输出模式、存档刷新均通过，pageErrors0。新的全锁说明要求在共享派发器同样生效；未连接外部iPhone时已授权内部App的明确全锁继续保留。私人role-push独立qvu项目部署ACTIVE version42，其余函数及独立公版后台不部署。门禁两次手动等待失败后诊断证实实际回复正确但额外的空聊天闲置自动查岗消耗第二次HTTP；测试夹具设当日闲置预算已用，强制查看仍独立验证，未mock buildSystem/myActivity、未更改生产自动查岗。最后一遍门禁通过。尚无真实用户模型/原生锁回执/真实iPhone和Mac签名编译验收；将从准确提交复用既有打包脚本生成完整v1675源码覆盖包，旧1669包不覆盖。</ns0:t>
       </ns0:r>
     </ns0:p>
     <ns0:sectPr ns0:rsidR="00FC693F" ns0:rsidRPr="0006063C" ns0:rsidSect="00034616">

</xml_diff>

<commit_message>
docs: record verified private v1675 overlay delivery
</commit_message>
<xml_diff>
--- a/docs/maintenance/AI开发项目_Bug修改规范.docx
+++ b/docs/maintenance/AI开发项目_Bug修改规范.docx
@@ -13314,6 +13314,11 @@
     <ns0:p>
       <ns0:r>
         <ns0:t>2026-10-11 最终验收补充：源代码完整3824/3824、0失败（136360ms）；正常与缺可选机票组件的网页/私人双端授权聊天门禁、手动/自动查看、输出模式、存档刷新均通过，pageErrors0。新的全锁说明要求在共享派发器同样生效；未连接外部iPhone时已授权内部App的明确全锁继续保留。私人role-push独立qvu项目部署ACTIVE version42，其余函数及独立公版后台不部署。门禁两次手动等待失败后诊断证实实际回复正确但额外的空聊天闲置自动查岗消耗第二次HTTP；测试夹具设当日闲置预算已用，强制查看仍独立验证，未mock buildSystem/myActivity、未更改生产自动查岗。最后一遍门禁通过。尚无真实用户模型/原生锁回执/真实iPhone和Mac签名编译验收；将从准确提交复用既有打包脚本生成完整v1675源码覆盖包，旧1669包不覆盖。</ns0:t>
+      </ns0:r>
+    </ns0:p>
+    <ns0:p>
+      <ns0:r>
+        <ns0:t>2026-10-11 私人覆盖包已生成并核验：最新私人版本覆盖包_v1675_iOS439.zip，189508210字节，1769文件/1768 manifest条目，SHA256 a45812032c5c418d668c62f231a7c1e113a8874cc53671c0744a3deb66f0fa79。sourceCommit=f81f5de4849c2e318e09c75b9f6ac464d42c83bd，reviewed runtime=3cb33fac407d6c015571c6aef0550f296a0b61a8，网页1674/私人1675/iOS1.0.439(build439)/桥42。继承原1669完整manifest并逐个核对旧哈希；新包CRC/manifest/解压字节回读通过，原生/签名/私人policy和runtime/性能guard与1253小家资源不变。包只从Git提交读，明确排除另一聊天工作树中的delivery诊断；没有把脏工作内容复制进包。旧1669包仍保留原SHA。交付种类Mac-Xcode源码覆盖包，不是IPA；Mac签名编译、真实iPhone覆盖安装及用户主模型未验证。</ns0:t>
       </ns0:r>
     </ns0:p>
     <ns0:sectPr ns0:rsidR="00FC693F" ns0:rsidRPr="0006063C" ns0:rsidSect="00034616">

</xml_diff>

<commit_message>
Apply approved optical glass and private role sync relay
Add scoped fixed relay, foreground pull recovery and diagnostics while preserving private native control. Keep tap-next cue and list-only hidden chats. Advance web to 1676 and private runtime to 1677; inherit the complete 1675 source overlay. Core scenarios checked through CUA; 3788 Node checks pass, 54 standalone browser-driver cases skipped.
</commit_message>
<xml_diff>
--- a/docs/maintenance/AI开发项目_Bug修改规范.docx
+++ b/docs/maintenance/AI开发项目_Bug修改规范.docx
@@ -13319,6 +13319,71 @@
     <ns0:p>
       <ns0:r>
         <ns0:t>2026-10-11 私人覆盖包已生成并核验：最新私人版本覆盖包_v1675_iOS439.zip，189508210字节，1769文件/1768 manifest条目，SHA256 a45812032c5c418d668c62f231a7c1e113a8874cc53671c0744a3deb66f0fa79。sourceCommit=f81f5de4849c2e318e09c75b9f6ac464d42c83bd，reviewed runtime=3cb33fac407d6c015571c6aef0550f296a0b61a8，网页1674/私人1675/iOS1.0.439(build439)/桥42。继承原1669完整manifest并逐个核对旧哈希；新包CRC/manifest/解压字节回读通过，原生/签名/私人policy和runtime/性能guard与1253小家资源不变。包只从Git提交读，明确排除另一聊天工作树中的delivery诊断；没有把脏工作内容复制进包。旧1669包仍保留原SHA。交付种类Mac-Xcode源码覆盖包，不是IPA；Mac签名编译、真实iPhone覆盖安装及用户主模型未验证。</ns0:t>
+      </ns0:r>
+    </ns0:p>
+    <ns0:p>
+      <ns0:r>
+        <ns0:t>2026-10-11 本地预览：共同生活续回复箭头、微信不显示该聊天。用户只要截图，禁止推送和打包；本轮不提交、不更新版本、不部署后台。共同生活将原滚动内容底部提示改为输入栏上方固定小箭头：仅当前角色还有待点出的下一句时显示，离开/多选隐藏；点击先完成当前逐字内容、再释放下一句，待显示回复结束后消失，无额外模型调用。微信角色/本地群/真人好友/真人群左滑显示不显示该聊天；按当前身份及会话类型ID隔离保存，过滤列表，不删除联系人、消息、群成员或历史，原置顶/时间排序和未读逻辑保留；晚于隐藏时间的新消息重新显示，通讯录打开也恢复。纵向滑动不触发，滑动抑制误打开，操作按钮可直接点，拖动不选中文字。</ns0:t>
+      </ns0:r>
+    </ns0:p>
+    <ns0:p>
+      <ns0:r>
+        <ns0:t>双端实际HTML：左滑/隐藏、通讯录与消息逐字保留、正常入口保存刷新、重新打开恢复、箭头可见/点击释放/消失均通过，pageErrors0；主聊天授权门禁通过，新增行为与原排序/通讯录回归通过；永久保护628/628。完整回归初次3825中1项旧三参数源码检查失败，更新为新会话key第四参数的精确断言，保留排序检查后重跑，最终结果见固定full-tests.log。截图均为本地测试内容，时区Asia/Seoul：.codex_tmp/eight-chat/cohab-next-arrow.png、wechat-hide-chat.png、wechat-hidden-contacts.png。</ns0:t>
+      </ns0:r>
+    </ns0:p>
+    <ns0:p>
+      <ns0:r>
+        <ns0:t>失败记录：预览刷新重建演示种子不能用于判断存档丢失，改正常入口验证；正常入口授权遮罩不作箭头点击验收，预览视觉另验，不改正式授权。好友恢复拼接语法被双端node --check检出并修正；没有发布。复用日志/目录/既有脚本，无新脚本/目录/工作树。原生签名/桥、1675旧包、其他聊天delivery诊断/好友SQL/继承测试全部保留，文档仅追加。</ns0:t>
+      </ns0:r>
+    </ns0:p>
+    <ns0:p>
+      <ns0:r>
+        <ns0:t>2026-10-11 用户位置纠正：续回复小箭头应在屏幕中间的聊天文字下面，随文字移动，取消此前输入栏上方固定位置。双端将箭头放入offbg消息滚动区域、紧接当前文字居中，CSS改正常文档流；仍仅有待显示下一句时出现，点击与结束消失规则不变。网页/私人真实HTML验证位置在当前文字下方、水平居中、滚动时一起移动、点击释放及消失，pageErrors0；共同生活相关11项回归通过。更新同一张本轮截图，不增加重复图片/目录；不提交、不推送、不打包。</ns0:t>
+      </ns0:r>
+    </ns0:p>
+    <ns0:p>
+      <ns0:r>
+        <ns0:t>2026-10-11 液态玻璃参数调试页，仅本地阶段。用户只有参考图、没有原网页链接；按图中22个项目独立实现GL_LAB_FIELDS及WebGL圆角/圆形SDF、折射、RGB色散、斜面、高光、材质颜色与阴影实验，不冒充原算法或原数值映射。复用theme-real-preview.html，保留原14个真实主题预览入口；新增液态玻璃调试页、黑白玻璃、旧/新实验配方、按压胀开/弹回、拖动水滴、内置底图和本地图片、重置、保存/加载、JSON导入/导出。卡片/气泡/输入框/按钮前景文字独立清晰，按预览容器缩放。这个图形实验并未覆盖真实小手机DOM，不把实验页效果冒充正式全局适配。</ns0:t>
+      </ns0:r>
+    </ns0:p>
+    <ns0:p>
+      <ns0:r>
+        <ns0:t>参数单独写north-glass-lab-v1及-draft，不读写小手机核心存档；22项白名单/有限数值/范围钳位，保留0，非法或空值用默认。保存失败可导出，坏JSON不覆盖当前参数；自选照片仅本次预览，不混入配方。单次requestAnimationFrame更新，静止/隐藏或切回原预览不持续绘制，DPR上限2；图形不支持/丢失时明确显示有限兼容预览并禁用19项，不放无效滑块冒充全功能。图形恢复重新建渲染器，参数保留。按压/拖动使用指针捕获并清理取消状态。</ns0:t>
+      </ns0:r>
+    </ns0:p>
+    <ns0:p>
+      <ns0:r>
+        <ns0:t>验收：22项逐项改变实际像素；光方向0与360等价不是缺失，测试改0对180。保存/刷新恢复、核心存档哨兵保留、数字直接修改、按压开关与弹回、水滴拖动、坏/有效JSON导入/导出、原真实预览切换与停止绘制、无WebGL兼容提示与19项禁用、320/390/430无横向溢出全部通过；46项相关回归通过。实际Codex内置浏览器确认完整22项可用，用户正在调整；不重置/刷新其参数，只用CSS开发热更新修正预览文字缩放，更新前后22项值完全一致。原皮肤高光配方和三个壳子的环/遮罩回归保留，未改正式样式、私人桥、签名或其他聊天。截图复用本轮glass-lab-preview.png，server复用59656，仅本机127.0.0.1，留给用户调试。没有新增脚本/目录/工作树。</ns0:t>
+      </ns0:r>
+    </ns0:p>
+    <ns0:p>
+      <ns0:r>
+        <ns0:t>本轮不提交、不推送、不打包，也没有执行全局覆盖。用户调好后保存并告知，下一阶段再读取确定配方，检查真实页面、文字清晰度、私人/Web差异和手机性能后统一。没有Safari/iPhone真机性能验收，不承诺所有浏览器的物理折射一致。</ns0:t>
+      </ns0:r>
+    </ns0:p>
+    <ns0:p>
+      <ns0:r>
+        <ns0:t>2026-10-11 调试页交付补充：实际内置浏览器的预览字随容器缩放，采用CSS开发热更新，修改前后22项用户参数完全一致，不刷新/重置其操作。当前页面真实截图保留glass-lab-preview.jpg，已核对JPEG；本轮初始默认PNG已被当前实际浏览器截图替代并清理，只有一份当前交付图。用户保存按钮状态表示已保存实验配方，不代表批准全局覆盖；仍等待用户明确调好后读取最终配方。</ns0:t>
+      </ns0:r>
+    </ns0:p>
+    <ns0:p>
+      <ns0:r>
+        <ns0:t>2026-10-11 主屏组件玻璃本地试用（未发布）：将用户导出的完整 22 项配方固定到 theme-real-preview.html 的 GL_HOME_RECIPE；白玻璃、新配方，blur=2.25、ior=1.38、bend=0.6、thickness=2.7、angle=229、shadow=2.9，全部参数以源码 JSON 为准。主屏预览更换既有上海天际线壁纸，仅信息面板、唱片、双人组件及五个面板子块共 8 个玻璃面采用同一调试器算法；一个共享 WebGL 上下文输出到 2D 组件画布，保留原照片、文字及点击处理，不处理图标和 dock。预览按 390x844 缩放显示完整主屏；采用异步代次检查与资源释放，静止时不持续重绘。相关 47 项检查通过；实际点击信息面板和唱片入口通过，未选择音频，未验证播放或私人真机。截图 .codex_tmp/eight-chat/home-glass-trial.jpg。仅本地试用，不修改正式应用样式或私人包，不提交、不推送、不打包；保留其他聊天的在途内容。</ns0:t>
+      </ns0:r>
+    </ns0:p>
+    <ns0:p>
+      <ns0:r>
+        <ns0:t>2026-10-11 统一液态玻璃材质（本地未提交/未发布/未打包）：用户确认主屏试用后明确授权扩展到全部液态玻璃，包括角色手机与电话信息。仅在网页/私人既有 app.js 和 glass-theme.css 追加 NORTH_OPTICAL_MATERIAL_V1 装饰运行层；保留两端业务差异、原生桥/后台/版本。完整冻结用户选定的 22 项 GL_HOME_RECIPE，不用未确认的新参数。自动收集已有有效 backdrop-filter 容器及明确组件，CSSOM 在新 Chromium 中 CSSStyleRule.cssRules 可为空数组，必须先识别实际样式规则；晚加载 CSS 重新收集。壁纸区域共用原调试器 WebGL 着色算法，一个离屏 GL 上下文输出为容器背景，不替换前景 DOM、点击函数、照片或用户存档；无可读取壁纸/跨域/GL 不可用区域采用透明材质、高光与原生 backdrop 兼容显示，不能宣称任何浏览器/视频/页面内容均逐像素完全相同。原 iOS/WKWebView 禁用多层实时 backdrop 保护保留，匹配统一规则的特异性；实际私人 HTML 页面临时添加 iOS 样式条件核对 modalSheet 从 blur(2.25px) saturate(0.95) 变为 none，恢复条件后关闭测试页，此为浏览器兼容样式验证，非真 iPhone/私人原生验收。 组件已有自定义色与透明度仍优先，不覆盖用户上传壁纸；0 值保留。头像/照片、图片消息、图片图标、绿色开关、分类勾选标志、调色网格不作为玻璃底重绘。短信尾巴与生成的镂空细环保持，沿新光向着色。亮壁纸上的组件正文和角色图标标题适应底色。缓存限 48 个材质面/8 个已用壁纸，离屏或移除元素释放背景引用，静止无持续循环；dispose 后迟到图像回调不复活渲染，保留用户自有 blob URL。 验证过程中曾发现初次全量 3844 项中 55 项失败：54 个浏览器用例缺失 playwright 依赖及 1 个旧 Android 解析守卫发现新增 optional chaining；移除新增可选链并补 ResizeObserver 能力判断。一次字符串替换造成 s.const，立即语法检查发现并修正，未发布。按当前浏览器操作约束，界面实测统一使用 CUA，非浏览器驱动的 492 个 Node 文件最终 3780/3780、0 失败；不能把这称作全部浏览器测试绿色。最终玻璃/短信/Android 兼容/永久保护专项 746/746 通过，实际网页角色编辑进入/取消、电话草稿/加号菜单/返回及私人 HTML 同流程通过，没有发送消息或调用收费模型。 复用 theme-real-preview.html 增加隔离角色手机与电话信息预览，示例数据不写实际存档；首次示例 couple 为 null 导致初始化失败，修正空对象并加行为回归，常规预览不改变。私人入口曾读旧缓存，开发工具绕过本地旧缓存后当前源码正常，不修改生产更新流程。截图 .codex_tmp/eight-chat/role-phone-glass.jpg 与 phone-info-glass.jpg 分别保留两种实际新效果，旧主屏与调试配方证据保留，未造新目录或脚本。测试草稿已清空、临时私人标签页已关闭；既有 59656 完整预览服务和用户预览页保留。其他聊天的 delivery/SQL/测试/维护历史不覆盖、不暂存，Git 索引空、HEAD 仍 69a2e8a205b60a4a402ba3db0a06f0ab9486aaeb；没有推送、没有打包，历史唯一私人覆盖包不变。</ns0:t>
+      </ns0:r>
+    </ns0:p>
+    <ns0:p>
+      <ns0:r>
+        <ns0:t>2026-10-11 玻璃覆盖复查及私人后台到前台同步修复候选（未提交、未部署、未推送、未打包）：用户反馈关梯子后台连接报错，补充后台可生成显示、前台未同步。没有获得手机实际完整错误或当前版本；不能据此断定模型不通。代码确认前台同步仍直连原 qvu 独立云、没有受控替代传输；roleServerPushPull 原先把非数组/拒绝结果当空列表成功，网络失败又静默返回，且失败保留拉取节流时间。补严格收件数组校验、会话内前台同步错误提示、失败释放节流，成功再清提示；原保存消息/持久收件凭据/最后 ack 顺序、删除不复活、同一回执去重、场景占用与原生唤醒均保留，不造本地假消息。 复用既有 services/phone-license-relay Worker 在 /companion 下准备固定代理：无凭据 GET健康标记，10个原私人角色同步/交接RPC，唯一允许的 Edge action 为 task_status。固定转给原qvu项目，保留apikey/Authorization/owner secret/body与后端所有权校验，拒绝全局dispatch_due、shortcut_deliver、账户/备份/原生设备管控及任意上游/查询参数；没有service role。正文1MiB上限、上游与读取20秒超时、无Cookie/存储/缓存/正文或密钥日志、无未知写回执换路重试。客户端完整健康探测3.5秒上限并共享探测缓存，不可用保持原直连；公版North/非白名单管控继续原路。退后台keepalive只用已核验路线，不等待新探测；原cron加速直连不改，失败时原每分钟任务兜底。模型、Deno后台生成/APNs、Swift/签名/桥、独立账户/备份地址与用户密钥/存档都不改。代理将处理原有角色配置（含模型Key）与聊天上下文/鉴权，须明确发布授权，不把候选当已联网修复。 玻璃漏项：后加到head的style块没进入原body观察范围；改观察documentElement并在style插入/文本更新时重收集，保留已有link加载处理。电话圆形控制SVG玻璃底曾被一般SVG保护跳过；只纳入.phcallctl&gt;svg外观，保持矢量路径、图片消息、照片、开关/分类色块、红色挂断按钮与功能不变。实际主屏两页、设置、微信可见backdrop面检查未再发现未标记项；不是宣称逐个打开了全部软件/弹窗。 本地 Worker HEAD 基线私同步路径404、候选正确固定上游；鉴权/owner/Origin/体积/读取超时/重定向/非JSON/ACK只发一次测试通过。客户端网络恢复立即补拉、拒绝收件不能假成功、任务状态/交接消费者及探测体卡住有上限通过；尚无真实收费模型、通知或手机关闭梯子验证。一次全量仅旧private-phone-account守卫硬编码fetchT符号失败，按新受控传输保留原鉴权验证并修正断言后专项通过，未删防护。最近 785项关联专项通过；最终不含浏览器驱动的完整Node结果以固定full-tests.log为准，浏览器交互只用CUA。 本机DNS检查返回198.18段虚拟地址，不能当手机真实关闭代理网络的直连证明；本机HTTP响应也不代表移动网络可达。用户上一轮要求暂不推送/打包，本轮发布必须再获确认，旧私人包不会自动带入此修复。复用现有文档/脚本/工作树/固定日志与预览，无新临时目录、工作树、版本副本或安装包；其他聊天delivery诊断、SQL、测试及维护历史全部保留，不暂存，现有完整预览服务保留供用户操作。</ns0:t>
+      </ns0:r>
+    </ns0:p>
+    <ns0:p>
+      <ns0:r>
+        <ns0:t xml:space="preserve">2026-10-11 发布授权与最终验收：用户明确允许部署固定同步代理、推送并打包私人版，并本人完成Cloudflare登录。线上旧Worker 05dd1e47的去空白SHA256 176872aa98da5567b028cdc26095ab088bd08adfa7051cabcc166b078be43199与Git基线完全一致；编辑器粘贴后全文再核验，部署46720726 Active Latest。license.smallphoneapp.com/companion/health返回200和private-role-sync-relay-v1，官方Origin预检204；空owner400、全局dispatch_due403，未用真实密钥或调用模型/通知。Python默认UA先被Cloudflare1010拦截，标准浏览器UA检查成功；不能据此承诺手机所有网络可达。复用cloudflare-deployed.jpg保留本次线上凭据。网页版本1676、私人前台1677、原生iOS439/桥42不变。完整Node入口最终3842项中3788通过0失败54跳过；54个旧浏览器驱动用例按当前电脑交互约束不从CLI启动。原check_chat_authorized_phone.cjs同一实际buildSystem/myActivity/aiReply场景通过CUA CDP执行：网页和私人正常/缺可选航班组件，手动日程可见/参与开关/流式设置，锁定拒绝及明确全锁、旧图、角色独自机票失败/成功、通知手势及附近的人权限、8种查看权限/笔记/输出模式、手动回复/主动查看与保存后重开。仅HTTP模型受控；原生桥返回不可用测试值，不是收费模型或真机。字符串生成Node适配器被运行环境拒绝，改在自己的隔离本地浏览器执行原验收场景；Page.addScriptToEvaluateOnNewDocument不支持，私人fixture改加载后设置，不修改正式源码。版本升级曾触发旧版本号/标题断言，更新当前发布身份断言，行为断言未删除；最终0失败。打包复用既有脚本，只读Git提交，逐一核验原1675完整包manifest、原生/签名及私人独立伴生继承；不带其他聊天delivery诊断/好友SQL/继承CRLF测试。包种类是Mac-Xcode源码覆盖包，Mac签名编译、真实iPhone安装、用户主模型和关闭梯子移动网络仍待验收。</ns0:t>
       </ns0:r>
     </ns0:p>
     <ns0:sectPr ns0:rsidR="00FC693F" ns0:rsidRPr="0006063C" ns0:rsidSect="00034616">

</xml_diff>

<commit_message>
Pin role relay regression baseline and record private overlay delivery
</commit_message>
<xml_diff>
--- a/docs/maintenance/AI开发项目_Bug修改规范.docx
+++ b/docs/maintenance/AI开发项目_Bug修改规范.docx
@@ -13384,6 +13384,11 @@
     <ns0:p>
       <ns0:r>
         <ns0:t xml:space="preserve">2026-10-11 发布授权与最终验收：用户明确允许部署固定同步代理、推送并打包私人版，并本人完成Cloudflare登录。线上旧Worker 05dd1e47的去空白SHA256 176872aa98da5567b028cdc26095ab088bd08adfa7051cabcc166b078be43199与Git基线完全一致；编辑器粘贴后全文再核验，部署46720726 Active Latest。license.smallphoneapp.com/companion/health返回200和private-role-sync-relay-v1，官方Origin预检204；空owner400、全局dispatch_due403，未用真实密钥或调用模型/通知。Python默认UA先被Cloudflare1010拦截，标准浏览器UA检查成功；不能据此承诺手机所有网络可达。复用cloudflare-deployed.jpg保留本次线上凭据。网页版本1676、私人前台1677、原生iOS439/桥42不变。完整Node入口最终3842项中3788通过0失败54跳过；54个旧浏览器驱动用例按当前电脑交互约束不从CLI启动。原check_chat_authorized_phone.cjs同一实际buildSystem/myActivity/aiReply场景通过CUA CDP执行：网页和私人正常/缺可选航班组件，手动日程可见/参与开关/流式设置，锁定拒绝及明确全锁、旧图、角色独自机票失败/成功、通知手势及附近的人权限、8种查看权限/笔记/输出模式、手动回复/主动查看与保存后重开。仅HTTP模型受控；原生桥返回不可用测试值，不是收费模型或真机。字符串生成Node适配器被运行环境拒绝，改在自己的隔离本地浏览器执行原验收场景；Page.addScriptToEvaluateOnNewDocument不支持，私人fixture改加载后设置，不修改正式源码。版本升级曾触发旧版本号/标题断言，更新当前发布身份断言，行为断言未删除；最终0失败。打包复用既有脚本，只读Git提交，逐一核验原1675完整包manifest、原生/签名及私人独立伴生继承；不带其他聊天delivery诊断/好友SQL/继承CRLF测试。包种类是Mac-Xcode源码覆盖包，Mac签名编译、真实iPhone安装、用户主模型和关闭梯子移动网络仍待验收。</ns0:t>
+      </ns0:r>
+    </ns0:p>
+    <ns0:p>
+      <ns0:r>
+        <ns0:t xml:space="preserve">2026-10-11 交付结果与代理守卫修正：完整私人源码包最新私人版本覆盖包_v1677_iOS439.zip已从93d71cd8d1fbe82b890aa7beee3fc267b7c51ff7生成，189519137字节，1769文件/1768 manifest项，SHA256 ad7dcb0e25a9ce3f46ea150e717ac0d620ae7d86a924afb4a7605787d991d694；CRC、回读、1675旧包完整manifest和原生签名/桥42/1253小家资源继承通过。源码93d71cd8已推送，Pages工作流38093245661当时正在部署，在线最终字节另核验，不把推送当部署完成。提交后复查代理32项出现一项旧基线比较失败：测试使用HEAD，HEAD已经是修复版，导致期望404实际200；这是测试参考对象错误，正式代码未变。将旧基线固定到69a2e8a205b60a4a402ba3db0a06f0ab9486aaeb，复测32/32通过。维护DOCX原命名空间为ns0，首次w:sectPr假设校验拒绝写入；改从XML识别命名空间。首次TXT遍历意外含第四个启动文档，断言停止，改仅明确的三份维护文档；第四份未改。索引直接写入永久守卫的CRLF曾造成整文件diff，索引归一LF后只有9行新增，工作文件及另一个聊天的诊断保留不变。隔离59657浏览器数据库和local/sessionStorage已清除，标签页和验收服务器关闭；59656用户完整预览继续保留。版本唯一新交付包保留，未生成新脚本/目录/工作树；真实iPhone/关闭梯子移动网络仍需用户验收。</ns0:t>
       </ns0:r>
     </ns0:p>
     <ns0:sectPr ns0:rsidR="00FC693F" ns0:rsidRPr="0006063C" ns0:rsidSect="00034616">

</xml_diff>

<commit_message>
Apply revised glass recipe only to approved surfaces
Web v1678 and private runtime v1679; restore WeChat, settings and non-SMS phone appearance. Retain material offscreen and remove home widget text shadows. 3806 Node checks pass; 54 standalone browser-driver cases excluded under CUA constraints, with core web/private chat scenarios exercised through CUA. Preserve parallel delivery diagnostics and friend SQL. No private package generated.
</commit_message>
<xml_diff>
--- a/docs/maintenance/AI开发项目_Bug修改规范.docx
+++ b/docs/maintenance/AI开发项目_Bug修改规范.docx
@@ -13389,6 +13389,16 @@
     <ns0:p>
       <ns0:r>
         <ns0:t xml:space="preserve">2026-10-11 交付结果与代理守卫修正：完整私人源码包最新私人版本覆盖包_v1677_iOS439.zip已从93d71cd8d1fbe82b890aa7beee3fc267b7c51ff7生成，189519137字节，1769文件/1768 manifest项，SHA256 ad7dcb0e25a9ce3f46ea150e717ac0d620ae7d86a924afb4a7605787d991d694；CRC、回读、1675旧包完整manifest和原生签名/桥42/1253小家资源继承通过。源码93d71cd8已推送，Pages工作流38093245661当时正在部署，在线最终字节另核验，不把推送当部署完成。提交后复查代理32项出现一项旧基线比较失败：测试使用HEAD，HEAD已经是修复版，导致期望404实际200；这是测试参考对象错误，正式代码未变。将旧基线固定到69a2e8a205b60a4a402ba3db0a06f0ab9486aaeb，复测32/32通过。维护DOCX原命名空间为ns0，首次w:sectPr假设校验拒绝写入；改从XML识别命名空间。首次TXT遍历意外含第四个启动文档，断言停止，改仅明确的三份维护文档；第四份未改。索引直接写入永久守卫的CRLF曾造成整文件diff，索引归一LF后只有9行新增，工作文件及另一个聊天的诊断保留不变。隔离59657浏览器数据库和local/sessionStorage已清除，标签页和验收服务器关闭；59656用户完整预览继续保留。版本唯一新交付包保留，未生成新脚本/目录/工作树；真实iPhone/关闭梯子移动网络仍需用户验收。</ns0:t>
+      </ns0:r>
+    </ns0:p>
+    <ns0:p>
+      <ns0:r>
+        <ns0:t xml:space="preserve">2026-10-11 新玻璃配方与覆盖收窄（本地预览，未发布/未打包）：用户明确微信恢复原样、设置恢复原样，电话仅信息对话页保留，主屏/角色手机主页组件/线下使用新配方，其他未列明页面恢复原样。读取用户已保存 north-glass-lab-v1，savedAt=2026-10-10T23:25:16.783Z；完整22项保存至双端运行层与既有GL_HOME_RECIPE，变化为thickness1.9/inner1.3/outer0/highlight1.1/angle315/shadow0.5/bevel3，其余保持用户数值。NORTH_OPTICAL_SCOPE_V2使用容器白名单，拒绝微信/设置/非信息电话与SVG控件；原页面背景/照片/业务/私人桥与同步代理保持。NORTH_OPTICAL_TEXT_V2仅移除主屏玻璃组件的文字阴影，保留前景清晰。高光切换原因之一：运行层原来在元素离屏时restore成旧样式，再进入重新绘制；改为离屏保留材质，仅移除或退出批准范围时恢复，DOM替换在MutationObserver内完成装饰，避免等下一帧先显示旧高光。浏览器实测同一组件移出/返回均wallpaper，材质撤销次数0，文字阴影none；微信主列表/聊天/设置/电话主页面新材质数0，信息页7个。尚未真iPhone复验，不能保证消除所有WebKit合成闪动。专项117/117通过，包括范围行为与同步装饰回归。首次浏览器实测仍见旧覆盖，HTTP源码已是新代码但运行scopeVersion为undefined；隔离59657测试地址旧SW/3个缓存清除后scopeVersion2生效，没有清59656用户调参页或手机存档。既有59657服务复用，保留完整新效果预览供用户操作；调参页与已保存配方保持。未提交/推送/打包，本次不改已交付v1677包。复用现有工作区、文档、测试及截图；其他聊天delivery/SQL/维护内容全部保留。</ns0:t>
+      </ns0:r>
+    </ns0:p>
+    <ns0:p>
+      <ns0:r>
+        <ns0:t xml:space="preserve">2026-10-11 发布授权：用户要求先推送，不打包。网页v1678、私人共享运行源码v1679，iOS439/桥42不变；旧v1677私人包未更新。完整Node入口3806项通过、0失败；54个独立Playwright浏览器驱动用例因当前CUA操作约束未执行（未删除测试），核心真实buildSystem/myActivity/aiReply以CUA检查网页和私人入口8种查看权限/笔记/输出模式、手动回复、主动查看、存档恢复、锁定否定/明确全锁/思考标签、旧图、机票成功/失败、通知手势与附近的人权限。仅HTTP模型受控，无收费模型、Mac签名编译或iPhone实测。预览参数会重新播种部分状态，保存后重开验收去掉northPreview后通过；隔离预览曾命中旧SW导致版本不一致，清除59657测试缓存后新版本正常，没有清用户59656调参页或手机存档。维护中测试筛选首次未生效，修正为明确test-skip-pattern；旧Mac版本说明断言已同步当前身份，业务断言不删。仅提交本轮参数/范围/高光/前景文字及版本/测试/维护记录，其他聊天delivery诊断、好友SQL及11个CRLF现场不带入。</ns0:t>
       </ns0:r>
     </ns0:p>
     <ns0:sectPr ns0:rsidR="00FC693F" ns0:rsidRPr="0006063C" ns0:rsidSect="00034616">

</xml_diff>

<commit_message>
Restore album and calendar glass and reduce material repaint work
Web v1680 and private runtime v1681. Add independently configurable widget foreground, smaller heart and bright offline labels/parameter surfaces. Reuse sampled ink and resolved images, skip text-only repaint and preserve finished material during recovery. 3810 Node checks pass; core web/private reply scenarios verified through CUA, 54 standalone browser-driver cases excluded. Preserve parallel delivery diagnostics and friend SQL. No package or native changes.
</commit_message>
<xml_diff>
--- a/docs/maintenance/AI开发项目_Bug修改规范.docx
+++ b/docs/maintenance/AI开发项目_Bug修改规范.docx
@@ -13399,6 +13399,16 @@
     <ns0:p>
       <ns0:r>
         <ns0:t xml:space="preserve">2026-10-11 发布授权：用户要求先推送，不打包。网页v1678、私人共享运行源码v1679，iOS439/桥42不变；旧v1677私人包未更新。完整Node入口3806项通过、0失败；54个独立Playwright浏览器驱动用例因当前CUA操作约束未执行（未删除测试），核心真实buildSystem/myActivity/aiReply以CUA检查网页和私人入口8种查看权限/笔记/输出模式、手动回复、主动查看、存档恢复、锁定否定/明确全锁/思考标签、旧图、机票成功/失败、通知手势与附近的人权限。仅HTTP模型受控，无收费模型、Mac签名编译或iPhone实测。预览参数会重新播种部分状态，保存后重开验收去掉northPreview后通过；隔离预览曾命中旧SW导致版本不一致，清除59657测试缓存后新版本正常，没有清用户59656调参页或手机存档。维护中测试筛选首次未生效，修正为明确test-skip-pattern；旧Mac版本说明断言已同步当前身份，业务断言不删。仅提交本轮参数/范围/高光/前景文字及版本/测试/维护记录，其他聊天delivery诊断、好友SQL及11个CRLF现场不带入。</ns0:t>
+      </ns0:r>
+    </ns0:p>
+    <ns0:p>
+      <ns0:r>
+        <ns0:t xml:space="preserve">2026-10-11 玻璃范围补正、可调前景与线下性能（本地候选，未推送/未打包）：用户补正相册和日历仍用新22项参数；微信/通用设置/非信息电话恢复规则保留。主屏组件新增独立文字图标颜色与不透明度，默认白色100%、允许0%，按已有当前账号与图标包配置保存；实时只改CSS变量、不重建组件或照片，原恢复默认入口保留。心率爱心24缩至19。线下全部页面及从off/offline打开的设置弹窗亮白文字，参数input/select显式加入材质，原功能字段与路线选择逻辑不变，原生select弹出的系统选项仍受浏览器绘制限制。卡顿诊断确认原文本childList会触发全扫描、缓存命中仍重复采样getImageData、无背景大卡片fallback逐像素CPU计算，背景快照父层/过渡/图片暂不可用会影响稳定。改为忽略纯文字DOM更新、复用一次像素采样结果、复用已解码图、跳过已装饰祖先、主屏离屏预装饰、class切换同步装饰、现有快照在背景/WebGL短暂不可用时保留、contextlost不清已完成快照、材质只允许transform/opacity过渡；无图兼容材质用空心SVG细环，真实背景继续原22参数shader；快照采样改为1x，前景文字仍DOM。代码新增前景变量写入已做值比较，避免自身触发无穷重绘。753项关联专项通过；新回归覆盖0/100颜色、图标包隔离、已解码图复用、纯文字50次不重绘、空心环、批准范围与双端继承。回归mock首次缺getPropertyValue及元素matches，修正fixture未改业务断言。未修改模型请求、付费、聊天、角色状态、照片、存档、背景或原生桥；实际iPhone/WebKit仍需用户复验，不能用桌面通过宣称全部真机卡顿已消除。</ns0:t>
+      </ns0:r>
+    </ns0:p>
+    <ns0:p>
+      <ns0:r>
+        <ns0:t xml:space="preserve">2026-10-11 本轮推送授权与发布门禁：用户要求先推送，不打包。网页v1680、私人共享源码v1681；iOS439/桥42不变，旧v1677私人包不更新。关联753项及完整Node3810项通过、0失败；54个独立浏览器驱动用例受当前CUA约束未运行（测试未删除），核心发布门禁以CUA运行原实际buildSystem/myActivity/aiReply场景，双端8种权限/笔记/输出模式、手动回复、主动查看和保存重开通过；仅模型HTTP受控，不是收费模型或真机。原抖音守卫错误将主屏新增19px爱心识别为抖音19px按钮，已只排除wDashboard函数，抖音边栏/评论的正向行为断言完整保留。实际浏览器共同生活说明小字及6个select均白色、新材质；日历5面、相册12面覆盖；50次文字更新材质切换0、桌面测量8ms，不冒充真机FPS。新增回归验证旧HEAD50次文字更新触发50次绘制、新实现0。主屏19px爱心、白字、蓝色40%与恢复默认验证通过。其他聊天delivery/好友SQL/CRLF测试及维护历史不进入提交；本轮不生成新包或新脚本。</ns0:t>
       </ns0:r>
     </ns0:p>
     <ns0:sectPr ns0:rsidR="00FC693F" ns0:rsidRPr="0006063C" ns0:rsidSect="00034616">

</xml_diff>

<commit_message>
Restore wallpaper recognition and stop offline material scroll repaint
Web v1682 and private runtime v1683. Use semantic wallpaper class instead of brittle serialized-style matching. Reject background and scroll containers as optical surfaces, restrict targets, retain finished controls and use static no-GPU/no-backdrop offline material. Controlled 300-row scroll moves 2160px without material changes; 3814 Node checks pass and core web/private chat gates pass through CUA. iPhone performance remains unverified. Preserve parallel delivery diagnostics and friend SQL. No package or native changes.
</commit_message>
<xml_diff>
--- a/docs/maintenance/AI开发项目_Bug修改规范.docx
+++ b/docs/maintenance/AI开发项目_Bug修改规范.docx
@@ -13409,6 +13409,11 @@
     <ns0:p>
       <ns0:r>
         <ns0:t xml:space="preserve">2026-10-11 本轮推送授权与发布门禁：用户要求先推送，不打包。网页v1680、私人共享源码v1681；iOS439/桥42不变，旧v1677私人包不更新。关联753项及完整Node3810项通过、0失败；54个独立浏览器驱动用例受当前CUA约束未运行（测试未删除），核心发布门禁以CUA运行原实际buildSystem/myActivity/aiReply场景，双端8种权限/笔记/输出模式、手动回复、主动查看和保存重开通过；仅模型HTTP受控，不是收费模型或真机。原抖音守卫错误将主屏新增19px爱心识别为抖音19px按钮，已只排除wDashboard函数，抖音边栏/评论的正向行为断言完整保留。实际浏览器共同生活说明小字及6个select均白色、新材质；日历5面、相册12面覆盖；50次文字更新材质切换0、桌面测量8ms，不冒充真机FPS。新增回归验证旧HEAD50次文字更新触发50次绘制、新实现0。主屏19px爱心、白字、蓝色40%与恢复默认验证通过。其他聊天delivery/好友SQL/CRLF测试及维护历史不进入提交；本轮不生成新包或新脚本。</ns0:t>
+      </ns0:r>
+    </ns0:p>
+    <ns0:p>
+      <ns0:r>
+        <ns0:t xml:space="preserve">2026-10-11 v1680回归救急修复（网页1682/私人共享源码1683，不打包）：用户iPhone截图主屏黑底、组件仍有壁纸快照，且线下滑不动，说明上一轮桌面计数不足以证明手机性能。确认两个背景缺陷：1.新文字颜色CSS变量写入会让浏览器把background:url序列化为background: url，旧玻璃CSS用style字符串判断壁纸，错误激活!important黑默认背景；改为renderHome根据有效存档图生成has-home-wallpaper语义类，CSS与伪元素据此判断，取消字符串匹配。2.自动CSS发现与内联backdrop选择器可能把背景容器整体当玻璃；受控旧版主屏blur(1px)会变backdrop/SVG，新版根容器明确拒绝、名单只含小控件。完整3814项通过、0失败；旧壁纸伪元素断言更新为语义类，隔离上传/头像断言保留，旧自动发现断言改为禁止任意新增背景选择器，这是有意取消危险覆盖能力。性能方案改为静态轻量线下材质，保留22参数配方给主屏/角色/SMS/相册/日历，线下只保留参数边缘/着色，不做逐控件GPU背景快照、不启用嵌套实时backdrop；移除滚动监听，已装饰控件不重复读布局，新节点装饰一次，尺寸/显式刷新另处理。新回归根容器拒绝、滚动不排帧、20次新增节点变化不重复读取已有控件布局、空心细环与前景设置通过。浏览器实际壁纸保持URL、文字设置后仍可见、有模糊的根也不被覆盖；300条带背景共同生活记录可向上滚动2160px，材质style更新0、持续blur控件0、背景保留；这些是桌面受控结果，不是iPhone触控/FPS证据。原tab5被切至调参页，后续检查另开临时tab7，不改用户调参值，已关闭；只移除含fake.invalid的3条测试核心/恢复快照，未清玻璃配方/上传图片/用户59656或正式存档。双端原实际buildSystem/myActivity/aiReply门禁8种权限/笔记/输出模式、手动回复、主动查看、存档重开通过，只有模型HTTP受控；54个独立浏览器驱动例因CUA约束未执行，测试不删。保留白字/可调颜色透明度/小爱心及旧私人独立功能，原生iOS439/桥42、签名与旧v1677包不变。其他聊天delivery诊断、好友SQL、CRLF现场与维护历史不带入本提交。</ns0:t>
       </ns0:r>
     </ns0:p>
     <ns0:sectPr ns0:rsidR="00FC693F" ns0:rsidRPr="0006063C" ns0:rsidSect="00034616">

</xml_diff>

<commit_message>
Keep revised optical material only on home and flatten offline controls
Web v1684 and private runtime v1685. Restore non-home pages to prior appearance, remove offline glass effects, and retain home foreground controls and wallpaper guard. Permit actual widget cards carrying the drag-layout home-item class. 3816 Node checks pass; core web/private reply paths verified through CUA. Preserve parallel delivery diagnostics and friend SQL. No native changes or package.
</commit_message>
<xml_diff>
--- a/docs/maintenance/AI开发项目_Bug修改规范.docx
+++ b/docs/maintenance/AI开发项目_Bug修改规范.docx
@@ -13414,6 +13414,11 @@
     <ns0:p>
       <ns0:r>
         <ns0:t xml:space="preserve">2026-10-11 v1680回归救急修复（网页1682/私人共享源码1683，不打包）：用户iPhone截图主屏黑底、组件仍有壁纸快照，且线下滑不动，说明上一轮桌面计数不足以证明手机性能。确认两个背景缺陷：1.新文字颜色CSS变量写入会让浏览器把background:url序列化为background: url，旧玻璃CSS用style字符串判断壁纸，错误激活!important黑默认背景；改为renderHome根据有效存档图生成has-home-wallpaper语义类，CSS与伪元素据此判断，取消字符串匹配。2.自动CSS发现与内联backdrop选择器可能把背景容器整体当玻璃；受控旧版主屏blur(1px)会变backdrop/SVG，新版根容器明确拒绝、名单只含小控件。完整3814项通过、0失败；旧壁纸伪元素断言更新为语义类，隔离上传/头像断言保留，旧自动发现断言改为禁止任意新增背景选择器，这是有意取消危险覆盖能力。性能方案改为静态轻量线下材质，保留22参数配方给主屏/角色/SMS/相册/日历，线下只保留参数边缘/着色，不做逐控件GPU背景快照、不启用嵌套实时backdrop；移除滚动监听，已装饰控件不重复读布局，新节点装饰一次，尺寸/显式刷新另处理。新回归根容器拒绝、滚动不排帧、20次新增节点变化不重复读取已有控件布局、空心细环与前景设置通过。浏览器实际壁纸保持URL、文字设置后仍可见、有模糊的根也不被覆盖；300条带背景共同生活记录可向上滚动2160px，材质style更新0、持续blur控件0、背景保留；这些是桌面受控结果，不是iPhone触控/FPS证据。原tab5被切至调参页，后续检查另开临时tab7，不改用户调参值，已关闭；只移除含fake.invalid的3条测试核心/恢复快照，未清玻璃配方/上传图片/用户59656或正式存档。双端原实际buildSystem/myActivity/aiReply门禁8种权限/笔记/输出模式、手动回复、主动查看、存档重开通过，只有模型HTTP受控；54个独立浏览器驱动例因CUA约束未执行，测试不删。保留白字/可调颜色透明度/小爱心及旧私人独立功能，原生iOS439/桥42、签名与旧v1677包不变。其他聊天delivery诊断、好友SQL、CRLF现场与维护历史不带入本提交。</ns0:t>
+      </ns0:r>
+    </ns0:p>
+    <ns0:p>
+      <ns0:r>
+        <ns0:t xml:space="preserve">2026-10-11 用户收窄为仅主屏材质：网页1684/私人共享源码1685，不打包。只允许#homeDesktop内明确小控件接入新配方；线下所有旧/新玻璃的模糊、渐变、高光、阴影取消，控件为普通底色，背景图、亮白字体、参数/路线/聊天功能保留。角色手机、相册、日历、电话信息恢复原样，不再用这套光学运行层。主屏保留新参数、可调文字图标颜色/不透明度和19px爱心。实际浏览器初查发现三个主屏外层卡片带home-item拖拽类，被上轮根容器保护误排除，只有5内部小块和dock有材质；删除该过宽排除后三个外层、五内块、dock共9面均wallpaper，新行为回归保护真实复合类名；背景根仍不参与材质。共同生活新光学标记0，参数框blur/image/shadow均none、白字保留；相册和日历标记0。完整3816项通过、0失败，54个独立浏览器驱动例因CUA约束未运行，源码测试保留。原真实buildSystem/myActivity/aiReply门禁以CUA检查双端8种权限/笔记/输出模式、手动回复与主动查看；私人保存重开回复/笔记/流式设置通过；网页主动查看后保存重开流式设置通过，其当次fixture没有填OWN_NOTE，因此notes=false属fixture状态，未冒称网页该次已有笔记恢复。仅模型HTTP受控，未真机或收费模型。临时tab8关闭，只清含fake.invalid的3条本轮测试核心/恢复快照，玻璃配方/图片/用户页面不清；原用户调参页保留。原生iOS439/桥42、签名与旧v1677包不变；其他聊天delivery/好友SQL/CRLF及维护历史不带入本轮提交。</ns0:t>
       </ns0:r>
     </ns0:p>
     <ns0:sectPr ns0:rsidR="00FC693F" ns0:rsidRPr="0006063C" ns0:rsidSect="00034616">

</xml_diff>

<commit_message>
Restore only legacy glass material and preserve all current non-material features
</commit_message>
<xml_diff>
--- a/docs/maintenance/AI开发项目_Bug修改规范.docx
+++ b/docs/maintenance/AI开发项目_Bug修改规范.docx
@@ -13429,6 +13429,11 @@
     <w:p>
       <w:r>
         <w:t>回退验收：运行文件逐字节匹配40695a1a（网页1676/私人1677），两端语法与暂存diff检查通过；完整Node源码回归3802通过、0失败，54个独立浏览器驱动例未执行，原测试保留。CUA独立测试页双端各8种权限/笔记/输出模式真实buildSystem/myActivity/aiReply均通过，只有模型HTTP受控；主动查看、保存重开回复和OWN_NOTE笔记通过。私人首次复验受测试浏览器旧资源缓存影响启动失败，清测试59657的SW/CacheStorage、不清存档后重新加载通过，正式数据不碰。只移除含fake.invalid的本轮测试快照并关闭测试tab9。v1677既有覆盖包CRC通过、SHA256 ad7dcb0e25a9ce3f46ea150e717ac0d620ae7d86a924afb4a7605787d991d694；不重复打包，无本轮Mac/iPhone安装验收。待推送及线上逐字核对。</w:t>
+      </w:r>
+    </w:p>
+    <w:p>
+      <w:r>
+        <w:t>2026-10-11 材质回退范围纠正：用户只要求恢复原材质，先前8c58f972整版回退属于误解，随后一次本地恢复被停止且未发布；用户明确要求修好直接推送。此次网页1686/私人共享源码1687，以误回退前5d41c5f0为非材质基线，原材质配方/样式从40695a1a（网页1676/私人1677）恢复。两份app.js光学模块之前的全部非材质代码与5d41c5f0在仅版本/副标题归一后逐字一致，保留组件文字颜色/透明度设置、19px爱心、线下白字、语义壁纸显示修复、后台同步及其他既有功能；材质层另保留背景根容器禁止捕获，防止旧材质误覆盖壁纸。不改数据、收费模型、原生签名/桥/iOS、后台或其他聊天。完整源码回归3806通过0失败，54个独立浏览器驱动例因CUA约束未执行、测试保留；首轮34失败均为版本副标题断言未同步，修正发布标记断言后通过，未弱化业务行为检查。双端各8种权限/笔记/输出模式实际buildSystem/myActivity/aiReply通过，模型HTTP受控；主动查看、保存重开OWN_NOTE/回复通过。私人测试资源混用导致启动失败，清59657测试资源缓存保留存档后通过；未清正式缓存/用户数据。既有v1677包不代表此新修正版，本次只推送不打包，无Mac或真机验收。</w:t>
       </w:r>
     </w:p>
     <w:sectPr>

</xml_diff>

<commit_message>
Restore complete public web v1674 while leaving private release unchanged
</commit_message>
<xml_diff>
--- a/docs/maintenance/AI开发项目_Bug修改规范.docx
+++ b/docs/maintenance/AI开发项目_Bug修改规范.docx
@@ -13434,6 +13434,11 @@
     <w:p>
       <w:r>
         <w:t>2026-10-11 材质回退范围纠正：用户只要求恢复原材质，先前8c58f972整版回退属于误解，随后一次本地恢复被停止且未发布；用户明确要求修好直接推送。此次网页1686/私人共享源码1687，以误回退前5d41c5f0为非材质基线，原材质配方/样式从40695a1a（网页1676/私人1677）恢复。两份app.js光学模块之前的全部非材质代码与5d41c5f0在仅版本/副标题归一后逐字一致，保留组件文字颜色/透明度设置、19px爱心、线下白字、语义壁纸显示修复、后台同步及其他既有功能；材质层另保留背景根容器禁止捕获，防止旧材质误覆盖壁纸。不改数据、收费模型、原生签名/桥/iOS、后台或其他聊天。完整源码回归3806通过0失败，54个独立浏览器驱动例因CUA约束未执行、测试保留；首轮34失败均为版本副标题断言未同步，修正发布标记断言后通过，未弱化业务行为检查。双端各8种权限/笔记/输出模式实际buildSystem/myActivity/aiReply通过，模型HTTP受控；主动查看、保存重开OWN_NOTE/回复通过。私人测试资源混用导致启动失败，清59657测试资源缓存保留存档后通过；未清正式缓存/用户数据。既有v1677包不代表此新修正版，本次只推送不打包，无Mac或真机验收。</w:t>
+      </w:r>
+    </w:p>
+    <w:p>
+      <w:r>
+        <w:t>2026-10-11 用户要求直接回退网页版1674，私人版不动。先前错误把1676当原材质基线，但1676本身已引入光学材质，所以1686改回1676配方仍不能达到用户要求；用户现场反馈外观没有恢复。此次8个网页运行/壳/缓存/预览文件完整逐字节恢复3cb33fac（网页1674），明确不保留网页后续新光学模块、配方和前景改动，不修改私人1687、原生iOS439/桥42、后台代理/独立服务、存档或密钥。实际CUA页面APP_VER为1674，NorthOpticalGlass为undefined、data-north-optical数量0；8组合权限/笔记/原文真实buildSystem/myActivity/aiReply、主动查看、保存重开OWN_NOTE和回复通过，仅HTTP模型受控。源码完整3784通过0失败，54个独立浏览器驱动例因CUA约束未执行，测试保留。网页版和私人版此次有意不同，旧强制逐字相同测试改为分别对不可变3cb33fac/c13ef80b基线检查，保留原功能行为断言；首次基线读取超出Node默认缓冲与CRLF夹具末尾差异已修正，不改业务。此前Douyin全局19px爱心检查误抓私人dashboard19px，仅排除独立wDashboard，抖音三个正向断言保留。保护其他聊天delivery诊断、好友SQL、11行尾现场和维护历史，仅移除59657含fake.invalid的本轮测试快照并关闭tab11。仅推送网页，不打包，无Mac/真机验收。</w:t>
       </w:r>
     </w:p>
     <w:sectPr>

</xml_diff>

<commit_message>
Restore scoped UI features and retire role sync relay without optical material
</commit_message>
<xml_diff>
--- a/docs/maintenance/AI开发项目_Bug修改规范.docx
+++ b/docs/maintenance/AI开发项目_Bug修改规范.docx
@@ -13439,6 +13439,16 @@
     <w:p>
       <w:r>
         <w:t>2026-10-11 用户要求直接回退网页版1674，私人版不动。先前错误把1676当原材质基线，但1676本身已引入光学材质，所以1686改回1676配方仍不能达到用户要求；用户现场反馈外观没有恢复。此次8个网页运行/壳/缓存/预览文件完整逐字节恢复3cb33fac（网页1674），明确不保留网页后续新光学模块、配方和前景改动，不修改私人1687、原生iOS439/桥42、后台代理/独立服务、存档或密钥。实际CUA页面APP_VER为1674，NorthOpticalGlass为undefined、data-north-optical数量0；8组合权限/笔记/原文真实buildSystem/myActivity/aiReply、主动查看、保存重开OWN_NOTE和回复通过，仅HTTP模型受控。源码完整3784通过0失败，54个独立浏览器驱动例因CUA约束未执行，测试保留。网页版和私人版此次有意不同，旧强制逐字相同测试改为分别对不可变3cb33fac/c13ef80b基线检查，保留原功能行为断言；首次基线读取超出Node默认缓冲与CRLF夹具末尾差异已修正，不改业务。此前Douyin全局19px爱心检查误抓私人dashboard19px，仅排除独立wDashboard，抖音三个正向断言保留。保护其他聊天delivery诊断、好友SQL、11行尾现场和维护历史，仅移除59657含fake.invalid的本轮测试快照并关闭tab11。仅推送网页，不打包，无Mac/真机验收。</w:t>
+      </w:r>
+    </w:p>
+    <w:p>
+      <w:r>
+        <w:t xml:space="preserve">2026-10-11 网页v1688 / 私人共享源码v1689：按用户限定范围恢复微信左滑“不显示该聊天”（联系人和聊天内容保留、新消息重新显示、身份隔离）、共同生活正文下无气泡续句箭头（仅待续时显示）、19px小爱心和默认亮白的可调组件文字。线下参数框与小气泡使用轻量透明底，所有线下文字亮白；不改变组件或聊天背景图片，不为网页重新启用光学渲染。私人同步去掉v1677代理探测及转发，改走配置的原独立后台，保留收件入库/确认顺序与失败处理。Cloudflare north-license-connectivity 已发布c26a0d51，仅/companion/返回410；/health实测200，好友/语音路由保留。Node完整3813项通过，新增直连后台回归通过；网页及私人源码各8组核心聊天、自动查看手机、存档重载通过。HTTP模型为测试响应，未验证真实模型、Mac构建和iPhone。只推送，不打包；原生iOS439/桥42及旧私人包不改。</w:t>
+      </w:r>
+    </w:p>
+    <w:p>
+      <w:r>
+        <w:t xml:space="preserve">本轮复核纠正：用户指出私人微信截图混入旧实验材质。确认残留位于私人app末尾的光学渲染IIFE及专属CSS，现已整体删除，未更改微信业务和原有v1674视觉规则。线下小框仅透明底、无新增高光或阴影；网页及私人端均无NorthOpticalGlass和data-north-optical覆盖。保留字体调色、19px爱心、隐藏聊天与无气泡箭头。重新检查启动及私人8组核心聊天回归；完整Node测试3815项通过、0失败。仍仅推送，不打包。</w:t>
       </w:r>
     </w:p>
     <w:sectPr>

</xml_diff>

<commit_message>
Prepare complete private v1689 overlay with material and relay retirement checks
</commit_message>
<xml_diff>
--- a/docs/maintenance/AI开发项目_Bug修改规范.docx
+++ b/docs/maintenance/AI开发项目_Bug修改规范.docx
@@ -13449,6 +13449,11 @@
     <w:p>
       <w:r>
         <w:t xml:space="preserve">本轮复核纠正：用户指出私人微信截图混入旧实验材质。确认残留位于私人app末尾的光学渲染IIFE及专属CSS，现已整体删除，未更改微信业务和原有v1674视觉规则。线下小框仅透明底、无新增高光或阴影；网页及私人端均无NorthOpticalGlass和data-north-optical覆盖。保留字体调色、19px爱心、隐藏聊天与无气泡箭头。重新检查启动及私人8组核心聊天回归；完整Node测试3815项通过、0失败。仍仅推送，不打包。</w:t>
+      </w:r>
+    </w:p>
+    <w:p>
+      <w:r>
+        <w:t xml:space="preserve">2026-10-11 用户授权完整私人打包：v1689/iOS439/桥42，运行资源固定为已验收提交1a81f164057a12df75b3b275aa822f787c55cce8（网页v1688）。复用既有打包脚本并从提交读取；v1677完整旧包作继承基线。增加光学材质和后台代理负向检查，保留字体、透明控件、小爱心、隐藏聊天、无气泡箭头及既有日历/外卖/角色修复；原生/签名/私人伴生及1253小家资源保留。打包前完整源码1767文件验证通过。ZIP必须再次逐文件对照提交、校验manifest与解压回读；这是Mac/Xcode源码覆盖包，Mac编译、签名及真实iPhone验收仍未完成。</w:t>
       </w:r>
     </w:p>
     <w:sectPr>

</xml_diff>

<commit_message>
Use batch object reads for complete private package comparison on Windows
</commit_message>
<xml_diff>
--- a/docs/maintenance/AI开发项目_Bug修改规范.docx
+++ b/docs/maintenance/AI开发项目_Bug修改规范.docx
@@ -13454,6 +13454,11 @@
     <w:p>
       <w:r>
         <w:t xml:space="preserve">2026-10-11 用户授权完整私人打包：v1689/iOS439/桥42，运行资源固定为已验收提交1a81f164057a12df75b3b275aa822f787c55cce8（网页v1688）。复用既有打包脚本并从提交读取；v1677完整旧包作继承基线。增加光学材质和后台代理负向检查，保留字体、透明控件、小爱心、隐藏聊天、无气泡箭头及既有日历/外卖/角色修复；原生/签名/私人伴生及1253小家资源保留。打包前完整源码1767文件验证通过。ZIP必须再次逐文件对照提交、校验manifest与解压回读；这是Mac/Xcode源码覆盖包，Mac编译、签名及真实iPhone验收仍未完成。</w:t>
+      </w:r>
+    </w:p>
+    <w:p>
+      <w:r>
+        <w:t xml:space="preserve">v1689打包工具复核：逐个git show核对小家深层文件时遇到Windows路径长度限制，打包在写ZIP前停止。改为既有git cat-file --batch读取准确提交的全部对象，再逐文件比较字节；未改应用源码、签名、资源路径或继承要求。长路径检查不再依赖工作区文件系统，也不放宽校验。</w:t>
       </w:r>
     </w:p>
     <w:sectPr>

</xml_diff>

<commit_message>
Fix private inbox delivery with bounded reads and scoped message transport
</commit_message>
<xml_diff>
--- a/docs/maintenance/AI开发项目_Bug修改规范.docx
+++ b/docs/maintenance/AI开发项目_Bug修改规范.docx
@@ -13459,6 +13459,16 @@
     <w:p>
       <w:r>
         <w:t xml:space="preserve">v1689打包工具复核：逐个git show核对小家深层文件时遇到Windows路径长度限制，打包在写ZIP前停止。改为既有git cat-file --batch读取准确提交的全部对象，再逐文件比较字节；未改应用源码、签名、资源路径或继承要求。长路径检查不再依赖工作区文件系统，也不放宽校验。</w:t>
+      </w:r>
+    </w:p>
+    <w:p>
+      <w:r>
+        <w:t xml:space="preserve">2026-10-11 私人v1691后台收件修复（网页仍v1688）：用户v1689开着梯子仍提示“后台链路已接通，前台同步暂未完成：独立云暂时无法连接”。安全匿名探测原独立云收件/状态RPC可达，不能证明该用户实收。受控测试复现响应头已到但正文卡住，以及设备控制权核验挂起拖住收件。修复仅收件/状态/确认的完整响应限时与限时核验，服务器仍核验原设备owner；不影响其他设备写命令。用户已明确授权部署、发布并重新打包独立收件入口。Worker生产4d054a59，/role-inbox/v1/仅允许pull/ack/status，/companion/仍410，模型Key/角色资料/设备命令禁止经该入口；同原独立云转发，不记录正文和密钥。收件优先稳定入口、原地址后备，每次至多两个请求；成功通道按设备/owner短期记忆，其他项目不转发，401/403不换通道。保留消息先落盘再确认、回执去重、角色归属、账号切换不误入新身份，补微信列表即时刷新。材质文件未改，光学渲染仍移除。Node3823项0失败，私人8组真实buildSystem/myActivity聊天回归通过，模拟HTTP；实时探测仅验证入口、拒绝上传和旧代理停用，不冒充用户iPhone实收。iOS439/桥42不变，需新完整覆盖包Mac编译安装后手机复验。</w:t>
+      </w:r>
+    </w:p>
+    <w:p>
+      <w:r>
+        <w:t xml:space="preserve">v1691最终复核：收件入口优先新窄范围通道，原独立云作为后备，成功通道缓存不跨设备owner。3秒控制权核验等待只用于收件/状态/确认，服务器仍校验原owner；其他设备写命令完整等待原核验。正文响应超时也保留401/403拒绝状态，不能因正文卡住改道绕过鉴权；204空确认不重复请求。完整Node3824项0失败，私人8组聊天、手动回复、自动查看手机和存档重载通过，时间边界及权限撤销复核通过；模型HTTP模拟，未真实iPhone实收。线上Worker4d054a59已由用户授权启用，旧代理仍410。</w:t>
       </w:r>
     </w:p>
     <w:sectPr>

</xml_diff>

<commit_message>
Add natural per-message WeChat motion and delayed read display
</commit_message>
<xml_diff>
--- a/docs/maintenance/AI开发项目_Bug修改规范.docx
+++ b/docs/maintenance/AI开发项目_Bug修改规范.docx
@@ -13469,6 +13469,66 @@
     <w:p>
       <w:r>
         <w:t xml:space="preserve">v1691最终复核：收件入口优先新窄范围通道，原独立云作为后备，成功通道缓存不跨设备owner。3秒控制权核验等待只用于收件/状态/确认，服务器仍校验原owner；其他设备写命令完整等待原核验。正文响应超时也保留401/403拒绝状态，不能因正文卡住改道绕过鉴权；204空确认不重复请求。完整Node3824项0失败，私人8组聊天、手动回复、自动查看手机和存档重载通过，时间边界及权限撤销复核通过；模型HTTP模拟，未真实iPhone实收。线上Worker4d054a59已由用户授权启用，旧代理仍410。</w:t>
+      </w:r>
+    </w:p>
+    <w:p>
+      <w:r>
+        <w:t xml:space="preserve">2026-10-11 微信动画参数预览 本地未发布</w:t>
+      </w:r>
+    </w:p>
+    <w:p>
+      <w:r>
+        <w:t xml:space="preserve">复用 theme-real-preview.html?motion=wechat 和既有59656服务，保留原14种主题预览。独立演示22项数值参数及黑白外观、入场曲线、动画开关；发送气泡与头像分开入场，聊天滚动按可调减速曲线，已读在演示实际状态成立后延迟逐字渐显，时间延迟渐显。用户明确未读不显示文字，空白表示未读。演示不发送请求、不调用模型、不读写正式小手机存档；参数单独存north-wechat-motion-lab-v1。支持重播、模拟已读/收件、保存刷新恢复、重置及JSON导入导出，坏JSON保留参数，范围钳位保留0。向上查看历史时收到消息不抢滚动，滚动输入中止自动上推。</w:t>
+      </w:r>
+    </w:p>
+    <w:p>
+      <w:r>
+        <w:t xml:space="preserve">CUA核验22项控件、发送未读空白、已读等待阶段空白、保存1800ms刷新恢复、坏JSON保护和恢复默认通过；脚本语法通过。首次字段索引写错造成默认数值/范围错误，浏览器发现后修正，未发布。只修改预览与追加维护TXT记录；DOCX尚未同步，正式app.js/私人bundle/后台/版本未改。截图固定为.codex_tmp/eight-chat/wechat-motion-lab.jpg，独立演示布局不是正式微信/iPhone效果验收；用户选定参数后再应用正式页面。无提交、推送或打包；受保护22项现场保留，无新的脚本、目录、工作树、源码副本或安装包。</w:t>
+      </w:r>
+    </w:p>
+    <w:p>
+      <w:r>
+        <w:t xml:space="preserve"/>
+      </w:r>
+    </w:p>
+    <w:p>
+      <w:r>
+        <w:t xml:space="preserve">2026-10-11 微信动画调参左右布局：用户要求参数始终在预览右侧。仅追加预览CSS：固定视口内左右两栏，左侧聊天及操作始终可见，右侧参数独立滚动，窄侧栏也保持左右排列。当前调参页通过CDP样式热更新，无刷新；更新前后44个输入值完全一致。右侧实际滚动1326px后，左侧顶部仍91.39px，window.scrollY=0；截图复用wechat-motion-lab.jpg。没有修改正式微信、提交、推送、打包或新增临时文件。</w:t>
+      </w:r>
+    </w:p>
+    <w:p>
+      <w:r>
+        <w:t xml:space="preserve"/>
+      </w:r>
+    </w:p>
+    <w:p>
+      <w:r>
+        <w:t xml:space="preserve">2026-10-11 微信动画已读按条计时：用户接受其他默认参数，明确对方每条消息出现后各等两秒显示已读，禁止一批同时已读。预览readDelay默认改2000ms；每条新收到消息建立自己的定时器，未读留白，渐显和字间隔保持。模拟实际已读只作用于最新未标记的发送消息，不批量修改历史；重播连续三条回复相隔800ms。CUA实测三条已读显示时刻相隔801ms、799ms，与各自截止时间相差1至5ms；原参数保留，仅已读等待改2000。脚本语法及diff检查通过。只更新本地预览和维护TXT，正式微信/原生/后台未修改，无提交、推送、打包；截图复用固定wechat-motion-lab.jpg，无新临时文件。</w:t>
+      </w:r>
+    </w:p>
+    <w:p>
+      <w:r>
+        <w:t xml:space="preserve"/>
+      </w:r>
+    </w:p>
+    <w:p>
+      <w:r>
+        <w:t xml:space="preserve">2026-10-11 网页v1692 私人共享源码v1693 微信自然消息动画</w:t>
+      </w:r>
+    </w:p>
+    <w:p>
+      <w:r>
+        <w:t xml:space="preserve">用户确认演示参数并授权推送，不打包。气泡420ms/12px/97%，头像80ms延迟/520ms/6px/94%，聊天580ms减速上推/底部18px/间距12px，时间220ms延迟/600ms/5px。每条消息独立两秒已读等待，再700ms渐显/4px/字间90ms；未读留白。计时按身份、会话及消息ID隔离，重绘不重启，历史已读不重播，页面恢复可见继续显示；真人好友读人数仍依据原回执，未知发送状态不改。只改微信展示，不改后台/ACK/存档/模型/原生/签名。</w:t>
+      </w:r>
+    </w:p>
+    <w:p>
+      <w:r>
+        <w:t xml:space="preserve">正式页面三条回复相隔800ms，已读分别在2005/2007/2006ms出现，中途重绘不并批。发送抓到滚动中间位置561.78px（目标649px）；上翻历史后新消息保持top0，草稿保留。双端正常聊天各八组权限/笔记/输出模式、手动与自动查看及存档恢复门禁通过，pageErrors0；HTTP模型受控。专项655/655；完整Node3851/3851、0失败、0跳过，含浏览器驱动场景。初次49项版本/入口/换行断言失败，精准更新身份、入口缓存及LF后通过，业务断言不删。新计时回归先在旧实现失败，后双端通过。</w:t>
+      </w:r>
+    </w:p>
+    <w:p>
+      <w:r>
+        <w:t xml:space="preserve">网页v1692；私人源码v1693，iOS439/桥42不变。最近私人包仍v1691，本轮不Mac编译/签名/打包，不称手机自动更新或真机已验。只提交本轮，排除另一个聊天delivery两文件、好友SQL/测试、永久保护中的被动诊断及其文档增补。维护TXT/DOCX追加本轮记录，保护独有历史。复用预览、固定日志与截图，无新脚本、目录、工作树、源副本，无收费模型或真实消息发送。</w:t>
       </w:r>
     </w:p>
     <w:sectPr>

</xml_diff>

<commit_message>
Fix WeChat message animation flashes on acknowledgement and redraw
</commit_message>
<xml_diff>
--- a/docs/maintenance/AI开发项目_Bug修改规范.docx
+++ b/docs/maintenance/AI开发项目_Bug修改规范.docx
@@ -13529,6 +13529,26 @@
     <w:p>
       <w:r>
         <w:t xml:space="preserve">网页v1692；私人源码v1693，iOS439/桥42不变。最近私人包仍v1691，本轮不Mac编译/签名/打包，不称手机自动更新或真机已验。只提交本轮，排除另一个聊天delivery两文件、好友SQL/测试、永久保护中的被动诊断及其文档增补。维护TXT/DOCX追加本轮记录，保护独有历史。复用预览、固定日志与截图，无新脚本、目录、工作树、源副本，无收费模型或真实消息发送。</w:t>
+      </w:r>
+    </w:p>
+    <w:p>
+      <w:r>
+        <w:t>2026-10-11 微信发送后头像和气泡闪动 本地修复未发布</w:t>
+      </w:r>
+    </w:p>
+    <w:p>
+      <w:r>
+        <w:t>真人好友及真人群发送成功后临时ID换成服务器ID，原动画扫描会误判为新消息；角色及群聊在入场期间重绘会替换DOM并丢失动画进度。双端源码增加独立展示身份（优先原_clientSendId），保留实际消息ID、菜单及回执；替换节点继承原Web Animation.currentTime，完成的动画不重播，原每条两秒已读及滚动参数保留。四条消费者：角色单聊/角色群聊/真人好友/真人群聊。先在旧实现验证四项失败；修复后双端定向11项含真实Edge四路径连续性通过。最初使用墙钟估算进度有跳变，浏览器暴露后改为继承真实动画时间。永久门禁639通过；双端原buildSystem/myActivity八组权限/笔记/输出模式、手动及自动查看、持久化门禁通过，页面错误0，模型HTTP受控。完整Node回归3856通过、0失败、0跳过（108.2秒）；新增永久保护条目另跑639全部通过。没有推送、打包、Mac编译或iPhone复验；原生键盘问题本轮不处理，受保护其他聊天现场保留。</w:t>
+      </w:r>
+    </w:p>
+    <w:p>
+      <w:r>
+        <w:t>2026-10-11 用户授权推送本次闪动修复：网页v1694 / 私人共享源码v1695，iOS439/桥42不变。保留逐条两秒已读与原参数；不打包，最近交付私人包仍v1691。提交排除其他聊天delivery、好友SQL/回归及其维护记录。发布验收以本次完整测试、聊天核心门禁、Pages工作流及线上字节核对为准；真实iPhone尚未复验。</w:t>
+      </w:r>
+    </w:p>
+    <w:p>
+      <w:r>
+        <w:t>2026-10-11 v1694/v1695 发布前最终复核：完整Node3857通过、0失败、0跳过（109.1秒）；定向650通过；网页与私人各八组实际聊天核心门禁通过，pageErrors0。初次完整回归仅版本副标题断言未同步，修正当前标题后全量通过，业务断言保留。</w:t>
       </w:r>
     </w:p>
     <w:sectPr>

</xml_diff>

<commit_message>
Preserve WeChat timestamp and read receipt animation progress
</commit_message>
<xml_diff>
--- a/docs/maintenance/AI开发项目_Bug修改规范.docx
+++ b/docs/maintenance/AI开发项目_Bug修改规范.docx
@@ -13549,6 +13549,26 @@
     <w:p>
       <w:r>
         <w:t>2026-10-11 v1694/v1695 发布前最终复核：完整Node3857通过、0失败、0跳过（109.1秒）；定向650通过；网页与私人各八组实际聊天核心门禁通过，pageErrors0。初次完整回归仅版本副标题断言未同步，修正当前标题后全量通过，业务断言保留。</w:t>
+      </w:r>
+    </w:p>
+    <w:p>
+      <w:r>
+        <w:t>2026-10-11 真人好友时间标签重播及已读渐显中断 本地修复未发布</w:t>
+      </w:r>
+    </w:p>
+    <w:p>
+      <w:r>
+        <w:t>用户反馈头像已不重播，但真人好友时间仍闪动，询问已读。浏览器先复现：时间使用服务器消息ID导致ACK换ID重播；单独修时间后，回归继续证明已读渐显中重绘会跳至完整文字，而非重新等待两秒。双端时间记录由Set改Map，按相邻消息稳定展示身份记忆并继承原动画currentTime；服务器修正时间文字可正常更新，动画不重启。已读保存显示时刻及每字动画，替换节点继承每字原进度，完成后不再播放；重复扫描同节点不重建字，逐条原两秒截止时间与真实回执保持。角色单聊、角色群聊、真人好友、真人群聊共享路径均保留，账号/会话隔离不变。定向651通过；新增永久保护另跑640通过；网页和私人实际buildSystem/myActivity八组权限/笔记/输出模式、手动和自动查看及持久化门禁通过，pageErrors0，模型HTTP受控。完整Node3858通过、0失败、0跳过（107.8秒），新增永久条目另跑640通过。无提交、推送、打包、Mac编译或真实iPhone复验；当前线上仍网页v1694/私人源码v1695，其他聊天改动全部保留。</w:t>
+      </w:r>
+    </w:p>
+    <w:p>
+      <w:r>
+        <w:t>2026-10-11 用户授权推送时间/已读动画补修：网页v1696、私人共享源码v1697，iOS439/桥42不变。不打包；最近交付私人包仍v1691，真实iPhone未复验。提交排除其他聊天delivery、好友SQL/测试及其维护增补，发布结果以本次最终检查为准。</w:t>
+      </w:r>
+    </w:p>
+    <w:p>
+      <w:r>
+        <w:t>2026-10-11 v1696/v1697最终发布门禁：完整Node3859通过、0失败、0跳过（115.4秒）；网页和私人原实际聊天核心门禁各八组通过，pageErrors0。时间ACK换编号、已读渐显中重绘、播完后刷新不重播的浏览器回归通过；模型HTTP受控，未真实iPhone验收。</w:t>
       </w:r>
     </w:p>
     <w:sectPr>

</xml_diff>

<commit_message>
Unify natural motion across small phone chat surfaces
</commit_message>
<xml_diff>
--- a/docs/maintenance/AI开发项目_Bug修改规范.docx
+++ b/docs/maintenance/AI开发项目_Bug修改规范.docx
@@ -13569,6 +13569,31 @@
     <w:p>
       <w:r>
         <w:t>2026-10-11 v1696/v1697最终发布门禁：完整Node3859通过、0失败、0跳过（115.4秒）；网页和私人原实际聊天核心门禁各八组通过，pageErrors0。时间ACK换编号、已读渐显中重绘、播完后刷新不重播的浏览器回归通过；模型HTTP受控，未真实iPhone验收。</w:t>
+      </w:r>
+    </w:p>
+    <w:p>
+      <w:r>
+        <w:t>2026-10-11 全部气泡聊天统一自然呈现 本地未发布</w:t>
+      </w:r>
+    </w:p>
+    <w:p>
+      <w:r>
+        <w:t>用户确认微信效果，授权将小手机电话、音乐、抖音、登录角色微信、线下约会、共同生活及其他气泡聊天和旁白统一为自然呈现，明确放映室排除。双端复用已验收420ms/12px/97%气泡、80ms延迟/520ms头像、580ms减速滚动和原时间/已读进度记忆。白名单包含原四种微信、角色登录/查看微信、抖音私信及群聊、X私信、短信/iMessage、线下约会/共同生活、角色扮演、沙盒角色对话、多人小剧场、常规游戏、监禁/恐怖/规则怪谈、商城客服；动态气泡及旁白按模型现有ID或已有时间/内容生成展示键，不写入存档。新消息才入场，重绘继承进度，已播完不重播；上翻历史不抢底部，键鼠触摸取消自动滚动。其他场景沿用原布局，不套微信气泡间距/底部留白；已读只保留原本存在的真实回执，不新增其他场景已读。线下旧逐字offglyph动画仅在新呈现容器内关闭，用完整旁白自然入场，原回复内容、揭示流程/等待/语音节奏不改。音乐和电话单句采用同420ms入场，音乐消失时间/播放、电话字幕上屏与声音同步及原生PiP载荷保持；PiP仅呈现参数改420/12/.97，无原生/签名编辑。放映室渲染和播放/聊天逻辑不改。</w:t>
+      </w:r>
+    </w:p>
+    <w:p>
+      <w:r>
+        <w:t>新浏览器回归先在HEAD旧实现失败（线下旁白没有自然入场），新实现30个双端容器场景验证新增入场/中途重绘续播/结束后不重播/放映室排除/电话音乐单句续播通过；实际双端页面渲染验证线下、共同生活、角色扮演、抖音、X、角色微信、短信、客服、游戏、音乐和电话，无页面错误。原微信12项含真人ACK/时间/已读续播通过。初次完整测试一项旧旁白源码格式断言失败，展示键改放在class后保留原选择器与模板，未删除业务断言；测试初版.msg夹具缺少实际.col，被验证发现并纠正夹具。双端原实际buildSystem/myActivity聊天核心各八组权限/笔记/输出模式、手动与自动查看及持久化门禁通过，pageErrors0；模型HTTP受控。最终完整Node回归3862项全部通过（fail0/skipped0）；记录沿用固定full-tests.log。无提交、推送、打包、Mac编译或iPhone复验；当前线上仍网页1696/私人源码1697，受保护其他聊天现场保留。</w:t>
+      </w:r>
+    </w:p>
+    <w:p>
+      <w:r>
+        <w:t>2026-10-11 用户授权发布全场景自然聊天动画：网页v1698、私人共享源码v1699，放映室排除；保留既有微信防闪动、时间和逐条已读修复。只推送本轮动画与版本标记，其他聊天delivery/好友SQL及测试和维护记录不纳入。不打包、不改原生iOS439/桥42，真实iPhone未复验。发布门禁及部署结果以固定日志与最终线上核对为准。</w:t>
+      </w:r>
+    </w:p>
+    <w:p>
+      <w:r>
+        <w:t>2026-10-11 v1698/v1699最终发布门禁：完整Node3862项通过、0失败、0跳过（109.7秒）；网页和私人实际聊天核心各八组通过，pageErrors0。发布版本更新曾误改药品图片SHA256中的1696字串，首跑3861通过/1失败；已恢复原完整校验值，资源未变，最终完整重跑通过。后续版本替换必须识别版本语义，不能替换校验值。真实模型、Mac编译及iPhone未复验。</w:t>
       </w:r>
     </w:p>
     <w:sectPr>

</xml_diff>

<commit_message>
Fix natural chat scrolling and music composer recovery
</commit_message>
<xml_diff>
--- a/docs/maintenance/AI开发项目_Bug修改规范.docx
+++ b/docs/maintenance/AI开发项目_Bug修改规范.docx
@@ -13594,6 +13594,31 @@
     <w:p>
       <w:r>
         <w:t>2026-10-11 v1698/v1699最终发布门禁：完整Node3862项通过、0失败、0跳过（109.7秒）；网页和私人实际聊天核心各八组通过，pageErrors0。发布版本更新曾误改药品图片SHA256中的1696字串，首跑3861通过/1失败；已恢复原完整校验值，资源未变，最终完整重跑通过。后续版本替换必须识别版本语义，不能替换校验值。真实模型、Mac编译及iPhone未复验。</w:t>
+      </w:r>
+    </w:p>
+    <w:p>
+      <w:r>
+        <w:t>2026-10-11 全场景自然聊天动画发布完成：提交15b13556c6a9df4daf479c9e78a67cf39276afc3已正常推送origin/main；网页v1698/私人源码v1699。Pages38111496090 completed/success；线上小手机.html、app.js、sw.js、web-hotfix.js均HTTP200且与提交字节完全一致。固定online-release-result.json保留验证记录。未打包、未Mac/iPhone复验；其他聊天未提交内容保留，没有新增临时目录或重复产物。</w:t>
+      </w:r>
+    </w:p>
+    <w:p>
+      <w:r>
+        <w:t>2026-10-11 自然动画发布后用户实机问题补修（本地未发布）：抖音连续角色回复在580ms滚动未完成时，nearBottom将程序滚动误判为查看历史；captureRenderScroll保留动画中的跟随意图，scroll事件在程序动画中只更新位置，完成后才更新follow，用户触摸/滚轮等仍取消跟随。线下/共同生活旧offglyph动画被禁用但blur3px/translateY残留；共享自然样式显式清除filter与transform。音乐键盘旧north-apple-remote-safe标记已被applyAppleHomeCompat移除，旧分支不可达；增加私人标记和visualViewport判定，焦点音乐输入期间按可视区域定位dock，blur清除局部定位，未加入全局页面高度hack。音乐首入存储头像未进入路由优先加载，异步替换img失去尺寸；增加音乐头像关键图片与限定音乐头像的尺寸恢复。音乐输入40px border-box保证20px行高加16pxpadding可见，发完清空scrollTop及临时height。一起听模型请求原catch静默、空回复静默；现在明确toast失败/空回复且finally释放busy，忙时给予等待提示；成功回复使用真实buildSystem/chatAPI链路加受控模型HTTP验证，未臆称用户真实模型故障已消失。网页与私人共享源码同修，放映室/原生桥/签名未改。 回归先跑HEAD旧实现，blur3px、第二条抖音消息余1207px未滚到、音乐critical头像缺失、私人dock未定位、模型503无提示均复现。浏览器夹具最初Windows路径转义/HEAD大文件maxBuffer导致环境失败，随后修正；头像SVG含原始引号使夹具尺寸异常，改成base64并保留尺寸断言；这些环境失败不作为旧实现失败证据。新实现逐项双端实际页面回归完成后以固定full-tests.log为完整结果。双端实际聊天核心各八组、自动/手动查看与保存重开通过，pageErrors0。未提交/推送/打包，iPhone键盘及真实配置模型仍待实机复验；维护记录和日志复用原位置，其他聊天dirty现场保留。</w:t>
+      </w:r>
+    </w:p>
+    <w:p>
+      <w:r>
+        <w:t>2026-10-11 发布后补修最终验证：完整Node3868项通过、0失败、0跳过（115.0秒）；双端实际聊天核心八组权限/笔记/输出模式、自动与手动检查、保存重开通过，pageErrors0。新增五项双端浏览器回归：清晰旁白、两条超长抖音回复在上推中接连到达、首次存储头像尺寸、私人音乐焦点输入/发送/受控模型回复、模型503提示与busy释放，均通过。第一轮全量出现4项既有浏览器夹具路径转义错误以及抽取captureRenderScroll未定义_wechatMotion错误；恢复浏览器路径使用正斜线并增加typeof可选动画状态守卫，未删除或弱化断言，完整重跑全通过。没有提交、推送、版本变更或安装包；线上仍v1698，私人源码发布基线v1699。本轮未新增临时目录或重复证据，复用固定full-tests.log，保留必要记录和其他聊天未提交内容。</w:t>
+      </w:r>
+    </w:p>
+    <w:p>
+      <w:r>
+        <w:t>2026-10-11 用户授权发布自然聊天补修：网页v1700/私人共享源码v1701；本轮仅提交抖音滚动跟随、清晰旁白、音乐头像/输入键盘/输入复位/模型失败提示及版本断言。此前所有修复继续继承，放映室排除。不打包、不改iOS439/桥42。其他聊天delivery、好友SQL/测试和维护增补排除；发布结果以最终全量回归、Pages及线上字节核对为准。</w:t>
+      </w:r>
+    </w:p>
+    <w:p>
+      <w:r>
+        <w:t>2026-10-11 v1700/v1701最终发布门禁：完整Node3868项全部通过，fail0/skipped0（115.8秒）；网页及私人实际聊天核心各八组、手动/自动检查及保存重开通过，pageErrors0。旧实现失败回归与新增五项双端实际浏览器检查继续通过。未打包；iOS439/桥42不变，真实模型配置和iPhone键盘未复验。</w:t>
       </w:r>
     </w:p>
     <w:sectPr>

</xml_diff>

<commit_message>
Keep music send and reply failures visible across redraw
Catch the full sending and delivery chain, retain scoped status above the composer, and preserve the original travel price calculation.
</commit_message>
<xml_diff>
--- a/docs/maintenance/AI开发项目_Bug修改规范.docx
+++ b/docs/maintenance/AI开发项目_Bug修改规范.docx
@@ -13654,6 +13654,26 @@
     <ns0:p>
       <ns0:r>
         <ns0:t>2026-10-11 v1702/v1703音乐补修与心情场景隔离最终门禁：完整Node3873项全部通过，fail0/skipped0（126.7秒）；网页/私人实际聊天核心各八组、手动/自动查看、权限撤销及保存重开全部通过，pageErrors0。双端心情范围检查旧HEAD失败、新实现通过，正常对白/旁白/操作协议及微信角色内心元数据保留；模型服务受控，未调用用户真实收费模型。此前音乐八组实际页面回归继续通过。仅发布本轮源码、版本、回归及维护记录，其他聊天未提交内容排除；私人iOS439/桥42不变，不打包，真实iPhone键盘尚需用户实测。</ns0:t>
+      </ns0:r>
+    </ns0:p>
+    <ns0:p>
+      <ns0:r>
+        <ns0:t>2026-10-11 v1702/v1703音乐与心情范围补修发布完成：70f797da0af931dfafdffddc305aa87b6152da97正常推送origin/main，Pages38115809585 completed/success；线上小手机.html、app.js、sw.js、web-hotfix.js全部HTTP200且与提交逐字节一致。完整Node3873项通过、双端实际核心各八组及自动/手动查看、保存重开通过，pageErrors0。心情展示标签仅微信角色私聊允许，其他请求场景禁止并在响应边界处理；正常旁白、操作/支付协议及内部心情数据保留。私人仅共享源码v1703，未制作新包、未Mac/Xcode或iPhone验证，原iOS439/桥42及最新私人包v1691保留。发布仅本轮内容；其他聊天delivery/SQL/测试/维护dirty未包含。HEAD=origin/main，暂存空、无新未跟踪文件，无本轮新增重复临时产物需要删除；固定证据继续复用，其他工作区和唯一包保留。</ns0:t>
+      </ns0:r>
+    </ns0:p>
+    <ns0:p>
+      <ns0:r>
+        <ns0:t>2026-10-11 音乐真人无状态故障复核：用户确认网页v1702，音乐用户消息已发出但无回复且没有任何状态；两轮受控模型绿灯未证明真实音乐恢复，禁止再次据此宣称真人模型已修好。改为核对完整发送链：发送后歌曲匹配/镜像/显示/保存原在错误捕获外；aiMusicReply角色不存在/屏蔽直接静默返回、歌曲查找也在try外；错误只写DOM，render重置成busy文本或空白；setTimeout中的回复绘制异常无法被外层catch捕获。现在发送阶段全程捕获，失效/屏蔽明确说明；状态按账号与角色保存，放输入框上方、重绘保留；回复逐条await显示，保持850ms间隔且全程捕获，校验账号与会话对象，旧回复不写新会话；音乐请求接入现有diagnosticRoleId/音乐回复阶段记录。仍用角色微信同路线/主副回退及配置额度，正常键盘、自然动画、心情场景限制不变。四项双端真实页面故障回归旧HEAD均失败、新实现通过（发送前中断、失效联系人、重绘丢状态、回复显示异常），九项音乐回归全部通过；真实模型故障原因仍待用户新版阶段结果，不调用收费模型、不删数据/密钥/配对。</ns0:t>
+      </ns0:r>
+    </ns0:p>
+    <ns0:p>
+      <ns0:r>
+        <ns0:t>2026-10-11 本轮发布核对修正：Unicode Git路径输出引号导致部分壳版本号未同步，版本门禁/实际核心阻止发布，已改-z读取真实路径；URL正则版本断言未同步，已只修显式版本标记。另发现上次1702发布误把tvPrice国内计算范围从1700改1702（私人相同），核对1691/1699/1700历史均为1700，已双端恢复原值并添加北京到上海经济舱原价格1790行为守卫（旧1702为1800）；本轮版本替换不改未加引号数值。没有扩大到其他旅行功能或修改既有订单。</ns0:t>
+      </ns0:r>
+    </ns0:p>
+    <ns0:p>
+      <ns0:r>
+        <ns0:t>2026-10-11 v1704/v1705音乐阶段可见修复最终门禁：完整Node3879项通过，fail0/skipped0（132.0秒），双端实际聊天核心各八组、手动/自动查看、权限撤销和保存重开通过，pageErrors0。九项音乐实际页面回归通过；四项新故障回归旧1702均失败，新版双端通过。价格继承守卫旧1702计算1800失败，新版恢复原1790通过。新增价格测试初次漏导入VM导致门禁失败，修正真实依赖后全量重跑全部成功，未改弱断言。仍未调用用户收费模型、未确认用户模型无回复根因；发布后需依据持续显示的阶段/失败原因复验，不宣称真实音乐已恢复。仅网页发布与私人共享源码更新，不打包，不改iOS439/桥42或其他聊天现场。</ns0:t>
       </ns0:r>
     </ns0:p>
     <ns0:sectPr ns0:rsidR="00FC693F" ns0:rsidRPr="0006063C" ns0:rsidSect="00034616">

</xml_diff>

<commit_message>
Prepare complete private v1705 chat and music overlay package
</commit_message>
<xml_diff>
--- a/docs/maintenance/AI开发项目_Bug修改规范.docx
+++ b/docs/maintenance/AI开发项目_Bug修改规范.docx
@@ -13674,6 +13674,31 @@
     <ns0:p>
       <ns0:r>
         <ns0:t>2026-10-11 v1704/v1705音乐阶段可见修复最终门禁：完整Node3879项通过，fail0/skipped0（132.0秒），双端实际聊天核心各八组、手动/自动查看、权限撤销和保存重开通过，pageErrors0。九项音乐实际页面回归通过；四项新故障回归旧1702均失败，新版双端通过。价格继承守卫旧1702计算1800失败，新版恢复原1790通过。新增价格测试初次漏导入VM导致门禁失败，修正真实依赖后全量重跑全部成功，未改弱断言。仍未调用用户收费模型、未确认用户模型无回复根因；发布后需依据持续显示的阶段/失败原因复验，不宣称真实音乐已恢复。仅网页发布与私人共享源码更新，不打包，不改iOS439/桥42或其他聊天现场。</ns0:t>
+      </ns0:r>
+    </ns0:p>
+    <ns0:p>
+      <ns0:r>
+        <ns0:t>2026-10-11 v1704/v1705音乐可见阶段修复发布完成：提交453c7f5b8d6f6d4efe7dfa5c9c0face74bfba2a1正常推送origin/main；Pages38116749666 completed/success；线上小手机.html、app.js、sw.js、web-hotfix.js全部HTTP200且与提交逐字节相同。全量3879通过、fail0/skipped0，双端实际核心各八组与保存重开通过，pageErrors0。四项旧版故障回归失败、新版双端通过；九项音乐回归通过。价格恢复与守卫一并继承。用户真实模型未调用，真实音乐是否恢复尚待用户v1704复验，已请求状态/阶段/失败文字；不得宣称真实根因确认。私人共享源码v1705未打包，不改iOS439/桥42，最近交付唯一包v1691保留。HEAD=origin/main、暂存空、无新未跟踪文件；复用固定日志与线上证据，无新增重复临时脚本/目录，其他聊天delivery/SQL/测试/维护未提交现场保留。</ns0:t>
+      </ns0:r>
+    </ns0:p>
+    <ns0:p>
+      <ns0:r>
+        <ns0:t>2026-10-11 外卖503转发恢复 SakuraCat进程直连</ns0:t>
+      </ns0:r>
+    </ns0:p>
+    <ns0:p>
+      <ns0:r>
+        <ns0:t>用户当前私人v1669报告HTTP503。现场8788 health200，而delivery.smallphoneapp.com/health返回530/1033；cloudflared持续TLS EOF及端口7844失败。先重启原转发仍失败。原先把TUN归因Clash Party的判断错误，实际核对Clash Party为direct且TUN=false；sing-box父服务属于SakuraCat，SakuraCat增强模式接管tun0，argotunnel解析到198.18虚拟IP。经用户授权分流修改，用SakuraCat既有自定义路由界面保存并立即应用唯一规则process_name=cloudflared.exe、outbound=direct，不停整个VPN、不修改Clash Party、不改防火墙。规则已持久保存shared_preferences自定义规则并经12440/rules和connections核对命中route(direct)。重启仅外卖隧道；旧进程退出与计划任务IgnoreNew出现一次启动竞态，等待旧任务结束后启动既有任务成功。改后Cloudflare TCP/UDP预检成功、隧道connIndex0在lax10注册，两次公网health200，本机health200；connIndex1仍有握手超时，不能承诺冗余完整或永久稳定。用户手机重新检测及真实点单仍待回报，不把health200当私人App已修或真实订单验收。窗口操作误触开机自启打开，收尾已恢复最初关闭。保留唯一cloudflared直连规则，其余VPN模式保持；未提交、推送、打包、配对、清存档或真实下单。</ns0:t>
+      </ns0:r>
+    </ns0:p>
+    <ns0:p>
+      <ns0:r>
+        <ns0:t>故障归因前核对实际运行内核父服务、DNS、模式与TUN配置，不能因某VPN进程存在就认定它接管网络。HTTP503、前端Load failed、Cloudflare530/1033、本地服务拒绝分别取证。优先只给已确认外卖cloudflared进程分流，并核对规则持久保存、运行命中、真实隧道注册和公网health；记录仍有的冗余连接缺口，不用预检通过替代在线和手机验收。</ns0:t>
+      </ns0:r>
+    </ns0:p>
+    <ns0:p>
+      <ns0:r>
+        <ns0:t>2026-10-11 用户确认网页音乐恢复并授权私人打包：用户明确网页v1704音乐现在已经能正常回复，并要求仔细打包。复用现有scripts/package_private_v1533_ios438.py，不新增版本脚本/临时源码目录；准备完整私人v1705/iOS439覆盖包，1767项已提交项目文件，单根SmallPhone_v1705_iOS439_Private，目标父目录最新私人版本覆盖包_v1705_iOS439.zip，拒绝覆盖已有文件。运行资源基线453c7f5b8d6f6d4efe7dfa5c9c0face74bfba2a1；只打HEAD已提交内容，另一聊天delivery/SQL/维护等排除。现有完整继承门禁通过，旧1691包完整哈希/清单与原生、签名、私人伴生差异、1253小家资源将在生成时及回读再验。新增自然动画、逐条已读/头像/时间稳定、抖音跟随、线下旁白清晰、音乐输入/路线/回复阶段、微信私聊心情例外均设置包内门禁。当前Mac说明与包装来源更新；网页确认不替代私人音乐/键盘/iPhone验收。iOS439/桥42不变；旧1691及更早唯一包保留。</ns0:t>
       </ns0:r>
     </ns0:p>
     <ns0:sectPr ns0:rsidR="00FC693F" ns0:rsidRPr="0006063C" ns0:rsidSect="00034616">

</xml_diff>

<commit_message>
Add social reply motion and global role group bubbles
</commit_message>
<xml_diff>
--- a/docs/maintenance/AI开发项目_Bug修改规范.docx
+++ b/docs/maintenance/AI开发项目_Bug修改规范.docx
@@ -13699,6 +13699,31 @@
     <ns0:p>
       <ns0:r>
         <ns0:t>2026-10-11 用户确认网页音乐恢复并授权私人打包：用户明确网页v1704音乐现在已经能正常回复，并要求仔细打包。复用现有scripts/package_private_v1533_ios438.py，不新增版本脚本/临时源码目录；准备完整私人v1705/iOS439覆盖包，1767项已提交项目文件，单根SmallPhone_v1705_iOS439_Private，目标父目录最新私人版本覆盖包_v1705_iOS439.zip，拒绝覆盖已有文件。运行资源基线453c7f5b8d6f6d4efe7dfa5c9c0face74bfba2a1；只打HEAD已提交内容，另一聊天delivery/SQL/维护等排除。现有完整继承门禁通过，旧1691包完整哈希/清单与原生、签名、私人伴生差异、1253小家资源将在生成时及回读再验。新增自然动画、逐条已读/头像/时间稳定、抖音跟随、线下旁白清晰、音乐输入/路线/回复阶段、微信私聊心情例外均设置包内门禁。当前Mac说明与包装来源更新；网页确认不替代私人音乐/键盘/iPhone验收。iOS439/桥42不变；旧1691及更早唯一包保留。</ns0:t>
+      </ns0:r>
+    </ns0:p>
+    <ns0:p>
+      <ns0:r>
+        <ns0:t>2026-10-11 完整私人v1705覆盖包交付完成：父目录最新私人版本覆盖包_v1705_iOS439.zip，189521301字节，SHA256 9cdb705480c5f0fc99eafad5f8336096f3e4071282d33dc24e4dc5b1305d0136，单根SmallPhone_v1705_iOS439_Private，1769文件/1768项清单。包装来源0533dd7fa107bfedb937ff54995d523baa491b7c；私人运行资源逐字节匹配已审453c7f5b8d6f6d4efe7dfa5c9c0face74bfba2a1；网页仍v1704且用户确认音乐回复恢复，私人源码v1705/iOS439/桥42。ZIP CRC、全部清单哈希、逐文件回读、完整继承门禁及旧v1691全部哈希/文件集合检查通过；39个原生/签名文件原样、私人policy/runtime和性能材质护栏原样、1253小家资源保留；另独立回读1768哈希、两个入口版本、67入口JS语法通过。另一聊天delivery工作文件与SQL/维护未提交内容不入包。Mac/Xcode编译签名和真实iPhone未验证，包为完整源码覆盖包而非IPA。包装脚本/说明/阶段记录已本地提交0533dd7f，未另推送（运行源码453c7f5b已在远程，网页未变）；暂存空，其他dirty保护保留。新交付ZIP是本轮唯一新增交付物，复用现有脚本/日志/证据，无新增临时源码副本/目录；旧1691和其他唯一旧包保留，未清存档/密钥/签名。</ns0:t>
+      </ns0:r>
+    </ns0:p>
+    <ns0:p>
+      <ns0:r>
+        <ns0:t>2026-10-11 动画维护规则补充：其他应用复用已读引擎只扩展选择器，不附加微信独有布局类；评论动画先初始化空列表，再追踪稳定评论ID，局部更新前后扫描并保持进度，避免首条漏播及点赞/状态刷新重播。页面/账号切换已有评论初始静止，遵守减少动态效果设置。</ns0:t>
+      </ns0:r>
+    </ns0:p>
+    <ns0:p>
+      <ns0:r>
+        <ns0:t>2026-10-11 全局气泡规则：全局预设应用角色群聊时把me/them字段映射为单成员bg/text/shape/avatar/icon/iconColor/glow，保留明确成员覆盖；新增颜色选项不擅自重写原经典白色或已保存个别配置。源码保持LF，避免旧功能切片比较因末尾残留CR产生伪回归；无需改动登录等业务逻辑。</ns0:t>
+      </ns0:r>
+    </ns0:p>
+    <ns0:p>
+      <ns0:r>
+        <ns0:t>2026-10-11 用户授权推送后追加推特私信等待与失败提示：先暂停发布，双端X私信增加WeakMap会话请求状态、三个跳动点；重绘保留，重复发送阻止，完成/失败finally清除。失败或清理后空回复toast提示，保留用户消息，不伪造角色回复；账号/会话对象与线程归属核对，删除线程/换账号不写旧回复。保留原dyAuxChat副模型/回退、上下文和额度，不改音乐/微信模型路线。旧HEAD真实页面在缺少正在回复节点失败，新双端请求成功、HTTP503、空回复三项通过，页面错误0。测试路由夹具初次await未标async导致语法错误，已修正并重跑；该夹具错误不当作产品失败。网页准备v1706/私人源码v1707，iOS439/桥42不变；当前未推送，不重新打包，既有v1705完整包保留。</ns0:t>
+      </ns0:r>
+    </ns0:p>
+    <ns0:p>
+      <ns0:r>
+        <ns0:t>2026-10-11 v1706/v1707最终发布门禁：完整Node3894项通过，0失败/0跳过（119.8秒）；双端实际聊天核心各八组及自动/手动检查、保存重开通过，pageErrors0。推特请求成功、503失败、空回复双端检查通过，先前动画/群聊灰色回归保持。版本只替换明确shell/cache/URL/APP_VER标记与测试，旅行报价1790保护保持，不改资源数字。提交范围只含本轮源码/版本回归及HEAD维护文档加本轮记录，排除另一聊天delivery/SQL/好友隔离测试/永久保护并行段落。准备推送网页v1706、私人源码v1707，不生成新包，旧v1705包及iOS439/桥42/私人伴生保留，Mac/iPhone未实测。</ns0:t>
       </ns0:r>
     </ns0:p>
     <ns0:sectPr ns0:rsidR="00FC693F" ns0:rsidRPr="0006063C" ns0:rsidSect="00034616">

</xml_diff>

<commit_message>
Prepare complete private v1707 source overlay package
</commit_message>
<xml_diff>
--- a/docs/maintenance/AI开发项目_Bug修改规范.docx
+++ b/docs/maintenance/AI开发项目_Bug修改规范.docx
@@ -13724,6 +13724,16 @@
     <ns0:p>
       <ns0:r>
         <ns0:t>2026-10-11 v1706/v1707最终发布门禁：完整Node3894项通过，0失败/0跳过（119.8秒）；双端实际聊天核心各八组及自动/手动检查、保存重开通过，pageErrors0。推特请求成功、503失败、空回复双端检查通过，先前动画/群聊灰色回归保持。版本只替换明确shell/cache/URL/APP_VER标记与测试，旅行报价1790保护保持，不改资源数字。提交范围只含本轮源码/版本回归及HEAD维护文档加本轮记录，排除另一聊天delivery/SQL/好友隔离测试/永久保护并行段落。准备推送网页v1706、私人源码v1707，不生成新包，旧v1705包及iOS439/桥42/私人伴生保留，Mac/iPhone未实测。</ns0:t>
+      </ns0:r>
+    </ns0:p>
+    <ns0:p>
+      <ns0:r>
+        <ns0:t>2026-10-11 v1706/v1707正式发布完成：提交781c83bd1e85f78a6ce3ac11cbce784b90cd29a5已一次推送origin/main成功；GitHub Pages38119293289 completed/success。线上小手机.html、app.js、wechat-me.js、sw.js、web-hotfix.js、index.html六项HTTP200且逐字节匹配提交。3894项全过及双端核心pageErrors0保持；抖音已读、朋友圈动画、全局灰色角色群继承、推特三点与失败toast均包含。私人仅源码v1707，最近完整包仍v1705，不含本轮新增内容；未Mac/iPhone验收。无新临时目录/脚本/源码副本，复用固定日志/evidence，暂存区为空，保护其他聊天dirty与唯一历史包。</ns0:t>
+      </ns0:r>
+    </ns0:p>
+    <ns0:p>
+      <ns0:r>
+        <ns0:t>2026-10-11 用户授权私人v1707完整打包：复用现有package_private_v1533_ios438.py，目标唯一最新私人版本覆盖包_v1707_iOS439.zip，禁止覆盖已有包；旧v1705完整包保留。运行资源基线781c83bd1e85f78a6ce3ac11cbce784b90cd29a5，网页v1706/私人v1707/iOS439/桥42，完整1767项目文件；继承验证预检通过。加入抖音独立已读、朋友圈新回复稳定、全局灰色与角色群继承、X三点等待和失败toast包内门禁。上一v1705包哈希9cdb705480c5f0fc99eafad5f8336096f3e4071282d33dc24e4dc5b1305d0136，源码0533dd7f；包内清单/原生签名、伴生差异、1253小家文件将在写入及回读验证。只读取HEAD已提交源码，排除另一聊天delivery/SQL/好友改动；完整3894测试与双端实际核心证据沿用本次已发布源码，无runtime再改动。完整Mac/Xcode源码覆盖包，不是IPA；Mac/iPhone尚未验证。仅元数据本地提交，不另推送网页。</ns0:t>
       </ns0:r>
     </ns0:p>
     <ns0:sectPr ns0:rsidR="00FC693F" ns0:rsidRPr="0006063C" ns0:rsidSect="00034616">

</xml_diff>

<commit_message>
Fix offline narration, route reasoning settings and quiet notifications (web v1708)
</commit_message>
<xml_diff>
--- a/docs/maintenance/AI开发项目_Bug修改规范.docx
+++ b/docs/maintenance/AI开发项目_Bug修改规范.docx
@@ -13734,6 +13734,31 @@
     <ns0:p>
       <ns0:r>
         <ns0:t>2026-10-11 用户授权私人v1707完整打包：复用现有package_private_v1533_ios438.py，目标唯一最新私人版本覆盖包_v1707_iOS439.zip，禁止覆盖已有包；旧v1705完整包保留。运行资源基线781c83bd1e85f78a6ce3ac11cbce784b90cd29a5，网页v1706/私人v1707/iOS439/桥42，完整1767项目文件；继承验证预检通过。加入抖音独立已读、朋友圈新回复稳定、全局灰色与角色群继承、X三点等待和失败toast包内门禁。上一v1705包哈希9cdb705480c5f0fc99eafad5f8336096f3e4071282d33dc24e4dc5b1305d0136，源码0533dd7f；包内清单/原生签名、伴生差异、1253小家文件将在写入及回读验证。只读取HEAD已提交源码，排除另一聊天delivery/SQL/好友改动；完整3894测试与双端实际核心证据沿用本次已发布源码，无runtime再改动。完整Mac/Xcode源码覆盖包，不是IPA；Mac/iPhone尚未验证。仅元数据本地提交，不另推送网页。</ns0:t>
+      </ns0:r>
+    </ns0:p>
+    <ns0:p>
+      <ns0:r>
+        <ns0:t>2026-10-12 四项问题本地修复与后台排查（尚未提交、推送、打包或部署角色推送函数）：用户确认网页与私人版均存在问题。线下截图中的第三人称短动作与长篇眼神描写未被保守分类覆盖，且原文输出绕过普通解析；补充明确动作/场景特征，原文入口复用分类，日期与共同生活旧记录仅按显示投影归为旁白，不改保存原文、用户记录或记忆。普通第三人称台词、问句、心情标签边界及截断【兼容保留。API网络连接设置增加默认关闭的reasoning_effort参数开关与low/high/max选择，随四条路线保存/切换，chatAPI主/辅助、固定角色路线及模型连接/通话规模测试均使用所选参数；不改模型、温度、额度或自动降级，强度不是固定思考字数，模型支持范围不同。后台APNs的roleNotificationBody此前只过滤心情元数据而未过滤保持安静，补充最终出口控制标签过滤，persistAndPush也去除静默控制；纯控制不触碰APNs凭据、不发送通知，不更改真实对话/来电等功能协议，客户端既有过滤保留。店铺只读目录本机HTTP522，认证健康请求超时；本机DNS198.18.0.106经代理，不能单凭本机请求判断全局后台。右侧浏览器已有fenglina35-dotcom登录会话，Supabase项目lkhlyfpssmrjkkzhuzag实际状态Unhealthy；近24小时界面显示374072请求/87.9%成功率，基础设施历史面板Compute99%/CPU99%/Memory80%/DiskIO96%不冒充当前瞬时指标或根因。按故障修复请求执行一次完整Restart project，等待恢复核对；未扩容、改套餐、关Spend Cap、删除数据或部署并行好友SQL。店铺客户端补中文网络错误及非JSON HTTP状态，保留原请求次数和写事务幂等，不以改提示冒充后台已恢复。</ns0:t>
+      </ns0:r>
+    </ns0:p>
+    <ns0:p>
+      <ns0:r>
+        <ns0:t>失败与验证记录：新增普通旁白/API路线/通知投影测试在旧代码失败，真人店铺双端Load failed与非JSON522共4例旧代码失败，原文旁白双端旧代码失败。初次全量命令缺NODE_PATH导致Playwright模块缺失，纠正执行环境，不修改业务以迎合测试。正确环境首轮3902项3897通过/5失败：一项浏览器新夹具用了不存在的设置分类；两项原文截断旁白永久标记因重构移动；一项旁白呈现旧源代码断言；一项此前打包说明缺当前私人源码版本字样。修正为实际network分类，保留原闭合/截断处理，更新源断言精确覆盖新增旁白条件且由双端实际页面验证，不降低功能断言；Mac说明补当前1707/iOS439，未改版本。相关687项通过，真实网页/私人旁白历史和路线表单回填通过；正常聊天双端8组合/手动自动/存档恢复均通过/pageErrors0。最后全量结果待核对。其他聊天delivery/SQL/测试/维护段落、私人伴生及签名、全部唯一历史包保持。</ns0:t>
+      </ns0:r>
+    </ns0:p>
+    <ns0:p>
+      <ns0:r>
+        <ns0:t>2026-10-12 最终本地验收：Node全量3905项全部通过，0失败/0跳过，125.6秒；网页与私人实际页面的旁白/原文输出/旧记录不改写/推理路线开关回填通过，模型和网络边界使用受控响应。正常聊天双端各8组合、自动读取/手动回复/存档恢复/pageErrors0。未付费调用真实模型、未Mac编译/iPhone验收、未提交推送打包或部署角色推送函数。新增永久保护随本轮测试保留。已复用当前工作树、已有测试/日志/固定恢复截图和维护文件，未新增源码副本、脚本、目录、包或工作树；其他聊天全部脏文件保持，暂存区为空。</ns0:t>
+      </ns0:r>
+    </ns0:p>
+    <ns0:p>
+      <ns0:r>
+        <ns0:t>2026-10-12 真人店铺恢复核对：已登录Supabase项目经一次恢复重启后显示Healthy；相同正式north_market_list只读请求由HTTP522恢复HTTP200，ok=true，返回9家真实店铺，耗时3306ms。恢复即时生效，无需客户端发布或重装。Postgres日志存在WAL归档多次失败警告，尚不足以证明反复不可用的根因；管理员终止连接及fast shutdown日志对应本轮主动重启，不当作原始崩溃证据。未扩容、改账单、删数据或部署SQL/函数。其他三项源码修复仍为本地候选，后台静默过滤尚未部署。</ns0:t>
+      </ns0:r>
+    </ns0:p>
+    <ns0:p>
+      <ns0:r>
+        <ns0:t>2026-10-12 用户授权发布验收：网页v1708、私人源码v1709，iOS439/桥42保持，未重新打包。版本更新后全量3905通过/0失败/0跳过（120.9秒），双端实际聊天核心各8组合/自动检查/手动回复/保存恢复/pageErrors0。角色推送私人云qvuahlqimcfgeoetosnl部署43，其旧线上源经TypeScript去类型及规范化与HEAD完全一致；网页云lkhlyfpssmrjkkzhuzag旧版本41有独立历史差异，仅在原线上源码补两处静默控制过滤并保留其余模块，部署42。两边部署后读取实际bundle源码并规范化核对一致，保持verify_jwt=false和既有函数内部鉴权，不调用收费模型、不发送真实通知、不改SQL。真人店铺后台恢复即时生效，反复异常根因仍待故障时证据。发布范围排除并行delivery/好友SQL/好友隔离测试/永久保护并行段落和并行维护内容，唯一历史包保留；准备一次Git推送。</ns0:t>
       </ns0:r>
     </ns0:p>
     <ns0:sectPr ns0:rsidR="00FC693F" ns0:rsidRPr="0006063C" ns0:rsidSect="00034616">

</xml_diff>

<commit_message>
Prepare complete private v1709 source overlay package
</commit_message>
<xml_diff>
--- a/docs/maintenance/AI开发项目_Bug修改规范.docx
+++ b/docs/maintenance/AI开发项目_Bug修改规范.docx
@@ -13759,6 +13759,16 @@
     <ns0:p>
       <ns0:r>
         <ns0:t>2026-10-12 用户授权发布验收：网页v1708、私人源码v1709，iOS439/桥42保持，未重新打包。版本更新后全量3905通过/0失败/0跳过（120.9秒），双端实际聊天核心各8组合/自动检查/手动回复/保存恢复/pageErrors0。角色推送私人云qvuahlqimcfgeoetosnl部署43，其旧线上源经TypeScript去类型及规范化与HEAD完全一致；网页云lkhlyfpssmrjkkzhuzag旧版本41有独立历史差异，仅在原线上源码补两处静默控制过滤并保留其余模块，部署42。两边部署后读取实际bundle源码并规范化核对一致，保持verify_jwt=false和既有函数内部鉴权，不调用收费模型、不发送真实通知、不改SQL。真人店铺后台恢复即时生效，反复异常根因仍待故障时证据。发布范围排除并行delivery/好友SQL/好友隔离测试/永久保护并行段落和并行维护内容，唯一历史包保留；准备一次Git推送。</ns0:t>
+      </ns0:r>
+    </ns0:p>
+    <ns0:p>
+      <ns0:r>
+        <ns0:t>2026-10-12 v1708网页发布完成：提交f50603bc2c5404ceacb6adc5589b2cd4f71fbeef已一次推送origin/main成功；GitHub Pages38172619990 completed/success。线上小手机.html、app.js、commerce-ui.js、sw.js、web-hotfix.js、index.html、repair.html七项HTTP200并逐字节匹配提交。网页v1708/私人源码v1709，私人云角色推送43、网页云42，部署源码已回读核对、两边OPTIONS启动检查200ok。完整3905测试及双端实际聊天核心通过/pageErrors0。未重新打包，最新完整覆盖包仍v1707_iOS439；iOS439/桥42、签名和私人伴生保持，未Mac/iPhone验收。暂存区空，无新增源码副本/目录/脚本/包，固定日志及证据复用；并行delivery/好友SQL/测试/维护未发布且原样保留。本条最终结果补充在当前维护记录及固定线上证据中，未为结果记录另行推送。</ns0:t>
+      </ns0:r>
+    </ns0:p>
+    <ns0:p>
+      <ns0:r>
+        <ns0:t>2026-10-12 用户授权完整私人v1709打包：复用现有打包器与当前Mac说明，不新增脚本/工作树/源码副本；只读取已提交HEAD，运行资源逐字节匹配f50603bc网页v1708/私人v1709，iOS439/桥42不改。目标唯一最新私人版本覆盖包_v1709_iOS439.zip，禁止覆盖已有包；上一完整v1707包哈希77a3db330e1da211c9bad59f38ec55f453f97630a3e455a7cac60914bfb24434，源码0239e552。包内新增旁白原文与历史显示、路线推理开关、店铺中文错误检查；后台静默过滤私人43/网页42已部署，云函数不作为Xcode源文件入包。完整3905测试及双端实际核心验收沿用已发布运行资源；继承完整校验预检通过。除app.js、commerce-ui.js及三个入口版本之外bundle必须与上包一致，原生/签名、1253小家资源及私人伴生保持；并行delivery/好友SQL/测试/维护不入包。只做包装元数据本地提交，不另推送网页。Mac编译签名和iPhone安装未验收，最终包内清单/哈希/回读结果另补。</ns0:t>
       </ns0:r>
     </ns0:p>
     <ns0:sectPr ns0:rsidR="00FC693F" ns0:rsidRPr="0006063C" ns0:rsidSect="00034616">

</xml_diff>

<commit_message>
Package private v1710 opt-in precise role time trial
</commit_message>
<xml_diff>
--- a/docs/maintenance/AI开发项目_Bug修改规范.docx
+++ b/docs/maintenance/AI开发项目_Bug修改规范.docx
@@ -13769,6 +13769,36 @@
     <ns0:p>
       <ns0:r>
         <ns0:t>2026-10-12 用户授权完整私人v1709打包：复用现有打包器与当前Mac说明，不新增脚本/工作树/源码副本；只读取已提交HEAD，运行资源逐字节匹配f50603bc网页v1708/私人v1709，iOS439/桥42不改。目标唯一最新私人版本覆盖包_v1709_iOS439.zip，禁止覆盖已有包；上一完整v1707包哈希77a3db330e1da211c9bad59f38ec55f453f97630a3e455a7cac60914bfb24434，源码0239e552。包内新增旁白原文与历史显示、路线推理开关、店铺中文错误检查；后台静默过滤私人43/网页42已部署，云函数不作为Xcode源文件入包。完整3905测试及双端实际核心验收沿用已发布运行资源；继承完整校验预检通过。除app.js、commerce-ui.js及三个入口版本之外bundle必须与上包一致，原生/签名、1253小家资源及私人伴生保持；并行delivery/好友SQL/测试/维护不入包。只做包装元数据本地提交，不另推送网页。Mac编译签名和iPhone安装未验收，最终包内清单/哈希/回读结果另补。</ns0:t>
+      </ns0:r>
+    </ns0:p>
+    <ns0:p>
+      <ns0:r>
+        <ns0:t>2026-10-12 私人v1709完整包交付完成：最新私人版本覆盖包_v1709_iOS439.zip，189524211字节，SHA256 d055105d18d7f2f0480806e8c8ca2dfdf80fd460fce92143bf06482794228876；源码6975aa0d12e64618b65ad6928852c247f8e29b33（包装元数据本地提交，未另推送），运行资源逐字节匹配已发布f50603bc。唯一根SmallPhone_v1709_iOS439_Private，1769文件/1768哈希；ZIP CRC、全部清单哈希、打包写入回读、完整validate与独立第二次回读通过。67入口脚本语法通过，39原生签名文件不变，1253小家资源与v1707完全一致，所有bundle文件与已验收运行提交一致。独立复核初次git show对小家供应商长路径触发Windows Filename too long，改用ls-tree对象哈希及cat-file批量只读后完整通过；未为此改产品源码或减少校验范围。网页v1708/私人v1709/iOS439/桥42，后台通知静默过滤私人云43/网页云42已部署；完整Mac/Xcode源码覆盖包不是IPA，Mac编译签名及iPhone安装未验收。v1707及所有唯一旧包保留；其他聊天delivery/SQL/好友/测试/维护不入包；未新增脚本、工作树或源码副本，固定证据与日志复用，暂存区空。</ns0:t>
+      </ns0:r>
+    </ns0:p>
+    <ns0:p>
+      <ns0:r>
+        <ns0:t>2026-10-12 精准角色时间观念实验本地候选（未推送/部署/打包）：设置→角色、时间与消息加入默认关闭的独立按钮。开启才提供真实事件起点、上一条用户消息间隔、离开/返回持续时间及明确联系约定；关闭恢复原提示与云配置形态，重置代次不补发旧约定，时间感知关闭/重开也失效旧约定。只识别1分钟至2小时的清楚第一人称约定，问句/假设/引用/他人承诺/内心标签不排队；缺时间戳不造时间，遵循原跨渠道同步设置，不改写历史或记忆。普通后台任务会按同kind互相取消，因此不借app_followup、不改SQL，改用现有automationCandidate独立preciseTime分支；作息事件优先、权限/忙碌/睡眠/启用限制及普通30分钟安静规则保留，前台与后台只选一条调度路径。每个约定一次触发，失败或安静不周期重试，既有有界模型格式修复和同路线回退保留；后台既有58秒预算覆盖90秒租约。到期按分钟检查，不保证手机准点收到；超过10分钟迟到不补催。生成前后复核代次、新用户互动和当前忙碌；本机关掉立即撤销，云同步失败明确提示，不冒称远端已经取消。角色表达与是否安静自主，无固定催促模板。</ns0:t>
+      </ns0:r>
+    </ns0:p>
+    <ns0:p>
+      <ns0:r>
+        <ns0:t>兼容与失败记录：新双端事件/回退测试在旧代码失败。实际页面发现cohab-theater覆写连续性提示，补齐两端入口并保留多人署名，不能仅测app.js。旧时长纠错混用了事件起点与聊天间隔，实验内按明确事件核对，关闭走旧规则。活动touch成功仅实验开启时去抖同步完整约定，avatar等待后取新配置，私人notificationAvatarPreserve和头像true参数保留。新UI夹具未设置settings路由导致点击回home，修正真实路由；预览URL重开会重新seed，持久化改用saveNowAsync加无预览入口。收紧第一人称词形漏去上厕所，补明确词形。首轮全量3915项3914通过/1失败是永久标记拼写错，修正标记不降行为断言；跨双端补丁被私人头像差异断言拦截后定点接入。两端实际模型请求受控验证精准事实、生成中关掉不晚到及busy释放；实际云dispatcher受控验证生成后撤销/一次消费。维护追加命令第一次多行字符串未闭合，未写文件，改成明确多行字符串。最终全量及核心结果另补。本轮不调用收费模型、不发真实用户消息、不碰原生签名/SQL/私人伴生，网页仍1708、既有私人包仍1709/iOS439/桥42，全部唯一包和并行dirty保护。</ns0:t>
+      </ns0:r>
+    </ns0:p>
+    <ns0:p>
+      <ns0:r>
+        <ns0:t>2026-10-12 精准时间实验最终本地验证：完整Node3917项全部通过/0失败/0跳过（125.4秒）；双端实际聊天核心各8权限/原文/笔记组合、自动查看/手动回复/存档恢复/pageErrors0。双端真实设置按钮开关、持久重开、精准事实进入实际模型请求、生成中关闭不晚到及busy释放通过；实际云dispatcher用受控模型核对新互动/关闭撤销、一次消费，29项精准/通知/头像专项通过。无关新话题不再注入事件时长；内心、引用、他人承诺排除。后续一轮3915项3905通过/10失败来自原私人头像独立入口新可选依赖缺失，增加typeof保护，原测试不改且全部恢复；最终3917全过。快速开关旧上传覆盖新配置风险通过实验专属串行队列、头像等待后取最新状态、排队切账号撤销处理，私人notificationAvatarPreserve及原头像行为保持。关闭时本机立即恢复，云同步不通如实提示。原生签名/桥/SQL/普通主动消息/旧包与并行dirty不改，本轮未提交推送、部署或打包，尚未真人模型及iPhone效果验收。当前手机v1709完整包不包含本轮实验，正式发布时需分别更新客户端与角色云函数。固定日志与证据复用，暂无本轮新增源码副本/脚本/目录/包需要清理，暂存区空。</ns0:t>
+      </ns0:r>
+    </ns0:p>
+    <ns0:p>
+      <ns0:r>
+        <ns0:t>2026-10-12 私人v1710精准时间实验打包：用户授权重新打包，复用已存在完整打包器；默认关闭独立开关，开关撤销/事件真实时长/前台约定跟进随包交付。后台新精准时间调度未部署，不能将关App后的新约定联系称为已生效。私人版本1710、网页仍1708、iOS439/桥42，原生签名和私人伴生不改，旧v1709包保留。只按本轮所有权本地提交后从Git读取源码，不推送、不部署，排除其他聊天delivery/SQL/好友测试及维护内容；完整测试和双端核心重新验收，成品清单/CRC/哈希/回读最终结果另补。打包核对命令曾因PowerShell大括号语法、日志不能恢复完整用例库存、长参数重定向启动失败而停止，均未执行产品变更或跳过检查；改用已有494测试文件完整执行。</ns0:t>
+      </ns0:r>
+    </ns0:p>
+    <ns0:p>
+      <ns0:r>
+        <ns0:t>2026-10-12 v1710打包复验修正：首次3917项完整复验3916通过/1失败，仅Mac指南的新版本文字不匹配既有“当前私人源码v1710…iOS439”格式；修正指南，保持测试不削弱，重跑完整测试。Python终端默认cp949输出中文日志失败，测试本身日志已完整保存，后续明确使用UTF-8。DOCX初次追加因旧XML使用ns0命名空间而校验失败、未写入文件，改为读取现有前缀并XML校验通过；不改历史段落。</ns0:t>
       </ns0:r>
     </ns0:p>
     <ns0:sectPr ns0:rsidR="00FC693F" ns0:rsidRPr="0006063C" ns0:rsidSect="00034616">

</xml_diff>

<commit_message>
Finalize private v1711 package identity and retain odd-version gate
</commit_message>
<xml_diff>
--- a/docs/maintenance/AI开发项目_Bug修改规范.docx
+++ b/docs/maintenance/AI开发项目_Bug修改规范.docx
@@ -13799,6 +13799,11 @@
     <ns0:p>
       <ns0:r>
         <ns0:t>2026-10-12 v1710打包复验修正：首次3917项完整复验3916通过/1失败，仅Mac指南的新版本文字不匹配既有“当前私人源码v1710…iOS439”格式；修正指南，保持测试不削弱，重跑完整测试。Python终端默认cp949输出中文日志失败，测试本身日志已完整保存，后续明确使用UTF-8。DOCX初次追加因旧XML使用ns0命名空间而校验失败、未写入文件，改为读取现有前缀并XML校验通过；不改历史段落。</ns0:t>
+      </ns0:r>
+    </ns0:p>
+    <ns0:p>
+      <ns0:r>
+        <ns0:t>2026-10-12 私人v1711最终打包候选：打包预检发现此前候选v1710违反现有“私人版本必须奇数”门禁，因此在ZIP写入前停止；保留门禁，改为v1711并同步私人入口/缓存/版本断言/Mac指南，完整打包validate预检通过。v1710未生成包、未推送或部署；旧包继续保留。重新执行最终完整测试与双端核心后从本地提交打包；精确时间后台调度仍未部署，不能将源码包说成后台已生效或IPA。</ns0:t>
       </ns0:r>
     </ns0:p>
     <ns0:sectPr ns0:rsidR="00FC693F" ns0:rsidRPr="0006063C" ns0:rsidSect="00034616">

</xml_diff>

<commit_message>
Restore cohab continuation arrows across renderers (web v1712)
</commit_message>
<xml_diff>
--- a/docs/maintenance/AI开发项目_Bug修改规范.docx
+++ b/docs/maintenance/AI开发项目_Bug修改规范.docx
@@ -13804,6 +13804,31 @@
     <ns0:p>
       <ns0:r>
         <ns0:t>2026-10-12 私人v1711最终打包候选：打包预检发现此前候选v1710违反现有“私人版本必须奇数”门禁，因此在ZIP写入前停止；保留门禁，改为v1711并同步私人入口/缓存/版本断言/Mac指南，完整打包validate预检通过。v1710未生成包、未推送或部署；旧包继续保留。重新执行最终完整测试与双端核心后从本地提交打包；精确时间后台调度仍未部署，不能将源码包说成后台已生效或IPA。</ns0:t>
+      </ns0:r>
+    </ns0:p>
+    <ns0:p>
+      <ns0:r>
+        <ns0:t>2026-10-12 私人v1711完整包交付完成：最新私人版本覆盖包_v1711_iOS439.zip，189528806字节，SHA256 84aad16d39057cb6e2b31f8d3eab13740008cfbdac0d59b009b460bc1e8a0712；源码提交5ac29e4b36307a2f5bd82e4dc352620d4164718e（本地提交，未推送/部署）。最终3917测试全部通过/0失败/0跳过（137.5秒），双端实际核心各8组合/手动自动回复/保存恢复/pageErrors0。1769文件/1768哈希，CRC、逐文件写入回读、完整validate、独立全部哈希和Git对象逐字节复核通过；67入口脚本语法通过，39原生签名文件及1253小家资源与v1709完全一致。默认关闭精准时间独立开关/实际事件时长/前台约定跟进已入包；后台新精准时间调度未部署，原后台私人43/网页42保留，网页仍1708。完整Mac/Xcode源码覆盖包不是IPA，Mac编译签名/iPhone安装/真人模型未验收。独立复核最初使用相对Path('.')的parent误指当前目录，仅只读未找到包；改用Path.cwd()绝对父目录后全部核验通过。旧v1709及所有唯一旧包保留；并行delivery/好友SQL/测试/维护未入包。固定日志证据复用，无新增工作树或源码副本；本轮import预检产生的314打包器pyc已按精确路径移除，其他旧缓存/受保护现场保留。</ns0:t>
+      </ns0:r>
+    </ns0:p>
+    <ns0:p>
+      <ns0:r>
+        <ns0:t>2026-10-12 共同生活待续箭头补全（本地未发布/未打包）：用户私人版点空白可显示下一句但没有箭头，等待逻辑正常，现场版本未提供；不可断言用户开了多人。实际双端页面验证纯普通待续箭头可见，同时新增真实页面回归复现多人关闭且保留旧来客记录时缺失箭头，旧代码明确失败“web history-only: missing continuation arrow”。根因是cohab-theater即使disabled也因castHistory接管渲染，但缺少原箭头模板。双端补同一正文末尾箭头，并新增COHAB_CONTINUATION_ARROW_V2：offRender后核对当前共同生活等待状态、必要时补一个箭头，释放等待立即移除，限制当前角色/场景、外出及多选隐藏，不改记录、模型/回复/生成/原逐句流程/删除菜单。回归覆盖普通/仅旧来客/多人开启、文字下居中和屏幕可见、单箭头、缺DOM恢复、多选/外出隐藏、点空白只释放一次、末条消失、历史及菜单保留；无收费模型或真人消息。测试初次把正常cohabRepairRows首次规范化前记录当基准导致无关失败，改为首次正常渲染后比较，随后在旧代码复现真实缺箭头；早期只读定位控制台cp949及闭包内部theaterState不可见错误未改产品、后以实际渲染测量核对。私人v1711交付包不包含本修复，网页仍1708，暂不改版本、不提交/推送/部署/打包；后台精准时间未部署边界保持。</ns0:t>
+      </ns0:r>
+    </ns0:p>
+    <ns0:p>
+      <ns0:r>
+        <ns0:t>2026-10-12 共同生活待续箭头最终本地验证：3919项完整测试全部通过/0失败/0跳过（142.8秒），双端实际核心各8组合/自动手动回复/持久保存/pageErrors0。新真实页面回归验证普通、多人关闭但有旧来客、多人成员页面均有唯一可见箭头、在当前正文下且归属滚动区；缺DOM恢复、多选/外出隐藏、点空白释放一次、结束移除、记录与删除菜单保留通过。永久门禁新增双端所有渲染分支及释放清理保护。只新增本地修复，当前网页仍1708、已交付私人包1711不含本项；本轮未提交/推送/部署/重新打包，未真人模型或iPhone验收。固定日志/证据复用，无新源码副本/目录/工作树或待删临时产物；其他聊天delivery/SQL/好友测试/永久门禁并行段及维护现场保留，暂存区为空。</ns0:t>
+      </ns0:r>
+    </ns0:p>
+    <ns0:p>
+      <ns0:r>
+        <ns0:t>2026-10-12 用户授权推送共同生活待续箭头：网页版本1712、私人源码1713（iOS439/桥42不变），保留最新完整包1711，不重新打包、不部署后台。推送会完整继承本地已提交1711精准时间默认关闭前台实验，不扩展后台调度；后台精准时间尚未生效。箭头仅补展示模板和等待态DOM核对/释放移除；普通/多人关闭旧来客/多人开启真实页面回归及原删除菜单保留。版本更新后重跑完整测试、双端核心，已只读确认远程main仍f50603bc，正常单次push origin HEAD:main，首败停；只提交本轮所有权，排除并行外卖/SQL/好友测试/永久门禁并行行及维护段落。原生签名/私人伴生、全部唯一旧包保留；最终Pages和线上字节核对另补。</ns0:t>
+      </ns0:r>
+    </ns0:p>
+    <ns0:p>
+      <ns0:r>
+        <ns0:t>2026-10-12 v1712网页/v1713私人源码发布前最终验证：版本更新后3919项完整测试全部通过/0失败/0跳过（136.0秒），双端实际核心各8组合/手动自动回复/保存恢复/pageErrors0。普通/多人关闭旧来客/多人箭头真实回归、等待核对、结束消失/菜单保留通过；永久门禁通过。66项暂存内容逐项所有权核对，其他聊天delivery/好友SQL/好友测试、永久门禁并行诊断行及维护段落不提交。继承先前本地提交精准时间默认关闭前台实验，不部署后台新精准时间调度，不重新打包；最新完整覆盖包仍1711/iOS439/桥42，Mac和iPhone未验收。准备唯一一次正常Git推送，最终Pages与线上八文件字节核验另补。</ns0:t>
       </ns0:r>
     </ns0:p>
     <ns0:sectPr ns0:rsidR="00FC693F" ns0:rsidRPr="0006063C" ns0:rsidSect="00034616">

</xml_diff>

<commit_message>
feat: home widget liquid glass baked once per widget, tunable in settings web v1716
Replaces the rolled-back snapshot approach: one shared offscreen WebGL program
renders each home widget into a static canvas inside the widget, computed at the
widget's resting page position, so swiping and re-renders never recompute.
Web only; the private bundle is unchanged.

Co-Authored-By: Claude Opus 5.5 <noreply@anthropic.com>
Claude-Session: https://claude.ai/code/session_017e35gCpQUoUfZvpbtFWA4Y
</commit_message>
<xml_diff>
--- a/docs/maintenance/AI开发项目_Bug修改规范.docx
+++ b/docs/maintenance/AI开发项目_Bug修改规范.docx
@@ -13829,6 +13829,11 @@
     <ns0:p>
       <ns0:r>
         <ns0:t>2026-10-12 v1712网页/v1713私人源码发布前最终验证：版本更新后3919项完整测试全部通过/0失败/0跳过（136.0秒），双端实际核心各8组合/手动自动回复/保存恢复/pageErrors0。普通/多人关闭旧来客/多人箭头真实回归、等待核对、结束消失/菜单保留通过；永久门禁通过。66项暂存内容逐项所有权核对，其他聊天delivery/好友SQL/好友测试、永久门禁并行诊断行及维护段落不提交。继承先前本地提交精准时间默认关闭前台实验，不部署后台新精准时间调度，不重新打包；最新完整覆盖包仍1711/iOS439/桥42，Mac和iPhone未验收。准备唯一一次正常Git推送，最终Pages与线上八文件字节核验另补。</ns0:t>
+      </ns0:r>
+    </ns0:p>
+    <ns0:p>
+      <ns0:r>
+        <ns0:t xml:space="preserve">2026-10-11 规则：主屏/列表等会滑动的界面做折射玻璃，不能在滑动或DOM变化时重算材质，也不能反复替换背景快照；应按元素静止布局一次性生成并放进元素内部随之移动，只在输入（壁纸/参数/尺寸/位置）变化时重做，并保证生成完成前保留原样式。</ns0:t>
       </ns0:r>
     </ns0:p>
     <ns0:sectPr ns0:rsidR="00FC693F" ns0:rsidRPr="0006063C" ns0:rsidSect="00034616">

</xml_diff>

<commit_message>
feat: iMessage bubbles and buttons use the liquid glass material web v1720
Co-Authored-By: Claude Opus 5.5 <noreply@anthropic.com>
Claude-Session: https://claude.ai/code/session_017e35gCpQUoUfZvpbtFWA4Y
</commit_message>
<xml_diff>
--- a/docs/maintenance/AI开发项目_Bug修改规范.docx
+++ b/docs/maintenance/AI开发项目_Bug修改规范.docx
@@ -13834,6 +13834,11 @@
     <ns0:p>
       <ns0:r>
         <ns0:t xml:space="preserve">2026-10-11 规则：主屏/列表等会滑动的界面做折射玻璃，不能在滑动或DOM变化时重算材质，也不能反复替换背景快照；应按元素静止布局一次性生成并放进元素内部随之移动，只在输入（壁纸/参数/尺寸/位置）变化时重做，并保证生成完成前保留原样式。</ns0:t>
+      </ns0:r>
+    </ns0:p>
+    <ns0:p>
+      <ns0:r>
+        <ns0:t xml:space="preserve">2026-10-11 v1720（网页，未动私人包）：用户要求电话→信息页按钮和小气泡也用主屏那套液态玻璃。仅在换了聊天背景(.imsg.hasbg)时，对文字/语音/三个点气泡、顶部返回/视频/名字、加号、发送、输入框用同一个 WebGL 着色器画进元素内画布；图片与隐形墨水不套。聊天滚动时只重画可见气泡（滚动距离推算位置、0.6倍分辨率，停下140ms原分辨率），气泡 clip-path 与环生成脚本不变；着色器新增 uBox/uRad/uTail/uShade 处理尾巴与上下压暗。坑：原 :before 细环的 backdrop brightness 会把整个画布气泡提亮，装好画布后改为只留白渐变细环。贴图改为最多两张（主屏+信息页）。防护 marker: function lgImsgFrame(final)。相关917项专项通过。</ns0:t>
       </ns0:r>
     </ns0:p>
     <ns0:sectPr ns0:rsidR="00FC693F" ns0:rsidRPr="0006063C" ns0:rsidSect="00034616">

</xml_diff>

<commit_message>
feat: offline date and cohabitation use the liquid glass material web v1722
Co-Authored-By: Claude Opus 5.5 <noreply@anthropic.com>
Claude-Session: https://claude.ai/code/session_017e35gCpQUoUfZvpbtFWA4Y
</commit_message>
<xml_diff>
--- a/docs/maintenance/AI开发项目_Bug修改规范.docx
+++ b/docs/maintenance/AI开发项目_Bug修改规范.docx
@@ -13839,6 +13839,11 @@
     <ns0:p>
       <ns0:r>
         <ns0:t xml:space="preserve">2026-10-11 v1720（网页，未动私人包）：用户要求电话→信息页按钮和小气泡也用主屏那套液态玻璃。仅在换了聊天背景(.imsg.hasbg)时，对文字/语音/三个点气泡、顶部返回/视频/名字、加号、发送、输入框用同一个 WebGL 着色器画进元素内画布；图片与隐形墨水不套。聊天滚动时只重画可见气泡（滚动距离推算位置、0.6倍分辨率，停下140ms原分辨率），气泡 clip-path 与环生成脚本不变；着色器新增 uBox/uRad/uTail/uShade 处理尾巴与上下压暗。坑：原 :before 细环的 backdrop brightness 会把整个画布气泡提亮，装好画布后改为只留白渐变细环。贴图改为最多两张（主屏+信息页）。防护 marker: function lgImsgFrame(final)。相关917项专项通过。</ns0:t>
+      </ns0:r>
+    </ns0:p>
+    <ns0:p>
+      <ns0:r>
+        <ns0:t xml:space="preserve">2026-10-12 v1722（网页，未动私人包）：用户要求线下共同生活和单次约会除背景外的按钮、页面元素都用液态玻璃。v1720信息页实现改为通用场景表 LG_SCENES，线下根 .offstage.hasbg:not(.off-classic)，classic 与无背景保持原样。顶栏、信息栏、气泡（染外观里自选的颜色，浓度 .62/.52）、让TA回、状态胶囊、旁白/记下、输入框与输入栏、共同生活设置面板及格子按钮、多人剧场、横幅/外出面板、多选按钮、继续箭头；旁白日期纯文字、input/select 不套。通栏两侧不折射；根上压暗改为 uShade 参数；画布 key 相同不重画；输入/resize 后140ms重画。注意10-11那轮光学运行层曾导致线下滑不动，本次不拍快照不监听DOM。防护 marker: root:'.offstage.hasbg:not(.off-classic)'。</ns0:t>
       </ns0:r>
     </ns0:p>
     <ns0:sectPr ns0:rsidR="00FC693F" ns0:rsidRPr="0006063C" ns0:rsidSect="00034616">

</xml_diff>

<commit_message>
feat: spy phone lock pad and home use the liquid glass material web v1724
Co-Authored-By: Claude Opus 5.5 <noreply@anthropic.com>
Claude-Session: https://claude.ai/code/session_017e35gCpQUoUfZvpbtFWA4Y
</commit_message>
<xml_diff>
--- a/docs/maintenance/AI开发项目_Bug修改规范.docx
+++ b/docs/maintenance/AI开发项目_Bug修改规范.docx
@@ -13844,6 +13844,11 @@
     <ns0:p>
       <ns0:r>
         <ns0:t xml:space="preserve">2026-10-12 v1722（网页，未动私人包）：用户要求线下共同生活和单次约会除背景外的按钮、页面元素都用液态玻璃。v1720信息页实现改为通用场景表 LG_SCENES，线下根 .offstage.hasbg:not(.off-classic)，classic 与无背景保持原样。顶栏、信息栏、气泡（染外观里自选的颜色，浓度 .62/.52）、让TA回、状态胶囊、旁白/记下、输入框与输入栏、共同生活设置面板及格子按钮、多人剧场、横幅/外出面板、多选按钮、继续箭头；旁白日期纯文字、input/select 不套。通栏两侧不折射；根上压暗改为 uShade 参数；画布 key 相同不重画；输入/resize 后140ms重画。注意10-11那轮光学运行层曾导致线下滑不动，本次不拍快照不监听DOM。防护 marker: root:'.offstage.hasbg:not(.off-classic)'。</ns0:t>
+      </ns0:r>
+    </ns0:p>
+    <ns0:p>
+      <ns0:r>
+        <ns0:t xml:space="preserve">2026-10-12 v1724（网页，未动私人包）：用户要求查他手机也换液态玻璃。LG_SCENES 增加 .spy-desktop：密码盘、返回/刷新、资料卡下半截、两页应用图标、底栏、重置存档(.spy-glass)。背景取 .spy-wallpaper img；未设壁纸时 lgDefaultWall('lg:spy') 照 CSS 默认渐变画贴图。#spyHomePages 横向翻页按 scrollLeft 推算位置；四角圆角分别读取；:before 细环去掉 backdrop 提亮。防护 marker: function lgDefaultWall(src)。</ns0:t>
       </ns0:r>
     </ns0:p>
     <ns0:sectPr ns0:rsidR="00FC693F" ns0:rsidRPr="0006063C" ns0:rsidSect="00034616">

</xml_diff>

<commit_message>
fix: role takeout fallback and cooldown, roleplay reply, cinema header, trip-day notice, stickers, shop read retry, glass texture reload web v1726
Co-Authored-By: Claude Opus 5.5 <noreply@anthropic.com>
Claude-Session: https://claude.ai/code/session_017e35gCpQUoUfZvpbtFWA4Y
</commit_message>
<xml_diff>
--- a/docs/maintenance/AI开发项目_Bug修改规范.docx
+++ b/docs/maintenance/AI开发项目_Bug修改规范.docx
@@ -13849,6 +13849,11 @@
     <ns0:p>
       <ns0:r>
         <ns0:t xml:space="preserve">2026-10-12 v1724（网页，未动私人包）：用户要求查他手机也换液态玻璃。LG_SCENES 增加 .spy-desktop：密码盘、返回/刷新、资料卡下半截、两页应用图标、底栏、重置存档(.spy-glass)。背景取 .spy-wallpaper img；未设壁纸时 lgDefaultWall('lg:spy') 照 CSS 默认渐变画贴图。#spyHomePages 横向翻页按 scrollLeft 推算位置；四角圆角分别读取；:before 细环去掉 backdrop 提亮。防护 marker: function lgDefaultWall(src)。</ns0:t>
+      </ns0:r>
+    </ns0:p>
+    <ns0:p>
+      <ns0:r>
+        <ns0:t xml:space="preserve">2026-10-12 v1726（网页1726，私人源码同步未升号未打包）：1)角色点外卖选商品模型出错/解析失败/啥都行时 northRoleFallbackPick 按真实菜单兜底，仍走报价与付款前校验；失败后20分钟 roleOrderCoolingDown 跳过角色重复 [点外卖]，她再提外卖则放行。2)角色扮演 renderRP 对齐 _rp，卡住3分钟可重点。3)放映室顶栏模板拼接错误改 ${calIcon('back')}。4)flightV2/railV2 出行当天 tvV2DayNotice 聊天提醒。5)真人店铺只读RPC网络失败自动重试一次，写操作不重发；根治需 Worker 白名单中转（需用户 Cloudflare 授权，未做）。6)表情包删除保持滚动、多选批量删除、链接表情尽量本地化并 no-referrer。7)液态玻璃贴图被挤掉/上下文丢失后重新读图不再定格；查他手机等待本机壁纸读出。</ns0:t>
       </ns0:r>
     </ns0:p>
     <ns0:sectPr ns0:rsidR="00FC693F" ns0:rsidRPr="0006063C" ns0:rsidSect="00034616">

</xml_diff>

<commit_message>
feat: real shops, shop images and uploads choose direct or relay line; relay worker market allowlist web v1728
Worker changes are not deployed yet; until /market-ready answers, clients stay on the direct line.

Co-Authored-By: Claude Opus 5.5 <noreply@anthropic.com>
Claude-Session: https://claude.ai/code/session_017e35gCpQUoUfZvpbtFWA4Y
</commit_message>
<xml_diff>
--- a/docs/maintenance/AI开发项目_Bug修改规范.docx
+++ b/docs/maintenance/AI开发项目_Bug修改规范.docx
@@ -13854,6 +13854,11 @@
     <ns0:p>
       <ns0:r>
         <ns0:t xml:space="preserve">2026-10-12 v1726（网页1726，私人源码同步未升号未打包）：1)角色点外卖选商品模型出错/解析失败/啥都行时 northRoleFallbackPick 按真实菜单兜底，仍走报价与付款前校验；失败后20分钟 roleOrderCoolingDown 跳过角色重复 [点外卖]，她再提外卖则放行。2)角色扮演 renderRP 对齐 _rp，卡住3分钟可重点。3)放映室顶栏模板拼接错误改 ${calIcon('back')}。4)flightV2/railV2 出行当天 tvV2DayNotice 聊天提醒。5)真人店铺只读RPC网络失败自动重试一次，写操作不重发；根治需 Worker 白名单中转（需用户 Cloudflare 授权，未做）。6)表情包删除保持滚动、多选批量删除、链接表情尽量本地化并 no-referrer。7)液态玻璃贴图被挤掉/上下文丢失后重新读图不再定格；查他手机等待本机壁纸读出。</ns0:t>
+      </ns0:r>
+    </ns0:p>
+    <ns0:p>
+      <ns0:r>
+        <ns0:t xml:space="preserve">2026-10-12 v1728（网页1728，私人源码 commerce-ui 同步未打包）：根治真人店铺连接失败。中转 Worker 增加 north_market_* 客户端接口白名单（不含管理员加款/触发器/内部函数）、/market-media 只读图片、/market-upload 图片上传（≤1MiB 仅图片）、/market-ready 探测；客户端复用好友 pfTransportRoute 选线，/market-ready 确认后才走中转，未部署时保持直连；只读失败换线一次，写不重发；图片显示换中转地址、保存换回原始地址。Worker 测试36/36，客户端8/8。Worker 需用户在 Cloudflare 部署，本次未部署。</ns0:t>
       </ns0:r>
     </ns0:p>
     <ns0:sectPr ns0:rsidR="00FC693F" ns0:rsidRPr="0006063C" ns0:rsidSect="00034616">

</xml_diff>

<commit_message>
fix: use the market relay only after it really reads the shop list; relay reports non-JSON upstream details web v1730
Co-Authored-By: Claude Opus 5.5 <noreply@anthropic.com>
Claude-Session: https://claude.ai/code/session_017e35gCpQUoUfZvpbtFWA4Y
</commit_message>
<xml_diff>
--- a/docs/maintenance/AI开发项目_Bug修改规范.docx
+++ b/docs/maintenance/AI开发项目_Bug修改规范.docx
@@ -13859,6 +13859,11 @@
     <ns0:p>
       <ns0:r>
         <ns0:t xml:space="preserve">2026-10-12 v1728（网页1728，私人源码 commerce-ui 同步未打包）：根治真人店铺连接失败。中转 Worker 增加 north_market_* 客户端接口白名单（不含管理员加款/触发器/内部函数）、/market-media 只读图片、/market-upload 图片上传（≤1MiB 仅图片）、/market-ready 探测；客户端复用好友 pfTransportRoute 选线，/market-ready 确认后才走中转，未部署时保持直连；只读失败换线一次，写不重发；图片显示换中转地址、保存换回原始地址。Worker 测试36/36，客户端8/8。Worker 需用户在 Cloudflare 部署，本次未部署。</ns0:t>
+      </ns0:r>
+    </ns0:p>
+    <ns0:p>
+      <ns0:r>
+        <ns0:t xml:space="preserve">2026-10-12 v1730：线上实测中转 north_market_list 返回 friend-upstream-non-json。客户端改为中转必须真读通店铺目录才切换，否则保持直连；Worker 非JSON时附带上游状态/类型/脱敏片段，空回复按 null，待重新部署诊断。</ns0:t>
       </ns0:r>
     </ns0:p>
     <ns0:sectPr ns0:rsidR="00FC693F" ns0:rsidRPr="0006063C" ns0:rsidSect="00034616">

</xml_diff>

<commit_message>
perf: real-friend sync backs off while idle to relieve the shared database web v1732
phone_friend_sync was 42% of all database time and kept the MICRO instance at 100% CPU.

Co-Authored-By: Claude Opus 5.5 <noreply@anthropic.com>
Claude-Session: https://claude.ai/code/session_017e35gCpQUoUfZvpbtFWA4Y
</commit_message>
<xml_diff>
--- a/docs/maintenance/AI开发项目_Bug修改规范.docx
+++ b/docs/maintenance/AI开发项目_Bug修改规范.docx
@@ -13864,6 +13864,11 @@
     <ns0:p>
       <ns0:r>
         <ns0:t xml:space="preserve">2026-10-12 v1730：线上实测中转 north_market_list 返回 friend-upstream-non-json。客户端改为中转必须真读通店铺目录才切换，否则保持直连；Worker 非JSON时附带上游状态/类型/脱敏片段，空回复按 null，待重新部署诊断。</ns0:t>
+      </ns0:r>
+    </ns0:p>
+    <ns0:p>
+      <ns0:r>
+        <ns0:t xml:space="preserve">2026-10-12 v1732（网页1732，私人源码同步未打包）：数据库卡死根因是 phone_friend_sync 轮询占全部数据库时间42%（MICRO CPU100%、IO96%）。好友同步改为空闲逐渐放慢：聊天2.5→8秒，微信/好友列表6→30秒，其他页30秒→3分钟；有新消息/自己发送/打开好友页/切回前台立即恢复。代价：不在好友相关页时提醒最多晚3分钟。</ns0:t>
       </ns0:r>
     </ns0:p>
     <ns0:sectPr ns0:rsidR="00FC693F" ns0:rsidRPr="0006063C" ns0:rsidSect="00034616">

</xml_diff>

<commit_message>
Package private v1733 main fixes without web liquid glass
</commit_message>
<xml_diff>
--- a/docs/maintenance/AI开发项目_Bug修改规范.docx
+++ b/docs/maintenance/AI开发项目_Bug修改规范.docx
@@ -13869,6 +13869,21 @@
     <ns0:p>
       <ns0:r>
         <ns0:t xml:space="preserve">2026-10-12 v1732（网页1732，私人源码同步未打包）：数据库卡死根因是 phone_friend_sync 轮询占全部数据库时间42%（MICRO CPU100%、IO96%）。好友同步改为空闲逐渐放慢：聊天2.5→8秒，微信/好友列表6→30秒，其他页30秒→3分钟；有新消息/自己发送/打开好友页/切回前台立即恢复。代价：不在好友相关页时提醒最多晚3分钟。</ns0:t>
+      </ns0:r>
+    </ns0:p>
+    <ns0:p>
+      <ns0:r>
+        <ns0:t>2026-10-13 用户授权最新main私人v1733分卷覆盖包：基线8f93cb787989a6664d5f92539d09c1fded3e7cf2，私人版本1713升1733，网页仍1732、iOS1.0.439/build439/桥42保持。包含1726～1732的真实菜单点外卖兜底及20分钟冷静期、角色扮演当前局让TA回应、放映室顶栏、新版机票火车票当天聊天提醒、表情包批量删除/滚动保留/尽量本地化、真人店铺中转真实读列表后选线及媒体/上传、真人好友空闲退避和活跃恢复；网页液态玻璃明确不迁入私人包。原生/签名/私人伴生和旧库私人相关流量不修改，不部署后台/Worker/SQL，不调用收费模型或发送真人消息。原eight-chat工作区保护并行脏改动，复用现有干净.codex_private_v1345_inherit_web切至main；切换前旧391ee9ca及18提交链在refs/codex/preserved-private-v1346永久保留，未新建工作树/源副本。复用现有package_private_v1533_ios438.py，从已提交源码读取，固定现有eight-chat日志及证据位置；完整validate预检通过。新增私人继承与排除网页玻璃门禁，运行独立permanent-fix-guard、tests/*.test.mjs全量499文件及双端实际聊天核心。上一完整v1713包哈希d217f900dad08d97e23770000639d4a5241dbae05093b97f32639cc3ee1dcd0f、源1b29c92f保留；完整包及50MiB连续.zip.001分卷均属本次授权新交付物，禁止覆盖；每卷回读/哈希、按序合并哈希及独立分卷ZIP读取核验后交付。Mac编译签名及iPhone实测未验收，最终测试/包哈希结果另补。</ns0:t>
+      </ns0:r>
+    </ns0:p>
+    <ns0:p>
+      <ns0:r>
+        <ns0:t>2026-10-13 v1733分卷包首次全量复验3957项中3955通过/2失败：v852旧正则仍要求phoneFriendPollDelay字面return2500，与main的v1732真实空闲退避不兼容；改为执行现有helper，断言活跃pfchat2500、空闲上限8000、活动后恢复2500，原语音重复识别及其他检查保留。wechat-login-performance-runtime在Windows CRLF下先slice再归一化，截断边界遗留单独回车导致严格函数一致比对失败；改为读取全文时先统一CRLF再slice，保持完整函数严格比较，不改登录实现。产品运行代码不改、不回退退避策略，不降低门禁。两项修正与1726/1728/1732相关定向共30项通过；独立永久门禁679项和双端核心已通过，随后重跑全部499测试文件。完整包尚未写出，最终结果另补。</ns0:t>
+      </ns0:r>
+    </ns0:p>
+    <ns0:p>
+      <ns0:r>
+        <ns0:t>2026-10-13 私人v1733打包前最终验收：最新main8f93cb787989a6664d5f92539d09c1fded3e7cf2继承成立，永久门禁独立679项全部通过，全量499测试文件共3957项全部通过/0失败/0跳过（137.1秒），两项旧测试已按现有行为/EOL修正，产品功能未回退。双端实际核心各8组权限/原文/笔记组合、手动自动回复、授权撤销/保存恢复/pageErrors0通过，无付费模型或真人消息。私人运行payload只从8f93的私人分支升1733标记，commerce/cohab及原生签名等全部沿main，不复制网页液态玻璃。打包器完整validate预检通过、main祖先强校验、前包1713完整哈希继承、每卷50MiB及合并哈希强校验。所有改动均属本轮私人打包/断言/维护，原受保护工作区不动；准备本地提交后打包，不推送、不部署。Mac编译签名/iPhone尚未验收，成品文件/分卷SHA另补。</ns0:t>
       </ns0:r>
     </ns0:p>
     <ns0:sectPr ns0:rsidR="00FC693F" ns0:rsidRPr="0006063C" ns0:rsidSect="00034616">

</xml_diff>

<commit_message>
Record verified private v1733 split overlay delivery
</commit_message>
<xml_diff>
--- a/docs/maintenance/AI开发项目_Bug修改规范.docx
+++ b/docs/maintenance/AI开发项目_Bug修改规范.docx
@@ -13884,6 +13884,11 @@
     <ns0:p>
       <ns0:r>
         <ns0:t>2026-10-13 私人v1733打包前最终验收：最新main8f93cb787989a6664d5f92539d09c1fded3e7cf2继承成立，永久门禁独立679项全部通过，全量499测试文件共3957项全部通过/0失败/0跳过（137.1秒），两项旧测试已按现有行为/EOL修正，产品功能未回退。双端实际核心各8组权限/原文/笔记组合、手动自动回复、授权撤销/保存恢复/pageErrors0通过，无付费模型或真人消息。私人运行payload只从8f93的私人分支升1733标记，commerce/cohab及原生签名等全部沿main，不复制网页液态玻璃。打包器完整validate预检通过、main祖先强校验、前包1713完整哈希继承、每卷50MiB及合并哈希强校验。所有改动均属本轮私人打包/断言/维护，原受保护工作区不动；准备本地提交后打包，不推送、不部署。Mac编译签名/iPhone尚未验收，成品文件/分卷SHA另补。</ns0:t>
+      </ns0:r>
+    </ns0:p>
+    <ns0:p>
+      <ns0:r>
+        <ns0:t>2026-10-13 私人v1733分卷包最终交付：完整ZIP最新私人版本覆盖包_v1733_iOS439.zip，189536919字节，SHA256 892f16ddbe3d948a027416e2a0d68f1a7fc21988719e445f7477760f2ef96520；四卷前三卷各52428800字节、第四卷32250519字节，SHA256 001=5ece68de045ce4a6c0890190175fb7d58853151467294a46e294c530f634eb20；002=3e23a8179413dcf2365a842d11591b5fd274800cc696cc439332d7dfc4e12e24；003=d7bf780af4f3c1967243b757c1be09e25256452be04f5296b7df7855c15f5bdf；004=0aecbc83b10c55ea449d6087b8d27dccff57d16d6d1fb0cb3c89a4a5d18807f4。包源码5210776f163d39d8eb5e72275a75f624e5149ea6，基于最新main8f93cb787989a6664d5f92539d09c1fded3e7cf2；私人1733/网页1732/iOS439/桥42。679永久保护及3957全量全部通过/0失败/0跳过，双端实际核心各8组合及保存撤销/pageErrors0。1769文件/1768清单哈希；完整ZIP写入回读、完整validate、所有提交对象逐字节比对、四卷每卷SHA及合并SHA通过；独立直接从分卷随机读取ZIP、CRC和全部清单哈希通过，无生成合并临时副本。67入口JS语法通过，39原生签名与1253小家资源同v1713，private-cloud-backup/public-north两模块/私人CSS/delivery逐字节保留；新private app与main私人app仅版本两处替换。1726～1732指定修复全部在私人代码中，网页液态玻璃未入包，私人伴生/旧库相关流量不动。成品首次来源metadata沿用旧includesProtectedParallelTestChanges=true，独立审核发现本轮是干净main故修正false；核对首次自建未交付ZIP和四卷精确路径及旧SHA后仅删除本轮可重建候选，重新生成当前最终包并全部再次回读验证，旧v1713及所有唯一旧包未删除。复用已有私人工作区/脚本/固定日志，原eight-chat脏现场保留，旧391ee9ca提交链受永久ref保护；无新增源码副本/目录/工作树或残留临时产物。本轮仅本地提交与私人打包，不推送main、不部署后台/Worker/SQL、不付费调用模型；Mac编译签名及iPhone验收未完成。</ns0:t>
       </ns0:r>
     </ns0:p>
     <ns0:sectPr ns0:rsidR="00FC693F" ns0:rsidRPr="0006063C" ns0:rsidSect="00034616">

</xml_diff>

<commit_message>
Fix roleplay reply lifecycle and runner canvas scaling (web v1734)
</commit_message>
<xml_diff>
--- a/docs/maintenance/AI开发项目_Bug修改规范.docx
+++ b/docs/maintenance/AI开发项目_Bug修改规范.docx
@@ -13889,6 +13889,16 @@
     <ns0:p>
       <ns0:r>
         <ns0:t>2026-10-13 私人v1733分卷包最终交付：完整ZIP最新私人版本覆盖包_v1733_iOS439.zip，189536919字节，SHA256 892f16ddbe3d948a027416e2a0d68f1a7fc21988719e445f7477760f2ef96520；四卷前三卷各52428800字节、第四卷32250519字节，SHA256 001=5ece68de045ce4a6c0890190175fb7d58853151467294a46e294c530f634eb20；002=3e23a8179413dcf2365a842d11591b5fd274800cc696cc439332d7dfc4e12e24；003=d7bf780af4f3c1967243b757c1be09e25256452be04f5296b7df7855c15f5bdf；004=0aecbc83b10c55ea449d6087b8d27dccff57d16d6d1fb0cb3c89a4a5d18807f4。包源码5210776f163d39d8eb5e72275a75f624e5149ea6，基于最新main8f93cb787989a6664d5f92539d09c1fded3e7cf2；私人1733/网页1732/iOS439/桥42。679永久保护及3957全量全部通过/0失败/0跳过，双端实际核心各8组合及保存撤销/pageErrors0。1769文件/1768清单哈希；完整ZIP写入回读、完整validate、所有提交对象逐字节比对、四卷每卷SHA及合并SHA通过；独立直接从分卷随机读取ZIP、CRC和全部清单哈希通过，无生成合并临时副本。67入口JS语法通过，39原生签名与1253小家资源同v1713，private-cloud-backup/public-north两模块/私人CSS/delivery逐字节保留；新private app与main私人app仅版本两处替换。1726～1732指定修复全部在私人代码中，网页液态玻璃未入包，私人伴生/旧库相关流量不动。成品首次来源metadata沿用旧includesProtectedParallelTestChanges=true，独立审核发现本轮是干净main故修正false；核对首次自建未交付ZIP和四卷精确路径及旧SHA后仅删除本轮可重建候选，重新生成当前最终包并全部再次回读验证，旧v1713及所有唯一旧包未删除。复用已有私人工作区/脚本/固定日志，原eight-chat脏现场保留，旧391ee9ca提交链受永久ref保护；无新增源码副本/目录/工作树或残留临时产物。本轮仅本地提交与私人打包，不推送main、不部署后台/Worker/SQL、不付费调用模型；Mac编译签名及iPhone验收未完成。</ns0:t>
+      </ns0:r>
+    </ns0:p>
+    <ns0:p>
+      <ns0:r>
+        <ns0:t>2026-10-13 角色扮演无响应与跑腿画面修复（待发布，用户授权只推送不打包）：用户报告角色扮演不出字且没有提示、其他聊天正常，跑腿截图街景仅占左上约2/3。旧实际网页复现rpReply后busy=true、模型requests=[]、pageerror=m is not defined：renderRP等待行引用map之外的m，rpAI先置busy再在try之外渲染，异常使请求根本未发出且busy不释放。双端移除等待行的错误展示键，rpRender移进try/finally，请求错误以toast与非聊天记录rp-reply-error显示，不再虚构“场景停顿”当成功回复；采用当前角色路线，保留offAux主/副设置，显式allowSessionModel/independentRoleModel/complete/120秒超时及诊断channel。添加session/request token/账号和room归属核对，旧请求不写新账号/房间、不清新请求busy，缺可显示内容明确报错。角色身份与多人解析、原叙事/成员设定/删除菜单/其他渠道保持。跑腿旧真实页面在canvas.width原值重置后缩放变identity，实际画面比例0.6666666666666666与截图一致；双端仅draw入口按bitmap实际宽高与CSS逻辑宽高每帧重建transform，恢复alpha与source-over，暂时无有效尺寸时跳过绘制；物理/轨迹/输入/暂停/计分/奖励/SQL完全不改。实际页面回归验证web/private主路线出字、副路线出字、503失败可见且不新增虚构台词、busy释放；VM验证渲染失败不发请求及释放、旧请求不影响新请求和跨账号丢弃。跑腿验证DPR3限1.5比例重置恢复、尺寸变化/暂停继续/退出，无页面错误；原物理和真实隔离PostgreSQL奖励回放保留。初版测试URL多斜杠/Playwright timeout位置错误、VM漏补历史speaker方法的夹具错误已修，未改产品绕过失败；旧实际故障m未定义及2/3缩小已确实失败。相关27项通过，永久门禁新增；网页升1734/私人源码1735，原生iOS439/桥42与私人无网页液态玻璃保持。准备全量/双端核心及一次正常push，首次push失败停。无新工作树/源码副本/脚本/截图/包，复用固定日志；最新1733完整包和四卷保留，不更新包，不部署后台。Mac/iPhone效果未验收，最终检查与Pages另补。</ns0:t>
+      </ns0:r>
+    </ns0:p>
+    <ns0:p>
+      <ns0:r>
+        <ns0:t>2026-10-13 网页v1734/私人源码v1735发布前最终验证：全量499文件3962项全部通过/0失败/0跳过（139.9秒），永久门禁680项独立通过，双端实际核心各8组合/手动自动回复/权限撤销/存档恢复/pageErrors0。实际角色扮演主/副正确路线出字、服务失败可见且不虚构台词、busy释放、旧请求/账号取消通过；实际跑腿像素比例丢失恢复、viewport变化、暂停继续/退出通过，原physics1～6和隔离PostgreSQL奖励、每日限额、幂等/钱包隔离回归通过。只推送本轮两个修复及相应版本/测试/维护，保留私人无网页玻璃差异、iOS439/桥42/签名与伴生；不新打包、不部署Worker/数据库/云函数、不改计分奖励。当前remote main仍8f93cb78，准备一次正常push，失败不重试；latest完整v1733与四卷保留，不含本轮两修复。原eight-chat受保护并行dirty未动，复用现有工作区与日志，无新脚本/副本/截图/临时产物；Mac/iPhone未验收，Pages与线上字节最终结果另补。</ns0:t>
       </ns0:r>
     </ns0:p>
     <ns0:sectPr ns0:rsidR="00FC693F" ns0:rsidRPr="0006063C" ns0:rsidSect="00034616">

</xml_diff>

<commit_message>
fix(web): protect local recovery snapshots and stored media (v1736)
</commit_message>
<xml_diff>
--- a/docs/maintenance/AI开发项目_Bug修改规范.docx
+++ b/docs/maintenance/AI开发项目_Bug修改规范.docx
@@ -13899,6 +13899,26 @@
     <ns0:p>
       <ns0:r>
         <ns0:t>2026-10-13 网页v1734/私人源码v1735发布前最终验证：全量499文件3962项全部通过/0失败/0跳过（139.9秒），永久门禁680项独立通过，双端实际核心各8组合/手动自动回复/权限撤销/存档恢复/pageErrors0。实际角色扮演主/副正确路线出字、服务失败可见且不虚构台词、busy释放、旧请求/账号取消通过；实际跑腿像素比例丢失恢复、viewport变化、暂停继续/退出通过，原physics1～6和隔离PostgreSQL奖励、每日限额、幂等/钱包隔离回归通过。只推送本轮两个修复及相应版本/测试/维护，保留私人无网页玻璃差异、iOS439/桥42/签名与伴生；不新打包、不部署Worker/数据库/云函数、不改计分奖励。当前remote main仍8f93cb78，准备一次正常push，失败不重试；latest完整v1733与四卷保留，不含本轮两修复。原eight-chat受保护并行dirty未动，复用现有工作区与日志，无新脚本/副本/截图/临时产物；Mac/iPhone未验收，Pages与线上字节最终结果另补。</ns0:t>
+      </ns0:r>
+    </ns0:p>
+    <ns0:p>
+      <ns0:r>
+        <ns0:t>2026-10-13 角色扮演与跑腿网页发布完成：提交1e4c30c5bb90e229801f355c403348f39baadc48已一次正常push origin HEAD:main成功，GitHub Pages38289267952 completed/success。线上小手机.html/app.js/north-runner.js/sw.js/web-hotfix.js/index.html/repair.html/glass-theme.css八项HTTP200并逐字节匹配提交，网页1734/私人源码1735/iOS439/桥42。3962全量/680永久门禁通过、双端核心各8组合及恢复/权限/pageErrors0；角色扮演等待行m未定义/请求未发出的旧真实失败与canvas比例0.6667旧失败确实复现，修后真实页面主副路线/可见失败/隔离及画布恢复/resize/暂停退出通过；原跑腿物理/计分/领奖SQL不变，不部署后台。未打包，v1733完整ZIP和四卷均保留且不含本轮两个修复，私人App不会由网页push自动替换内置源码。未真实付费模型、Mac编译或iPhone验收。原eight-chat并行dirty保留；固定日志证据复用。本轮499文件全量的既有cache-version浏览器测试自动生成personal-wardrobe-proof.png与merchant-pharmacy-proof.png于复用工作区.codex_tmp/eight-chat，尝试按精确路径清理该可重建无关产物被自动审批blocked by policy拒绝，未实际执行删除，保留不绕过；无新工作树/源码副本/打包产物，必要日志和所有唯一旧包继续保留。</ns0:t>
+      </ns0:r>
+    </ns0:p>
+    <ns0:p>
+      <ns0:r>
+        <ns0:t>2026-10-13 网页本机恢复媒体安全修复本地候选（未提交/推送/部署/打包）：用户转交v1706 iPhone主屏网页诊断，四联系人/10881消息/123记忆/摘要、前后多次data IMG错误、memory=null，没有能证明崩溃/清库的记录；不能声称原图已永久丢失或修复具体手机根因。用户授权尝试修复且不影响正常用户。本地明确复现网页recoveryHydrateCandidate不遵守lazyStoredImagesOn而读取imgAll及展开全图库；旧手动确认保存失败后S停在候选状态、缺恢复前保护，旧行为回归失败。只改root app网页手动恢复：移动平台保留idb短引用，桌面只读候选引用、不扫描全库；预览给出本次找到/未找到引用数量，保留缺失引用不伪造原图，不再宣称全部图片已恢复。确认前写一份滚动恢复前核心/聊天保护副本并回读验证，照片仅保留引用；用轻量图片引用清单保护该副本与选中候选免遭GC，不扫描图片内容，清单读取异常时不删除。扫描可读该恢复前副本；取消释放候选。确认后仅清选中图片的陈旧缓存与miss标记，走原可见图片按需读取；保留未相关缓存。恢复写入采用先含完整消息核心、再消息档案、最后压缩核心顺序，手动inline标志只覆盖同步序列化，不延长到IO；写入失败尝试恢复原状态，保前副本始终保留。恢复准备期间状态/候选/账号变化停止替换，写入阶段切账号停止后续写档，不回滚覆盖新账号操作；缺原文件不可重建。未改正常启动/普通导入/店铺外置后台/私人原生恢复，native/services/SW/HTML版本文件无差异，线上仍1734/私人源码1735，本候选不在线。测试初版缺esc夹具、旧直接saveNowAsync源码断言已改为验证安全persist及其实际save调用；实际账号名/头像需与accounts规范一致、负缓存为Map的夹具差异已纠正，未改账号规范化或降低断言。实际iPhone-like真实页面/IndexedDB案例：健康原图可恢复显示、陈旧data缓存清除、缺图片明确提醒、before副本和未相关媒体保留、无页面错误；不是实际Safari/iPhone验收。最终3974全量全部通过/0失败/0跳过（138.4秒），681永久门禁通过、双端正常授权核心各8组合/手动自动/权限撤销与保存恢复/pageErrors0。新增回归覆盖lazy/desktop边界、缺引用不改快照、GC保留并删真正孤儿、清单异常fail closed、存储失败回退和保前写失败不改S、新消息到达中止及账号切换禁止后续档案写。固定日志证据复用，无新脚本/工作树/源副本；v1733完整包和四卷、原eight-chat并行dirty保留，之前被审批拒绝清理的两张自动测试图片继续保留，不再尝试绕过。真实人的原始媒体库/备份仍需发布后原浏览器核验；本轮仅本地修复，不自动推送。</ns0:t>
+      </ns0:r>
+    </ns0:p>
+    <ns0:p>
+      <ns0:r>
+        <ns0:t>2026-10-13 网页恢复修复发布准备：用户明确授权先推送并提供给受影响用户的回复。网页版本升v1736（本机恢复与图片保护），私人源码仍v1735；本轮不打包、不改私人恢复或原生签名/backend。仅手动恢复候选与恢复前副本/媒体引用保护、安全持久化和对应回归及网页版本文件；原1706诊断无法确定具体闪退原因，实际用户原浏览器仍需核验，缺原图不能重建。已独立681永久门禁和双端核心各8组合/pageErrors0通过；全量最终结果发布后补。坚持一次正常push，首次失败停止，不重试强推；所有旧包及并行工作保持。</ns0:t>
+      </ns0:r>
+    </ns0:p>
+    <ns0:p>
+      <ns0:r>
+        <ns0:t>2026-10-13 网页v1736发布前最终检查：全量499文件3974项通过/0失败/0跳过（139.98秒），681永久门禁通过，双端核心各8组合/pageErrors0。测试已完整结束，Python汇总输出因宿主cp949不能编码ℹ返回非零；读取UTF-8原始日志确认测试无失败，未重复测试或降低门禁。私人源码/native/backend/跑腿等无产品差异，仅网页恢复修复与版本更新。本次发布不打包；原图恢复能力仍以本机实际保存文件为限。</ns0:t>
       </ns0:r>
     </ns0:p>
     <ns0:sectPr ns0:rsidR="00FC693F" ns0:rsidRPr="0006063C" ns0:rsidSect="00034616">

</xml_diff>

<commit_message>
Prepare private v1737 overlay with KFC repair and authorized liquid glass
</commit_message>
<xml_diff>
--- a/docs/maintenance/AI开发项目_Bug修改规范.docx
+++ b/docs/maintenance/AI开发项目_Bug修改规范.docx
@@ -13919,6 +13919,21 @@
     <ns0:p>
       <ns0:r>
         <ns0:t>2026-10-13 网页v1736发布前最终检查：全量499文件3974项通过/0失败/0跳过（139.98秒），681永久门禁通过，双端核心各8组合/pageErrors0。测试已完整结束，Python汇总输出因宿主cp949不能编码ℹ返回非零；读取UTF-8原始日志确认测试无失败，未重复测试或降低门禁。私人源码/native/backend/跑腿等无产品差异，仅网页恢复修复与版本更新。本次发布不打包；原图恢复能力仍以本机实际保存文件为限。</ns0:t>
+      </ns0:r>
+    </ns0:p>
+    <ns0:p>
+      <ns0:r>
+        <ns0:t>2026-10-13 网页v1736发布完成：提交e968f76ad5529446ee148c587ac20a17938a34a3一次正常push main成功；GitHub Pages38295792370 completed/success，build/deploy/report均通过。线上小手机.html/app.js/browser-diagnostics.js/sw.js/web-hotfix.js/index.html/repair.html/glass-theme.css八项HTTP200且逐字节匹配提交。3974全量/681永久门禁/双端核心各8组合pageErrors0通过。私人源码仍1735，本次不打包、不改native/backend/正常启动或普通导入，不承诺已恢复受影响真人所有原图；需原主屏入口更新后验证，先保留现有聊天与旧备份，不清站点数据、不卸载、不盲目二次覆盖恢复。原eight-chat并行dirty与所有唯一旧包保留；之前被自动审批拒绝删除的两张既有测试自动图片未绕过删除。此最终发布结果仅维护记录未再推送。</ns0:t>
+      </ns0:r>
+    </ns0:p>
+    <ns0:p>
+      <ns0:r>
+        <ns0:t>2026-10-13 私人v1737重新打包候选：用户明确要求含刚刚外卖改动及网页已有液态玻璃，并回复确认指原eight-chat未提交的肯德基点单上下文/角色当前答应后启动。以最新main e968f76a为基线，复用现有工作区，原eight-chat仍1b29c92f及并行dirty保持。仅抽取私人delivery的missingActionRepairPrompt/Retry/Failure、contextualCommittedKfcChoice及出口，私人aiReply当前raw/自然模式承诺补判条件；未纳入并行被动连接诊断、数据库迁移、后台、其他app dirty。网页app/delivery不改，网页仍1736。私人APP/两入口/repair资源升1737，原生iOS439/桥42/Team/Bundle ID/伴生/共享屏幕/备份保持。上次按网页独有排除的v1716～1726 WebGL材质，本轮新授权纳入私人设置入口与完全相同尾部renderer，11参数/黑白预设/开关/旧材质fallback，未恢复旧NorthOpticalGlass失败方案。原native合成保护不撤，仅lg-ready烤画布成功后去掉底色。实际iPhone-like浏览器发现native旧高specificity主题渐变仍盖canvas；初版低specificity规则仍被覆盖，停编辑核对glass-theme329的:not组合优先级，按现有CSS覆盖优先级用native限定lg-ready:not(#north-lg-fallback)保护条件，未改未ready/关闭/其他容器。原新外卖测试与private缺renderer在旧实现失败；最终定向741项通过，实际完整私人HTML验证WebGL像素、原生标志、透明底、pointer-none、11参数入口、关闭无canvas且pageErrors0。永久门禁682独立通过，全量/双端核心结果待补。脚本复用package_private_v1533_ios438.py，改1737/前包1733继承/已提交e968基线和合法bundle差异；不从dirty打包，不覆盖旧唯一包。Mac/iPhone真实GPU/性能及真实收费角色模型尚未验证。</ns0:t>
+      </ns0:r>
+    </ns0:p>
+    <ns0:p>
+      <ns0:r>
+        <ns0:t>2026-10-13 私人v1737打包前最终验收：全量499文件3978项全部通过/0失败/0跳过（138.86秒）；682永久门禁通过，双端原始核心各8组合/手动自动回复/查手机权限撤销和存档恢复/pageErrors0。第一轮3977通过1失败仅Mac guide当前版本说明缺“当前私人源码”固定表述，改正确文档并保留断言，定向8通过和最终完整3978重跑通过，产品逻辑未变化。基线remote main仍e968f76a，网页1736所有源码不改；私人1737仅授权KFC/液态glass与资源版本，PRIVATE_LIQUID_GLASS_V1737门禁保留ready-only样式，原native/sidebar/签名/后台/原eight-chat并行dirty不变。按已提交HEAD打包1737并校验1733旧包继承/CRC/manifest/分卷合并哈希；结果另补。</ns0:t>
       </ns0:r>
     </ns0:p>
     <ns0:sectPr ns0:rsidR="00FC693F" ns0:rsidRPr="0006063C" ns0:rsidSect="00034616">

</xml_diff>

<commit_message>
Record verified private v1737 package completion
</commit_message>
<xml_diff>
--- a/docs/maintenance/AI开发项目_Bug修改规范.docx
+++ b/docs/maintenance/AI开发项目_Bug修改规范.docx
@@ -13934,6 +13934,11 @@
     <ns0:p>
       <ns0:r>
         <ns0:t>2026-10-13 私人v1737打包前最终验收：全量499文件3978项全部通过/0失败/0跳过（138.86秒）；682永久门禁通过，双端原始核心各8组合/手动自动回复/查手机权限撤销和存档恢复/pageErrors0。第一轮3977通过1失败仅Mac guide当前版本说明缺“当前私人源码”固定表述，改正确文档并保留断言，定向8通过和最终完整3978重跑通过，产品逻辑未变化。基线remote main仍e968f76a，网页1736所有源码不改；私人1737仅授权KFC/液态glass与资源版本，PRIVATE_LIQUID_GLASS_V1737门禁保留ready-only样式，原native/sidebar/签名/后台/原eight-chat并行dirty不变。按已提交HEAD打包1737并校验1733旧包继承/CRC/manifest/分卷合并哈希；结果另补。</ns0:t>
+      </ns0:r>
+    </ns0:p>
+    <ns0:p>
+      <ns0:r>
+        <ns0:t>2026-10-13 私人v1737完整分卷包交付：提交5ba9a54189c10ac4ae4d859cf743090ef3036ec5已一次正常push main成功，以e968f76a最新main为基线，网页仍1736且web全部产品源码不变。最新私人版本覆盖包_v1737_iOS439.zip，189550324字节，1769文件/1768清单；SHA256=f82511da055319c0636277e48ad0a3d05c01bd2143924d2b20a0910ecbf69a60。四卷50MiB/50MiB/50MiB/32263924字节，分卷回读及顺序合并哈希与完整ZIP一致；001=08575d596210f4460a8b5d9a45380679daeaf30a7e588447465a2957809a9f4f；002=981d464f762728f5f97a656bd86a44e2b18ce8b8d422260ffc927e7e458a05b6；003=68faeecbe593ddc35fdbdee8297b52cd0d52c5e128a8819b56b49f31cc47b946；004=b2c36ba65d09873752cc73bd136b0ce37d699ff9bf94c71bb5b8812aaefbf463。CRC/所有manifest/逐文件回读/前1733清单继承与授权差异/1253小家及native签名逐字节保留校验通过。3978全量/682永久门禁/双端核心各8组合pageErrors0通过，private实际页面canvas像素/主题底层透明/11参数/关闭及当前KFC承诺回归通过。原eight-chatHEAD与所有未提交并行改动保留，无新工作区/源码副本/脚本/日志目录；只有用户授权的新交付ZIP和四卷，旧唯一包全部保留。沿用既有固定证据，之前自动测试两张PNG的删除已被审批阻止，不再尝试绕过，继续保留；无本轮新增其他临时产物可清理。不是IPA，未Mac编译/签名/真机安装/真实收费模型或下单验收；不给稳定性绝对承诺。此交付结果维护记录本地保存不再另推。</ns0:t>
       </ns0:r>
     </ns0:p>
     <ns0:sectPr ns0:rsidR="00FC693F" ns0:rsidRPr="0006063C" ns0:rsidSect="00034616">

</xml_diff>

<commit_message>
Release web v1740 and private v1739 thinking preview
</commit_message>
<xml_diff>
--- a/docs/maintenance/AI开发项目_Bug修改规范.docx
+++ b/docs/maintenance/AI开发项目_Bug修改规范.docx
@@ -13939,6 +13939,26 @@
     <ns0:p>
       <ns0:r>
         <ns0:t>2026-10-13 私人v1737完整分卷包交付：提交5ba9a54189c10ac4ae4d859cf743090ef3036ec5已一次正常push main成功，以e968f76a最新main为基线，网页仍1736且web全部产品源码不变。最新私人版本覆盖包_v1737_iOS439.zip，189550324字节，1769文件/1768清单；SHA256=f82511da055319c0636277e48ad0a3d05c01bd2143924d2b20a0910ecbf69a60。四卷50MiB/50MiB/50MiB/32263924字节，分卷回读及顺序合并哈希与完整ZIP一致；001=08575d596210f4460a8b5d9a45380679daeaf30a7e588447465a2957809a9f4f；002=981d464f762728f5f97a656bd86a44e2b18ce8b8d422260ffc927e7e458a05b6；003=68faeecbe593ddc35fdbdee8297b52cd0d52c5e128a8819b56b49f31cc47b946；004=b2c36ba65d09873752cc73bd136b0ce37d699ff9bf94c71bb5b8812aaefbf463。CRC/所有manifest/逐文件回读/前1733清单继承与授权差异/1253小家及native签名逐字节保留校验通过。3978全量/682永久门禁/双端核心各8组合pageErrors0通过，private实际页面canvas像素/主题底层透明/11参数/关闭及当前KFC承诺回归通过。原eight-chatHEAD与所有未提交并行改动保留，无新工作区/源码副本/脚本/日志目录；只有用户授权的新交付ZIP和四卷，旧唯一包全部保留。沿用既有固定证据，之前自动测试两张PNG的删除已被审批阻止，不再尝试绕过，继续保留；无本轮新增其他临时产物可清理。不是IPA，未Mac编译/签名/真机安装/真实收费模型或下单验收；不给稳定性绝对承诺。此交付结果维护记录本地保存不再另推。</ns0:t>
+      </ns0:r>
+    </ns0:p>
+    <ns0:p>
+      <ns0:r>
+        <ns0:t xml:space="preserve">2026-10-14 本地候选：心声原圆角小气泡内部展开/收起，点击正文再次收起，摘要按钮与收起按钮阻止冒泡；refreshChatMood 保留原地动作，避免新回复覆盖成中央弹窗。聊天与媒体新增思考摘要开关（默认关闭）与预算（默认2048，1024～32768）；仅微信角色私聊，Claude在所选角色路线走原生/messages enabled thinking，保留全部系统规则/历史/图片，正文额度另外预留，其他模型只展示接口已返回reasoning字符串。摘要独立于普通心声、正文和动作解析；不保存签名，只落盘最终采用且未过期、账号角色一致的回复摘要，空摘要清旧值。关闭保持原请求协议和主副模型路线。该线路之前真实短测 enabled+budget返回摘要，自适应/普通chat模式未返回；这是接口摘要，不保证完整内部推理，也不保证所有平台支持。开发阶段无新增付费模型调用，截图为明确界面测试摘要。新增双端请求/预算/正文隔离/安全转义/账户过期回归与完整SSE隔离测试；本地全量4032/4032，思考/诊断/永久专项725/725，双端实际HTML心声嵌套布局、摘要点击、正常回复、核心授权各8组合、自动巡查与持久化pageErrors0通过。首轮全量8项失败：新增DOM读取不适配旧VM、元数据插入改变既有源码保护前缀；已保持原声明与落盘注释前缀、使用既有DOM助手，旧安全检查未降低。首轮浏览器失败分别是测试未更新已初始化chatRoutes、以隐藏modal存在数误作可见数、父气泡中心点击被子面板阻止；分别配置实际路线、按可见性断言、只在按钮阻止冒泡后通过。复用既有工作区/测试/固定日志；用户授权两张必要截图，保留历史包与并行工作，无源码副本。维护小册子记录当前原理与失败办法；未推送、未打包，版本不升；私人源码页面通过不代表iPhone/原生编译已验收。</ns0:t>
+      </ns0:r>
+    </ns0:p>
+    <ns0:p>
+      <ns0:r>
+        <ns0:t xml:space="preserve">2026-10-14 心声视觉候选补充：用户要求两个小按钮放在撑开气泡的右上角，右侧收起改为“关闭”，普通心声与思考摘要之间只保留细分界线。双端改相同布局，不改思考请求、预算、解析与存储。新增实际HTML关闭按钮检查发现 esc(JSON.stringify(id)) 不是可靠的HTML属性转义，点击报 Unexpected end of input；修为 toggleChatThought(cur().id)，原函数仍校验当前页面和角色。关闭只收起视图，不关闭设置开关；保留按钮阻止事件冒泡和点正文再次收起。专项19项通过，双端实际HTML正常聊天与按钮检查重新执行；模型网络为受控fixture，截图使用既有固定文件。此前功能全量4032通过，本次仅视觉与按钮点击，不重复扩大付费请求或打包。未推送、未打包。</ns0:t>
+      </ns0:r>
+    </ns0:p>
+    <ns0:p>
+      <ns0:r>
+        <ns0:t xml:space="preserve">2026-10-14 心声展示本地候选补充：按用户要求移除摘要区域的时间、模型名、接口解释、截断说明与未返回内容提示，分界线下面仅显示接口实际返回的思考文字，空返回保持空白，不伪造内容。普通心声、右上角两按钮、开关默认关闭、预算及请求/保存/账号边界不改；说明继续保留于设置和功能小册子。双端相关专项19项通过，实际HTML正常聊天与按钮检查复用原门禁和固定截图。未推送、未打包，无新增文件。</ns0:t>
+      </ns0:r>
+    </ns0:p>
+    <ns0:p>
+      <ns0:r>
+        <ns0:t xml:space="preserve">2026-10-14 发布与打包准备：用户明确授权再次检查后打包并推送。本次网页v1740、私人内置网页v1739，iOS1.0.439/build439/桥42；思考开关默认关闭、初始2048（1024～32768），仅微信角色私聊。原圆角心声气泡内展开，右上角摘要展开/收起及关闭，分界线下仅展示接口实际思考文字。完整请求/账号/过期/正文动作隔离及原协议守护保留。最终全量4032/4032、永久696/696、双端实际HTML正常聊天各8组合/授权/自动巡查/持久化与思考摘要/按钮pageErrors0通过；原固定版本断言随升版更新，不删除安全检查。复用package_private_v1533_ios438.py，新完整v1739覆盖包及50MiB分卷只读取提交；与v1737逐文件继承并检查manifest及CRC、1253小家资产、签名和原生差异。main基线4d9865e8已有屏幕共享、小K一起看试验：三个原生文件和两个机器人网页文件逐字节匹配已发布main，其余原生/签名与前包相同；本轮未另改原生。保留main既有网页与私人机票/火车票组件差异，不抄网页覆盖私人。此前工作目录预检的mail-outbox差异是CRLF字节与Git正文比较，改用提交内容后仅确认两处真实旧差异；正式包使用git cat-file，避免行尾误判。旧包和其他工作区的未提交内容全部保护，无新增源码副本/脚本/日志目录。开发模型HTTP受控，之前已授权短测证明该线路能返回原生摘要，不代表完整内部链或实际角色已验收；Mac编译签名及iPhone实际效果尚未验证。此记录为发布前验收，正式push和包哈希另核对后记录。</ns0:t>
       </ns0:r>
     </ns0:p>
     <ns0:sectPr ns0:rsidR="00FC693F" ns0:rsidRPr="0006063C" ns0:rsidSect="00034616">

</xml_diff>

<commit_message>
feat(private): cozy home 062 and offline/online scene notes (private v1743, iOS 440)
Sync PhoneWeb.bundle/games/cozy-home to the standalone cozy home 062 (light volume for rough materials, all rooms precompiled at boot); private-bridge.mjs and web023.mjs are unchanged. chatHistoryWithDateBoundaries marks where the shared history switches between face-to-face cozy home lines (_cozy) and WeChat text; histories without cozy messages are unchanged. Permanent-fix markers for the v1274 cozy warm-up moved to the compile-only warm-up that replaced warmDraw/releaseGPU in cozy home 052/053. Private v1743, iOS 1.0.440 (440), bridge 42; web stays v1742. Full suite 4042/4042, chat release gate passed on web and private.
</commit_message>
<xml_diff>
--- a/docs/maintenance/AI开发项目_Bug修改规范.docx
+++ b/docs/maintenance/AI开发项目_Bug修改规范.docx
@@ -13959,6 +13959,30 @@
     <ns0:p>
       <ns0:r>
         <ns0:t xml:space="preserve">2026-10-14 发布与打包准备：用户明确授权再次检查后打包并推送。本次网页v1740、私人内置网页v1739，iOS1.0.439/build439/桥42；思考开关默认关闭、初始2048（1024～32768），仅微信角色私聊。原圆角心声气泡内展开，右上角摘要展开/收起及关闭，分界线下仅展示接口实际思考文字。完整请求/账号/过期/正文动作隔离及原协议守护保留。最终全量4032/4032、永久696/696、双端实际HTML正常聊天各8组合/授权/自动巡查/持久化与思考摘要/按钮pageErrors0通过；原固定版本断言随升版更新，不删除安全检查。复用package_private_v1533_ios438.py，新完整v1739覆盖包及50MiB分卷只读取提交；与v1737逐文件继承并检查manifest及CRC、1253小家资产、签名和原生差异。main基线4d9865e8已有屏幕共享、小K一起看试验：三个原生文件和两个机器人网页文件逐字节匹配已发布main，其余原生/签名与前包相同；本轮未另改原生。保留main既有网页与私人机票/火车票组件差异，不抄网页覆盖私人。此前工作目录预检的mail-outbox差异是CRLF字节与Git正文比较，改用提交内容后仅确认两处真实旧差异；正式包使用git cat-file，避免行尾误判。旧包和其他工作区的未提交内容全部保护，无新增源码副本/脚本/日志目录。开发模型HTTP受控，之前已授权短测证明该线路能返回原生摘要，不代表完整内部链或实际角色已验收；Mac编译签名及iPhone实际效果尚未验证。此记录为发布前验收，正式push和包哈希另核对后记录。</ns0:t>
+      </ns0:r>
+    </ns0:p>
+    <ns0:p/>
+    <ns0:p>
+      <ns0:r>
+        <ns0:rPr>
+          <ns0:b/>
+        </ns0:rPr>
+        <ns0:t>2026-10-15 共享记忆跨场景与内嵌小家同步规则</ns0:t>
+      </ns0:r>
+    </ns0:p>
+    <ns0:p>
+      <ns0:r>
+        <ns0:t>同一条聊天记录承载多个场景（微信文字、当面相处、通话）时，必须在发给模型的历史里标明场景切换，而不是另建一份记录；只在实际出现该场景的消息时插入，避免改变普通聊天的提示词。</ns0:t>
+      </ns0:r>
+    </ns0:p>
+    <ns0:p>
+      <ns0:r>
+        <ns0:t>内置games/cozy-home是独立小家仓库dist的原样拷贝，升级时整目录同步并先核对private-bridge.mjs与web023.mjs；永久修复清单中被小家新实现替代的标记要随代码迁移并在说明中写明，不得直接删除保护。</ns0:t>
+      </ns0:r>
+    </ns0:p>
+    <ns0:p>
+      <ns0:r>
+        <ns0:t>换掉材质着色器（onBeforeCompile/customProgramCacheKey）的改动，必须在启动阶段对所有房间和镜面输出预编译，否则首次进入房间会同步编译造成明显卡顿。</ns0:t>
       </ns0:r>
     </ns0:p>
     <ns0:sectPr ns0:rsidR="00FC693F" ns0:rsidRPr="0006063C" ns0:rsidSect="00034616">

</xml_diff>

<commit_message>
Preserve verified v1739 package completion records
</commit_message>
<xml_diff>
--- a/docs/maintenance/AI开发项目_Bug修改规范.docx
+++ b/docs/maintenance/AI开发项目_Bug修改规范.docx
@@ -13959,6 +13959,16 @@
     <ns0:p>
       <ns0:r>
         <ns0:t xml:space="preserve">2026-10-14 发布与打包准备：用户明确授权再次检查后打包并推送。本次网页v1740、私人内置网页v1739，iOS1.0.439/build439/桥42；思考开关默认关闭、初始2048（1024～32768），仅微信角色私聊。原圆角心声气泡内展开，右上角摘要展开/收起及关闭，分界线下仅展示接口实际思考文字。完整请求/账号/过期/正文动作隔离及原协议守护保留。最终全量4032/4032、永久696/696、双端实际HTML正常聊天各8组合/授权/自动巡查/持久化与思考摘要/按钮pageErrors0通过；原固定版本断言随升版更新，不删除安全检查。复用package_private_v1533_ios438.py，新完整v1739覆盖包及50MiB分卷只读取提交；与v1737逐文件继承并检查manifest及CRC、1253小家资产、签名和原生差异。main基线4d9865e8已有屏幕共享、小K一起看试验：三个原生文件和两个机器人网页文件逐字节匹配已发布main，其余原生/签名与前包相同；本轮未另改原生。保留main既有网页与私人机票/火车票组件差异，不抄网页覆盖私人。此前工作目录预检的mail-outbox差异是CRLF字节与Git正文比较，改用提交内容后仅确认两处真实旧差异；正式包使用git cat-file，避免行尾误判。旧包和其他工作区的未提交内容全部保护，无新增源码副本/脚本/日志目录。开发模型HTTP受控，之前已授权短测证明该线路能返回原生摘要，不代表完整内部链或实际角色已验收；Mac编译签名及iPhone实际效果尚未验证。此记录为发布前验收，正式push和包哈希另核对后记录。</ns0:t>
+      </ns0:r>
+    </ns0:p>
+    <ns0:p>
+      <ns0:r>
+        <ns0:t xml:space="preserve">2026-10-14 本次推送与私人包核验：提交1e6edec8f08e083012bcde493bd91fa62e135f87已推送origin/main，网页v1740、私人v1739/iOS439/桥42。最新私人版本覆盖包_v1739_iOS439.zip，189560904字节，1769文件/1768清单，SHA256=86c713b7cf7b59fea9dc56c432f992f1c1b37a32257b568a9293bb373a50171f。四卷50MiB/50MiB/50MiB/32274504字节：001=f8ff44cdc276c0646c6b1f8a6cbc14cfb63221306c420df6c36beaf93c425d1d；002=6d232ae10939624d4b7d87d6fac0c2cee189599725f5efea39911b8cb17b0e53；003=794f09b6cdeaf5d1852468a4016c0fbf4e12830c0da10c19e2a17246b2716c6d；004=0e75df73902da476a7cac3b32229655b3da05f2fc14bf16d2059d6f44da334aa。完整ZIP的CRC/逐文件回读/全部manifest/前1737继承与授权main差异/1253小家与签名保护校验通过，分卷回读和合并哈希与完整ZIP一致。最终全量4032及永久696通过，双端实际HTML正常授权聊天与本次思考/按钮检查pageErrors0。Pages运行38458584853仍在发布中，线上验收随后核对。本轮只有用户授权的新ZIP与四卷，复用固定日志/两张必要截图，未创建源码副本；本轮工作树发布时干净，其他工作区和旧包保留。维护交付结果本地追加，不另推文档触发重复发布。包为Mac/Xcode源码覆盖包，不是IPA；未Mac编译签名或iPhone安装验收。</ns0:t>
+      </ns0:r>
+    </ns0:p>
+    <ns0:p>
+      <ns0:r>
+        <ns0:t xml:space="preserve">2026-10-14 发布验收完成：Pages运行38458584853 completed/success，head_sha=1e6edec8f08e083012bcde493bd91fa62e135f87；线上index.html、小手机.html、app.js、request-diagnostics.js、sw.js、web-hotfix.js、glass-theme.css七项HTTP成功且逐字节匹配提交，网页v1740已生效。blanka原生/messages不含密钥的OPTIONS预检204、允许Origin*、POST及headers*，没有新增付费模型请求；这仅验证跨域预检，不冒充角色实模或iPhone验收。私人v1739完整ZIP/四卷及哈希已交付准备完成，结果见上一条和固定online-release-result.json。源码仍HEAD=origin/main=1e6edec8；仅七个交付结果维护记录本地追加，未再推送以免重复部署。本轮临时产物核对只有用户要求保留的两张截图与新交付ZIP/四卷，原有__pycache__和其他工作区/旧唯一包保留，没有新增无用文件可删除。</ns0:t>
       </ns0:r>
     </ns0:p>
     <ns0:sectPr ns0:rsidR="00FC693F" ns0:rsidRPr="0006063C" ns0:rsidSect="00034616">

</xml_diff>

<commit_message>
feat: complete opt-in private check-in screenshot handoff
</commit_message>
<xml_diff>
--- a/docs/maintenance/AI开发项目_Bug修改规范.docx
+++ b/docs/maintenance/AI开发项目_Bug修改规范.docx
@@ -13993,6 +13993,11 @@
     <ns0:p>
       <ns0:r>
         <ns0:t xml:space="preserve">2026-10-14 发布验收完成：Pages运行38458584853 completed/success，head_sha=1e6edec8f08e083012bcde493bd91fa62e135f87；线上index.html、小手机.html、app.js、request-diagnostics.js、sw.js、web-hotfix.js、glass-theme.css七项HTTP成功且逐字节匹配提交，网页v1740已生效。blanka原生/messages不含密钥的OPTIONS预检204、允许Origin*、POST及headers*，没有新增付费模型请求；这仅验证跨域预检，不冒充角色实模或iPhone验收。私人v1739完整ZIP/四卷及哈希已交付准备完成，结果见上一条和固定online-release-result.json。源码仍HEAD=origin/main=1e6edec8；仅七个交付结果维护记录本地追加，未再推送以免重复部署。本轮临时产物核对只有用户要求保留的两张截图与新交付ZIP/四卷，原有__pycache__和其他工作区/旧唯一包保留，没有新增无用文件可删除。</ns0:t>
+      </ns0:r>
+    </ns0:p>
+    <ns0:p>
+      <ns0:r>
+        <ns0:t xml:space="preserve">2026-10-16 查岗截屏本地候选（未推送/未打包/未升版）：用户提供Mac未提交ZIP五个文件；与最新main bd9e5213逐一对照，两个app.js仅各一行NorthExtraPages路由，原生桥57行，pbxproj完全相同，新CheckInShortcuts.swift。先将原七份1739交付结果保留为cbf78f92，再合并main为713d22c3，七项维护冲突按main正文加本地独有尾段解决，双方历史保留；未创建工作树或源码副本。补全两个系统AppIntent、原生checkin.configure/take/ack及现有phone-shortcuts.js中的独立shortcutSettings页面（双端共用追加模块，私人截屏才启用，原有云端动作仍在页内）。开场白只由所选角色当前微信路线主/副模型按人设批量写，支持删/重写、去重、40句/每句60字限制，多句避免连续重复；生成失败保留旧值、账号/角色/记忆重置过期不回写，空池不再硬编码兜底。默认关闭；用户明确开启和系统每次确认后才允许单张截图，取消先清旧确认；确认凭据120秒单次消耗、跨动作重启短暂持久化，scope绑定账号角色。Actor串行截图存取，20MB输入上限、ImageIO缩1440、JPEG不继承原EXIF、App临时目录排除备份、最多6张/24小时过期在下次处理清理。图片带账号/cid/scope元数据；仅匹配作用域可取/ACK。前端先存IndexedDB原图及普通微信图片消息并确认落盘，之后ACK删原生临时副本，聊天图按普通记录保留。receipt与稳定图片ID防重复、已删除消息不重建；保存失败不ACK、不调模型；识图失败显示真实错误且不伪造角色回复，断掉的识图留给手动重试，识图前后和异步存取核对账号/角色/设置/记忆重置；App自有锁屏或后台不接入。识图调用原visionAPI，回复走既有scheduleReply/featureEventNote即时分享事件，不改全局手动回复：首轮真实页面证实普通scheduleReply被默认manualReply=true挡住，原来只有生成+识图两请求、图片success却不自动回；改为本次已确认分享事件后真实页面完整收到回复、手动开关仍true。未接入夜巡、持续监控、原私人定位/时长/屏幕共享和后台；原生图片发送给已配置的识图服务，页面开启前明确告知，原附件“只存本机”文案已纠正。Apple确认接口使用非弃用requestConfirmation(actionName:dialog:)；新Swift在现有PBXFileSystemSynchronizedRootGroup主App目标自动编入，不改签名/Team/Bundle ID/构建号451。实测旧缺模块页面入口在受控原HTML失败，补后独立页面、云端入口、真实IndexedDB图片、原visionAPI模型HTTP、正常角色回复、ACK/重复检查通过。专项773通过（含边界回归、双端辅助函数漂移和永久门禁）；全量4135/4135通过；双端实际授权聊天各8组合/手动自动查看/持久化pageErrors0，模型HTTP和原生接口受控，无生产截图、私人聊天、付费模型调用。首次全量一项失败来自Mac新增漂移测试用URL.pathname在Windows生成/C:/路径；改fileURLToPath，未放宽KNOWN或删断言，保留漂移事故探针后通过。当前环境Windows没有Swift/Xcode，未原生编译、签名、iPhone安装、两个系统动作的实际确认/截屏顺序/冷启动验收；不能把上述测试称真机可用。维护记录仅追加并保留历史，Word只做XML/资源和ZIP检查，本轮非Word交付、未分页渲染。固定日志复用，唯一新增源文件为用户提供并授权完善的CheckInShortcuts.swift；旧包/其他工作区/附件ZIP不动。</ns0:t>
       </ns0:r>
     </ns0:p>
     <ns0:sectPr ns0:rsidR="00FC693F" ns0:rsidRPr="0006063C" ns0:rsidSect="00034616">

</xml_diff>

<commit_message>
docs: record private v1767 source overlay verification boundaries
</commit_message>
<xml_diff>
--- a/docs/maintenance/AI开发项目_Bug修改规范.docx
+++ b/docs/maintenance/AI开发项目_Bug修改规范.docx
@@ -13998,6 +13998,11 @@
     <ns0:p>
       <ns0:r>
         <ns0:t xml:space="preserve">2026-10-16 查岗截屏本地候选（未推送/未打包/未升版）：用户提供Mac未提交ZIP五个文件；与最新main bd9e5213逐一对照，两个app.js仅各一行NorthExtraPages路由，原生桥57行，pbxproj完全相同，新CheckInShortcuts.swift。先将原七份1739交付结果保留为cbf78f92，再合并main为713d22c3，七项维护冲突按main正文加本地独有尾段解决，双方历史保留；未创建工作树或源码副本。补全两个系统AppIntent、原生checkin.configure/take/ack及现有phone-shortcuts.js中的独立shortcutSettings页面（双端共用追加模块，私人截屏才启用，原有云端动作仍在页内）。开场白只由所选角色当前微信路线主/副模型按人设批量写，支持删/重写、去重、40句/每句60字限制，多句避免连续重复；生成失败保留旧值、账号/角色/记忆重置过期不回写，空池不再硬编码兜底。默认关闭；用户明确开启和系统每次确认后才允许单张截图，取消先清旧确认；确认凭据120秒单次消耗、跨动作重启短暂持久化，scope绑定账号角色。Actor串行截图存取，20MB输入上限、ImageIO缩1440、JPEG不继承原EXIF、App临时目录排除备份、最多6张/24小时过期在下次处理清理。图片带账号/cid/scope元数据；仅匹配作用域可取/ACK。前端先存IndexedDB原图及普通微信图片消息并确认落盘，之后ACK删原生临时副本，聊天图按普通记录保留。receipt与稳定图片ID防重复、已删除消息不重建；保存失败不ACK、不调模型；识图失败显示真实错误且不伪造角色回复，断掉的识图留给手动重试，识图前后和异步存取核对账号/角色/设置/记忆重置；App自有锁屏或后台不接入。识图调用原visionAPI，回复走既有scheduleReply/featureEventNote即时分享事件，不改全局手动回复：首轮真实页面证实普通scheduleReply被默认manualReply=true挡住，原来只有生成+识图两请求、图片success却不自动回；改为本次已确认分享事件后真实页面完整收到回复、手动开关仍true。未接入夜巡、持续监控、原私人定位/时长/屏幕共享和后台；原生图片发送给已配置的识图服务，页面开启前明确告知，原附件“只存本机”文案已纠正。Apple确认接口使用非弃用requestConfirmation(actionName:dialog:)；新Swift在现有PBXFileSystemSynchronizedRootGroup主App目标自动编入，不改签名/Team/Bundle ID/构建号451。实测旧缺模块页面入口在受控原HTML失败，补后独立页面、云端入口、真实IndexedDB图片、原visionAPI模型HTTP、正常角色回复、ACK/重复检查通过。专项773通过（含边界回归、双端辅助函数漂移和永久门禁）；全量4135/4135通过；双端实际授权聊天各8组合/手动自动查看/持久化pageErrors0，模型HTTP和原生接口受控，无生产截图、私人聊天、付费模型调用。首次全量一项失败来自Mac新增漂移测试用URL.pathname在Windows生成/C:/路径；改fileURLToPath，未放宽KNOWN或删断言，保留漂移事故探针后通过。当前环境Windows没有Swift/Xcode，未原生编译、签名、iPhone安装、两个系统动作的实际确认/截屏顺序/冷启动验收；不能把上述测试称真机可用。维护记录仅追加并保留历史，Word只做XML/资源和ZIP检查，本轮非Word交付、未分页渲染。固定日志复用，唯一新增源文件为用户提供并授权完善的CheckInShortcuts.swift；旧包/其他工作区/附件ZIP不动。</ns0:t>
+      </ns0:r>
+    </ns0:p>
+    <ns0:p>
+      <ns0:r>
+        <ns0:t xml:space="preserve">2026-10-16 私人v1767/iOS452覆盖包准备：用户要求将查岗截屏完整代码打包供Mac检查。本地功能提交3e6347c4，继承最新main bd9e5213的私人v1765及全部资源；私人入口/缓存/恢复页升1767，12项原生目标构建号升452，网页仍1762，本轮不推送。复用现有打包脚本，从提交树读取，核对本机v1739完整包及其全部清单、最新main完整私人树，并只允许已审查的查岗功能和版本标记差异。新增Swift和原生桥交接包含在包内；其他签名、身份、定位/时长/管控/共享屏幕/备份文件均保留。修正旧打包脚本沿用上一轮macBuildVerified=true的问题，本次明确false，真实iPhone验证同样false。专项和永久门禁773/773通过，双端实际HTML核心聊天及截图存储/识图/角色回复/ACK防重检查通过，模型HTTP和原生接口受控。升版首轮版本写死断言需同步；文本换行修正保留Windows工作树原CRLF，不改业务样式，22项对应检查通过；最终全量及交付哈希随后记在本README。本次是Mac/Xcode源码覆盖包，非IPA；Xcode编译、签名和真机快捷指令确认/取消/冷启动交接仍待Mac检查。Mac未提交半成品必须逐项合并，不直接覆盖独有修改。旧包及其他工作区保留；Word维护记录只核对XML、资源和ZIP，未声称分页渲染。</ns0:t>
       </ns0:r>
     </ns0:p>
     <ns0:sectPr ns0:rsidR="00FC693F" ns0:rsidRPr="0006063C" ns0:rsidSect="00034616">

</xml_diff>

<commit_message>
docs: record verified private v1767 iOS452 package and checksums
</commit_message>
<xml_diff>
--- a/docs/maintenance/AI开发项目_Bug修改规范.docx
+++ b/docs/maintenance/AI开发项目_Bug修改规范.docx
@@ -14003,6 +14003,11 @@
     <ns0:p>
       <ns0:r>
         <ns0:t xml:space="preserve">2026-10-16 私人v1767/iOS452覆盖包准备：用户要求将查岗截屏完整代码打包供Mac检查。本地功能提交3e6347c4，继承最新main bd9e5213的私人v1765及全部资源；私人入口/缓存/恢复页升1767，12项原生目标构建号升452，网页仍1762，本轮不推送。复用现有打包脚本，从提交树读取，核对本机v1739完整包及其全部清单、最新main完整私人树，并只允许已审查的查岗功能和版本标记差异。新增Swift和原生桥交接包含在包内；其他签名、身份、定位/时长/管控/共享屏幕/备份文件均保留。修正旧打包脚本沿用上一轮macBuildVerified=true的问题，本次明确false，真实iPhone验证同样false。专项和永久门禁773/773通过，双端实际HTML核心聊天及截图存储/识图/角色回复/ACK防重检查通过，模型HTTP和原生接口受控。升版首轮版本写死断言需同步；文本换行修正保留Windows工作树原CRLF，不改业务样式，22项对应检查通过；最终全量及交付哈希随后记在本README。本次是Mac/Xcode源码覆盖包，非IPA；Xcode编译、签名和真机快捷指令确认/取消/冷启动交接仍待Mac检查。Mac未提交半成品必须逐项合并，不直接覆盖独有修改。旧包及其他工作区保留；Word维护记录只核对XML、资源和ZIP，未声称分页渲染。</ns0:t>
+      </ns0:r>
+    </ns0:p>
+    <ns0:p>
+      <ns0:r>
+        <ns0:t xml:space="preserve">2026-10-16 私人v1767/iOS452交付核验完成：最新私人版本覆盖包_v1767_iOS452.zip，209983957字节，1832文件/1831清单，SHA256=050edf62b91a061b3611e08d5eae2245b5211a0af822db088e6f85c93b26aedf。包内sourceCommit=bcef7b225d9b4947ee01f44a0a4ad05731b7202a，main基线bd9e5213，查岗功能提交3e6347c4。全量4135/4135、专项及永久门禁773/773通过；两端实际HTML核心聊天与截屏接收受控检查通过。ZIP的CRC、逐文件回读及1831条哈希、69个实际加载脚本语法、main完整私人树和原1739包继承/签名保护检查通过。五卷拼接回读哈希与完整ZIP一致：001=0baf237ff9d76355f76d18f36d9a20b614d86000c1cf75f8ceb04bafb772039c；002=97eb0f2fdf2256068a95bb2981eea00c9fbb4effde720560792166279357c9d5；003=17d56d48926d9fed28f5bfd8fcaf375d7958fd91ed52207c47019ad8575659c0；004=adf5b4dcd017d740d73c8a201593adafaf24fa4754b7bd84ee4f5c8915906e82；005=36cac581927091ed4e5d8999b33f75e344de8d280799a3bae2a15dfe0fa061e9。macBuildVerified=false、realIPhoneVerified=false；这是Mac/Xcode源码覆盖包，不是IPA，未推送GitHub或部署网页。打包校验首次被反向替换版本数字误碰颜色字面量所阻止，未生成失败ZIP；改为从审查提交正向只验证本轮版本转换后通过，业务代码颜色未改。最终Git仅交付记录追加，旧包、原补丁和其他工作区保留；固定测试日志复用，无本轮无用新增临时文件可删，既有缓存不动。</ns0:t>
       </ns0:r>
     </ns0:p>
     <ns0:sectPr ns0:rsidR="00FC693F" ns0:rsidRPr="0006063C" ns0:rsidSect="00034616">

</xml_diff>

<commit_message>
chore(private): prepare v1769 iOS453 with verified web feature inheritance
</commit_message>
<xml_diff>
--- a/docs/maintenance/AI开发项目_Bug修改规范.docx
+++ b/docs/maintenance/AI开发项目_Bug修改规范.docx
@@ -14008,6 +14008,11 @@
     <ns0:p>
       <ns0:r>
         <ns0:t xml:space="preserve">2026-10-16 私人v1767/iOS452交付核验完成：最新私人版本覆盖包_v1767_iOS452.zip，209983957字节，1832文件/1831清单，SHA256=050edf62b91a061b3611e08d5eae2245b5211a0af822db088e6f85c93b26aedf。包内sourceCommit=bcef7b225d9b4947ee01f44a0a4ad05731b7202a，main基线bd9e5213，查岗功能提交3e6347c4。全量4135/4135、专项及永久门禁773/773通过；两端实际HTML核心聊天与截屏接收受控检查通过。ZIP的CRC、逐文件回读及1831条哈希、69个实际加载脚本语法、main完整私人树和原1739包继承/签名保护检查通过。五卷拼接回读哈希与完整ZIP一致：001=0baf237ff9d76355f76d18f36d9a20b614d86000c1cf75f8ceb04bafb772039c；002=97eb0f2fdf2256068a95bb2981eea00c9fbb4effde720560792166279357c9d5；003=17d56d48926d9fed28f5bfd8fcaf375d7958fd91ed52207c47019ad8575659c0；004=adf5b4dcd017d740d73c8a201593adafaf24fa4754b7bd84ee4f5c8915906e82；005=36cac581927091ed4e5d8999b33f75e344de8d280799a3bae2a15dfe0fa061e9。macBuildVerified=false、realIPhoneVerified=false；这是Mac/Xcode源码覆盖包，不是IPA，未推送GitHub或部署网页。打包校验首次被反向替换版本数字误碰颜色字面量所阻止，未生成失败ZIP；改为从审查提交正向只验证本轮版本转换后通过，业务代码颜色未改。最终Git仅交付记录追加，旧包、原补丁和其他工作区保留；固定测试日志复用，无本轮无用新增临时文件可删，既有缓存不动。</ns0:t>
+      </ns0:r>
+    </ns0:p>
+    <ns0:p>
+      <ns0:r>
+        <ns0:t xml:space="preserve">2026-10-16 私人v1769/iOS453网页功能继承修复：用户发现刚交付v1767的查找聊天记录仍旧版。确认为v1738网页独有提交0e877127未同步的功能，不能归因手机缓存；上轮只查文件清单、完整继承承诺过宽。扩展现有v1738/v1742及翻译队列回归同时运行私人源，旧私人实现19项失败；补齐角色/群聊搜索分组、原消息定位、扩大旧消息窗口、返回关键词/位置、群内分类点击定位、批量翻译与429退避、群聊每人和每轮总条数上限、手动总结视角判别与失败提示、角色微信快照去重，以及他人群气泡透明边框。两个私人HTML补齐搜索样式和CSS重试定义，移除漂移检查的已修复__northCssRetry例外，未扩大KNOWN。真实页面发现两端wxsearch未接入浅色主题标志，双端仅此共享主题接线补正；网页仍1762，本轮不推送。额外审计所有公开入口JS/CSS文件、差异模块与app函数，私人入口未缺公开样式选择器，其他差异有目的：私人HomeKit、屏幕时长/管控/共享、原生收件与后台任务、文件备份与恢复合并、真人好友性能与机器人钩子均保留，private-reply-intercept独立实现不覆盖，delivery私人肯德基补判比网页多也保留；webRecovery和公版额度/云端快捷入口停用不强灌私人。private-web-feature-parity新增24个关键行为函数的真实代码对比及入口样式门禁，永久门禁双端守住新功能；原始HTML检查420条旧聊天中第5条定位、返回关键词、角色群搜索、浅色样式和群条数保存，两端通过，并继续原始buildSystem/myActivity全部核心聊天门禁和查岗图片管线。专项及永久门禁801项通过；最终全量和ZIP结果后续追加。功能提交8dd79e0e，私人1769/原生453/桥42；版本替换用非十六进制边界，验证颜色字面量逐个未变。复用打包脚本，从提交树生成并比对已核验1767完整包及最新main，Mac指南提示先合并Mac未提交半成品。尚未Mac编译签名或iPhone实测，旧包保留；维护Word仅检查XML和资源，不声称分页验收。</ns0:t>
       </ns0:r>
     </ns0:p>
     <ns0:sectPr ns0:rsidR="00FC693F" ns0:rsidRPr="0006063C" ns0:rsidSect="00034616">

</xml_diff>

<commit_message>
docs: record v1769 overlay hashes and completed parity verification
</commit_message>
<xml_diff>
--- a/docs/maintenance/AI开发项目_Bug修改规范.docx
+++ b/docs/maintenance/AI开发项目_Bug修改规范.docx
@@ -14013,6 +14013,11 @@
     <ns0:p>
       <ns0:r>
         <ns0:t xml:space="preserve">2026-10-16 私人v1769/iOS453网页功能继承修复：用户发现刚交付v1767的查找聊天记录仍旧版。确认为v1738网页独有提交0e877127未同步的功能，不能归因手机缓存；上轮只查文件清单、完整继承承诺过宽。扩展现有v1738/v1742及翻译队列回归同时运行私人源，旧私人实现19项失败；补齐角色/群聊搜索分组、原消息定位、扩大旧消息窗口、返回关键词/位置、群内分类点击定位、批量翻译与429退避、群聊每人和每轮总条数上限、手动总结视角判别与失败提示、角色微信快照去重，以及他人群气泡透明边框。两个私人HTML补齐搜索样式和CSS重试定义，移除漂移检查的已修复__northCssRetry例外，未扩大KNOWN。真实页面发现两端wxsearch未接入浅色主题标志，双端仅此共享主题接线补正；网页仍1762，本轮不推送。额外审计所有公开入口JS/CSS文件、差异模块与app函数，私人入口未缺公开样式选择器，其他差异有目的：私人HomeKit、屏幕时长/管控/共享、原生收件与后台任务、文件备份与恢复合并、真人好友性能与机器人钩子均保留，private-reply-intercept独立实现不覆盖，delivery私人肯德基补判比网页多也保留；webRecovery和公版额度/云端快捷入口停用不强灌私人。private-web-feature-parity新增24个关键行为函数的真实代码对比及入口样式门禁，永久门禁双端守住新功能；原始HTML检查420条旧聊天中第5条定位、返回关键词、角色群搜索、浅色样式和群条数保存，两端通过，并继续原始buildSystem/myActivity全部核心聊天门禁和查岗图片管线。专项及永久门禁801项通过；最终全量和ZIP结果后续追加。功能提交8dd79e0e，私人1769/原生453/桥42；版本替换用非十六进制边界，验证颜色字面量逐个未变。复用打包脚本，从提交树生成并比对已核验1767完整包及最新main，Mac指南提示先合并Mac未提交半成品。尚未Mac编译签名或iPhone实测，旧包保留；维护Word仅检查XML和资源，不声称分页验收。</ns0:t>
+      </ns0:r>
+    </ns0:p>
+    <ns0:p>
+      <ns0:r>
+        <ns0:t xml:space="preserve">2026-10-16 私人v1769/iOS453完整覆盖包交付完成：最新私人版本覆盖包_v1769_iOS453.zip，209992380字节，1832文件/1831清单，SHA256=74d684e60ca61a225269581dd633a597efe747e0e6d40024148d955730c33cec；SOURCE_STATE.sourceCommit=51cee578f4ab220d82446482618babbfa74093dd，最终审查树187f5dc6，完整继承v1767查岗及所有旧内容。全量4185/4185，永久/查岗/功能继承专项801/801，实际两端HTML搜索旧消息定位/关键词保留/角色群定位/浅色主题/群条数保存与原核心聊天和查岗管线通过。首次全量3项失败分别是原始字符串测试不容CRLF、hisSeed测试按函数顺序截取缺新辅助函数、主题断言未列wxsearch；保留两端app原LF、把辅助函数排列与网页一致、在主题断言加入新搜索页，60项定向后最终全量通过，无删除断言或扩大白名单。包内CRC、1831哈希、69加载JS语法、前1767逐文件继承比对通过：除本轮私人app/两个入口/恢复页及元信息、指南之外均与1767包字节相同；原生仅452升453，不更改签名、身份、伴生协议或CheckIn代码。五卷回读合并SHA256与完整ZIP一致，分卷：001=4dc268001f6147438d3b6fd3b748c834f45da02b6a9432a8113b020ffc3b3ecc；002=c0dd1688885180cd43e854f435f20c4cbc229ed835f6c0d701cb2073089d73c0；003=b0a2fc94d5d2a9b21622d4b194c2400b462bd4206fbb18ea0909578afdd0b28d；004=0afa1db83416e446946be476f2281c66527ae39f65403699d723aeff69f932d0；005=0d3f87981b33f51ffe345bb11c3ec107c6f408ab4446cec9319316711d12fda2。未推送GitHub，网页线上未改；Windows结果不等于Mac/iPhone，macBuildVerified=false与realIPhoneVerified=false。旧1767包/原补丁/其他工作区和独有产物保留；复用固定日志，未创建新工作树、源码副本或无用缓存，本轮无无用新增临时文件待删。</ns0:t>
       </ns0:r>
     </ns0:p>
     <ns0:sectPr ns0:rsidR="00FC693F" ns0:rsidRPr="0006063C" ns0:rsidSect="00034616">

</xml_diff>